<commit_message>
Initial clean commit - project setup with gitignore
</commit_message>
<xml_diff>
--- a/Progress Report.docx
+++ b/Progress Report.docx
@@ -4419,6 +4419,1895 @@
       <w:r>
         <w:pict w14:anchorId="05941B63">
           <v:rect id="_x0000_i1054" style="width:0;height:1.5pt" o:hralign="center" o:hrstd="t" o:hr="t" fillcolor="#a0a0a0" stroked="f"/>
+        </w:pict>
+      </w:r>
+    </w:p>
+    <w:p>
+      <w:pPr>
+        <w:rPr>
+          <w:sz w:val="32"/>
+          <w:szCs w:val="32"/>
+        </w:rPr>
+      </w:pPr>
+      <w:r>
+        <w:rPr>
+          <w:sz w:val="32"/>
+          <w:szCs w:val="32"/>
+        </w:rPr>
+        <w:lastRenderedPageBreak/>
+        <w:t>Date- 26-04-2026</w:t>
+      </w:r>
+    </w:p>
+    <w:p>
+      <w:pPr>
+        <w:pStyle w:val="Heading1"/>
+      </w:pPr>
+      <w:r>
+        <w:rPr>
+          <w:rFonts w:ascii="Segoe UI Emoji" w:hAnsi="Segoe UI Emoji" w:cs="Segoe UI Emoji"/>
+        </w:rPr>
+        <w:t>📊</w:t>
+      </w:r>
+      <w:r>
+        <w:t xml:space="preserve"> Progress Report — Session Summary</w:t>
+      </w:r>
+    </w:p>
+    <w:p>
+      <w:pPr>
+        <w:pStyle w:val="Heading2"/>
+      </w:pPr>
+      <w:r>
+        <w:rPr>
+          <w:rFonts w:ascii="Segoe UI Emoji" w:hAnsi="Segoe UI Emoji" w:cs="Segoe UI Emoji"/>
+        </w:rPr>
+        <w:t>🧭</w:t>
+      </w:r>
+      <w:r>
+        <w:t xml:space="preserve"> Objective</w:t>
+      </w:r>
+    </w:p>
+    <w:p>
+      <w:pPr>
+        <w:pStyle w:val="NormalWeb"/>
+      </w:pPr>
+      <w:r>
+        <w:t xml:space="preserve">Extend a basic chat interface into a </w:t>
+      </w:r>
+      <w:r>
+        <w:rPr>
+          <w:rStyle w:val="Strong"/>
+        </w:rPr>
+        <w:t>stateful, multi-conversation system</w:t>
+      </w:r>
+      <w:r>
+        <w:t xml:space="preserve"> with UI parity to modern chat applications.</w:t>
+      </w:r>
+    </w:p>
+    <w:p>
+      <w:r>
+        <w:pict w14:anchorId="4D24D7FB">
+          <v:rect id="_x0000_i1055" style="width:0;height:1.5pt" o:hralign="center" o:hrstd="t" o:hr="t" fillcolor="#a0a0a0" stroked="f"/>
+        </w:pict>
+      </w:r>
+    </w:p>
+    <w:p>
+      <w:pPr>
+        <w:pStyle w:val="Heading2"/>
+      </w:pPr>
+      <w:r>
+        <w:rPr>
+          <w:rFonts w:ascii="Segoe UI Emoji" w:hAnsi="Segoe UI Emoji" w:cs="Segoe UI Emoji"/>
+        </w:rPr>
+        <w:t>🧩</w:t>
+      </w:r>
+      <w:r>
+        <w:t xml:space="preserve"> Phase 1 — Persistence Layer Stabilization</w:t>
+      </w:r>
+    </w:p>
+    <w:p>
+      <w:pPr>
+        <w:pStyle w:val="NormalWeb"/>
+        <w:numPr>
+          <w:ilvl w:val="0"/>
+          <w:numId w:val="27"/>
+        </w:numPr>
+      </w:pPr>
+      <w:r>
+        <w:t xml:space="preserve">Implemented </w:t>
+      </w:r>
+      <w:r>
+        <w:rPr>
+          <w:rStyle w:val="Strong"/>
+        </w:rPr>
+        <w:t>conversation storage</w:t>
+      </w:r>
+      <w:r>
+        <w:t xml:space="preserve"> using </w:t>
+      </w:r>
+      <w:proofErr w:type="spellStart"/>
+      <w:r>
+        <w:rPr>
+          <w:rStyle w:val="HTMLCode"/>
+          <w:rFonts w:eastAsiaTheme="majorEastAsia"/>
+        </w:rPr>
+        <w:t>localStorage</w:t>
+      </w:r>
+      <w:proofErr w:type="spellEnd"/>
+    </w:p>
+    <w:p>
+      <w:pPr>
+        <w:pStyle w:val="NormalWeb"/>
+        <w:numPr>
+          <w:ilvl w:val="0"/>
+          <w:numId w:val="27"/>
+        </w:numPr>
+      </w:pPr>
+      <w:r>
+        <w:t>Introduced:</w:t>
+      </w:r>
+    </w:p>
+    <w:p>
+      <w:pPr>
+        <w:pStyle w:val="NormalWeb"/>
+        <w:numPr>
+          <w:ilvl w:val="1"/>
+          <w:numId w:val="27"/>
+        </w:numPr>
+      </w:pPr>
+      <w:proofErr w:type="spellStart"/>
+      <w:proofErr w:type="gramStart"/>
+      <w:r>
+        <w:rPr>
+          <w:rStyle w:val="HTMLCode"/>
+          <w:rFonts w:eastAsiaTheme="majorEastAsia"/>
+        </w:rPr>
+        <w:t>saveConversations</w:t>
+      </w:r>
+      <w:proofErr w:type="spellEnd"/>
+      <w:r>
+        <w:rPr>
+          <w:rStyle w:val="HTMLCode"/>
+          <w:rFonts w:eastAsiaTheme="majorEastAsia"/>
+        </w:rPr>
+        <w:t>(</w:t>
+      </w:r>
+      <w:proofErr w:type="gramEnd"/>
+      <w:r>
+        <w:rPr>
+          <w:rStyle w:val="HTMLCode"/>
+          <w:rFonts w:eastAsiaTheme="majorEastAsia"/>
+        </w:rPr>
+        <w:t>)</w:t>
+      </w:r>
+    </w:p>
+    <w:p>
+      <w:pPr>
+        <w:pStyle w:val="NormalWeb"/>
+        <w:numPr>
+          <w:ilvl w:val="1"/>
+          <w:numId w:val="27"/>
+        </w:numPr>
+      </w:pPr>
+      <w:proofErr w:type="spellStart"/>
+      <w:proofErr w:type="gramStart"/>
+      <w:r>
+        <w:rPr>
+          <w:rStyle w:val="HTMLCode"/>
+          <w:rFonts w:eastAsiaTheme="majorEastAsia"/>
+        </w:rPr>
+        <w:t>loadConversations</w:t>
+      </w:r>
+      <w:proofErr w:type="spellEnd"/>
+      <w:r>
+        <w:rPr>
+          <w:rStyle w:val="HTMLCode"/>
+          <w:rFonts w:eastAsiaTheme="majorEastAsia"/>
+        </w:rPr>
+        <w:t>(</w:t>
+      </w:r>
+      <w:proofErr w:type="gramEnd"/>
+      <w:r>
+        <w:rPr>
+          <w:rStyle w:val="HTMLCode"/>
+          <w:rFonts w:eastAsiaTheme="majorEastAsia"/>
+        </w:rPr>
+        <w:t>)</w:t>
+      </w:r>
+    </w:p>
+    <w:p>
+      <w:pPr>
+        <w:pStyle w:val="NormalWeb"/>
+        <w:numPr>
+          <w:ilvl w:val="0"/>
+          <w:numId w:val="27"/>
+        </w:numPr>
+      </w:pPr>
+      <w:r>
+        <w:t xml:space="preserve">Established </w:t>
+      </w:r>
+      <w:r>
+        <w:rPr>
+          <w:rStyle w:val="Strong"/>
+        </w:rPr>
+        <w:t>single source of truth</w:t>
+      </w:r>
+      <w:r>
+        <w:t xml:space="preserve"> via </w:t>
+      </w:r>
+      <w:r>
+        <w:rPr>
+          <w:rStyle w:val="HTMLCode"/>
+          <w:rFonts w:eastAsiaTheme="majorEastAsia"/>
+        </w:rPr>
+        <w:t>conversations.js</w:t>
+      </w:r>
+    </w:p>
+    <w:p>
+      <w:pPr>
+        <w:pStyle w:val="NormalWeb"/>
+        <w:numPr>
+          <w:ilvl w:val="0"/>
+          <w:numId w:val="27"/>
+        </w:numPr>
+      </w:pPr>
+      <w:r>
+        <w:t xml:space="preserve">Verified persistence through </w:t>
+      </w:r>
+      <w:proofErr w:type="spellStart"/>
+      <w:r>
+        <w:t>DevTools</w:t>
+      </w:r>
+      <w:proofErr w:type="spellEnd"/>
+      <w:r>
+        <w:t xml:space="preserve"> inspection</w:t>
+      </w:r>
+    </w:p>
+    <w:p>
+      <w:pPr>
+        <w:pStyle w:val="NormalWeb"/>
+      </w:pPr>
+      <w:r>
+        <w:rPr>
+          <w:rStyle w:val="Strong"/>
+        </w:rPr>
+        <w:t>Outcome:</w:t>
+      </w:r>
+      <w:r>
+        <w:t xml:space="preserve"> Durable, reload-safe data layer</w:t>
+      </w:r>
+    </w:p>
+    <w:p>
+      <w:r>
+        <w:pict w14:anchorId="197EA20F">
+          <v:rect id="_x0000_i1056" style="width:0;height:1.5pt" o:hralign="center" o:hrstd="t" o:hr="t" fillcolor="#a0a0a0" stroked="f"/>
+        </w:pict>
+      </w:r>
+    </w:p>
+    <w:p>
+      <w:pPr>
+        <w:pStyle w:val="Heading2"/>
+      </w:pPr>
+      <w:r>
+        <w:rPr>
+          <w:rFonts w:ascii="Segoe UI Emoji" w:hAnsi="Segoe UI Emoji" w:cs="Segoe UI Emoji"/>
+        </w:rPr>
+        <w:t>🧩</w:t>
+      </w:r>
+      <w:r>
+        <w:t xml:space="preserve"> Phase 2 — Conversation Engine</w:t>
+      </w:r>
+    </w:p>
+    <w:p>
+      <w:pPr>
+        <w:pStyle w:val="NormalWeb"/>
+        <w:numPr>
+          <w:ilvl w:val="0"/>
+          <w:numId w:val="28"/>
+        </w:numPr>
+      </w:pPr>
+      <w:r>
+        <w:t>Built:</w:t>
+      </w:r>
+    </w:p>
+    <w:p>
+      <w:pPr>
+        <w:pStyle w:val="NormalWeb"/>
+        <w:numPr>
+          <w:ilvl w:val="1"/>
+          <w:numId w:val="28"/>
+        </w:numPr>
+      </w:pPr>
+      <w:proofErr w:type="spellStart"/>
+      <w:proofErr w:type="gramStart"/>
+      <w:r>
+        <w:rPr>
+          <w:rStyle w:val="HTMLCode"/>
+          <w:rFonts w:eastAsiaTheme="majorEastAsia"/>
+        </w:rPr>
+        <w:t>createConversation</w:t>
+      </w:r>
+      <w:proofErr w:type="spellEnd"/>
+      <w:r>
+        <w:rPr>
+          <w:rStyle w:val="HTMLCode"/>
+          <w:rFonts w:eastAsiaTheme="majorEastAsia"/>
+        </w:rPr>
+        <w:t>(</w:t>
+      </w:r>
+      <w:proofErr w:type="gramEnd"/>
+      <w:r>
+        <w:rPr>
+          <w:rStyle w:val="HTMLCode"/>
+          <w:rFonts w:eastAsiaTheme="majorEastAsia"/>
+        </w:rPr>
+        <w:t>)</w:t>
+      </w:r>
+    </w:p>
+    <w:p>
+      <w:pPr>
+        <w:pStyle w:val="NormalWeb"/>
+        <w:numPr>
+          <w:ilvl w:val="1"/>
+          <w:numId w:val="28"/>
+        </w:numPr>
+      </w:pPr>
+      <w:proofErr w:type="spellStart"/>
+      <w:proofErr w:type="gramStart"/>
+      <w:r>
+        <w:rPr>
+          <w:rStyle w:val="HTMLCode"/>
+          <w:rFonts w:eastAsiaTheme="majorEastAsia"/>
+        </w:rPr>
+        <w:t>updateConversation</w:t>
+      </w:r>
+      <w:proofErr w:type="spellEnd"/>
+      <w:r>
+        <w:rPr>
+          <w:rStyle w:val="HTMLCode"/>
+          <w:rFonts w:eastAsiaTheme="majorEastAsia"/>
+        </w:rPr>
+        <w:t>(</w:t>
+      </w:r>
+      <w:proofErr w:type="gramEnd"/>
+      <w:r>
+        <w:rPr>
+          <w:rStyle w:val="HTMLCode"/>
+          <w:rFonts w:eastAsiaTheme="majorEastAsia"/>
+        </w:rPr>
+        <w:t>)</w:t>
+      </w:r>
+    </w:p>
+    <w:p>
+      <w:pPr>
+        <w:pStyle w:val="NormalWeb"/>
+        <w:numPr>
+          <w:ilvl w:val="1"/>
+          <w:numId w:val="28"/>
+        </w:numPr>
+      </w:pPr>
+      <w:proofErr w:type="spellStart"/>
+      <w:proofErr w:type="gramStart"/>
+      <w:r>
+        <w:rPr>
+          <w:rStyle w:val="HTMLCode"/>
+          <w:rFonts w:eastAsiaTheme="majorEastAsia"/>
+        </w:rPr>
+        <w:t>getAllConversations</w:t>
+      </w:r>
+      <w:proofErr w:type="spellEnd"/>
+      <w:r>
+        <w:rPr>
+          <w:rStyle w:val="HTMLCode"/>
+          <w:rFonts w:eastAsiaTheme="majorEastAsia"/>
+        </w:rPr>
+        <w:t>(</w:t>
+      </w:r>
+      <w:proofErr w:type="gramEnd"/>
+      <w:r>
+        <w:rPr>
+          <w:rStyle w:val="HTMLCode"/>
+          <w:rFonts w:eastAsiaTheme="majorEastAsia"/>
+        </w:rPr>
+        <w:t>)</w:t>
+      </w:r>
+    </w:p>
+    <w:p>
+      <w:pPr>
+        <w:pStyle w:val="NormalWeb"/>
+        <w:numPr>
+          <w:ilvl w:val="0"/>
+          <w:numId w:val="28"/>
+        </w:numPr>
+      </w:pPr>
+      <w:r>
+        <w:t>Implemented:</w:t>
+      </w:r>
+    </w:p>
+    <w:p>
+      <w:pPr>
+        <w:pStyle w:val="NormalWeb"/>
+        <w:numPr>
+          <w:ilvl w:val="1"/>
+          <w:numId w:val="28"/>
+        </w:numPr>
+      </w:pPr>
+      <w:r>
+        <w:t>Automatic title derivation from first user message</w:t>
+      </w:r>
+    </w:p>
+    <w:p>
+      <w:pPr>
+        <w:pStyle w:val="NormalWeb"/>
+        <w:numPr>
+          <w:ilvl w:val="1"/>
+          <w:numId w:val="28"/>
+        </w:numPr>
+      </w:pPr>
+      <w:r>
+        <w:t>Timestamp tracking (</w:t>
+      </w:r>
+      <w:proofErr w:type="spellStart"/>
+      <w:r>
+        <w:rPr>
+          <w:rStyle w:val="HTMLCode"/>
+          <w:rFonts w:eastAsiaTheme="majorEastAsia"/>
+        </w:rPr>
+        <w:t>createdAt</w:t>
+      </w:r>
+      <w:proofErr w:type="spellEnd"/>
+      <w:r>
+        <w:t xml:space="preserve">, </w:t>
+      </w:r>
+      <w:proofErr w:type="spellStart"/>
+      <w:r>
+        <w:rPr>
+          <w:rStyle w:val="HTMLCode"/>
+          <w:rFonts w:eastAsiaTheme="majorEastAsia"/>
+        </w:rPr>
+        <w:t>updatedAt</w:t>
+      </w:r>
+      <w:proofErr w:type="spellEnd"/>
+      <w:r>
+        <w:t>)</w:t>
+      </w:r>
+    </w:p>
+    <w:p>
+      <w:pPr>
+        <w:pStyle w:val="NormalWeb"/>
+        <w:numPr>
+          <w:ilvl w:val="0"/>
+          <w:numId w:val="28"/>
+        </w:numPr>
+      </w:pPr>
+      <w:r>
+        <w:t>Fixed critical bug:</w:t>
+      </w:r>
+    </w:p>
+    <w:p>
+      <w:pPr>
+        <w:pStyle w:val="NormalWeb"/>
+        <w:numPr>
+          <w:ilvl w:val="1"/>
+          <w:numId w:val="28"/>
+        </w:numPr>
+      </w:pPr>
+      <w:r>
+        <w:t>Prevented unnecessary conversation creation on reload</w:t>
+      </w:r>
+    </w:p>
+    <w:p>
+      <w:pPr>
+        <w:pStyle w:val="NormalWeb"/>
+      </w:pPr>
+      <w:r>
+        <w:rPr>
+          <w:rStyle w:val="Strong"/>
+        </w:rPr>
+        <w:t>Outcome:</w:t>
+      </w:r>
+      <w:r>
+        <w:t xml:space="preserve"> Controlled conversation lifecycle with deterministic initialization</w:t>
+      </w:r>
+    </w:p>
+    <w:p>
+      <w:r>
+        <w:pict w14:anchorId="2A1BE62D">
+          <v:rect id="_x0000_i1057" style="width:0;height:1.5pt" o:hralign="center" o:hrstd="t" o:hr="t" fillcolor="#a0a0a0" stroked="f"/>
+        </w:pict>
+      </w:r>
+    </w:p>
+    <w:p>
+      <w:pPr>
+        <w:pStyle w:val="Heading2"/>
+      </w:pPr>
+      <w:r>
+        <w:rPr>
+          <w:rFonts w:ascii="Segoe UI Emoji" w:hAnsi="Segoe UI Emoji" w:cs="Segoe UI Emoji"/>
+        </w:rPr>
+        <w:t>🧩</w:t>
+      </w:r>
+      <w:r>
+        <w:t xml:space="preserve"> Phase 3 — Sidebar UI Architecture</w:t>
+      </w:r>
+    </w:p>
+    <w:p>
+      <w:pPr>
+        <w:pStyle w:val="NormalWeb"/>
+        <w:numPr>
+          <w:ilvl w:val="0"/>
+          <w:numId w:val="29"/>
+        </w:numPr>
+      </w:pPr>
+      <w:r>
+        <w:t>Introduced sidebar container (</w:t>
+      </w:r>
+      <w:r>
+        <w:rPr>
+          <w:rStyle w:val="HTMLCode"/>
+          <w:rFonts w:eastAsiaTheme="majorEastAsia"/>
+        </w:rPr>
+        <w:t>#sidebar</w:t>
+      </w:r>
+      <w:r>
+        <w:t>)</w:t>
+      </w:r>
+    </w:p>
+    <w:p>
+      <w:pPr>
+        <w:pStyle w:val="NormalWeb"/>
+        <w:numPr>
+          <w:ilvl w:val="0"/>
+          <w:numId w:val="29"/>
+        </w:numPr>
+      </w:pPr>
+      <w:r>
+        <w:lastRenderedPageBreak/>
+        <w:t>Refactored layout:</w:t>
+      </w:r>
+    </w:p>
+    <w:p>
+      <w:pPr>
+        <w:pStyle w:val="NormalWeb"/>
+        <w:numPr>
+          <w:ilvl w:val="1"/>
+          <w:numId w:val="29"/>
+        </w:numPr>
+      </w:pPr>
+      <w:r>
+        <w:t xml:space="preserve">Separated </w:t>
+      </w:r>
+      <w:r>
+        <w:rPr>
+          <w:rStyle w:val="HTMLCode"/>
+          <w:rFonts w:eastAsiaTheme="majorEastAsia"/>
+        </w:rPr>
+        <w:t>#main</w:t>
+      </w:r>
+      <w:r>
+        <w:t xml:space="preserve"> from sidebar</w:t>
+      </w:r>
+    </w:p>
+    <w:p>
+      <w:pPr>
+        <w:pStyle w:val="NormalWeb"/>
+        <w:numPr>
+          <w:ilvl w:val="1"/>
+          <w:numId w:val="29"/>
+        </w:numPr>
+      </w:pPr>
+      <w:r>
+        <w:t>Eliminated overlap via flex + margin system</w:t>
+      </w:r>
+    </w:p>
+    <w:p>
+      <w:pPr>
+        <w:pStyle w:val="NormalWeb"/>
+        <w:numPr>
+          <w:ilvl w:val="0"/>
+          <w:numId w:val="29"/>
+        </w:numPr>
+      </w:pPr>
+      <w:r>
+        <w:t>Created:</w:t>
+      </w:r>
+    </w:p>
+    <w:p>
+      <w:pPr>
+        <w:pStyle w:val="NormalWeb"/>
+        <w:numPr>
+          <w:ilvl w:val="1"/>
+          <w:numId w:val="29"/>
+        </w:numPr>
+      </w:pPr>
+      <w:r>
+        <w:rPr>
+          <w:rStyle w:val="HTMLCode"/>
+          <w:rFonts w:eastAsiaTheme="majorEastAsia"/>
+        </w:rPr>
+        <w:t>#chatList</w:t>
+      </w:r>
+      <w:r>
+        <w:t xml:space="preserve"> rendering container</w:t>
+      </w:r>
+    </w:p>
+    <w:p>
+      <w:pPr>
+        <w:pStyle w:val="NormalWeb"/>
+      </w:pPr>
+      <w:r>
+        <w:rPr>
+          <w:rStyle w:val="Strong"/>
+        </w:rPr>
+        <w:t>Outcome:</w:t>
+      </w:r>
+      <w:r>
+        <w:t xml:space="preserve"> Stable UI foundation for multi-chat navigation</w:t>
+      </w:r>
+    </w:p>
+    <w:p>
+      <w:r>
+        <w:pict w14:anchorId="0B5A2631">
+          <v:rect id="_x0000_i1058" style="width:0;height:1.5pt" o:hralign="center" o:hrstd="t" o:hr="t" fillcolor="#a0a0a0" stroked="f"/>
+        </w:pict>
+      </w:r>
+    </w:p>
+    <w:p>
+      <w:pPr>
+        <w:pStyle w:val="Heading2"/>
+      </w:pPr>
+      <w:r>
+        <w:rPr>
+          <w:rFonts w:ascii="Segoe UI Emoji" w:hAnsi="Segoe UI Emoji" w:cs="Segoe UI Emoji"/>
+        </w:rPr>
+        <w:t>🧩</w:t>
+      </w:r>
+      <w:r>
+        <w:t xml:space="preserve"> Phase 4 — Conversation Rendering</w:t>
+      </w:r>
+    </w:p>
+    <w:p>
+      <w:pPr>
+        <w:pStyle w:val="NormalWeb"/>
+        <w:numPr>
+          <w:ilvl w:val="0"/>
+          <w:numId w:val="30"/>
+        </w:numPr>
+      </w:pPr>
+      <w:r>
+        <w:t xml:space="preserve">Implemented </w:t>
+      </w:r>
+      <w:proofErr w:type="spellStart"/>
+      <w:proofErr w:type="gramStart"/>
+      <w:r>
+        <w:rPr>
+          <w:rStyle w:val="HTMLCode"/>
+          <w:rFonts w:eastAsiaTheme="majorEastAsia"/>
+        </w:rPr>
+        <w:t>renderConversations</w:t>
+      </w:r>
+      <w:proofErr w:type="spellEnd"/>
+      <w:r>
+        <w:rPr>
+          <w:rStyle w:val="HTMLCode"/>
+          <w:rFonts w:eastAsiaTheme="majorEastAsia"/>
+        </w:rPr>
+        <w:t>(</w:t>
+      </w:r>
+      <w:proofErr w:type="gramEnd"/>
+      <w:r>
+        <w:rPr>
+          <w:rStyle w:val="HTMLCode"/>
+          <w:rFonts w:eastAsiaTheme="majorEastAsia"/>
+        </w:rPr>
+        <w:t>)</w:t>
+      </w:r>
+    </w:p>
+    <w:p>
+      <w:pPr>
+        <w:pStyle w:val="NormalWeb"/>
+        <w:numPr>
+          <w:ilvl w:val="0"/>
+          <w:numId w:val="30"/>
+        </w:numPr>
+      </w:pPr>
+      <w:r>
+        <w:t>Dynamically populated sidebar from stored data</w:t>
+      </w:r>
+    </w:p>
+    <w:p>
+      <w:pPr>
+        <w:pStyle w:val="NormalWeb"/>
+        <w:numPr>
+          <w:ilvl w:val="0"/>
+          <w:numId w:val="30"/>
+        </w:numPr>
+      </w:pPr>
+      <w:r>
+        <w:t>Ensured:</w:t>
+      </w:r>
+    </w:p>
+    <w:p>
+      <w:pPr>
+        <w:pStyle w:val="NormalWeb"/>
+        <w:numPr>
+          <w:ilvl w:val="1"/>
+          <w:numId w:val="30"/>
+        </w:numPr>
+      </w:pPr>
+      <w:r>
+        <w:t>Clean re-rendering (no duplication)</w:t>
+      </w:r>
+    </w:p>
+    <w:p>
+      <w:pPr>
+        <w:pStyle w:val="NormalWeb"/>
+        <w:numPr>
+          <w:ilvl w:val="1"/>
+          <w:numId w:val="30"/>
+        </w:numPr>
+      </w:pPr>
+      <w:r>
+        <w:t>Proper DOM clearing before injection</w:t>
+      </w:r>
+    </w:p>
+    <w:p>
+      <w:pPr>
+        <w:pStyle w:val="NormalWeb"/>
+      </w:pPr>
+      <w:r>
+        <w:rPr>
+          <w:rStyle w:val="Strong"/>
+        </w:rPr>
+        <w:t>Outcome:</w:t>
+      </w:r>
+      <w:r>
+        <w:t xml:space="preserve"> Visual representation of persistent data</w:t>
+      </w:r>
+    </w:p>
+    <w:p>
+      <w:r>
+        <w:pict w14:anchorId="1C77D11D">
+          <v:rect id="_x0000_i1059" style="width:0;height:1.5pt" o:hralign="center" o:hrstd="t" o:hr="t" fillcolor="#a0a0a0" stroked="f"/>
+        </w:pict>
+      </w:r>
+    </w:p>
+    <w:p>
+      <w:pPr>
+        <w:pStyle w:val="Heading2"/>
+      </w:pPr>
+      <w:r>
+        <w:rPr>
+          <w:rFonts w:ascii="Segoe UI Emoji" w:hAnsi="Segoe UI Emoji" w:cs="Segoe UI Emoji"/>
+        </w:rPr>
+        <w:t>🧩</w:t>
+      </w:r>
+      <w:r>
+        <w:t xml:space="preserve"> Phase 5 — Conversation Switching</w:t>
+      </w:r>
+    </w:p>
+    <w:p>
+      <w:pPr>
+        <w:pStyle w:val="NormalWeb"/>
+        <w:numPr>
+          <w:ilvl w:val="0"/>
+          <w:numId w:val="31"/>
+        </w:numPr>
+      </w:pPr>
+      <w:r>
+        <w:t>Enabled click-based switching</w:t>
+      </w:r>
+    </w:p>
+    <w:p>
+      <w:pPr>
+        <w:pStyle w:val="NormalWeb"/>
+        <w:numPr>
+          <w:ilvl w:val="0"/>
+          <w:numId w:val="31"/>
+        </w:numPr>
+      </w:pPr>
+      <w:r>
+        <w:t>Synced:</w:t>
+      </w:r>
+    </w:p>
+    <w:p>
+      <w:pPr>
+        <w:pStyle w:val="NormalWeb"/>
+        <w:numPr>
+          <w:ilvl w:val="1"/>
+          <w:numId w:val="31"/>
+        </w:numPr>
+      </w:pPr>
+      <w:proofErr w:type="spellStart"/>
+      <w:r>
+        <w:rPr>
+          <w:rStyle w:val="HTMLCode"/>
+          <w:rFonts w:eastAsiaTheme="majorEastAsia"/>
+        </w:rPr>
+        <w:t>currentConversation</w:t>
+      </w:r>
+      <w:proofErr w:type="spellEnd"/>
+    </w:p>
+    <w:p>
+      <w:pPr>
+        <w:pStyle w:val="NormalWeb"/>
+        <w:numPr>
+          <w:ilvl w:val="1"/>
+          <w:numId w:val="31"/>
+        </w:numPr>
+      </w:pPr>
+      <w:r>
+        <w:rPr>
+          <w:rStyle w:val="HTMLCode"/>
+          <w:rFonts w:eastAsiaTheme="majorEastAsia"/>
+        </w:rPr>
+        <w:t>messages</w:t>
+      </w:r>
+    </w:p>
+    <w:p>
+      <w:pPr>
+        <w:pStyle w:val="NormalWeb"/>
+        <w:numPr>
+          <w:ilvl w:val="0"/>
+          <w:numId w:val="31"/>
+        </w:numPr>
+      </w:pPr>
+      <w:r>
+        <w:t>Reconstructed chat UI from stored messages</w:t>
+      </w:r>
+    </w:p>
+    <w:p>
+      <w:pPr>
+        <w:pStyle w:val="NormalWeb"/>
+        <w:numPr>
+          <w:ilvl w:val="0"/>
+          <w:numId w:val="31"/>
+        </w:numPr>
+      </w:pPr>
+      <w:r>
+        <w:t>Fixed highlight bug via forced re-render</w:t>
+      </w:r>
+    </w:p>
+    <w:p>
+      <w:pPr>
+        <w:pStyle w:val="NormalWeb"/>
+      </w:pPr>
+      <w:r>
+        <w:rPr>
+          <w:rStyle w:val="Strong"/>
+        </w:rPr>
+        <w:t>Outcome:</w:t>
+      </w:r>
+      <w:r>
+        <w:t xml:space="preserve"> Functional multi-session navigation</w:t>
+      </w:r>
+    </w:p>
+    <w:p>
+      <w:r>
+        <w:pict w14:anchorId="3B9DF890">
+          <v:rect id="_x0000_i1060" style="width:0;height:1.5pt" o:hralign="center" o:hrstd="t" o:hr="t" fillcolor="#a0a0a0" stroked="f"/>
+        </w:pict>
+      </w:r>
+    </w:p>
+    <w:p>
+      <w:pPr>
+        <w:pStyle w:val="Heading2"/>
+      </w:pPr>
+      <w:r>
+        <w:rPr>
+          <w:rFonts w:ascii="Segoe UI Emoji" w:hAnsi="Segoe UI Emoji" w:cs="Segoe UI Emoji"/>
+        </w:rPr>
+        <w:t>🧩</w:t>
+      </w:r>
+      <w:r>
+        <w:t xml:space="preserve"> Phase 6 — New Chat Flow</w:t>
+      </w:r>
+    </w:p>
+    <w:p>
+      <w:pPr>
+        <w:pStyle w:val="NormalWeb"/>
+        <w:numPr>
+          <w:ilvl w:val="0"/>
+          <w:numId w:val="32"/>
+        </w:numPr>
+      </w:pPr>
+      <w:r>
+        <w:t xml:space="preserve">Bound </w:t>
+      </w:r>
+      <w:r>
+        <w:rPr>
+          <w:rStyle w:val="HTMLCode"/>
+          <w:rFonts w:eastAsiaTheme="majorEastAsia"/>
+        </w:rPr>
+        <w:t>+ New Chat</w:t>
+      </w:r>
+      <w:r>
+        <w:t xml:space="preserve"> button</w:t>
+      </w:r>
+    </w:p>
+    <w:p>
+      <w:pPr>
+        <w:pStyle w:val="NormalWeb"/>
+        <w:numPr>
+          <w:ilvl w:val="0"/>
+          <w:numId w:val="32"/>
+        </w:numPr>
+      </w:pPr>
+      <w:r>
+        <w:t>Ensured:</w:t>
+      </w:r>
+    </w:p>
+    <w:p>
+      <w:pPr>
+        <w:pStyle w:val="NormalWeb"/>
+        <w:numPr>
+          <w:ilvl w:val="1"/>
+          <w:numId w:val="32"/>
+        </w:numPr>
+      </w:pPr>
+      <w:r>
+        <w:t>New conversation creation</w:t>
+      </w:r>
+    </w:p>
+    <w:p>
+      <w:pPr>
+        <w:pStyle w:val="NormalWeb"/>
+        <w:numPr>
+          <w:ilvl w:val="1"/>
+          <w:numId w:val="32"/>
+        </w:numPr>
+      </w:pPr>
+      <w:r>
+        <w:t>UI reset</w:t>
+      </w:r>
+    </w:p>
+    <w:p>
+      <w:pPr>
+        <w:pStyle w:val="NormalWeb"/>
+        <w:numPr>
+          <w:ilvl w:val="1"/>
+          <w:numId w:val="32"/>
+        </w:numPr>
+      </w:pPr>
+      <w:r>
+        <w:t>Sidebar refresh</w:t>
+      </w:r>
+    </w:p>
+    <w:p>
+      <w:pPr>
+        <w:pStyle w:val="NormalWeb"/>
+      </w:pPr>
+      <w:r>
+        <w:rPr>
+          <w:rStyle w:val="Strong"/>
+        </w:rPr>
+        <w:t>Outcome:</w:t>
+      </w:r>
+      <w:r>
+        <w:t xml:space="preserve"> Clean session instantiation pipeline</w:t>
+      </w:r>
+    </w:p>
+    <w:p>
+      <w:r>
+        <w:lastRenderedPageBreak/>
+        <w:pict w14:anchorId="36557A8A">
+          <v:rect id="_x0000_i1061" style="width:0;height:1.5pt" o:hralign="center" o:hrstd="t" o:hr="t" fillcolor="#a0a0a0" stroked="f"/>
+        </w:pict>
+      </w:r>
+    </w:p>
+    <w:p>
+      <w:pPr>
+        <w:pStyle w:val="Heading2"/>
+      </w:pPr>
+      <w:r>
+        <w:rPr>
+          <w:rFonts w:ascii="Segoe UI Emoji" w:hAnsi="Segoe UI Emoji" w:cs="Segoe UI Emoji"/>
+        </w:rPr>
+        <w:t>🧩</w:t>
+      </w:r>
+      <w:r>
+        <w:t xml:space="preserve"> Phase 7 — Active Chat Highlighting</w:t>
+      </w:r>
+    </w:p>
+    <w:p>
+      <w:pPr>
+        <w:pStyle w:val="NormalWeb"/>
+        <w:numPr>
+          <w:ilvl w:val="0"/>
+          <w:numId w:val="33"/>
+        </w:numPr>
+      </w:pPr>
+      <w:r>
+        <w:t>Implemented visual state tracking</w:t>
+      </w:r>
+    </w:p>
+    <w:p>
+      <w:pPr>
+        <w:pStyle w:val="NormalWeb"/>
+        <w:numPr>
+          <w:ilvl w:val="0"/>
+          <w:numId w:val="33"/>
+        </w:numPr>
+      </w:pPr>
+      <w:r>
+        <w:t>Fixed stale UI issue by re-rendering on switch</w:t>
+      </w:r>
+    </w:p>
+    <w:p>
+      <w:pPr>
+        <w:pStyle w:val="NormalWeb"/>
+      </w:pPr>
+      <w:r>
+        <w:rPr>
+          <w:rStyle w:val="Strong"/>
+        </w:rPr>
+        <w:t>Outcome:</w:t>
+      </w:r>
+      <w:r>
+        <w:t xml:space="preserve"> Clear user context awareness</w:t>
+      </w:r>
+    </w:p>
+    <w:p>
+      <w:r>
+        <w:pict w14:anchorId="084ACBE4">
+          <v:rect id="_x0000_i1062" style="width:0;height:1.5pt" o:hralign="center" o:hrstd="t" o:hr="t" fillcolor="#a0a0a0" stroked="f"/>
+        </w:pict>
+      </w:r>
+    </w:p>
+    <w:p>
+      <w:pPr>
+        <w:pStyle w:val="Heading2"/>
+      </w:pPr>
+      <w:r>
+        <w:rPr>
+          <w:rFonts w:ascii="Segoe UI Emoji" w:hAnsi="Segoe UI Emoji" w:cs="Segoe UI Emoji"/>
+        </w:rPr>
+        <w:t>🧩</w:t>
+      </w:r>
+      <w:r>
+        <w:t xml:space="preserve"> Phase 8 — Sidebar Controls</w:t>
+      </w:r>
+    </w:p>
+    <w:p>
+      <w:pPr>
+        <w:pStyle w:val="Heading3"/>
+      </w:pPr>
+      <w:r>
+        <w:t>Toggle</w:t>
+      </w:r>
+    </w:p>
+    <w:p>
+      <w:pPr>
+        <w:pStyle w:val="NormalWeb"/>
+        <w:numPr>
+          <w:ilvl w:val="0"/>
+          <w:numId w:val="34"/>
+        </w:numPr>
+      </w:pPr>
+      <w:r>
+        <w:t xml:space="preserve">Implemented </w:t>
+      </w:r>
+      <w:proofErr w:type="spellStart"/>
+      <w:proofErr w:type="gramStart"/>
+      <w:r>
+        <w:rPr>
+          <w:rStyle w:val="HTMLCode"/>
+          <w:rFonts w:eastAsiaTheme="majorEastAsia"/>
+        </w:rPr>
+        <w:t>toggleSidebar</w:t>
+      </w:r>
+      <w:proofErr w:type="spellEnd"/>
+      <w:r>
+        <w:rPr>
+          <w:rStyle w:val="HTMLCode"/>
+          <w:rFonts w:eastAsiaTheme="majorEastAsia"/>
+        </w:rPr>
+        <w:t>(</w:t>
+      </w:r>
+      <w:proofErr w:type="gramEnd"/>
+      <w:r>
+        <w:rPr>
+          <w:rStyle w:val="HTMLCode"/>
+          <w:rFonts w:eastAsiaTheme="majorEastAsia"/>
+        </w:rPr>
+        <w:t>)</w:t>
+      </w:r>
+    </w:p>
+    <w:p>
+      <w:pPr>
+        <w:pStyle w:val="NormalWeb"/>
+        <w:numPr>
+          <w:ilvl w:val="0"/>
+          <w:numId w:val="34"/>
+        </w:numPr>
+      </w:pPr>
+      <w:r>
+        <w:t>Fixed positioning bug by relocating button into layout</w:t>
+      </w:r>
+    </w:p>
+    <w:p>
+      <w:pPr>
+        <w:pStyle w:val="Heading3"/>
+      </w:pPr>
+      <w:r>
+        <w:t>Resize</w:t>
+      </w:r>
+    </w:p>
+    <w:p>
+      <w:pPr>
+        <w:pStyle w:val="NormalWeb"/>
+        <w:numPr>
+          <w:ilvl w:val="0"/>
+          <w:numId w:val="35"/>
+        </w:numPr>
+      </w:pPr>
+      <w:r>
+        <w:t>Added drag-based resizer (</w:t>
+      </w:r>
+      <w:r>
+        <w:rPr>
+          <w:rStyle w:val="HTMLCode"/>
+          <w:rFonts w:eastAsiaTheme="majorEastAsia"/>
+        </w:rPr>
+        <w:t>#resizer</w:t>
+      </w:r>
+      <w:r>
+        <w:t>)</w:t>
+      </w:r>
+    </w:p>
+    <w:p>
+      <w:pPr>
+        <w:pStyle w:val="NormalWeb"/>
+        <w:numPr>
+          <w:ilvl w:val="0"/>
+          <w:numId w:val="35"/>
+        </w:numPr>
+      </w:pPr>
+      <w:r>
+        <w:t>Synced sidebar width with main layout dynamically</w:t>
+      </w:r>
+    </w:p>
+    <w:p>
+      <w:pPr>
+        <w:pStyle w:val="NormalWeb"/>
+      </w:pPr>
+      <w:r>
+        <w:rPr>
+          <w:rStyle w:val="Strong"/>
+        </w:rPr>
+        <w:t>Outcome:</w:t>
+      </w:r>
+      <w:r>
+        <w:t xml:space="preserve"> Interactive and adjustable interface</w:t>
+      </w:r>
+    </w:p>
+    <w:p>
+      <w:r>
+        <w:pict w14:anchorId="387C8F71">
+          <v:rect id="_x0000_i1063" style="width:0;height:1.5pt" o:hralign="center" o:hrstd="t" o:hr="t" fillcolor="#a0a0a0" stroked="f"/>
+        </w:pict>
+      </w:r>
+    </w:p>
+    <w:p>
+      <w:pPr>
+        <w:pStyle w:val="Heading2"/>
+      </w:pPr>
+      <w:r>
+        <w:rPr>
+          <w:rFonts w:ascii="Segoe UI Emoji" w:hAnsi="Segoe UI Emoji" w:cs="Segoe UI Emoji"/>
+        </w:rPr>
+        <w:t>🧩</w:t>
+      </w:r>
+      <w:r>
+        <w:t xml:space="preserve"> Phase 9 — UI Controls Separation</w:t>
+      </w:r>
+    </w:p>
+    <w:p>
+      <w:pPr>
+        <w:pStyle w:val="NormalWeb"/>
+        <w:numPr>
+          <w:ilvl w:val="0"/>
+          <w:numId w:val="36"/>
+        </w:numPr>
+      </w:pPr>
+      <w:r>
+        <w:t>Restored customization panel</w:t>
+      </w:r>
+    </w:p>
+    <w:p>
+      <w:pPr>
+        <w:pStyle w:val="NormalWeb"/>
+        <w:numPr>
+          <w:ilvl w:val="0"/>
+          <w:numId w:val="36"/>
+        </w:numPr>
+      </w:pPr>
+      <w:r>
+        <w:t>Separated:</w:t>
+      </w:r>
+    </w:p>
+    <w:p>
+      <w:pPr>
+        <w:pStyle w:val="NormalWeb"/>
+        <w:numPr>
+          <w:ilvl w:val="1"/>
+          <w:numId w:val="36"/>
+        </w:numPr>
+      </w:pPr>
+      <w:r>
+        <w:t>Sidebar toggle</w:t>
+      </w:r>
+    </w:p>
+    <w:p>
+      <w:pPr>
+        <w:pStyle w:val="NormalWeb"/>
+        <w:numPr>
+          <w:ilvl w:val="1"/>
+          <w:numId w:val="36"/>
+        </w:numPr>
+      </w:pPr>
+      <w:r>
+        <w:t>Theme customization</w:t>
+      </w:r>
+    </w:p>
+    <w:p>
+      <w:pPr>
+        <w:pStyle w:val="NormalWeb"/>
+      </w:pPr>
+      <w:r>
+        <w:rPr>
+          <w:rStyle w:val="Strong"/>
+        </w:rPr>
+        <w:t>Outcome:</w:t>
+      </w:r>
+      <w:r>
+        <w:t xml:space="preserve"> Clean control architecture</w:t>
+      </w:r>
+    </w:p>
+    <w:p>
+      <w:r>
+        <w:pict w14:anchorId="1D97C2EF">
+          <v:rect id="_x0000_i1064" style="width:0;height:1.5pt" o:hralign="center" o:hrstd="t" o:hr="t" fillcolor="#a0a0a0" stroked="f"/>
+        </w:pict>
+      </w:r>
+    </w:p>
+    <w:p>
+      <w:pPr>
+        <w:pStyle w:val="Heading2"/>
+      </w:pPr>
+      <w:r>
+        <w:rPr>
+          <w:rFonts w:ascii="Segoe UI Emoji" w:hAnsi="Segoe UI Emoji" w:cs="Segoe UI Emoji"/>
+        </w:rPr>
+        <w:t>🧩</w:t>
+      </w:r>
+      <w:r>
+        <w:t xml:space="preserve"> Phase 10 — Conversation Deletion</w:t>
+      </w:r>
+    </w:p>
+    <w:p>
+      <w:pPr>
+        <w:pStyle w:val="NormalWeb"/>
+        <w:numPr>
+          <w:ilvl w:val="0"/>
+          <w:numId w:val="37"/>
+        </w:numPr>
+      </w:pPr>
+      <w:r>
+        <w:t>Added per-item delete button</w:t>
+      </w:r>
+    </w:p>
+    <w:p>
+      <w:pPr>
+        <w:pStyle w:val="NormalWeb"/>
+        <w:numPr>
+          <w:ilvl w:val="0"/>
+          <w:numId w:val="37"/>
+        </w:numPr>
+      </w:pPr>
+      <w:r>
+        <w:t>Fixed major flaw:</w:t>
+      </w:r>
+    </w:p>
+    <w:p>
+      <w:pPr>
+        <w:pStyle w:val="NormalWeb"/>
+        <w:numPr>
+          <w:ilvl w:val="1"/>
+          <w:numId w:val="37"/>
+        </w:numPr>
+      </w:pPr>
+      <w:r>
+        <w:t xml:space="preserve">Eliminated direct </w:t>
+      </w:r>
+      <w:proofErr w:type="spellStart"/>
+      <w:r>
+        <w:rPr>
+          <w:rStyle w:val="HTMLCode"/>
+          <w:rFonts w:eastAsiaTheme="majorEastAsia"/>
+        </w:rPr>
+        <w:t>localStorage</w:t>
+      </w:r>
+      <w:proofErr w:type="spellEnd"/>
+      <w:r>
+        <w:t xml:space="preserve"> mutation</w:t>
+      </w:r>
+    </w:p>
+    <w:p>
+      <w:pPr>
+        <w:pStyle w:val="NormalWeb"/>
+        <w:numPr>
+          <w:ilvl w:val="1"/>
+          <w:numId w:val="37"/>
+        </w:numPr>
+      </w:pPr>
+      <w:r>
+        <w:lastRenderedPageBreak/>
+        <w:t xml:space="preserve">Introduced </w:t>
+      </w:r>
+      <w:proofErr w:type="spellStart"/>
+      <w:proofErr w:type="gramStart"/>
+      <w:r>
+        <w:rPr>
+          <w:rStyle w:val="HTMLCode"/>
+          <w:rFonts w:eastAsiaTheme="majorEastAsia"/>
+        </w:rPr>
+        <w:t>deleteConversation</w:t>
+      </w:r>
+      <w:proofErr w:type="spellEnd"/>
+      <w:r>
+        <w:rPr>
+          <w:rStyle w:val="HTMLCode"/>
+          <w:rFonts w:eastAsiaTheme="majorEastAsia"/>
+        </w:rPr>
+        <w:t>(</w:t>
+      </w:r>
+      <w:proofErr w:type="gramEnd"/>
+      <w:r>
+        <w:rPr>
+          <w:rStyle w:val="HTMLCode"/>
+          <w:rFonts w:eastAsiaTheme="majorEastAsia"/>
+        </w:rPr>
+        <w:t>)</w:t>
+      </w:r>
+      <w:r>
+        <w:t xml:space="preserve"> in data layer</w:t>
+      </w:r>
+    </w:p>
+    <w:p>
+      <w:pPr>
+        <w:pStyle w:val="NormalWeb"/>
+        <w:numPr>
+          <w:ilvl w:val="0"/>
+          <w:numId w:val="37"/>
+        </w:numPr>
+      </w:pPr>
+      <w:r>
+        <w:t>Implemented:</w:t>
+      </w:r>
+    </w:p>
+    <w:p>
+      <w:pPr>
+        <w:pStyle w:val="NormalWeb"/>
+        <w:numPr>
+          <w:ilvl w:val="1"/>
+          <w:numId w:val="37"/>
+        </w:numPr>
+      </w:pPr>
+      <w:r>
+        <w:t>Safe deletion of active conversation</w:t>
+      </w:r>
+    </w:p>
+    <w:p>
+      <w:pPr>
+        <w:pStyle w:val="NormalWeb"/>
+        <w:numPr>
+          <w:ilvl w:val="1"/>
+          <w:numId w:val="37"/>
+        </w:numPr>
+      </w:pPr>
+      <w:r>
+        <w:t>Automatic fallback selection</w:t>
+      </w:r>
+    </w:p>
+    <w:p>
+      <w:pPr>
+        <w:pStyle w:val="NormalWeb"/>
+        <w:numPr>
+          <w:ilvl w:val="0"/>
+          <w:numId w:val="37"/>
+        </w:numPr>
+      </w:pPr>
+      <w:r>
+        <w:t>Resolved state inconsistency bug</w:t>
+      </w:r>
+    </w:p>
+    <w:p>
+      <w:pPr>
+        <w:pStyle w:val="NormalWeb"/>
+      </w:pPr>
+      <w:r>
+        <w:rPr>
+          <w:rStyle w:val="Strong"/>
+        </w:rPr>
+        <w:t>Outcome:</w:t>
+      </w:r>
+      <w:r>
+        <w:t xml:space="preserve"> Robust, production-grade deletion flow</w:t>
+      </w:r>
+    </w:p>
+    <w:p>
+      <w:r>
+        <w:pict w14:anchorId="621E1F57">
+          <v:rect id="_x0000_i1065" style="width:0;height:1.5pt" o:hralign="center" o:hrstd="t" o:hr="t" fillcolor="#a0a0a0" stroked="f"/>
+        </w:pict>
+      </w:r>
+    </w:p>
+    <w:p>
+      <w:pPr>
+        <w:pStyle w:val="Heading2"/>
+      </w:pPr>
+      <w:r>
+        <w:rPr>
+          <w:rFonts w:ascii="Segoe UI Emoji" w:hAnsi="Segoe UI Emoji" w:cs="Segoe UI Emoji"/>
+        </w:rPr>
+        <w:t>⚙️</w:t>
+      </w:r>
+      <w:r>
+        <w:t xml:space="preserve"> System Characteristics Achieved</w:t>
+      </w:r>
+    </w:p>
+    <w:p>
+      <w:pPr>
+        <w:pStyle w:val="NormalWeb"/>
+        <w:numPr>
+          <w:ilvl w:val="0"/>
+          <w:numId w:val="38"/>
+        </w:numPr>
+      </w:pPr>
+      <w:r>
+        <w:t xml:space="preserve">Stateful UI </w:t>
+      </w:r>
+      <w:r>
+        <w:rPr>
+          <w:rFonts w:ascii="Segoe UI Emoji" w:hAnsi="Segoe UI Emoji" w:cs="Segoe UI Emoji"/>
+        </w:rPr>
+        <w:t>✔️</w:t>
+      </w:r>
+    </w:p>
+    <w:p>
+      <w:pPr>
+        <w:pStyle w:val="NormalWeb"/>
+        <w:numPr>
+          <w:ilvl w:val="0"/>
+          <w:numId w:val="38"/>
+        </w:numPr>
+      </w:pPr>
+      <w:r>
+        <w:t xml:space="preserve">Persistent storage </w:t>
+      </w:r>
+      <w:r>
+        <w:rPr>
+          <w:rFonts w:ascii="Segoe UI Emoji" w:hAnsi="Segoe UI Emoji" w:cs="Segoe UI Emoji"/>
+        </w:rPr>
+        <w:t>✔️</w:t>
+      </w:r>
+    </w:p>
+    <w:p>
+      <w:pPr>
+        <w:pStyle w:val="NormalWeb"/>
+        <w:numPr>
+          <w:ilvl w:val="0"/>
+          <w:numId w:val="38"/>
+        </w:numPr>
+      </w:pPr>
+      <w:r>
+        <w:t xml:space="preserve">Deterministic data flow </w:t>
+      </w:r>
+      <w:r>
+        <w:rPr>
+          <w:rFonts w:ascii="Segoe UI Emoji" w:hAnsi="Segoe UI Emoji" w:cs="Segoe UI Emoji"/>
+        </w:rPr>
+        <w:t>✔️</w:t>
+      </w:r>
+    </w:p>
+    <w:p>
+      <w:pPr>
+        <w:pStyle w:val="NormalWeb"/>
+        <w:numPr>
+          <w:ilvl w:val="0"/>
+          <w:numId w:val="38"/>
+        </w:numPr>
+      </w:pPr>
+      <w:r>
+        <w:t xml:space="preserve">Separation of concerns </w:t>
+      </w:r>
+      <w:r>
+        <w:rPr>
+          <w:rFonts w:ascii="Segoe UI Emoji" w:hAnsi="Segoe UI Emoji" w:cs="Segoe UI Emoji"/>
+        </w:rPr>
+        <w:t>✔️</w:t>
+      </w:r>
+    </w:p>
+    <w:p>
+      <w:pPr>
+        <w:pStyle w:val="NormalWeb"/>
+        <w:numPr>
+          <w:ilvl w:val="0"/>
+          <w:numId w:val="38"/>
+        </w:numPr>
+      </w:pPr>
+      <w:r>
+        <w:t xml:space="preserve">Event-driven architecture </w:t>
+      </w:r>
+      <w:r>
+        <w:rPr>
+          <w:rFonts w:ascii="Segoe UI Emoji" w:hAnsi="Segoe UI Emoji" w:cs="Segoe UI Emoji"/>
+        </w:rPr>
+        <w:t>✔️</w:t>
+      </w:r>
+    </w:p>
+    <w:p>
+      <w:pPr>
+        <w:pStyle w:val="NormalWeb"/>
+        <w:numPr>
+          <w:ilvl w:val="0"/>
+          <w:numId w:val="38"/>
+        </w:numPr>
+      </w:pPr>
+      <w:r>
+        <w:t xml:space="preserve">UI-data synchronization </w:t>
+      </w:r>
+      <w:r>
+        <w:rPr>
+          <w:rFonts w:ascii="Segoe UI Emoji" w:hAnsi="Segoe UI Emoji" w:cs="Segoe UI Emoji"/>
+        </w:rPr>
+        <w:t>✔️</w:t>
+      </w:r>
+    </w:p>
+    <w:p>
+      <w:r>
+        <w:pict w14:anchorId="38A5489D">
+          <v:rect id="_x0000_i1066" style="width:0;height:1.5pt" o:hralign="center" o:hrstd="t" o:hr="t" fillcolor="#a0a0a0" stroked="f"/>
+        </w:pict>
+      </w:r>
+    </w:p>
+    <w:p>
+      <w:pPr>
+        <w:pStyle w:val="Heading2"/>
+      </w:pPr>
+      <w:r>
+        <w:rPr>
+          <w:rFonts w:ascii="Segoe UI Emoji" w:hAnsi="Segoe UI Emoji" w:cs="Segoe UI Emoji"/>
+        </w:rPr>
+        <w:t>🧠</w:t>
+      </w:r>
+      <w:r>
+        <w:t xml:space="preserve"> Key Engineering Milestones</w:t>
+      </w:r>
+    </w:p>
+    <w:p>
+      <w:pPr>
+        <w:pStyle w:val="NormalWeb"/>
+        <w:numPr>
+          <w:ilvl w:val="0"/>
+          <w:numId w:val="39"/>
+        </w:numPr>
+      </w:pPr>
+      <w:r>
+        <w:t xml:space="preserve">Transition from </w:t>
+      </w:r>
+      <w:r>
+        <w:rPr>
+          <w:rStyle w:val="Strong"/>
+        </w:rPr>
+        <w:t>stateless UI → stateful system</w:t>
+      </w:r>
+    </w:p>
+    <w:p>
+      <w:pPr>
+        <w:pStyle w:val="NormalWeb"/>
+        <w:numPr>
+          <w:ilvl w:val="0"/>
+          <w:numId w:val="39"/>
+        </w:numPr>
+      </w:pPr>
+      <w:r>
+        <w:t xml:space="preserve">Enforcement of </w:t>
+      </w:r>
+      <w:r>
+        <w:rPr>
+          <w:rStyle w:val="Strong"/>
+        </w:rPr>
+        <w:t>single source of truth</w:t>
+      </w:r>
+    </w:p>
+    <w:p>
+      <w:pPr>
+        <w:pStyle w:val="NormalWeb"/>
+        <w:numPr>
+          <w:ilvl w:val="0"/>
+          <w:numId w:val="39"/>
+        </w:numPr>
+      </w:pPr>
+      <w:r>
+        <w:t xml:space="preserve">Handling of </w:t>
+      </w:r>
+      <w:r>
+        <w:rPr>
+          <w:rStyle w:val="Strong"/>
+        </w:rPr>
+        <w:t>edge cases (active deletion, reload state)</w:t>
+      </w:r>
+    </w:p>
+    <w:p>
+      <w:pPr>
+        <w:pStyle w:val="NormalWeb"/>
+        <w:numPr>
+          <w:ilvl w:val="0"/>
+          <w:numId w:val="39"/>
+        </w:numPr>
+      </w:pPr>
+      <w:r>
+        <w:t xml:space="preserve">Introduction of </w:t>
+      </w:r>
+      <w:r>
+        <w:rPr>
+          <w:rStyle w:val="Strong"/>
+        </w:rPr>
+        <w:t>incremental UI composition strategy</w:t>
+      </w:r>
+    </w:p>
+    <w:p>
+      <w:r>
+        <w:pict w14:anchorId="37DF7A1D">
+          <v:rect id="_x0000_i1067" style="width:0;height:1.5pt" o:hralign="center" o:hrstd="t" o:hr="t" fillcolor="#a0a0a0" stroked="f"/>
+        </w:pict>
+      </w:r>
+    </w:p>
+    <w:p>
+      <w:pPr>
+        <w:pStyle w:val="Heading2"/>
+      </w:pPr>
+      <w:r>
+        <w:rPr>
+          <w:rFonts w:ascii="Segoe UI Emoji" w:hAnsi="Segoe UI Emoji" w:cs="Segoe UI Emoji"/>
+        </w:rPr>
+        <w:t>📈</w:t>
+      </w:r>
+      <w:r>
+        <w:t xml:space="preserve"> Final System Capability</w:t>
+      </w:r>
+    </w:p>
+    <w:p>
+      <w:pPr>
+        <w:pStyle w:val="NormalWeb"/>
+      </w:pPr>
+      <w:r>
+        <w:t>You now possess a:</w:t>
+      </w:r>
+    </w:p>
+    <w:p>
+      <w:pPr>
+        <w:pStyle w:val="NormalWeb"/>
+      </w:pPr>
+      <w:r>
+        <w:rPr>
+          <w:rStyle w:val="Strong"/>
+        </w:rPr>
+        <w:t>Multi-session conversational interface with persistence, dynamic rendering, and controlled state transitions</w:t>
+      </w:r>
+    </w:p>
+    <w:p>
+      <w:pPr>
+        <w:pStyle w:val="NormalWeb"/>
+      </w:pPr>
+      <w:r>
+        <w:t>This is structurally equivalent to:</w:t>
+      </w:r>
+    </w:p>
+    <w:p>
+      <w:pPr>
+        <w:pStyle w:val="NormalWeb"/>
+        <w:numPr>
+          <w:ilvl w:val="0"/>
+          <w:numId w:val="40"/>
+        </w:numPr>
+      </w:pPr>
+      <w:r>
+        <w:t>Early-stage chat platforms</w:t>
+      </w:r>
+    </w:p>
+    <w:p>
+      <w:pPr>
+        <w:pStyle w:val="NormalWeb"/>
+        <w:numPr>
+          <w:ilvl w:val="0"/>
+          <w:numId w:val="40"/>
+        </w:numPr>
+      </w:pPr>
+      <w:r>
+        <w:t>Frontend layer of AI chat clients</w:t>
+      </w:r>
+    </w:p>
+    <w:p>
+      <w:r>
+        <w:pict w14:anchorId="135C8487">
+          <v:rect id="_x0000_i1068" style="width:0;height:1.5pt" o:hralign="center" o:hrstd="t" o:hr="t" fillcolor="#a0a0a0" stroked="f"/>
+        </w:pict>
+      </w:r>
+    </w:p>
+    <w:p>
+      <w:pPr>
+        <w:pStyle w:val="Heading2"/>
+      </w:pPr>
+      <w:r>
+        <w:rPr>
+          <w:rFonts w:ascii="Segoe UI Emoji" w:hAnsi="Segoe UI Emoji" w:cs="Segoe UI Emoji"/>
+        </w:rPr>
+        <w:lastRenderedPageBreak/>
+        <w:t>🧭</w:t>
+      </w:r>
+      <w:r>
+        <w:t xml:space="preserve"> Strategic Note</w:t>
+      </w:r>
+    </w:p>
+    <w:p>
+      <w:pPr>
+        <w:pStyle w:val="NormalWeb"/>
+      </w:pPr>
+      <w:r>
+        <w:t>Your methodology—</w:t>
+      </w:r>
+    </w:p>
+    <w:p>
+      <w:pPr>
+        <w:pStyle w:val="NormalWeb"/>
+      </w:pPr>
+      <w:r>
+        <w:rPr>
+          <w:rStyle w:val="Emphasis"/>
+        </w:rPr>
+        <w:t>one-step execution, validation, then progression</w:t>
+      </w:r>
+    </w:p>
+    <w:p>
+      <w:pPr>
+        <w:pStyle w:val="NormalWeb"/>
+      </w:pPr>
+      <w:r>
+        <w:t>—prevented:</w:t>
+      </w:r>
+    </w:p>
+    <w:p>
+      <w:pPr>
+        <w:pStyle w:val="NormalWeb"/>
+        <w:numPr>
+          <w:ilvl w:val="0"/>
+          <w:numId w:val="41"/>
+        </w:numPr>
+      </w:pPr>
+      <w:r>
+        <w:t>state corruption</w:t>
+      </w:r>
+    </w:p>
+    <w:p>
+      <w:pPr>
+        <w:pStyle w:val="NormalWeb"/>
+        <w:numPr>
+          <w:ilvl w:val="0"/>
+          <w:numId w:val="41"/>
+        </w:numPr>
+      </w:pPr>
+      <w:r>
+        <w:t>UI desynchronization</w:t>
+      </w:r>
+    </w:p>
+    <w:p>
+      <w:pPr>
+        <w:pStyle w:val="NormalWeb"/>
+        <w:numPr>
+          <w:ilvl w:val="0"/>
+          <w:numId w:val="41"/>
+        </w:numPr>
+      </w:pPr>
+      <w:r>
+        <w:t>architectural drift</w:t>
+      </w:r>
+    </w:p>
+    <w:p>
+      <w:pPr>
+        <w:pStyle w:val="NormalWeb"/>
+      </w:pPr>
+      <w:r>
+        <w:t xml:space="preserve">This is </w:t>
+      </w:r>
+      <w:r>
+        <w:rPr>
+          <w:rStyle w:val="Strong"/>
+        </w:rPr>
+        <w:t>professional-grade workflow discipline</w:t>
+      </w:r>
+      <w:r>
+        <w:t>.</w:t>
+      </w:r>
+    </w:p>
+    <w:p>
+      <w:r>
+        <w:pict w14:anchorId="5F54E849">
+          <v:rect id="_x0000_i1069" style="width:0;height:1.5pt" o:hralign="center" o:hrstd="t" o:hr="t" fillcolor="#a0a0a0" stroked="f"/>
+        </w:pict>
+      </w:r>
+    </w:p>
+    <w:p>
+      <w:pPr>
+        <w:pStyle w:val="Heading2"/>
+      </w:pPr>
+      <w:r>
+        <w:rPr>
+          <w:rFonts w:ascii="Segoe UI Emoji" w:hAnsi="Segoe UI Emoji" w:cs="Segoe UI Emoji"/>
+        </w:rPr>
+        <w:t>⏸️</w:t>
+      </w:r>
+      <w:r>
+        <w:t xml:space="preserve"> End State</w:t>
+      </w:r>
+    </w:p>
+    <w:p>
+      <w:pPr>
+        <w:pStyle w:val="NormalWeb"/>
+      </w:pPr>
+      <w:r>
+        <w:t>System is:</w:t>
+      </w:r>
+    </w:p>
+    <w:p>
+      <w:pPr>
+        <w:pStyle w:val="NormalWeb"/>
+        <w:numPr>
+          <w:ilvl w:val="0"/>
+          <w:numId w:val="42"/>
+        </w:numPr>
+      </w:pPr>
+      <w:r>
+        <w:t>Stable</w:t>
+      </w:r>
+    </w:p>
+    <w:p>
+      <w:pPr>
+        <w:pStyle w:val="NormalWeb"/>
+        <w:numPr>
+          <w:ilvl w:val="0"/>
+          <w:numId w:val="42"/>
+        </w:numPr>
+      </w:pPr>
+      <w:r>
+        <w:t>Extensible</w:t>
+      </w:r>
+    </w:p>
+    <w:p>
+      <w:pPr>
+        <w:pStyle w:val="NormalWeb"/>
+        <w:numPr>
+          <w:ilvl w:val="0"/>
+          <w:numId w:val="42"/>
+        </w:numPr>
+      </w:pPr>
+      <w:r>
+        <w:t>Internally consistent</w:t>
+      </w:r>
+    </w:p>
+    <w:p>
+      <w:pPr>
+        <w:pStyle w:val="NormalWeb"/>
+      </w:pPr>
+      <w:r>
+        <w:t>Ready for next phase expansion.</w:t>
+      </w:r>
+    </w:p>
+    <w:p>
+      <w:r>
+        <w:pict w14:anchorId="57603007">
+          <v:rect id="_x0000_i1070" style="width:0;height:1.5pt" o:hralign="center" o:hrstd="t" o:hr="t" fillcolor="#a0a0a0" stroked="f"/>
         </w:pict>
       </w:r>
     </w:p>
@@ -4443,6 +6332,304 @@
 <file path=word/numbering.xml><?xml version="1.0" encoding="utf-8"?>
 <w:numbering xmlns:wpc="http://schemas.microsoft.com/office/word/2010/wordprocessingCanvas" xmlns:cx="http://schemas.microsoft.com/office/drawing/2014/chartex" xmlns:cx1="http://schemas.microsoft.com/office/drawing/2015/9/8/chartex" xmlns:cx2="http://schemas.microsoft.com/office/drawing/2015/10/21/chartex" xmlns:cx3="http://schemas.microsoft.com/office/drawing/2016/5/9/chartex" xmlns:cx4="http://schemas.microsoft.com/office/drawing/2016/5/10/chartex" xmlns:cx5="http://schemas.microsoft.com/office/drawing/2016/5/11/chartex" xmlns:cx6="http://schemas.microsoft.com/office/drawing/2016/5/12/chartex" xmlns:cx7="http://schemas.microsoft.com/office/drawing/2016/5/13/chartex" xmlns:cx8="http://schemas.microsoft.com/office/drawing/2016/5/14/chartex" xmlns:mc="http://schemas.openxmlformats.org/markup-compatibility/2006" xmlns:aink="http://schemas.microsoft.com/office/drawing/2016/ink" xmlns:am3d="http://schemas.microsoft.com/office/drawing/2017/model3d" xmlns:o="urn:schemas-microsoft-com:office:office" xmlns:oel="http://schemas.microsoft.com/office/2019/extlst" xmlns:r="http://schemas.openxmlformats.org/officeDocument/2006/relationships" xmlns:m="http://schemas.openxmlformats.org/officeDocument/2006/math" xmlns:v="urn:schemas-microsoft-com:vml" xmlns:wp14="http://schemas.microsoft.com/office/word/2010/wordprocessingDrawing" xmlns:wp="http://schemas.openxmlformats.org/drawingml/2006/wordprocessingDrawing" xmlns:w10="urn:schemas-microsoft-com:office:word" xmlns:w="http://schemas.openxmlformats.org/wordprocessingml/2006/main" xmlns:w14="http://schemas.microsoft.com/office/word/2010/wordml" xmlns:w15="http://schemas.microsoft.com/office/word/2012/wordml" xmlns:w16cex="http://schemas.microsoft.com/office/word/2018/wordml/cex" xmlns:w16cid="http://schemas.microsoft.com/office/word/2016/wordml/cid" xmlns:w16="http://schemas.microsoft.com/office/word/2018/wordml" xmlns:w16sdtdh="http://schemas.microsoft.com/office/word/2020/wordml/sdtdatahash" xmlns:w16se="http://schemas.microsoft.com/office/word/2015/wordml/symex" xmlns:wpg="http://schemas.microsoft.com/office/word/2010/wordprocessingGroup" xmlns:wpi="http://schemas.microsoft.com/office/word/2010/wordprocessingInk" xmlns:wne="http://schemas.microsoft.com/office/word/2006/wordml" xmlns:wps="http://schemas.microsoft.com/office/word/2010/wordprocessingShape" mc:Ignorable="w14 w15 w16se w16cid w16 w16cex w16sdtdh wp14">
   <w:abstractNum w:abstractNumId="0" w15:restartNumberingAfterBreak="0">
+    <w:nsid w:val="0136157F"/>
+    <w:multiLevelType w:val="multilevel"/>
+    <w:tmpl w:val="D628436C"/>
+    <w:lvl w:ilvl="0">
+      <w:start w:val="1"/>
+      <w:numFmt w:val="bullet"/>
+      <w:lvlText w:val=""/>
+      <w:lvlJc w:val="left"/>
+      <w:pPr>
+        <w:tabs>
+          <w:tab w:val="num" w:pos="720"/>
+        </w:tabs>
+        <w:ind w:left="720" w:hanging="360"/>
+      </w:pPr>
+      <w:rPr>
+        <w:rFonts w:ascii="Symbol" w:hAnsi="Symbol" w:hint="default"/>
+        <w:sz w:val="20"/>
+      </w:rPr>
+    </w:lvl>
+    <w:lvl w:ilvl="1">
+      <w:start w:val="1"/>
+      <w:numFmt w:val="bullet"/>
+      <w:lvlText w:val="o"/>
+      <w:lvlJc w:val="left"/>
+      <w:pPr>
+        <w:tabs>
+          <w:tab w:val="num" w:pos="1440"/>
+        </w:tabs>
+        <w:ind w:left="1440" w:hanging="360"/>
+      </w:pPr>
+      <w:rPr>
+        <w:rFonts w:ascii="Courier New" w:hAnsi="Courier New" w:hint="default"/>
+        <w:sz w:val="20"/>
+      </w:rPr>
+    </w:lvl>
+    <w:lvl w:ilvl="2" w:tentative="1">
+      <w:start w:val="1"/>
+      <w:numFmt w:val="bullet"/>
+      <w:lvlText w:val=""/>
+      <w:lvlJc w:val="left"/>
+      <w:pPr>
+        <w:tabs>
+          <w:tab w:val="num" w:pos="2160"/>
+        </w:tabs>
+        <w:ind w:left="2160" w:hanging="360"/>
+      </w:pPr>
+      <w:rPr>
+        <w:rFonts w:ascii="Wingdings" w:hAnsi="Wingdings" w:hint="default"/>
+        <w:sz w:val="20"/>
+      </w:rPr>
+    </w:lvl>
+    <w:lvl w:ilvl="3" w:tentative="1">
+      <w:start w:val="1"/>
+      <w:numFmt w:val="bullet"/>
+      <w:lvlText w:val=""/>
+      <w:lvlJc w:val="left"/>
+      <w:pPr>
+        <w:tabs>
+          <w:tab w:val="num" w:pos="2880"/>
+        </w:tabs>
+        <w:ind w:left="2880" w:hanging="360"/>
+      </w:pPr>
+      <w:rPr>
+        <w:rFonts w:ascii="Wingdings" w:hAnsi="Wingdings" w:hint="default"/>
+        <w:sz w:val="20"/>
+      </w:rPr>
+    </w:lvl>
+    <w:lvl w:ilvl="4" w:tentative="1">
+      <w:start w:val="1"/>
+      <w:numFmt w:val="bullet"/>
+      <w:lvlText w:val=""/>
+      <w:lvlJc w:val="left"/>
+      <w:pPr>
+        <w:tabs>
+          <w:tab w:val="num" w:pos="3600"/>
+        </w:tabs>
+        <w:ind w:left="3600" w:hanging="360"/>
+      </w:pPr>
+      <w:rPr>
+        <w:rFonts w:ascii="Wingdings" w:hAnsi="Wingdings" w:hint="default"/>
+        <w:sz w:val="20"/>
+      </w:rPr>
+    </w:lvl>
+    <w:lvl w:ilvl="5" w:tentative="1">
+      <w:start w:val="1"/>
+      <w:numFmt w:val="bullet"/>
+      <w:lvlText w:val=""/>
+      <w:lvlJc w:val="left"/>
+      <w:pPr>
+        <w:tabs>
+          <w:tab w:val="num" w:pos="4320"/>
+        </w:tabs>
+        <w:ind w:left="4320" w:hanging="360"/>
+      </w:pPr>
+      <w:rPr>
+        <w:rFonts w:ascii="Wingdings" w:hAnsi="Wingdings" w:hint="default"/>
+        <w:sz w:val="20"/>
+      </w:rPr>
+    </w:lvl>
+    <w:lvl w:ilvl="6" w:tentative="1">
+      <w:start w:val="1"/>
+      <w:numFmt w:val="bullet"/>
+      <w:lvlText w:val=""/>
+      <w:lvlJc w:val="left"/>
+      <w:pPr>
+        <w:tabs>
+          <w:tab w:val="num" w:pos="5040"/>
+        </w:tabs>
+        <w:ind w:left="5040" w:hanging="360"/>
+      </w:pPr>
+      <w:rPr>
+        <w:rFonts w:ascii="Wingdings" w:hAnsi="Wingdings" w:hint="default"/>
+        <w:sz w:val="20"/>
+      </w:rPr>
+    </w:lvl>
+    <w:lvl w:ilvl="7" w:tentative="1">
+      <w:start w:val="1"/>
+      <w:numFmt w:val="bullet"/>
+      <w:lvlText w:val=""/>
+      <w:lvlJc w:val="left"/>
+      <w:pPr>
+        <w:tabs>
+          <w:tab w:val="num" w:pos="5760"/>
+        </w:tabs>
+        <w:ind w:left="5760" w:hanging="360"/>
+      </w:pPr>
+      <w:rPr>
+        <w:rFonts w:ascii="Wingdings" w:hAnsi="Wingdings" w:hint="default"/>
+        <w:sz w:val="20"/>
+      </w:rPr>
+    </w:lvl>
+    <w:lvl w:ilvl="8" w:tentative="1">
+      <w:start w:val="1"/>
+      <w:numFmt w:val="bullet"/>
+      <w:lvlText w:val=""/>
+      <w:lvlJc w:val="left"/>
+      <w:pPr>
+        <w:tabs>
+          <w:tab w:val="num" w:pos="6480"/>
+        </w:tabs>
+        <w:ind w:left="6480" w:hanging="360"/>
+      </w:pPr>
+      <w:rPr>
+        <w:rFonts w:ascii="Wingdings" w:hAnsi="Wingdings" w:hint="default"/>
+        <w:sz w:val="20"/>
+      </w:rPr>
+    </w:lvl>
+  </w:abstractNum>
+  <w:abstractNum w:abstractNumId="1" w15:restartNumberingAfterBreak="0">
+    <w:nsid w:val="0E5D3725"/>
+    <w:multiLevelType w:val="multilevel"/>
+    <w:tmpl w:val="A94A1D8E"/>
+    <w:lvl w:ilvl="0">
+      <w:start w:val="1"/>
+      <w:numFmt w:val="bullet"/>
+      <w:lvlText w:val=""/>
+      <w:lvlJc w:val="left"/>
+      <w:pPr>
+        <w:tabs>
+          <w:tab w:val="num" w:pos="720"/>
+        </w:tabs>
+        <w:ind w:left="720" w:hanging="360"/>
+      </w:pPr>
+      <w:rPr>
+        <w:rFonts w:ascii="Symbol" w:hAnsi="Symbol" w:hint="default"/>
+        <w:sz w:val="20"/>
+      </w:rPr>
+    </w:lvl>
+    <w:lvl w:ilvl="1" w:tentative="1">
+      <w:start w:val="1"/>
+      <w:numFmt w:val="bullet"/>
+      <w:lvlText w:val="o"/>
+      <w:lvlJc w:val="left"/>
+      <w:pPr>
+        <w:tabs>
+          <w:tab w:val="num" w:pos="1440"/>
+        </w:tabs>
+        <w:ind w:left="1440" w:hanging="360"/>
+      </w:pPr>
+      <w:rPr>
+        <w:rFonts w:ascii="Courier New" w:hAnsi="Courier New" w:hint="default"/>
+        <w:sz w:val="20"/>
+      </w:rPr>
+    </w:lvl>
+    <w:lvl w:ilvl="2" w:tentative="1">
+      <w:start w:val="1"/>
+      <w:numFmt w:val="bullet"/>
+      <w:lvlText w:val=""/>
+      <w:lvlJc w:val="left"/>
+      <w:pPr>
+        <w:tabs>
+          <w:tab w:val="num" w:pos="2160"/>
+        </w:tabs>
+        <w:ind w:left="2160" w:hanging="360"/>
+      </w:pPr>
+      <w:rPr>
+        <w:rFonts w:ascii="Wingdings" w:hAnsi="Wingdings" w:hint="default"/>
+        <w:sz w:val="20"/>
+      </w:rPr>
+    </w:lvl>
+    <w:lvl w:ilvl="3" w:tentative="1">
+      <w:start w:val="1"/>
+      <w:numFmt w:val="bullet"/>
+      <w:lvlText w:val=""/>
+      <w:lvlJc w:val="left"/>
+      <w:pPr>
+        <w:tabs>
+          <w:tab w:val="num" w:pos="2880"/>
+        </w:tabs>
+        <w:ind w:left="2880" w:hanging="360"/>
+      </w:pPr>
+      <w:rPr>
+        <w:rFonts w:ascii="Wingdings" w:hAnsi="Wingdings" w:hint="default"/>
+        <w:sz w:val="20"/>
+      </w:rPr>
+    </w:lvl>
+    <w:lvl w:ilvl="4" w:tentative="1">
+      <w:start w:val="1"/>
+      <w:numFmt w:val="bullet"/>
+      <w:lvlText w:val=""/>
+      <w:lvlJc w:val="left"/>
+      <w:pPr>
+        <w:tabs>
+          <w:tab w:val="num" w:pos="3600"/>
+        </w:tabs>
+        <w:ind w:left="3600" w:hanging="360"/>
+      </w:pPr>
+      <w:rPr>
+        <w:rFonts w:ascii="Wingdings" w:hAnsi="Wingdings" w:hint="default"/>
+        <w:sz w:val="20"/>
+      </w:rPr>
+    </w:lvl>
+    <w:lvl w:ilvl="5" w:tentative="1">
+      <w:start w:val="1"/>
+      <w:numFmt w:val="bullet"/>
+      <w:lvlText w:val=""/>
+      <w:lvlJc w:val="left"/>
+      <w:pPr>
+        <w:tabs>
+          <w:tab w:val="num" w:pos="4320"/>
+        </w:tabs>
+        <w:ind w:left="4320" w:hanging="360"/>
+      </w:pPr>
+      <w:rPr>
+        <w:rFonts w:ascii="Wingdings" w:hAnsi="Wingdings" w:hint="default"/>
+        <w:sz w:val="20"/>
+      </w:rPr>
+    </w:lvl>
+    <w:lvl w:ilvl="6" w:tentative="1">
+      <w:start w:val="1"/>
+      <w:numFmt w:val="bullet"/>
+      <w:lvlText w:val=""/>
+      <w:lvlJc w:val="left"/>
+      <w:pPr>
+        <w:tabs>
+          <w:tab w:val="num" w:pos="5040"/>
+        </w:tabs>
+        <w:ind w:left="5040" w:hanging="360"/>
+      </w:pPr>
+      <w:rPr>
+        <w:rFonts w:ascii="Wingdings" w:hAnsi="Wingdings" w:hint="default"/>
+        <w:sz w:val="20"/>
+      </w:rPr>
+    </w:lvl>
+    <w:lvl w:ilvl="7" w:tentative="1">
+      <w:start w:val="1"/>
+      <w:numFmt w:val="bullet"/>
+      <w:lvlText w:val=""/>
+      <w:lvlJc w:val="left"/>
+      <w:pPr>
+        <w:tabs>
+          <w:tab w:val="num" w:pos="5760"/>
+        </w:tabs>
+        <w:ind w:left="5760" w:hanging="360"/>
+      </w:pPr>
+      <w:rPr>
+        <w:rFonts w:ascii="Wingdings" w:hAnsi="Wingdings" w:hint="default"/>
+        <w:sz w:val="20"/>
+      </w:rPr>
+    </w:lvl>
+    <w:lvl w:ilvl="8" w:tentative="1">
+      <w:start w:val="1"/>
+      <w:numFmt w:val="bullet"/>
+      <w:lvlText w:val=""/>
+      <w:lvlJc w:val="left"/>
+      <w:pPr>
+        <w:tabs>
+          <w:tab w:val="num" w:pos="6480"/>
+        </w:tabs>
+        <w:ind w:left="6480" w:hanging="360"/>
+      </w:pPr>
+      <w:rPr>
+        <w:rFonts w:ascii="Wingdings" w:hAnsi="Wingdings" w:hint="default"/>
+        <w:sz w:val="20"/>
+      </w:rPr>
+    </w:lvl>
+  </w:abstractNum>
+  <w:abstractNum w:abstractNumId="2" w15:restartNumberingAfterBreak="0">
     <w:nsid w:val="152A2023"/>
     <w:multiLevelType w:val="multilevel"/>
     <w:tmpl w:val="2738F738"/>
@@ -4591,7 +6778,7 @@
       </w:rPr>
     </w:lvl>
   </w:abstractNum>
-  <w:abstractNum w:abstractNumId="1" w15:restartNumberingAfterBreak="0">
+  <w:abstractNum w:abstractNumId="3" w15:restartNumberingAfterBreak="0">
     <w:nsid w:val="170F5AFB"/>
     <w:multiLevelType w:val="multilevel"/>
     <w:tmpl w:val="4FA0166C"/>
@@ -4740,7 +6927,156 @@
       </w:rPr>
     </w:lvl>
   </w:abstractNum>
-  <w:abstractNum w:abstractNumId="2" w15:restartNumberingAfterBreak="0">
+  <w:abstractNum w:abstractNumId="4" w15:restartNumberingAfterBreak="0">
+    <w:nsid w:val="181C309E"/>
+    <w:multiLevelType w:val="multilevel"/>
+    <w:tmpl w:val="CCE8601C"/>
+    <w:lvl w:ilvl="0">
+      <w:start w:val="1"/>
+      <w:numFmt w:val="bullet"/>
+      <w:lvlText w:val=""/>
+      <w:lvlJc w:val="left"/>
+      <w:pPr>
+        <w:tabs>
+          <w:tab w:val="num" w:pos="720"/>
+        </w:tabs>
+        <w:ind w:left="720" w:hanging="360"/>
+      </w:pPr>
+      <w:rPr>
+        <w:rFonts w:ascii="Symbol" w:hAnsi="Symbol" w:hint="default"/>
+        <w:sz w:val="20"/>
+      </w:rPr>
+    </w:lvl>
+    <w:lvl w:ilvl="1" w:tentative="1">
+      <w:start w:val="1"/>
+      <w:numFmt w:val="bullet"/>
+      <w:lvlText w:val="o"/>
+      <w:lvlJc w:val="left"/>
+      <w:pPr>
+        <w:tabs>
+          <w:tab w:val="num" w:pos="1440"/>
+        </w:tabs>
+        <w:ind w:left="1440" w:hanging="360"/>
+      </w:pPr>
+      <w:rPr>
+        <w:rFonts w:ascii="Courier New" w:hAnsi="Courier New" w:hint="default"/>
+        <w:sz w:val="20"/>
+      </w:rPr>
+    </w:lvl>
+    <w:lvl w:ilvl="2" w:tentative="1">
+      <w:start w:val="1"/>
+      <w:numFmt w:val="bullet"/>
+      <w:lvlText w:val=""/>
+      <w:lvlJc w:val="left"/>
+      <w:pPr>
+        <w:tabs>
+          <w:tab w:val="num" w:pos="2160"/>
+        </w:tabs>
+        <w:ind w:left="2160" w:hanging="360"/>
+      </w:pPr>
+      <w:rPr>
+        <w:rFonts w:ascii="Wingdings" w:hAnsi="Wingdings" w:hint="default"/>
+        <w:sz w:val="20"/>
+      </w:rPr>
+    </w:lvl>
+    <w:lvl w:ilvl="3" w:tentative="1">
+      <w:start w:val="1"/>
+      <w:numFmt w:val="bullet"/>
+      <w:lvlText w:val=""/>
+      <w:lvlJc w:val="left"/>
+      <w:pPr>
+        <w:tabs>
+          <w:tab w:val="num" w:pos="2880"/>
+        </w:tabs>
+        <w:ind w:left="2880" w:hanging="360"/>
+      </w:pPr>
+      <w:rPr>
+        <w:rFonts w:ascii="Wingdings" w:hAnsi="Wingdings" w:hint="default"/>
+        <w:sz w:val="20"/>
+      </w:rPr>
+    </w:lvl>
+    <w:lvl w:ilvl="4" w:tentative="1">
+      <w:start w:val="1"/>
+      <w:numFmt w:val="bullet"/>
+      <w:lvlText w:val=""/>
+      <w:lvlJc w:val="left"/>
+      <w:pPr>
+        <w:tabs>
+          <w:tab w:val="num" w:pos="3600"/>
+        </w:tabs>
+        <w:ind w:left="3600" w:hanging="360"/>
+      </w:pPr>
+      <w:rPr>
+        <w:rFonts w:ascii="Wingdings" w:hAnsi="Wingdings" w:hint="default"/>
+        <w:sz w:val="20"/>
+      </w:rPr>
+    </w:lvl>
+    <w:lvl w:ilvl="5" w:tentative="1">
+      <w:start w:val="1"/>
+      <w:numFmt w:val="bullet"/>
+      <w:lvlText w:val=""/>
+      <w:lvlJc w:val="left"/>
+      <w:pPr>
+        <w:tabs>
+          <w:tab w:val="num" w:pos="4320"/>
+        </w:tabs>
+        <w:ind w:left="4320" w:hanging="360"/>
+      </w:pPr>
+      <w:rPr>
+        <w:rFonts w:ascii="Wingdings" w:hAnsi="Wingdings" w:hint="default"/>
+        <w:sz w:val="20"/>
+      </w:rPr>
+    </w:lvl>
+    <w:lvl w:ilvl="6" w:tentative="1">
+      <w:start w:val="1"/>
+      <w:numFmt w:val="bullet"/>
+      <w:lvlText w:val=""/>
+      <w:lvlJc w:val="left"/>
+      <w:pPr>
+        <w:tabs>
+          <w:tab w:val="num" w:pos="5040"/>
+        </w:tabs>
+        <w:ind w:left="5040" w:hanging="360"/>
+      </w:pPr>
+      <w:rPr>
+        <w:rFonts w:ascii="Wingdings" w:hAnsi="Wingdings" w:hint="default"/>
+        <w:sz w:val="20"/>
+      </w:rPr>
+    </w:lvl>
+    <w:lvl w:ilvl="7" w:tentative="1">
+      <w:start w:val="1"/>
+      <w:numFmt w:val="bullet"/>
+      <w:lvlText w:val=""/>
+      <w:lvlJc w:val="left"/>
+      <w:pPr>
+        <w:tabs>
+          <w:tab w:val="num" w:pos="5760"/>
+        </w:tabs>
+        <w:ind w:left="5760" w:hanging="360"/>
+      </w:pPr>
+      <w:rPr>
+        <w:rFonts w:ascii="Wingdings" w:hAnsi="Wingdings" w:hint="default"/>
+        <w:sz w:val="20"/>
+      </w:rPr>
+    </w:lvl>
+    <w:lvl w:ilvl="8" w:tentative="1">
+      <w:start w:val="1"/>
+      <w:numFmt w:val="bullet"/>
+      <w:lvlText w:val=""/>
+      <w:lvlJc w:val="left"/>
+      <w:pPr>
+        <w:tabs>
+          <w:tab w:val="num" w:pos="6480"/>
+        </w:tabs>
+        <w:ind w:left="6480" w:hanging="360"/>
+      </w:pPr>
+      <w:rPr>
+        <w:rFonts w:ascii="Wingdings" w:hAnsi="Wingdings" w:hint="default"/>
+        <w:sz w:val="20"/>
+      </w:rPr>
+    </w:lvl>
+  </w:abstractNum>
+  <w:abstractNum w:abstractNumId="5" w15:restartNumberingAfterBreak="0">
     <w:nsid w:val="197726C7"/>
     <w:multiLevelType w:val="multilevel"/>
     <w:tmpl w:val="AE242412"/>
@@ -4889,7 +7225,7 @@
       </w:rPr>
     </w:lvl>
   </w:abstractNum>
-  <w:abstractNum w:abstractNumId="3" w15:restartNumberingAfterBreak="0">
+  <w:abstractNum w:abstractNumId="6" w15:restartNumberingAfterBreak="0">
     <w:nsid w:val="19BB5737"/>
     <w:multiLevelType w:val="multilevel"/>
     <w:tmpl w:val="6178B8B0"/>
@@ -5038,7 +7374,156 @@
       </w:rPr>
     </w:lvl>
   </w:abstractNum>
-  <w:abstractNum w:abstractNumId="4" w15:restartNumberingAfterBreak="0">
+  <w:abstractNum w:abstractNumId="7" w15:restartNumberingAfterBreak="0">
+    <w:nsid w:val="1CDD0AC9"/>
+    <w:multiLevelType w:val="multilevel"/>
+    <w:tmpl w:val="077A5326"/>
+    <w:lvl w:ilvl="0">
+      <w:start w:val="1"/>
+      <w:numFmt w:val="bullet"/>
+      <w:lvlText w:val=""/>
+      <w:lvlJc w:val="left"/>
+      <w:pPr>
+        <w:tabs>
+          <w:tab w:val="num" w:pos="720"/>
+        </w:tabs>
+        <w:ind w:left="720" w:hanging="360"/>
+      </w:pPr>
+      <w:rPr>
+        <w:rFonts w:ascii="Symbol" w:hAnsi="Symbol" w:hint="default"/>
+        <w:sz w:val="20"/>
+      </w:rPr>
+    </w:lvl>
+    <w:lvl w:ilvl="1" w:tentative="1">
+      <w:start w:val="1"/>
+      <w:numFmt w:val="bullet"/>
+      <w:lvlText w:val="o"/>
+      <w:lvlJc w:val="left"/>
+      <w:pPr>
+        <w:tabs>
+          <w:tab w:val="num" w:pos="1440"/>
+        </w:tabs>
+        <w:ind w:left="1440" w:hanging="360"/>
+      </w:pPr>
+      <w:rPr>
+        <w:rFonts w:ascii="Courier New" w:hAnsi="Courier New" w:hint="default"/>
+        <w:sz w:val="20"/>
+      </w:rPr>
+    </w:lvl>
+    <w:lvl w:ilvl="2" w:tentative="1">
+      <w:start w:val="1"/>
+      <w:numFmt w:val="bullet"/>
+      <w:lvlText w:val=""/>
+      <w:lvlJc w:val="left"/>
+      <w:pPr>
+        <w:tabs>
+          <w:tab w:val="num" w:pos="2160"/>
+        </w:tabs>
+        <w:ind w:left="2160" w:hanging="360"/>
+      </w:pPr>
+      <w:rPr>
+        <w:rFonts w:ascii="Wingdings" w:hAnsi="Wingdings" w:hint="default"/>
+        <w:sz w:val="20"/>
+      </w:rPr>
+    </w:lvl>
+    <w:lvl w:ilvl="3" w:tentative="1">
+      <w:start w:val="1"/>
+      <w:numFmt w:val="bullet"/>
+      <w:lvlText w:val=""/>
+      <w:lvlJc w:val="left"/>
+      <w:pPr>
+        <w:tabs>
+          <w:tab w:val="num" w:pos="2880"/>
+        </w:tabs>
+        <w:ind w:left="2880" w:hanging="360"/>
+      </w:pPr>
+      <w:rPr>
+        <w:rFonts w:ascii="Wingdings" w:hAnsi="Wingdings" w:hint="default"/>
+        <w:sz w:val="20"/>
+      </w:rPr>
+    </w:lvl>
+    <w:lvl w:ilvl="4" w:tentative="1">
+      <w:start w:val="1"/>
+      <w:numFmt w:val="bullet"/>
+      <w:lvlText w:val=""/>
+      <w:lvlJc w:val="left"/>
+      <w:pPr>
+        <w:tabs>
+          <w:tab w:val="num" w:pos="3600"/>
+        </w:tabs>
+        <w:ind w:left="3600" w:hanging="360"/>
+      </w:pPr>
+      <w:rPr>
+        <w:rFonts w:ascii="Wingdings" w:hAnsi="Wingdings" w:hint="default"/>
+        <w:sz w:val="20"/>
+      </w:rPr>
+    </w:lvl>
+    <w:lvl w:ilvl="5" w:tentative="1">
+      <w:start w:val="1"/>
+      <w:numFmt w:val="bullet"/>
+      <w:lvlText w:val=""/>
+      <w:lvlJc w:val="left"/>
+      <w:pPr>
+        <w:tabs>
+          <w:tab w:val="num" w:pos="4320"/>
+        </w:tabs>
+        <w:ind w:left="4320" w:hanging="360"/>
+      </w:pPr>
+      <w:rPr>
+        <w:rFonts w:ascii="Wingdings" w:hAnsi="Wingdings" w:hint="default"/>
+        <w:sz w:val="20"/>
+      </w:rPr>
+    </w:lvl>
+    <w:lvl w:ilvl="6" w:tentative="1">
+      <w:start w:val="1"/>
+      <w:numFmt w:val="bullet"/>
+      <w:lvlText w:val=""/>
+      <w:lvlJc w:val="left"/>
+      <w:pPr>
+        <w:tabs>
+          <w:tab w:val="num" w:pos="5040"/>
+        </w:tabs>
+        <w:ind w:left="5040" w:hanging="360"/>
+      </w:pPr>
+      <w:rPr>
+        <w:rFonts w:ascii="Wingdings" w:hAnsi="Wingdings" w:hint="default"/>
+        <w:sz w:val="20"/>
+      </w:rPr>
+    </w:lvl>
+    <w:lvl w:ilvl="7" w:tentative="1">
+      <w:start w:val="1"/>
+      <w:numFmt w:val="bullet"/>
+      <w:lvlText w:val=""/>
+      <w:lvlJc w:val="left"/>
+      <w:pPr>
+        <w:tabs>
+          <w:tab w:val="num" w:pos="5760"/>
+        </w:tabs>
+        <w:ind w:left="5760" w:hanging="360"/>
+      </w:pPr>
+      <w:rPr>
+        <w:rFonts w:ascii="Wingdings" w:hAnsi="Wingdings" w:hint="default"/>
+        <w:sz w:val="20"/>
+      </w:rPr>
+    </w:lvl>
+    <w:lvl w:ilvl="8" w:tentative="1">
+      <w:start w:val="1"/>
+      <w:numFmt w:val="bullet"/>
+      <w:lvlText w:val=""/>
+      <w:lvlJc w:val="left"/>
+      <w:pPr>
+        <w:tabs>
+          <w:tab w:val="num" w:pos="6480"/>
+        </w:tabs>
+        <w:ind w:left="6480" w:hanging="360"/>
+      </w:pPr>
+      <w:rPr>
+        <w:rFonts w:ascii="Wingdings" w:hAnsi="Wingdings" w:hint="default"/>
+        <w:sz w:val="20"/>
+      </w:rPr>
+    </w:lvl>
+  </w:abstractNum>
+  <w:abstractNum w:abstractNumId="8" w15:restartNumberingAfterBreak="0">
     <w:nsid w:val="234E24EF"/>
     <w:multiLevelType w:val="multilevel"/>
     <w:tmpl w:val="42FC2EEE"/>
@@ -5187,7 +7672,305 @@
       </w:rPr>
     </w:lvl>
   </w:abstractNum>
-  <w:abstractNum w:abstractNumId="5" w15:restartNumberingAfterBreak="0">
+  <w:abstractNum w:abstractNumId="9" w15:restartNumberingAfterBreak="0">
+    <w:nsid w:val="26BC218B"/>
+    <w:multiLevelType w:val="multilevel"/>
+    <w:tmpl w:val="04F0A698"/>
+    <w:lvl w:ilvl="0">
+      <w:start w:val="1"/>
+      <w:numFmt w:val="bullet"/>
+      <w:lvlText w:val=""/>
+      <w:lvlJc w:val="left"/>
+      <w:pPr>
+        <w:tabs>
+          <w:tab w:val="num" w:pos="720"/>
+        </w:tabs>
+        <w:ind w:left="720" w:hanging="360"/>
+      </w:pPr>
+      <w:rPr>
+        <w:rFonts w:ascii="Symbol" w:hAnsi="Symbol" w:hint="default"/>
+        <w:sz w:val="20"/>
+      </w:rPr>
+    </w:lvl>
+    <w:lvl w:ilvl="1">
+      <w:start w:val="1"/>
+      <w:numFmt w:val="bullet"/>
+      <w:lvlText w:val="o"/>
+      <w:lvlJc w:val="left"/>
+      <w:pPr>
+        <w:tabs>
+          <w:tab w:val="num" w:pos="1440"/>
+        </w:tabs>
+        <w:ind w:left="1440" w:hanging="360"/>
+      </w:pPr>
+      <w:rPr>
+        <w:rFonts w:ascii="Courier New" w:hAnsi="Courier New" w:hint="default"/>
+        <w:sz w:val="20"/>
+      </w:rPr>
+    </w:lvl>
+    <w:lvl w:ilvl="2" w:tentative="1">
+      <w:start w:val="1"/>
+      <w:numFmt w:val="bullet"/>
+      <w:lvlText w:val=""/>
+      <w:lvlJc w:val="left"/>
+      <w:pPr>
+        <w:tabs>
+          <w:tab w:val="num" w:pos="2160"/>
+        </w:tabs>
+        <w:ind w:left="2160" w:hanging="360"/>
+      </w:pPr>
+      <w:rPr>
+        <w:rFonts w:ascii="Wingdings" w:hAnsi="Wingdings" w:hint="default"/>
+        <w:sz w:val="20"/>
+      </w:rPr>
+    </w:lvl>
+    <w:lvl w:ilvl="3" w:tentative="1">
+      <w:start w:val="1"/>
+      <w:numFmt w:val="bullet"/>
+      <w:lvlText w:val=""/>
+      <w:lvlJc w:val="left"/>
+      <w:pPr>
+        <w:tabs>
+          <w:tab w:val="num" w:pos="2880"/>
+        </w:tabs>
+        <w:ind w:left="2880" w:hanging="360"/>
+      </w:pPr>
+      <w:rPr>
+        <w:rFonts w:ascii="Wingdings" w:hAnsi="Wingdings" w:hint="default"/>
+        <w:sz w:val="20"/>
+      </w:rPr>
+    </w:lvl>
+    <w:lvl w:ilvl="4" w:tentative="1">
+      <w:start w:val="1"/>
+      <w:numFmt w:val="bullet"/>
+      <w:lvlText w:val=""/>
+      <w:lvlJc w:val="left"/>
+      <w:pPr>
+        <w:tabs>
+          <w:tab w:val="num" w:pos="3600"/>
+        </w:tabs>
+        <w:ind w:left="3600" w:hanging="360"/>
+      </w:pPr>
+      <w:rPr>
+        <w:rFonts w:ascii="Wingdings" w:hAnsi="Wingdings" w:hint="default"/>
+        <w:sz w:val="20"/>
+      </w:rPr>
+    </w:lvl>
+    <w:lvl w:ilvl="5" w:tentative="1">
+      <w:start w:val="1"/>
+      <w:numFmt w:val="bullet"/>
+      <w:lvlText w:val=""/>
+      <w:lvlJc w:val="left"/>
+      <w:pPr>
+        <w:tabs>
+          <w:tab w:val="num" w:pos="4320"/>
+        </w:tabs>
+        <w:ind w:left="4320" w:hanging="360"/>
+      </w:pPr>
+      <w:rPr>
+        <w:rFonts w:ascii="Wingdings" w:hAnsi="Wingdings" w:hint="default"/>
+        <w:sz w:val="20"/>
+      </w:rPr>
+    </w:lvl>
+    <w:lvl w:ilvl="6" w:tentative="1">
+      <w:start w:val="1"/>
+      <w:numFmt w:val="bullet"/>
+      <w:lvlText w:val=""/>
+      <w:lvlJc w:val="left"/>
+      <w:pPr>
+        <w:tabs>
+          <w:tab w:val="num" w:pos="5040"/>
+        </w:tabs>
+        <w:ind w:left="5040" w:hanging="360"/>
+      </w:pPr>
+      <w:rPr>
+        <w:rFonts w:ascii="Wingdings" w:hAnsi="Wingdings" w:hint="default"/>
+        <w:sz w:val="20"/>
+      </w:rPr>
+    </w:lvl>
+    <w:lvl w:ilvl="7" w:tentative="1">
+      <w:start w:val="1"/>
+      <w:numFmt w:val="bullet"/>
+      <w:lvlText w:val=""/>
+      <w:lvlJc w:val="left"/>
+      <w:pPr>
+        <w:tabs>
+          <w:tab w:val="num" w:pos="5760"/>
+        </w:tabs>
+        <w:ind w:left="5760" w:hanging="360"/>
+      </w:pPr>
+      <w:rPr>
+        <w:rFonts w:ascii="Wingdings" w:hAnsi="Wingdings" w:hint="default"/>
+        <w:sz w:val="20"/>
+      </w:rPr>
+    </w:lvl>
+    <w:lvl w:ilvl="8" w:tentative="1">
+      <w:start w:val="1"/>
+      <w:numFmt w:val="bullet"/>
+      <w:lvlText w:val=""/>
+      <w:lvlJc w:val="left"/>
+      <w:pPr>
+        <w:tabs>
+          <w:tab w:val="num" w:pos="6480"/>
+        </w:tabs>
+        <w:ind w:left="6480" w:hanging="360"/>
+      </w:pPr>
+      <w:rPr>
+        <w:rFonts w:ascii="Wingdings" w:hAnsi="Wingdings" w:hint="default"/>
+        <w:sz w:val="20"/>
+      </w:rPr>
+    </w:lvl>
+  </w:abstractNum>
+  <w:abstractNum w:abstractNumId="10" w15:restartNumberingAfterBreak="0">
+    <w:nsid w:val="29903720"/>
+    <w:multiLevelType w:val="multilevel"/>
+    <w:tmpl w:val="E69469C6"/>
+    <w:lvl w:ilvl="0">
+      <w:start w:val="1"/>
+      <w:numFmt w:val="bullet"/>
+      <w:lvlText w:val=""/>
+      <w:lvlJc w:val="left"/>
+      <w:pPr>
+        <w:tabs>
+          <w:tab w:val="num" w:pos="720"/>
+        </w:tabs>
+        <w:ind w:left="720" w:hanging="360"/>
+      </w:pPr>
+      <w:rPr>
+        <w:rFonts w:ascii="Symbol" w:hAnsi="Symbol" w:hint="default"/>
+        <w:sz w:val="20"/>
+      </w:rPr>
+    </w:lvl>
+    <w:lvl w:ilvl="1">
+      <w:start w:val="1"/>
+      <w:numFmt w:val="bullet"/>
+      <w:lvlText w:val="o"/>
+      <w:lvlJc w:val="left"/>
+      <w:pPr>
+        <w:tabs>
+          <w:tab w:val="num" w:pos="1440"/>
+        </w:tabs>
+        <w:ind w:left="1440" w:hanging="360"/>
+      </w:pPr>
+      <w:rPr>
+        <w:rFonts w:ascii="Courier New" w:hAnsi="Courier New" w:hint="default"/>
+        <w:sz w:val="20"/>
+      </w:rPr>
+    </w:lvl>
+    <w:lvl w:ilvl="2" w:tentative="1">
+      <w:start w:val="1"/>
+      <w:numFmt w:val="bullet"/>
+      <w:lvlText w:val=""/>
+      <w:lvlJc w:val="left"/>
+      <w:pPr>
+        <w:tabs>
+          <w:tab w:val="num" w:pos="2160"/>
+        </w:tabs>
+        <w:ind w:left="2160" w:hanging="360"/>
+      </w:pPr>
+      <w:rPr>
+        <w:rFonts w:ascii="Wingdings" w:hAnsi="Wingdings" w:hint="default"/>
+        <w:sz w:val="20"/>
+      </w:rPr>
+    </w:lvl>
+    <w:lvl w:ilvl="3" w:tentative="1">
+      <w:start w:val="1"/>
+      <w:numFmt w:val="bullet"/>
+      <w:lvlText w:val=""/>
+      <w:lvlJc w:val="left"/>
+      <w:pPr>
+        <w:tabs>
+          <w:tab w:val="num" w:pos="2880"/>
+        </w:tabs>
+        <w:ind w:left="2880" w:hanging="360"/>
+      </w:pPr>
+      <w:rPr>
+        <w:rFonts w:ascii="Wingdings" w:hAnsi="Wingdings" w:hint="default"/>
+        <w:sz w:val="20"/>
+      </w:rPr>
+    </w:lvl>
+    <w:lvl w:ilvl="4" w:tentative="1">
+      <w:start w:val="1"/>
+      <w:numFmt w:val="bullet"/>
+      <w:lvlText w:val=""/>
+      <w:lvlJc w:val="left"/>
+      <w:pPr>
+        <w:tabs>
+          <w:tab w:val="num" w:pos="3600"/>
+        </w:tabs>
+        <w:ind w:left="3600" w:hanging="360"/>
+      </w:pPr>
+      <w:rPr>
+        <w:rFonts w:ascii="Wingdings" w:hAnsi="Wingdings" w:hint="default"/>
+        <w:sz w:val="20"/>
+      </w:rPr>
+    </w:lvl>
+    <w:lvl w:ilvl="5" w:tentative="1">
+      <w:start w:val="1"/>
+      <w:numFmt w:val="bullet"/>
+      <w:lvlText w:val=""/>
+      <w:lvlJc w:val="left"/>
+      <w:pPr>
+        <w:tabs>
+          <w:tab w:val="num" w:pos="4320"/>
+        </w:tabs>
+        <w:ind w:left="4320" w:hanging="360"/>
+      </w:pPr>
+      <w:rPr>
+        <w:rFonts w:ascii="Wingdings" w:hAnsi="Wingdings" w:hint="default"/>
+        <w:sz w:val="20"/>
+      </w:rPr>
+    </w:lvl>
+    <w:lvl w:ilvl="6" w:tentative="1">
+      <w:start w:val="1"/>
+      <w:numFmt w:val="bullet"/>
+      <w:lvlText w:val=""/>
+      <w:lvlJc w:val="left"/>
+      <w:pPr>
+        <w:tabs>
+          <w:tab w:val="num" w:pos="5040"/>
+        </w:tabs>
+        <w:ind w:left="5040" w:hanging="360"/>
+      </w:pPr>
+      <w:rPr>
+        <w:rFonts w:ascii="Wingdings" w:hAnsi="Wingdings" w:hint="default"/>
+        <w:sz w:val="20"/>
+      </w:rPr>
+    </w:lvl>
+    <w:lvl w:ilvl="7" w:tentative="1">
+      <w:start w:val="1"/>
+      <w:numFmt w:val="bullet"/>
+      <w:lvlText w:val=""/>
+      <w:lvlJc w:val="left"/>
+      <w:pPr>
+        <w:tabs>
+          <w:tab w:val="num" w:pos="5760"/>
+        </w:tabs>
+        <w:ind w:left="5760" w:hanging="360"/>
+      </w:pPr>
+      <w:rPr>
+        <w:rFonts w:ascii="Wingdings" w:hAnsi="Wingdings" w:hint="default"/>
+        <w:sz w:val="20"/>
+      </w:rPr>
+    </w:lvl>
+    <w:lvl w:ilvl="8" w:tentative="1">
+      <w:start w:val="1"/>
+      <w:numFmt w:val="bullet"/>
+      <w:lvlText w:val=""/>
+      <w:lvlJc w:val="left"/>
+      <w:pPr>
+        <w:tabs>
+          <w:tab w:val="num" w:pos="6480"/>
+        </w:tabs>
+        <w:ind w:left="6480" w:hanging="360"/>
+      </w:pPr>
+      <w:rPr>
+        <w:rFonts w:ascii="Wingdings" w:hAnsi="Wingdings" w:hint="default"/>
+        <w:sz w:val="20"/>
+      </w:rPr>
+    </w:lvl>
+  </w:abstractNum>
+  <w:abstractNum w:abstractNumId="11" w15:restartNumberingAfterBreak="0">
     <w:nsid w:val="2A037951"/>
     <w:multiLevelType w:val="multilevel"/>
     <w:tmpl w:val="F6744FDA"/>
@@ -5336,7 +8119,7 @@
       </w:rPr>
     </w:lvl>
   </w:abstractNum>
-  <w:abstractNum w:abstractNumId="6" w15:restartNumberingAfterBreak="0">
+  <w:abstractNum w:abstractNumId="12" w15:restartNumberingAfterBreak="0">
     <w:nsid w:val="2B686062"/>
     <w:multiLevelType w:val="multilevel"/>
     <w:tmpl w:val="BD9C8A84"/>
@@ -5485,7 +8268,7 @@
       </w:rPr>
     </w:lvl>
   </w:abstractNum>
-  <w:abstractNum w:abstractNumId="7" w15:restartNumberingAfterBreak="0">
+  <w:abstractNum w:abstractNumId="13" w15:restartNumberingAfterBreak="0">
     <w:nsid w:val="2BBC7F70"/>
     <w:multiLevelType w:val="multilevel"/>
     <w:tmpl w:val="5ABC69CA"/>
@@ -5634,7 +8417,7 @@
       </w:rPr>
     </w:lvl>
   </w:abstractNum>
-  <w:abstractNum w:abstractNumId="8" w15:restartNumberingAfterBreak="0">
+  <w:abstractNum w:abstractNumId="14" w15:restartNumberingAfterBreak="0">
     <w:nsid w:val="31892256"/>
     <w:multiLevelType w:val="multilevel"/>
     <w:tmpl w:val="0ADCED9A"/>
@@ -5783,7 +8566,7 @@
       </w:rPr>
     </w:lvl>
   </w:abstractNum>
-  <w:abstractNum w:abstractNumId="9" w15:restartNumberingAfterBreak="0">
+  <w:abstractNum w:abstractNumId="15" w15:restartNumberingAfterBreak="0">
     <w:nsid w:val="33BE49A5"/>
     <w:multiLevelType w:val="multilevel"/>
     <w:tmpl w:val="1778D452"/>
@@ -5932,7 +8715,156 @@
       </w:rPr>
     </w:lvl>
   </w:abstractNum>
-  <w:abstractNum w:abstractNumId="10" w15:restartNumberingAfterBreak="0">
+  <w:abstractNum w:abstractNumId="16" w15:restartNumberingAfterBreak="0">
+    <w:nsid w:val="347E1320"/>
+    <w:multiLevelType w:val="multilevel"/>
+    <w:tmpl w:val="EB44296A"/>
+    <w:lvl w:ilvl="0">
+      <w:start w:val="1"/>
+      <w:numFmt w:val="bullet"/>
+      <w:lvlText w:val=""/>
+      <w:lvlJc w:val="left"/>
+      <w:pPr>
+        <w:tabs>
+          <w:tab w:val="num" w:pos="720"/>
+        </w:tabs>
+        <w:ind w:left="720" w:hanging="360"/>
+      </w:pPr>
+      <w:rPr>
+        <w:rFonts w:ascii="Symbol" w:hAnsi="Symbol" w:hint="default"/>
+        <w:sz w:val="20"/>
+      </w:rPr>
+    </w:lvl>
+    <w:lvl w:ilvl="1">
+      <w:start w:val="1"/>
+      <w:numFmt w:val="bullet"/>
+      <w:lvlText w:val="o"/>
+      <w:lvlJc w:val="left"/>
+      <w:pPr>
+        <w:tabs>
+          <w:tab w:val="num" w:pos="1440"/>
+        </w:tabs>
+        <w:ind w:left="1440" w:hanging="360"/>
+      </w:pPr>
+      <w:rPr>
+        <w:rFonts w:ascii="Courier New" w:hAnsi="Courier New" w:hint="default"/>
+        <w:sz w:val="20"/>
+      </w:rPr>
+    </w:lvl>
+    <w:lvl w:ilvl="2" w:tentative="1">
+      <w:start w:val="1"/>
+      <w:numFmt w:val="bullet"/>
+      <w:lvlText w:val=""/>
+      <w:lvlJc w:val="left"/>
+      <w:pPr>
+        <w:tabs>
+          <w:tab w:val="num" w:pos="2160"/>
+        </w:tabs>
+        <w:ind w:left="2160" w:hanging="360"/>
+      </w:pPr>
+      <w:rPr>
+        <w:rFonts w:ascii="Wingdings" w:hAnsi="Wingdings" w:hint="default"/>
+        <w:sz w:val="20"/>
+      </w:rPr>
+    </w:lvl>
+    <w:lvl w:ilvl="3" w:tentative="1">
+      <w:start w:val="1"/>
+      <w:numFmt w:val="bullet"/>
+      <w:lvlText w:val=""/>
+      <w:lvlJc w:val="left"/>
+      <w:pPr>
+        <w:tabs>
+          <w:tab w:val="num" w:pos="2880"/>
+        </w:tabs>
+        <w:ind w:left="2880" w:hanging="360"/>
+      </w:pPr>
+      <w:rPr>
+        <w:rFonts w:ascii="Wingdings" w:hAnsi="Wingdings" w:hint="default"/>
+        <w:sz w:val="20"/>
+      </w:rPr>
+    </w:lvl>
+    <w:lvl w:ilvl="4" w:tentative="1">
+      <w:start w:val="1"/>
+      <w:numFmt w:val="bullet"/>
+      <w:lvlText w:val=""/>
+      <w:lvlJc w:val="left"/>
+      <w:pPr>
+        <w:tabs>
+          <w:tab w:val="num" w:pos="3600"/>
+        </w:tabs>
+        <w:ind w:left="3600" w:hanging="360"/>
+      </w:pPr>
+      <w:rPr>
+        <w:rFonts w:ascii="Wingdings" w:hAnsi="Wingdings" w:hint="default"/>
+        <w:sz w:val="20"/>
+      </w:rPr>
+    </w:lvl>
+    <w:lvl w:ilvl="5" w:tentative="1">
+      <w:start w:val="1"/>
+      <w:numFmt w:val="bullet"/>
+      <w:lvlText w:val=""/>
+      <w:lvlJc w:val="left"/>
+      <w:pPr>
+        <w:tabs>
+          <w:tab w:val="num" w:pos="4320"/>
+        </w:tabs>
+        <w:ind w:left="4320" w:hanging="360"/>
+      </w:pPr>
+      <w:rPr>
+        <w:rFonts w:ascii="Wingdings" w:hAnsi="Wingdings" w:hint="default"/>
+        <w:sz w:val="20"/>
+      </w:rPr>
+    </w:lvl>
+    <w:lvl w:ilvl="6" w:tentative="1">
+      <w:start w:val="1"/>
+      <w:numFmt w:val="bullet"/>
+      <w:lvlText w:val=""/>
+      <w:lvlJc w:val="left"/>
+      <w:pPr>
+        <w:tabs>
+          <w:tab w:val="num" w:pos="5040"/>
+        </w:tabs>
+        <w:ind w:left="5040" w:hanging="360"/>
+      </w:pPr>
+      <w:rPr>
+        <w:rFonts w:ascii="Wingdings" w:hAnsi="Wingdings" w:hint="default"/>
+        <w:sz w:val="20"/>
+      </w:rPr>
+    </w:lvl>
+    <w:lvl w:ilvl="7" w:tentative="1">
+      <w:start w:val="1"/>
+      <w:numFmt w:val="bullet"/>
+      <w:lvlText w:val=""/>
+      <w:lvlJc w:val="left"/>
+      <w:pPr>
+        <w:tabs>
+          <w:tab w:val="num" w:pos="5760"/>
+        </w:tabs>
+        <w:ind w:left="5760" w:hanging="360"/>
+      </w:pPr>
+      <w:rPr>
+        <w:rFonts w:ascii="Wingdings" w:hAnsi="Wingdings" w:hint="default"/>
+        <w:sz w:val="20"/>
+      </w:rPr>
+    </w:lvl>
+    <w:lvl w:ilvl="8" w:tentative="1">
+      <w:start w:val="1"/>
+      <w:numFmt w:val="bullet"/>
+      <w:lvlText w:val=""/>
+      <w:lvlJc w:val="left"/>
+      <w:pPr>
+        <w:tabs>
+          <w:tab w:val="num" w:pos="6480"/>
+        </w:tabs>
+        <w:ind w:left="6480" w:hanging="360"/>
+      </w:pPr>
+      <w:rPr>
+        <w:rFonts w:ascii="Wingdings" w:hAnsi="Wingdings" w:hint="default"/>
+        <w:sz w:val="20"/>
+      </w:rPr>
+    </w:lvl>
+  </w:abstractNum>
+  <w:abstractNum w:abstractNumId="17" w15:restartNumberingAfterBreak="0">
     <w:nsid w:val="3BEB578A"/>
     <w:multiLevelType w:val="multilevel"/>
     <w:tmpl w:val="418E5F56"/>
@@ -6081,7 +9013,7 @@
       </w:rPr>
     </w:lvl>
   </w:abstractNum>
-  <w:abstractNum w:abstractNumId="11" w15:restartNumberingAfterBreak="0">
+  <w:abstractNum w:abstractNumId="18" w15:restartNumberingAfterBreak="0">
     <w:nsid w:val="3D5C293C"/>
     <w:multiLevelType w:val="multilevel"/>
     <w:tmpl w:val="1500FEFA"/>
@@ -6230,7 +9162,156 @@
       </w:rPr>
     </w:lvl>
   </w:abstractNum>
-  <w:abstractNum w:abstractNumId="12" w15:restartNumberingAfterBreak="0">
+  <w:abstractNum w:abstractNumId="19" w15:restartNumberingAfterBreak="0">
+    <w:nsid w:val="3FBE1FE5"/>
+    <w:multiLevelType w:val="multilevel"/>
+    <w:tmpl w:val="74A44AC2"/>
+    <w:lvl w:ilvl="0">
+      <w:start w:val="1"/>
+      <w:numFmt w:val="bullet"/>
+      <w:lvlText w:val=""/>
+      <w:lvlJc w:val="left"/>
+      <w:pPr>
+        <w:tabs>
+          <w:tab w:val="num" w:pos="720"/>
+        </w:tabs>
+        <w:ind w:left="720" w:hanging="360"/>
+      </w:pPr>
+      <w:rPr>
+        <w:rFonts w:ascii="Symbol" w:hAnsi="Symbol" w:hint="default"/>
+        <w:sz w:val="20"/>
+      </w:rPr>
+    </w:lvl>
+    <w:lvl w:ilvl="1" w:tentative="1">
+      <w:start w:val="1"/>
+      <w:numFmt w:val="bullet"/>
+      <w:lvlText w:val="o"/>
+      <w:lvlJc w:val="left"/>
+      <w:pPr>
+        <w:tabs>
+          <w:tab w:val="num" w:pos="1440"/>
+        </w:tabs>
+        <w:ind w:left="1440" w:hanging="360"/>
+      </w:pPr>
+      <w:rPr>
+        <w:rFonts w:ascii="Courier New" w:hAnsi="Courier New" w:hint="default"/>
+        <w:sz w:val="20"/>
+      </w:rPr>
+    </w:lvl>
+    <w:lvl w:ilvl="2" w:tentative="1">
+      <w:start w:val="1"/>
+      <w:numFmt w:val="bullet"/>
+      <w:lvlText w:val=""/>
+      <w:lvlJc w:val="left"/>
+      <w:pPr>
+        <w:tabs>
+          <w:tab w:val="num" w:pos="2160"/>
+        </w:tabs>
+        <w:ind w:left="2160" w:hanging="360"/>
+      </w:pPr>
+      <w:rPr>
+        <w:rFonts w:ascii="Wingdings" w:hAnsi="Wingdings" w:hint="default"/>
+        <w:sz w:val="20"/>
+      </w:rPr>
+    </w:lvl>
+    <w:lvl w:ilvl="3" w:tentative="1">
+      <w:start w:val="1"/>
+      <w:numFmt w:val="bullet"/>
+      <w:lvlText w:val=""/>
+      <w:lvlJc w:val="left"/>
+      <w:pPr>
+        <w:tabs>
+          <w:tab w:val="num" w:pos="2880"/>
+        </w:tabs>
+        <w:ind w:left="2880" w:hanging="360"/>
+      </w:pPr>
+      <w:rPr>
+        <w:rFonts w:ascii="Wingdings" w:hAnsi="Wingdings" w:hint="default"/>
+        <w:sz w:val="20"/>
+      </w:rPr>
+    </w:lvl>
+    <w:lvl w:ilvl="4" w:tentative="1">
+      <w:start w:val="1"/>
+      <w:numFmt w:val="bullet"/>
+      <w:lvlText w:val=""/>
+      <w:lvlJc w:val="left"/>
+      <w:pPr>
+        <w:tabs>
+          <w:tab w:val="num" w:pos="3600"/>
+        </w:tabs>
+        <w:ind w:left="3600" w:hanging="360"/>
+      </w:pPr>
+      <w:rPr>
+        <w:rFonts w:ascii="Wingdings" w:hAnsi="Wingdings" w:hint="default"/>
+        <w:sz w:val="20"/>
+      </w:rPr>
+    </w:lvl>
+    <w:lvl w:ilvl="5" w:tentative="1">
+      <w:start w:val="1"/>
+      <w:numFmt w:val="bullet"/>
+      <w:lvlText w:val=""/>
+      <w:lvlJc w:val="left"/>
+      <w:pPr>
+        <w:tabs>
+          <w:tab w:val="num" w:pos="4320"/>
+        </w:tabs>
+        <w:ind w:left="4320" w:hanging="360"/>
+      </w:pPr>
+      <w:rPr>
+        <w:rFonts w:ascii="Wingdings" w:hAnsi="Wingdings" w:hint="default"/>
+        <w:sz w:val="20"/>
+      </w:rPr>
+    </w:lvl>
+    <w:lvl w:ilvl="6" w:tentative="1">
+      <w:start w:val="1"/>
+      <w:numFmt w:val="bullet"/>
+      <w:lvlText w:val=""/>
+      <w:lvlJc w:val="left"/>
+      <w:pPr>
+        <w:tabs>
+          <w:tab w:val="num" w:pos="5040"/>
+        </w:tabs>
+        <w:ind w:left="5040" w:hanging="360"/>
+      </w:pPr>
+      <w:rPr>
+        <w:rFonts w:ascii="Wingdings" w:hAnsi="Wingdings" w:hint="default"/>
+        <w:sz w:val="20"/>
+      </w:rPr>
+    </w:lvl>
+    <w:lvl w:ilvl="7" w:tentative="1">
+      <w:start w:val="1"/>
+      <w:numFmt w:val="bullet"/>
+      <w:lvlText w:val=""/>
+      <w:lvlJc w:val="left"/>
+      <w:pPr>
+        <w:tabs>
+          <w:tab w:val="num" w:pos="5760"/>
+        </w:tabs>
+        <w:ind w:left="5760" w:hanging="360"/>
+      </w:pPr>
+      <w:rPr>
+        <w:rFonts w:ascii="Wingdings" w:hAnsi="Wingdings" w:hint="default"/>
+        <w:sz w:val="20"/>
+      </w:rPr>
+    </w:lvl>
+    <w:lvl w:ilvl="8" w:tentative="1">
+      <w:start w:val="1"/>
+      <w:numFmt w:val="bullet"/>
+      <w:lvlText w:val=""/>
+      <w:lvlJc w:val="left"/>
+      <w:pPr>
+        <w:tabs>
+          <w:tab w:val="num" w:pos="6480"/>
+        </w:tabs>
+        <w:ind w:left="6480" w:hanging="360"/>
+      </w:pPr>
+      <w:rPr>
+        <w:rFonts w:ascii="Wingdings" w:hAnsi="Wingdings" w:hint="default"/>
+        <w:sz w:val="20"/>
+      </w:rPr>
+    </w:lvl>
+  </w:abstractNum>
+  <w:abstractNum w:abstractNumId="20" w15:restartNumberingAfterBreak="0">
     <w:nsid w:val="4022142D"/>
     <w:multiLevelType w:val="multilevel"/>
     <w:tmpl w:val="91CE0946"/>
@@ -6379,7 +9460,7 @@
       </w:rPr>
     </w:lvl>
   </w:abstractNum>
-  <w:abstractNum w:abstractNumId="13" w15:restartNumberingAfterBreak="0">
+  <w:abstractNum w:abstractNumId="21" w15:restartNumberingAfterBreak="0">
     <w:nsid w:val="42295FD5"/>
     <w:multiLevelType w:val="multilevel"/>
     <w:tmpl w:val="5678AC2C"/>
@@ -6528,7 +9609,7 @@
       </w:rPr>
     </w:lvl>
   </w:abstractNum>
-  <w:abstractNum w:abstractNumId="14" w15:restartNumberingAfterBreak="0">
+  <w:abstractNum w:abstractNumId="22" w15:restartNumberingAfterBreak="0">
     <w:nsid w:val="486D547F"/>
     <w:multiLevelType w:val="multilevel"/>
     <w:tmpl w:val="8CE231FA"/>
@@ -6677,7 +9758,156 @@
       </w:rPr>
     </w:lvl>
   </w:abstractNum>
-  <w:abstractNum w:abstractNumId="15" w15:restartNumberingAfterBreak="0">
+  <w:abstractNum w:abstractNumId="23" w15:restartNumberingAfterBreak="0">
+    <w:nsid w:val="4E072FF2"/>
+    <w:multiLevelType w:val="multilevel"/>
+    <w:tmpl w:val="0570E538"/>
+    <w:lvl w:ilvl="0">
+      <w:start w:val="1"/>
+      <w:numFmt w:val="bullet"/>
+      <w:lvlText w:val=""/>
+      <w:lvlJc w:val="left"/>
+      <w:pPr>
+        <w:tabs>
+          <w:tab w:val="num" w:pos="720"/>
+        </w:tabs>
+        <w:ind w:left="720" w:hanging="360"/>
+      </w:pPr>
+      <w:rPr>
+        <w:rFonts w:ascii="Symbol" w:hAnsi="Symbol" w:hint="default"/>
+        <w:sz w:val="20"/>
+      </w:rPr>
+    </w:lvl>
+    <w:lvl w:ilvl="1" w:tentative="1">
+      <w:start w:val="1"/>
+      <w:numFmt w:val="bullet"/>
+      <w:lvlText w:val="o"/>
+      <w:lvlJc w:val="left"/>
+      <w:pPr>
+        <w:tabs>
+          <w:tab w:val="num" w:pos="1440"/>
+        </w:tabs>
+        <w:ind w:left="1440" w:hanging="360"/>
+      </w:pPr>
+      <w:rPr>
+        <w:rFonts w:ascii="Courier New" w:hAnsi="Courier New" w:hint="default"/>
+        <w:sz w:val="20"/>
+      </w:rPr>
+    </w:lvl>
+    <w:lvl w:ilvl="2" w:tentative="1">
+      <w:start w:val="1"/>
+      <w:numFmt w:val="bullet"/>
+      <w:lvlText w:val=""/>
+      <w:lvlJc w:val="left"/>
+      <w:pPr>
+        <w:tabs>
+          <w:tab w:val="num" w:pos="2160"/>
+        </w:tabs>
+        <w:ind w:left="2160" w:hanging="360"/>
+      </w:pPr>
+      <w:rPr>
+        <w:rFonts w:ascii="Wingdings" w:hAnsi="Wingdings" w:hint="default"/>
+        <w:sz w:val="20"/>
+      </w:rPr>
+    </w:lvl>
+    <w:lvl w:ilvl="3" w:tentative="1">
+      <w:start w:val="1"/>
+      <w:numFmt w:val="bullet"/>
+      <w:lvlText w:val=""/>
+      <w:lvlJc w:val="left"/>
+      <w:pPr>
+        <w:tabs>
+          <w:tab w:val="num" w:pos="2880"/>
+        </w:tabs>
+        <w:ind w:left="2880" w:hanging="360"/>
+      </w:pPr>
+      <w:rPr>
+        <w:rFonts w:ascii="Wingdings" w:hAnsi="Wingdings" w:hint="default"/>
+        <w:sz w:val="20"/>
+      </w:rPr>
+    </w:lvl>
+    <w:lvl w:ilvl="4" w:tentative="1">
+      <w:start w:val="1"/>
+      <w:numFmt w:val="bullet"/>
+      <w:lvlText w:val=""/>
+      <w:lvlJc w:val="left"/>
+      <w:pPr>
+        <w:tabs>
+          <w:tab w:val="num" w:pos="3600"/>
+        </w:tabs>
+        <w:ind w:left="3600" w:hanging="360"/>
+      </w:pPr>
+      <w:rPr>
+        <w:rFonts w:ascii="Wingdings" w:hAnsi="Wingdings" w:hint="default"/>
+        <w:sz w:val="20"/>
+      </w:rPr>
+    </w:lvl>
+    <w:lvl w:ilvl="5" w:tentative="1">
+      <w:start w:val="1"/>
+      <w:numFmt w:val="bullet"/>
+      <w:lvlText w:val=""/>
+      <w:lvlJc w:val="left"/>
+      <w:pPr>
+        <w:tabs>
+          <w:tab w:val="num" w:pos="4320"/>
+        </w:tabs>
+        <w:ind w:left="4320" w:hanging="360"/>
+      </w:pPr>
+      <w:rPr>
+        <w:rFonts w:ascii="Wingdings" w:hAnsi="Wingdings" w:hint="default"/>
+        <w:sz w:val="20"/>
+      </w:rPr>
+    </w:lvl>
+    <w:lvl w:ilvl="6" w:tentative="1">
+      <w:start w:val="1"/>
+      <w:numFmt w:val="bullet"/>
+      <w:lvlText w:val=""/>
+      <w:lvlJc w:val="left"/>
+      <w:pPr>
+        <w:tabs>
+          <w:tab w:val="num" w:pos="5040"/>
+        </w:tabs>
+        <w:ind w:left="5040" w:hanging="360"/>
+      </w:pPr>
+      <w:rPr>
+        <w:rFonts w:ascii="Wingdings" w:hAnsi="Wingdings" w:hint="default"/>
+        <w:sz w:val="20"/>
+      </w:rPr>
+    </w:lvl>
+    <w:lvl w:ilvl="7" w:tentative="1">
+      <w:start w:val="1"/>
+      <w:numFmt w:val="bullet"/>
+      <w:lvlText w:val=""/>
+      <w:lvlJc w:val="left"/>
+      <w:pPr>
+        <w:tabs>
+          <w:tab w:val="num" w:pos="5760"/>
+        </w:tabs>
+        <w:ind w:left="5760" w:hanging="360"/>
+      </w:pPr>
+      <w:rPr>
+        <w:rFonts w:ascii="Wingdings" w:hAnsi="Wingdings" w:hint="default"/>
+        <w:sz w:val="20"/>
+      </w:rPr>
+    </w:lvl>
+    <w:lvl w:ilvl="8" w:tentative="1">
+      <w:start w:val="1"/>
+      <w:numFmt w:val="bullet"/>
+      <w:lvlText w:val=""/>
+      <w:lvlJc w:val="left"/>
+      <w:pPr>
+        <w:tabs>
+          <w:tab w:val="num" w:pos="6480"/>
+        </w:tabs>
+        <w:ind w:left="6480" w:hanging="360"/>
+      </w:pPr>
+      <w:rPr>
+        <w:rFonts w:ascii="Wingdings" w:hAnsi="Wingdings" w:hint="default"/>
+        <w:sz w:val="20"/>
+      </w:rPr>
+    </w:lvl>
+  </w:abstractNum>
+  <w:abstractNum w:abstractNumId="24" w15:restartNumberingAfterBreak="0">
     <w:nsid w:val="4E84565A"/>
     <w:multiLevelType w:val="multilevel"/>
     <w:tmpl w:val="E7BEE546"/>
@@ -6826,7 +10056,156 @@
       </w:rPr>
     </w:lvl>
   </w:abstractNum>
-  <w:abstractNum w:abstractNumId="16" w15:restartNumberingAfterBreak="0">
+  <w:abstractNum w:abstractNumId="25" w15:restartNumberingAfterBreak="0">
+    <w:nsid w:val="53982AAB"/>
+    <w:multiLevelType w:val="multilevel"/>
+    <w:tmpl w:val="3BE8998E"/>
+    <w:lvl w:ilvl="0">
+      <w:start w:val="1"/>
+      <w:numFmt w:val="bullet"/>
+      <w:lvlText w:val=""/>
+      <w:lvlJc w:val="left"/>
+      <w:pPr>
+        <w:tabs>
+          <w:tab w:val="num" w:pos="720"/>
+        </w:tabs>
+        <w:ind w:left="720" w:hanging="360"/>
+      </w:pPr>
+      <w:rPr>
+        <w:rFonts w:ascii="Symbol" w:hAnsi="Symbol" w:hint="default"/>
+        <w:sz w:val="20"/>
+      </w:rPr>
+    </w:lvl>
+    <w:lvl w:ilvl="1" w:tentative="1">
+      <w:start w:val="1"/>
+      <w:numFmt w:val="bullet"/>
+      <w:lvlText w:val="o"/>
+      <w:lvlJc w:val="left"/>
+      <w:pPr>
+        <w:tabs>
+          <w:tab w:val="num" w:pos="1440"/>
+        </w:tabs>
+        <w:ind w:left="1440" w:hanging="360"/>
+      </w:pPr>
+      <w:rPr>
+        <w:rFonts w:ascii="Courier New" w:hAnsi="Courier New" w:hint="default"/>
+        <w:sz w:val="20"/>
+      </w:rPr>
+    </w:lvl>
+    <w:lvl w:ilvl="2" w:tentative="1">
+      <w:start w:val="1"/>
+      <w:numFmt w:val="bullet"/>
+      <w:lvlText w:val=""/>
+      <w:lvlJc w:val="left"/>
+      <w:pPr>
+        <w:tabs>
+          <w:tab w:val="num" w:pos="2160"/>
+        </w:tabs>
+        <w:ind w:left="2160" w:hanging="360"/>
+      </w:pPr>
+      <w:rPr>
+        <w:rFonts w:ascii="Wingdings" w:hAnsi="Wingdings" w:hint="default"/>
+        <w:sz w:val="20"/>
+      </w:rPr>
+    </w:lvl>
+    <w:lvl w:ilvl="3" w:tentative="1">
+      <w:start w:val="1"/>
+      <w:numFmt w:val="bullet"/>
+      <w:lvlText w:val=""/>
+      <w:lvlJc w:val="left"/>
+      <w:pPr>
+        <w:tabs>
+          <w:tab w:val="num" w:pos="2880"/>
+        </w:tabs>
+        <w:ind w:left="2880" w:hanging="360"/>
+      </w:pPr>
+      <w:rPr>
+        <w:rFonts w:ascii="Wingdings" w:hAnsi="Wingdings" w:hint="default"/>
+        <w:sz w:val="20"/>
+      </w:rPr>
+    </w:lvl>
+    <w:lvl w:ilvl="4" w:tentative="1">
+      <w:start w:val="1"/>
+      <w:numFmt w:val="bullet"/>
+      <w:lvlText w:val=""/>
+      <w:lvlJc w:val="left"/>
+      <w:pPr>
+        <w:tabs>
+          <w:tab w:val="num" w:pos="3600"/>
+        </w:tabs>
+        <w:ind w:left="3600" w:hanging="360"/>
+      </w:pPr>
+      <w:rPr>
+        <w:rFonts w:ascii="Wingdings" w:hAnsi="Wingdings" w:hint="default"/>
+        <w:sz w:val="20"/>
+      </w:rPr>
+    </w:lvl>
+    <w:lvl w:ilvl="5" w:tentative="1">
+      <w:start w:val="1"/>
+      <w:numFmt w:val="bullet"/>
+      <w:lvlText w:val=""/>
+      <w:lvlJc w:val="left"/>
+      <w:pPr>
+        <w:tabs>
+          <w:tab w:val="num" w:pos="4320"/>
+        </w:tabs>
+        <w:ind w:left="4320" w:hanging="360"/>
+      </w:pPr>
+      <w:rPr>
+        <w:rFonts w:ascii="Wingdings" w:hAnsi="Wingdings" w:hint="default"/>
+        <w:sz w:val="20"/>
+      </w:rPr>
+    </w:lvl>
+    <w:lvl w:ilvl="6" w:tentative="1">
+      <w:start w:val="1"/>
+      <w:numFmt w:val="bullet"/>
+      <w:lvlText w:val=""/>
+      <w:lvlJc w:val="left"/>
+      <w:pPr>
+        <w:tabs>
+          <w:tab w:val="num" w:pos="5040"/>
+        </w:tabs>
+        <w:ind w:left="5040" w:hanging="360"/>
+      </w:pPr>
+      <w:rPr>
+        <w:rFonts w:ascii="Wingdings" w:hAnsi="Wingdings" w:hint="default"/>
+        <w:sz w:val="20"/>
+      </w:rPr>
+    </w:lvl>
+    <w:lvl w:ilvl="7" w:tentative="1">
+      <w:start w:val="1"/>
+      <w:numFmt w:val="bullet"/>
+      <w:lvlText w:val=""/>
+      <w:lvlJc w:val="left"/>
+      <w:pPr>
+        <w:tabs>
+          <w:tab w:val="num" w:pos="5760"/>
+        </w:tabs>
+        <w:ind w:left="5760" w:hanging="360"/>
+      </w:pPr>
+      <w:rPr>
+        <w:rFonts w:ascii="Wingdings" w:hAnsi="Wingdings" w:hint="default"/>
+        <w:sz w:val="20"/>
+      </w:rPr>
+    </w:lvl>
+    <w:lvl w:ilvl="8" w:tentative="1">
+      <w:start w:val="1"/>
+      <w:numFmt w:val="bullet"/>
+      <w:lvlText w:val=""/>
+      <w:lvlJc w:val="left"/>
+      <w:pPr>
+        <w:tabs>
+          <w:tab w:val="num" w:pos="6480"/>
+        </w:tabs>
+        <w:ind w:left="6480" w:hanging="360"/>
+      </w:pPr>
+      <w:rPr>
+        <w:rFonts w:ascii="Wingdings" w:hAnsi="Wingdings" w:hint="default"/>
+        <w:sz w:val="20"/>
+      </w:rPr>
+    </w:lvl>
+  </w:abstractNum>
+  <w:abstractNum w:abstractNumId="26" w15:restartNumberingAfterBreak="0">
     <w:nsid w:val="54064360"/>
     <w:multiLevelType w:val="multilevel"/>
     <w:tmpl w:val="E56AAC72"/>
@@ -6975,7 +10354,7 @@
       </w:rPr>
     </w:lvl>
   </w:abstractNum>
-  <w:abstractNum w:abstractNumId="17" w15:restartNumberingAfterBreak="0">
+  <w:abstractNum w:abstractNumId="27" w15:restartNumberingAfterBreak="0">
     <w:nsid w:val="5FB26915"/>
     <w:multiLevelType w:val="multilevel"/>
     <w:tmpl w:val="1DD4BD44"/>
@@ -7124,7 +10503,7 @@
       </w:rPr>
     </w:lvl>
   </w:abstractNum>
-  <w:abstractNum w:abstractNumId="18" w15:restartNumberingAfterBreak="0">
+  <w:abstractNum w:abstractNumId="28" w15:restartNumberingAfterBreak="0">
     <w:nsid w:val="605C6834"/>
     <w:multiLevelType w:val="multilevel"/>
     <w:tmpl w:val="A288BBDE"/>
@@ -7273,7 +10652,156 @@
       </w:rPr>
     </w:lvl>
   </w:abstractNum>
-  <w:abstractNum w:abstractNumId="19" w15:restartNumberingAfterBreak="0">
+  <w:abstractNum w:abstractNumId="29" w15:restartNumberingAfterBreak="0">
+    <w:nsid w:val="638127B1"/>
+    <w:multiLevelType w:val="multilevel"/>
+    <w:tmpl w:val="E6A4D87E"/>
+    <w:lvl w:ilvl="0">
+      <w:start w:val="1"/>
+      <w:numFmt w:val="bullet"/>
+      <w:lvlText w:val=""/>
+      <w:lvlJc w:val="left"/>
+      <w:pPr>
+        <w:tabs>
+          <w:tab w:val="num" w:pos="720"/>
+        </w:tabs>
+        <w:ind w:left="720" w:hanging="360"/>
+      </w:pPr>
+      <w:rPr>
+        <w:rFonts w:ascii="Symbol" w:hAnsi="Symbol" w:hint="default"/>
+        <w:sz w:val="20"/>
+      </w:rPr>
+    </w:lvl>
+    <w:lvl w:ilvl="1" w:tentative="1">
+      <w:start w:val="1"/>
+      <w:numFmt w:val="bullet"/>
+      <w:lvlText w:val="o"/>
+      <w:lvlJc w:val="left"/>
+      <w:pPr>
+        <w:tabs>
+          <w:tab w:val="num" w:pos="1440"/>
+        </w:tabs>
+        <w:ind w:left="1440" w:hanging="360"/>
+      </w:pPr>
+      <w:rPr>
+        <w:rFonts w:ascii="Courier New" w:hAnsi="Courier New" w:hint="default"/>
+        <w:sz w:val="20"/>
+      </w:rPr>
+    </w:lvl>
+    <w:lvl w:ilvl="2" w:tentative="1">
+      <w:start w:val="1"/>
+      <w:numFmt w:val="bullet"/>
+      <w:lvlText w:val=""/>
+      <w:lvlJc w:val="left"/>
+      <w:pPr>
+        <w:tabs>
+          <w:tab w:val="num" w:pos="2160"/>
+        </w:tabs>
+        <w:ind w:left="2160" w:hanging="360"/>
+      </w:pPr>
+      <w:rPr>
+        <w:rFonts w:ascii="Wingdings" w:hAnsi="Wingdings" w:hint="default"/>
+        <w:sz w:val="20"/>
+      </w:rPr>
+    </w:lvl>
+    <w:lvl w:ilvl="3" w:tentative="1">
+      <w:start w:val="1"/>
+      <w:numFmt w:val="bullet"/>
+      <w:lvlText w:val=""/>
+      <w:lvlJc w:val="left"/>
+      <w:pPr>
+        <w:tabs>
+          <w:tab w:val="num" w:pos="2880"/>
+        </w:tabs>
+        <w:ind w:left="2880" w:hanging="360"/>
+      </w:pPr>
+      <w:rPr>
+        <w:rFonts w:ascii="Wingdings" w:hAnsi="Wingdings" w:hint="default"/>
+        <w:sz w:val="20"/>
+      </w:rPr>
+    </w:lvl>
+    <w:lvl w:ilvl="4" w:tentative="1">
+      <w:start w:val="1"/>
+      <w:numFmt w:val="bullet"/>
+      <w:lvlText w:val=""/>
+      <w:lvlJc w:val="left"/>
+      <w:pPr>
+        <w:tabs>
+          <w:tab w:val="num" w:pos="3600"/>
+        </w:tabs>
+        <w:ind w:left="3600" w:hanging="360"/>
+      </w:pPr>
+      <w:rPr>
+        <w:rFonts w:ascii="Wingdings" w:hAnsi="Wingdings" w:hint="default"/>
+        <w:sz w:val="20"/>
+      </w:rPr>
+    </w:lvl>
+    <w:lvl w:ilvl="5" w:tentative="1">
+      <w:start w:val="1"/>
+      <w:numFmt w:val="bullet"/>
+      <w:lvlText w:val=""/>
+      <w:lvlJc w:val="left"/>
+      <w:pPr>
+        <w:tabs>
+          <w:tab w:val="num" w:pos="4320"/>
+        </w:tabs>
+        <w:ind w:left="4320" w:hanging="360"/>
+      </w:pPr>
+      <w:rPr>
+        <w:rFonts w:ascii="Wingdings" w:hAnsi="Wingdings" w:hint="default"/>
+        <w:sz w:val="20"/>
+      </w:rPr>
+    </w:lvl>
+    <w:lvl w:ilvl="6" w:tentative="1">
+      <w:start w:val="1"/>
+      <w:numFmt w:val="bullet"/>
+      <w:lvlText w:val=""/>
+      <w:lvlJc w:val="left"/>
+      <w:pPr>
+        <w:tabs>
+          <w:tab w:val="num" w:pos="5040"/>
+        </w:tabs>
+        <w:ind w:left="5040" w:hanging="360"/>
+      </w:pPr>
+      <w:rPr>
+        <w:rFonts w:ascii="Wingdings" w:hAnsi="Wingdings" w:hint="default"/>
+        <w:sz w:val="20"/>
+      </w:rPr>
+    </w:lvl>
+    <w:lvl w:ilvl="7" w:tentative="1">
+      <w:start w:val="1"/>
+      <w:numFmt w:val="bullet"/>
+      <w:lvlText w:val=""/>
+      <w:lvlJc w:val="left"/>
+      <w:pPr>
+        <w:tabs>
+          <w:tab w:val="num" w:pos="5760"/>
+        </w:tabs>
+        <w:ind w:left="5760" w:hanging="360"/>
+      </w:pPr>
+      <w:rPr>
+        <w:rFonts w:ascii="Wingdings" w:hAnsi="Wingdings" w:hint="default"/>
+        <w:sz w:val="20"/>
+      </w:rPr>
+    </w:lvl>
+    <w:lvl w:ilvl="8" w:tentative="1">
+      <w:start w:val="1"/>
+      <w:numFmt w:val="bullet"/>
+      <w:lvlText w:val=""/>
+      <w:lvlJc w:val="left"/>
+      <w:pPr>
+        <w:tabs>
+          <w:tab w:val="num" w:pos="6480"/>
+        </w:tabs>
+        <w:ind w:left="6480" w:hanging="360"/>
+      </w:pPr>
+      <w:rPr>
+        <w:rFonts w:ascii="Wingdings" w:hAnsi="Wingdings" w:hint="default"/>
+        <w:sz w:val="20"/>
+      </w:rPr>
+    </w:lvl>
+  </w:abstractNum>
+  <w:abstractNum w:abstractNumId="30" w15:restartNumberingAfterBreak="0">
     <w:nsid w:val="63FD2244"/>
     <w:multiLevelType w:val="multilevel"/>
     <w:tmpl w:val="7A78F2A4"/>
@@ -7422,7 +10950,305 @@
       </w:rPr>
     </w:lvl>
   </w:abstractNum>
-  <w:abstractNum w:abstractNumId="20" w15:restartNumberingAfterBreak="0">
+  <w:abstractNum w:abstractNumId="31" w15:restartNumberingAfterBreak="0">
+    <w:nsid w:val="647661AA"/>
+    <w:multiLevelType w:val="multilevel"/>
+    <w:tmpl w:val="2530F62C"/>
+    <w:lvl w:ilvl="0">
+      <w:start w:val="1"/>
+      <w:numFmt w:val="bullet"/>
+      <w:lvlText w:val=""/>
+      <w:lvlJc w:val="left"/>
+      <w:pPr>
+        <w:tabs>
+          <w:tab w:val="num" w:pos="720"/>
+        </w:tabs>
+        <w:ind w:left="720" w:hanging="360"/>
+      </w:pPr>
+      <w:rPr>
+        <w:rFonts w:ascii="Symbol" w:hAnsi="Symbol" w:hint="default"/>
+        <w:sz w:val="20"/>
+      </w:rPr>
+    </w:lvl>
+    <w:lvl w:ilvl="1">
+      <w:start w:val="1"/>
+      <w:numFmt w:val="bullet"/>
+      <w:lvlText w:val="o"/>
+      <w:lvlJc w:val="left"/>
+      <w:pPr>
+        <w:tabs>
+          <w:tab w:val="num" w:pos="1440"/>
+        </w:tabs>
+        <w:ind w:left="1440" w:hanging="360"/>
+      </w:pPr>
+      <w:rPr>
+        <w:rFonts w:ascii="Courier New" w:hAnsi="Courier New" w:hint="default"/>
+        <w:sz w:val="20"/>
+      </w:rPr>
+    </w:lvl>
+    <w:lvl w:ilvl="2" w:tentative="1">
+      <w:start w:val="1"/>
+      <w:numFmt w:val="bullet"/>
+      <w:lvlText w:val=""/>
+      <w:lvlJc w:val="left"/>
+      <w:pPr>
+        <w:tabs>
+          <w:tab w:val="num" w:pos="2160"/>
+        </w:tabs>
+        <w:ind w:left="2160" w:hanging="360"/>
+      </w:pPr>
+      <w:rPr>
+        <w:rFonts w:ascii="Wingdings" w:hAnsi="Wingdings" w:hint="default"/>
+        <w:sz w:val="20"/>
+      </w:rPr>
+    </w:lvl>
+    <w:lvl w:ilvl="3" w:tentative="1">
+      <w:start w:val="1"/>
+      <w:numFmt w:val="bullet"/>
+      <w:lvlText w:val=""/>
+      <w:lvlJc w:val="left"/>
+      <w:pPr>
+        <w:tabs>
+          <w:tab w:val="num" w:pos="2880"/>
+        </w:tabs>
+        <w:ind w:left="2880" w:hanging="360"/>
+      </w:pPr>
+      <w:rPr>
+        <w:rFonts w:ascii="Wingdings" w:hAnsi="Wingdings" w:hint="default"/>
+        <w:sz w:val="20"/>
+      </w:rPr>
+    </w:lvl>
+    <w:lvl w:ilvl="4" w:tentative="1">
+      <w:start w:val="1"/>
+      <w:numFmt w:val="bullet"/>
+      <w:lvlText w:val=""/>
+      <w:lvlJc w:val="left"/>
+      <w:pPr>
+        <w:tabs>
+          <w:tab w:val="num" w:pos="3600"/>
+        </w:tabs>
+        <w:ind w:left="3600" w:hanging="360"/>
+      </w:pPr>
+      <w:rPr>
+        <w:rFonts w:ascii="Wingdings" w:hAnsi="Wingdings" w:hint="default"/>
+        <w:sz w:val="20"/>
+      </w:rPr>
+    </w:lvl>
+    <w:lvl w:ilvl="5" w:tentative="1">
+      <w:start w:val="1"/>
+      <w:numFmt w:val="bullet"/>
+      <w:lvlText w:val=""/>
+      <w:lvlJc w:val="left"/>
+      <w:pPr>
+        <w:tabs>
+          <w:tab w:val="num" w:pos="4320"/>
+        </w:tabs>
+        <w:ind w:left="4320" w:hanging="360"/>
+      </w:pPr>
+      <w:rPr>
+        <w:rFonts w:ascii="Wingdings" w:hAnsi="Wingdings" w:hint="default"/>
+        <w:sz w:val="20"/>
+      </w:rPr>
+    </w:lvl>
+    <w:lvl w:ilvl="6" w:tentative="1">
+      <w:start w:val="1"/>
+      <w:numFmt w:val="bullet"/>
+      <w:lvlText w:val=""/>
+      <w:lvlJc w:val="left"/>
+      <w:pPr>
+        <w:tabs>
+          <w:tab w:val="num" w:pos="5040"/>
+        </w:tabs>
+        <w:ind w:left="5040" w:hanging="360"/>
+      </w:pPr>
+      <w:rPr>
+        <w:rFonts w:ascii="Wingdings" w:hAnsi="Wingdings" w:hint="default"/>
+        <w:sz w:val="20"/>
+      </w:rPr>
+    </w:lvl>
+    <w:lvl w:ilvl="7" w:tentative="1">
+      <w:start w:val="1"/>
+      <w:numFmt w:val="bullet"/>
+      <w:lvlText w:val=""/>
+      <w:lvlJc w:val="left"/>
+      <w:pPr>
+        <w:tabs>
+          <w:tab w:val="num" w:pos="5760"/>
+        </w:tabs>
+        <w:ind w:left="5760" w:hanging="360"/>
+      </w:pPr>
+      <w:rPr>
+        <w:rFonts w:ascii="Wingdings" w:hAnsi="Wingdings" w:hint="default"/>
+        <w:sz w:val="20"/>
+      </w:rPr>
+    </w:lvl>
+    <w:lvl w:ilvl="8" w:tentative="1">
+      <w:start w:val="1"/>
+      <w:numFmt w:val="bullet"/>
+      <w:lvlText w:val=""/>
+      <w:lvlJc w:val="left"/>
+      <w:pPr>
+        <w:tabs>
+          <w:tab w:val="num" w:pos="6480"/>
+        </w:tabs>
+        <w:ind w:left="6480" w:hanging="360"/>
+      </w:pPr>
+      <w:rPr>
+        <w:rFonts w:ascii="Wingdings" w:hAnsi="Wingdings" w:hint="default"/>
+        <w:sz w:val="20"/>
+      </w:rPr>
+    </w:lvl>
+  </w:abstractNum>
+  <w:abstractNum w:abstractNumId="32" w15:restartNumberingAfterBreak="0">
+    <w:nsid w:val="660E6280"/>
+    <w:multiLevelType w:val="multilevel"/>
+    <w:tmpl w:val="19A42C26"/>
+    <w:lvl w:ilvl="0">
+      <w:start w:val="1"/>
+      <w:numFmt w:val="bullet"/>
+      <w:lvlText w:val=""/>
+      <w:lvlJc w:val="left"/>
+      <w:pPr>
+        <w:tabs>
+          <w:tab w:val="num" w:pos="720"/>
+        </w:tabs>
+        <w:ind w:left="720" w:hanging="360"/>
+      </w:pPr>
+      <w:rPr>
+        <w:rFonts w:ascii="Symbol" w:hAnsi="Symbol" w:hint="default"/>
+        <w:sz w:val="20"/>
+      </w:rPr>
+    </w:lvl>
+    <w:lvl w:ilvl="1">
+      <w:start w:val="1"/>
+      <w:numFmt w:val="bullet"/>
+      <w:lvlText w:val="o"/>
+      <w:lvlJc w:val="left"/>
+      <w:pPr>
+        <w:tabs>
+          <w:tab w:val="num" w:pos="1440"/>
+        </w:tabs>
+        <w:ind w:left="1440" w:hanging="360"/>
+      </w:pPr>
+      <w:rPr>
+        <w:rFonts w:ascii="Courier New" w:hAnsi="Courier New" w:hint="default"/>
+        <w:sz w:val="20"/>
+      </w:rPr>
+    </w:lvl>
+    <w:lvl w:ilvl="2" w:tentative="1">
+      <w:start w:val="1"/>
+      <w:numFmt w:val="bullet"/>
+      <w:lvlText w:val=""/>
+      <w:lvlJc w:val="left"/>
+      <w:pPr>
+        <w:tabs>
+          <w:tab w:val="num" w:pos="2160"/>
+        </w:tabs>
+        <w:ind w:left="2160" w:hanging="360"/>
+      </w:pPr>
+      <w:rPr>
+        <w:rFonts w:ascii="Wingdings" w:hAnsi="Wingdings" w:hint="default"/>
+        <w:sz w:val="20"/>
+      </w:rPr>
+    </w:lvl>
+    <w:lvl w:ilvl="3" w:tentative="1">
+      <w:start w:val="1"/>
+      <w:numFmt w:val="bullet"/>
+      <w:lvlText w:val=""/>
+      <w:lvlJc w:val="left"/>
+      <w:pPr>
+        <w:tabs>
+          <w:tab w:val="num" w:pos="2880"/>
+        </w:tabs>
+        <w:ind w:left="2880" w:hanging="360"/>
+      </w:pPr>
+      <w:rPr>
+        <w:rFonts w:ascii="Wingdings" w:hAnsi="Wingdings" w:hint="default"/>
+        <w:sz w:val="20"/>
+      </w:rPr>
+    </w:lvl>
+    <w:lvl w:ilvl="4" w:tentative="1">
+      <w:start w:val="1"/>
+      <w:numFmt w:val="bullet"/>
+      <w:lvlText w:val=""/>
+      <w:lvlJc w:val="left"/>
+      <w:pPr>
+        <w:tabs>
+          <w:tab w:val="num" w:pos="3600"/>
+        </w:tabs>
+        <w:ind w:left="3600" w:hanging="360"/>
+      </w:pPr>
+      <w:rPr>
+        <w:rFonts w:ascii="Wingdings" w:hAnsi="Wingdings" w:hint="default"/>
+        <w:sz w:val="20"/>
+      </w:rPr>
+    </w:lvl>
+    <w:lvl w:ilvl="5" w:tentative="1">
+      <w:start w:val="1"/>
+      <w:numFmt w:val="bullet"/>
+      <w:lvlText w:val=""/>
+      <w:lvlJc w:val="left"/>
+      <w:pPr>
+        <w:tabs>
+          <w:tab w:val="num" w:pos="4320"/>
+        </w:tabs>
+        <w:ind w:left="4320" w:hanging="360"/>
+      </w:pPr>
+      <w:rPr>
+        <w:rFonts w:ascii="Wingdings" w:hAnsi="Wingdings" w:hint="default"/>
+        <w:sz w:val="20"/>
+      </w:rPr>
+    </w:lvl>
+    <w:lvl w:ilvl="6" w:tentative="1">
+      <w:start w:val="1"/>
+      <w:numFmt w:val="bullet"/>
+      <w:lvlText w:val=""/>
+      <w:lvlJc w:val="left"/>
+      <w:pPr>
+        <w:tabs>
+          <w:tab w:val="num" w:pos="5040"/>
+        </w:tabs>
+        <w:ind w:left="5040" w:hanging="360"/>
+      </w:pPr>
+      <w:rPr>
+        <w:rFonts w:ascii="Wingdings" w:hAnsi="Wingdings" w:hint="default"/>
+        <w:sz w:val="20"/>
+      </w:rPr>
+    </w:lvl>
+    <w:lvl w:ilvl="7" w:tentative="1">
+      <w:start w:val="1"/>
+      <w:numFmt w:val="bullet"/>
+      <w:lvlText w:val=""/>
+      <w:lvlJc w:val="left"/>
+      <w:pPr>
+        <w:tabs>
+          <w:tab w:val="num" w:pos="5760"/>
+        </w:tabs>
+        <w:ind w:left="5760" w:hanging="360"/>
+      </w:pPr>
+      <w:rPr>
+        <w:rFonts w:ascii="Wingdings" w:hAnsi="Wingdings" w:hint="default"/>
+        <w:sz w:val="20"/>
+      </w:rPr>
+    </w:lvl>
+    <w:lvl w:ilvl="8" w:tentative="1">
+      <w:start w:val="1"/>
+      <w:numFmt w:val="bullet"/>
+      <w:lvlText w:val=""/>
+      <w:lvlJc w:val="left"/>
+      <w:pPr>
+        <w:tabs>
+          <w:tab w:val="num" w:pos="6480"/>
+        </w:tabs>
+        <w:ind w:left="6480" w:hanging="360"/>
+      </w:pPr>
+      <w:rPr>
+        <w:rFonts w:ascii="Wingdings" w:hAnsi="Wingdings" w:hint="default"/>
+        <w:sz w:val="20"/>
+      </w:rPr>
+    </w:lvl>
+  </w:abstractNum>
+  <w:abstractNum w:abstractNumId="33" w15:restartNumberingAfterBreak="0">
     <w:nsid w:val="686F2F06"/>
     <w:multiLevelType w:val="multilevel"/>
     <w:tmpl w:val="543276EE"/>
@@ -7571,7 +11397,7 @@
       </w:rPr>
     </w:lvl>
   </w:abstractNum>
-  <w:abstractNum w:abstractNumId="21" w15:restartNumberingAfterBreak="0">
+  <w:abstractNum w:abstractNumId="34" w15:restartNumberingAfterBreak="0">
     <w:nsid w:val="6A0E646F"/>
     <w:multiLevelType w:val="multilevel"/>
     <w:tmpl w:val="98B25B0E"/>
@@ -7720,7 +11546,454 @@
       </w:rPr>
     </w:lvl>
   </w:abstractNum>
-  <w:abstractNum w:abstractNumId="22" w15:restartNumberingAfterBreak="0">
+  <w:abstractNum w:abstractNumId="35" w15:restartNumberingAfterBreak="0">
+    <w:nsid w:val="6B4B6A21"/>
+    <w:multiLevelType w:val="multilevel"/>
+    <w:tmpl w:val="92FE7EDE"/>
+    <w:lvl w:ilvl="0">
+      <w:start w:val="1"/>
+      <w:numFmt w:val="bullet"/>
+      <w:lvlText w:val=""/>
+      <w:lvlJc w:val="left"/>
+      <w:pPr>
+        <w:tabs>
+          <w:tab w:val="num" w:pos="720"/>
+        </w:tabs>
+        <w:ind w:left="720" w:hanging="360"/>
+      </w:pPr>
+      <w:rPr>
+        <w:rFonts w:ascii="Symbol" w:hAnsi="Symbol" w:hint="default"/>
+        <w:sz w:val="20"/>
+      </w:rPr>
+    </w:lvl>
+    <w:lvl w:ilvl="1">
+      <w:start w:val="1"/>
+      <w:numFmt w:val="bullet"/>
+      <w:lvlText w:val="o"/>
+      <w:lvlJc w:val="left"/>
+      <w:pPr>
+        <w:tabs>
+          <w:tab w:val="num" w:pos="1440"/>
+        </w:tabs>
+        <w:ind w:left="1440" w:hanging="360"/>
+      </w:pPr>
+      <w:rPr>
+        <w:rFonts w:ascii="Courier New" w:hAnsi="Courier New" w:hint="default"/>
+        <w:sz w:val="20"/>
+      </w:rPr>
+    </w:lvl>
+    <w:lvl w:ilvl="2" w:tentative="1">
+      <w:start w:val="1"/>
+      <w:numFmt w:val="bullet"/>
+      <w:lvlText w:val=""/>
+      <w:lvlJc w:val="left"/>
+      <w:pPr>
+        <w:tabs>
+          <w:tab w:val="num" w:pos="2160"/>
+        </w:tabs>
+        <w:ind w:left="2160" w:hanging="360"/>
+      </w:pPr>
+      <w:rPr>
+        <w:rFonts w:ascii="Wingdings" w:hAnsi="Wingdings" w:hint="default"/>
+        <w:sz w:val="20"/>
+      </w:rPr>
+    </w:lvl>
+    <w:lvl w:ilvl="3" w:tentative="1">
+      <w:start w:val="1"/>
+      <w:numFmt w:val="bullet"/>
+      <w:lvlText w:val=""/>
+      <w:lvlJc w:val="left"/>
+      <w:pPr>
+        <w:tabs>
+          <w:tab w:val="num" w:pos="2880"/>
+        </w:tabs>
+        <w:ind w:left="2880" w:hanging="360"/>
+      </w:pPr>
+      <w:rPr>
+        <w:rFonts w:ascii="Wingdings" w:hAnsi="Wingdings" w:hint="default"/>
+        <w:sz w:val="20"/>
+      </w:rPr>
+    </w:lvl>
+    <w:lvl w:ilvl="4" w:tentative="1">
+      <w:start w:val="1"/>
+      <w:numFmt w:val="bullet"/>
+      <w:lvlText w:val=""/>
+      <w:lvlJc w:val="left"/>
+      <w:pPr>
+        <w:tabs>
+          <w:tab w:val="num" w:pos="3600"/>
+        </w:tabs>
+        <w:ind w:left="3600" w:hanging="360"/>
+      </w:pPr>
+      <w:rPr>
+        <w:rFonts w:ascii="Wingdings" w:hAnsi="Wingdings" w:hint="default"/>
+        <w:sz w:val="20"/>
+      </w:rPr>
+    </w:lvl>
+    <w:lvl w:ilvl="5" w:tentative="1">
+      <w:start w:val="1"/>
+      <w:numFmt w:val="bullet"/>
+      <w:lvlText w:val=""/>
+      <w:lvlJc w:val="left"/>
+      <w:pPr>
+        <w:tabs>
+          <w:tab w:val="num" w:pos="4320"/>
+        </w:tabs>
+        <w:ind w:left="4320" w:hanging="360"/>
+      </w:pPr>
+      <w:rPr>
+        <w:rFonts w:ascii="Wingdings" w:hAnsi="Wingdings" w:hint="default"/>
+        <w:sz w:val="20"/>
+      </w:rPr>
+    </w:lvl>
+    <w:lvl w:ilvl="6" w:tentative="1">
+      <w:start w:val="1"/>
+      <w:numFmt w:val="bullet"/>
+      <w:lvlText w:val=""/>
+      <w:lvlJc w:val="left"/>
+      <w:pPr>
+        <w:tabs>
+          <w:tab w:val="num" w:pos="5040"/>
+        </w:tabs>
+        <w:ind w:left="5040" w:hanging="360"/>
+      </w:pPr>
+      <w:rPr>
+        <w:rFonts w:ascii="Wingdings" w:hAnsi="Wingdings" w:hint="default"/>
+        <w:sz w:val="20"/>
+      </w:rPr>
+    </w:lvl>
+    <w:lvl w:ilvl="7" w:tentative="1">
+      <w:start w:val="1"/>
+      <w:numFmt w:val="bullet"/>
+      <w:lvlText w:val=""/>
+      <w:lvlJc w:val="left"/>
+      <w:pPr>
+        <w:tabs>
+          <w:tab w:val="num" w:pos="5760"/>
+        </w:tabs>
+        <w:ind w:left="5760" w:hanging="360"/>
+      </w:pPr>
+      <w:rPr>
+        <w:rFonts w:ascii="Wingdings" w:hAnsi="Wingdings" w:hint="default"/>
+        <w:sz w:val="20"/>
+      </w:rPr>
+    </w:lvl>
+    <w:lvl w:ilvl="8" w:tentative="1">
+      <w:start w:val="1"/>
+      <w:numFmt w:val="bullet"/>
+      <w:lvlText w:val=""/>
+      <w:lvlJc w:val="left"/>
+      <w:pPr>
+        <w:tabs>
+          <w:tab w:val="num" w:pos="6480"/>
+        </w:tabs>
+        <w:ind w:left="6480" w:hanging="360"/>
+      </w:pPr>
+      <w:rPr>
+        <w:rFonts w:ascii="Wingdings" w:hAnsi="Wingdings" w:hint="default"/>
+        <w:sz w:val="20"/>
+      </w:rPr>
+    </w:lvl>
+  </w:abstractNum>
+  <w:abstractNum w:abstractNumId="36" w15:restartNumberingAfterBreak="0">
+    <w:nsid w:val="6C1C365F"/>
+    <w:multiLevelType w:val="multilevel"/>
+    <w:tmpl w:val="438810AA"/>
+    <w:lvl w:ilvl="0">
+      <w:start w:val="1"/>
+      <w:numFmt w:val="bullet"/>
+      <w:lvlText w:val=""/>
+      <w:lvlJc w:val="left"/>
+      <w:pPr>
+        <w:tabs>
+          <w:tab w:val="num" w:pos="720"/>
+        </w:tabs>
+        <w:ind w:left="720" w:hanging="360"/>
+      </w:pPr>
+      <w:rPr>
+        <w:rFonts w:ascii="Symbol" w:hAnsi="Symbol" w:hint="default"/>
+        <w:sz w:val="20"/>
+      </w:rPr>
+    </w:lvl>
+    <w:lvl w:ilvl="1">
+      <w:start w:val="1"/>
+      <w:numFmt w:val="bullet"/>
+      <w:lvlText w:val="o"/>
+      <w:lvlJc w:val="left"/>
+      <w:pPr>
+        <w:tabs>
+          <w:tab w:val="num" w:pos="1440"/>
+        </w:tabs>
+        <w:ind w:left="1440" w:hanging="360"/>
+      </w:pPr>
+      <w:rPr>
+        <w:rFonts w:ascii="Courier New" w:hAnsi="Courier New" w:hint="default"/>
+        <w:sz w:val="20"/>
+      </w:rPr>
+    </w:lvl>
+    <w:lvl w:ilvl="2" w:tentative="1">
+      <w:start w:val="1"/>
+      <w:numFmt w:val="bullet"/>
+      <w:lvlText w:val=""/>
+      <w:lvlJc w:val="left"/>
+      <w:pPr>
+        <w:tabs>
+          <w:tab w:val="num" w:pos="2160"/>
+        </w:tabs>
+        <w:ind w:left="2160" w:hanging="360"/>
+      </w:pPr>
+      <w:rPr>
+        <w:rFonts w:ascii="Wingdings" w:hAnsi="Wingdings" w:hint="default"/>
+        <w:sz w:val="20"/>
+      </w:rPr>
+    </w:lvl>
+    <w:lvl w:ilvl="3" w:tentative="1">
+      <w:start w:val="1"/>
+      <w:numFmt w:val="bullet"/>
+      <w:lvlText w:val=""/>
+      <w:lvlJc w:val="left"/>
+      <w:pPr>
+        <w:tabs>
+          <w:tab w:val="num" w:pos="2880"/>
+        </w:tabs>
+        <w:ind w:left="2880" w:hanging="360"/>
+      </w:pPr>
+      <w:rPr>
+        <w:rFonts w:ascii="Wingdings" w:hAnsi="Wingdings" w:hint="default"/>
+        <w:sz w:val="20"/>
+      </w:rPr>
+    </w:lvl>
+    <w:lvl w:ilvl="4" w:tentative="1">
+      <w:start w:val="1"/>
+      <w:numFmt w:val="bullet"/>
+      <w:lvlText w:val=""/>
+      <w:lvlJc w:val="left"/>
+      <w:pPr>
+        <w:tabs>
+          <w:tab w:val="num" w:pos="3600"/>
+        </w:tabs>
+        <w:ind w:left="3600" w:hanging="360"/>
+      </w:pPr>
+      <w:rPr>
+        <w:rFonts w:ascii="Wingdings" w:hAnsi="Wingdings" w:hint="default"/>
+        <w:sz w:val="20"/>
+      </w:rPr>
+    </w:lvl>
+    <w:lvl w:ilvl="5" w:tentative="1">
+      <w:start w:val="1"/>
+      <w:numFmt w:val="bullet"/>
+      <w:lvlText w:val=""/>
+      <w:lvlJc w:val="left"/>
+      <w:pPr>
+        <w:tabs>
+          <w:tab w:val="num" w:pos="4320"/>
+        </w:tabs>
+        <w:ind w:left="4320" w:hanging="360"/>
+      </w:pPr>
+      <w:rPr>
+        <w:rFonts w:ascii="Wingdings" w:hAnsi="Wingdings" w:hint="default"/>
+        <w:sz w:val="20"/>
+      </w:rPr>
+    </w:lvl>
+    <w:lvl w:ilvl="6" w:tentative="1">
+      <w:start w:val="1"/>
+      <w:numFmt w:val="bullet"/>
+      <w:lvlText w:val=""/>
+      <w:lvlJc w:val="left"/>
+      <w:pPr>
+        <w:tabs>
+          <w:tab w:val="num" w:pos="5040"/>
+        </w:tabs>
+        <w:ind w:left="5040" w:hanging="360"/>
+      </w:pPr>
+      <w:rPr>
+        <w:rFonts w:ascii="Wingdings" w:hAnsi="Wingdings" w:hint="default"/>
+        <w:sz w:val="20"/>
+      </w:rPr>
+    </w:lvl>
+    <w:lvl w:ilvl="7" w:tentative="1">
+      <w:start w:val="1"/>
+      <w:numFmt w:val="bullet"/>
+      <w:lvlText w:val=""/>
+      <w:lvlJc w:val="left"/>
+      <w:pPr>
+        <w:tabs>
+          <w:tab w:val="num" w:pos="5760"/>
+        </w:tabs>
+        <w:ind w:left="5760" w:hanging="360"/>
+      </w:pPr>
+      <w:rPr>
+        <w:rFonts w:ascii="Wingdings" w:hAnsi="Wingdings" w:hint="default"/>
+        <w:sz w:val="20"/>
+      </w:rPr>
+    </w:lvl>
+    <w:lvl w:ilvl="8" w:tentative="1">
+      <w:start w:val="1"/>
+      <w:numFmt w:val="bullet"/>
+      <w:lvlText w:val=""/>
+      <w:lvlJc w:val="left"/>
+      <w:pPr>
+        <w:tabs>
+          <w:tab w:val="num" w:pos="6480"/>
+        </w:tabs>
+        <w:ind w:left="6480" w:hanging="360"/>
+      </w:pPr>
+      <w:rPr>
+        <w:rFonts w:ascii="Wingdings" w:hAnsi="Wingdings" w:hint="default"/>
+        <w:sz w:val="20"/>
+      </w:rPr>
+    </w:lvl>
+  </w:abstractNum>
+  <w:abstractNum w:abstractNumId="37" w15:restartNumberingAfterBreak="0">
+    <w:nsid w:val="6C333C24"/>
+    <w:multiLevelType w:val="multilevel"/>
+    <w:tmpl w:val="E3AA6D26"/>
+    <w:lvl w:ilvl="0">
+      <w:start w:val="1"/>
+      <w:numFmt w:val="bullet"/>
+      <w:lvlText w:val=""/>
+      <w:lvlJc w:val="left"/>
+      <w:pPr>
+        <w:tabs>
+          <w:tab w:val="num" w:pos="720"/>
+        </w:tabs>
+        <w:ind w:left="720" w:hanging="360"/>
+      </w:pPr>
+      <w:rPr>
+        <w:rFonts w:ascii="Symbol" w:hAnsi="Symbol" w:hint="default"/>
+        <w:sz w:val="20"/>
+      </w:rPr>
+    </w:lvl>
+    <w:lvl w:ilvl="1" w:tentative="1">
+      <w:start w:val="1"/>
+      <w:numFmt w:val="bullet"/>
+      <w:lvlText w:val="o"/>
+      <w:lvlJc w:val="left"/>
+      <w:pPr>
+        <w:tabs>
+          <w:tab w:val="num" w:pos="1440"/>
+        </w:tabs>
+        <w:ind w:left="1440" w:hanging="360"/>
+      </w:pPr>
+      <w:rPr>
+        <w:rFonts w:ascii="Courier New" w:hAnsi="Courier New" w:hint="default"/>
+        <w:sz w:val="20"/>
+      </w:rPr>
+    </w:lvl>
+    <w:lvl w:ilvl="2" w:tentative="1">
+      <w:start w:val="1"/>
+      <w:numFmt w:val="bullet"/>
+      <w:lvlText w:val=""/>
+      <w:lvlJc w:val="left"/>
+      <w:pPr>
+        <w:tabs>
+          <w:tab w:val="num" w:pos="2160"/>
+        </w:tabs>
+        <w:ind w:left="2160" w:hanging="360"/>
+      </w:pPr>
+      <w:rPr>
+        <w:rFonts w:ascii="Wingdings" w:hAnsi="Wingdings" w:hint="default"/>
+        <w:sz w:val="20"/>
+      </w:rPr>
+    </w:lvl>
+    <w:lvl w:ilvl="3" w:tentative="1">
+      <w:start w:val="1"/>
+      <w:numFmt w:val="bullet"/>
+      <w:lvlText w:val=""/>
+      <w:lvlJc w:val="left"/>
+      <w:pPr>
+        <w:tabs>
+          <w:tab w:val="num" w:pos="2880"/>
+        </w:tabs>
+        <w:ind w:left="2880" w:hanging="360"/>
+      </w:pPr>
+      <w:rPr>
+        <w:rFonts w:ascii="Wingdings" w:hAnsi="Wingdings" w:hint="default"/>
+        <w:sz w:val="20"/>
+      </w:rPr>
+    </w:lvl>
+    <w:lvl w:ilvl="4" w:tentative="1">
+      <w:start w:val="1"/>
+      <w:numFmt w:val="bullet"/>
+      <w:lvlText w:val=""/>
+      <w:lvlJc w:val="left"/>
+      <w:pPr>
+        <w:tabs>
+          <w:tab w:val="num" w:pos="3600"/>
+        </w:tabs>
+        <w:ind w:left="3600" w:hanging="360"/>
+      </w:pPr>
+      <w:rPr>
+        <w:rFonts w:ascii="Wingdings" w:hAnsi="Wingdings" w:hint="default"/>
+        <w:sz w:val="20"/>
+      </w:rPr>
+    </w:lvl>
+    <w:lvl w:ilvl="5" w:tentative="1">
+      <w:start w:val="1"/>
+      <w:numFmt w:val="bullet"/>
+      <w:lvlText w:val=""/>
+      <w:lvlJc w:val="left"/>
+      <w:pPr>
+        <w:tabs>
+          <w:tab w:val="num" w:pos="4320"/>
+        </w:tabs>
+        <w:ind w:left="4320" w:hanging="360"/>
+      </w:pPr>
+      <w:rPr>
+        <w:rFonts w:ascii="Wingdings" w:hAnsi="Wingdings" w:hint="default"/>
+        <w:sz w:val="20"/>
+      </w:rPr>
+    </w:lvl>
+    <w:lvl w:ilvl="6" w:tentative="1">
+      <w:start w:val="1"/>
+      <w:numFmt w:val="bullet"/>
+      <w:lvlText w:val=""/>
+      <w:lvlJc w:val="left"/>
+      <w:pPr>
+        <w:tabs>
+          <w:tab w:val="num" w:pos="5040"/>
+        </w:tabs>
+        <w:ind w:left="5040" w:hanging="360"/>
+      </w:pPr>
+      <w:rPr>
+        <w:rFonts w:ascii="Wingdings" w:hAnsi="Wingdings" w:hint="default"/>
+        <w:sz w:val="20"/>
+      </w:rPr>
+    </w:lvl>
+    <w:lvl w:ilvl="7" w:tentative="1">
+      <w:start w:val="1"/>
+      <w:numFmt w:val="bullet"/>
+      <w:lvlText w:val=""/>
+      <w:lvlJc w:val="left"/>
+      <w:pPr>
+        <w:tabs>
+          <w:tab w:val="num" w:pos="5760"/>
+        </w:tabs>
+        <w:ind w:left="5760" w:hanging="360"/>
+      </w:pPr>
+      <w:rPr>
+        <w:rFonts w:ascii="Wingdings" w:hAnsi="Wingdings" w:hint="default"/>
+        <w:sz w:val="20"/>
+      </w:rPr>
+    </w:lvl>
+    <w:lvl w:ilvl="8" w:tentative="1">
+      <w:start w:val="1"/>
+      <w:numFmt w:val="bullet"/>
+      <w:lvlText w:val=""/>
+      <w:lvlJc w:val="left"/>
+      <w:pPr>
+        <w:tabs>
+          <w:tab w:val="num" w:pos="6480"/>
+        </w:tabs>
+        <w:ind w:left="6480" w:hanging="360"/>
+      </w:pPr>
+      <w:rPr>
+        <w:rFonts w:ascii="Wingdings" w:hAnsi="Wingdings" w:hint="default"/>
+        <w:sz w:val="20"/>
+      </w:rPr>
+    </w:lvl>
+  </w:abstractNum>
+  <w:abstractNum w:abstractNumId="38" w15:restartNumberingAfterBreak="0">
     <w:nsid w:val="76AC05B5"/>
     <w:multiLevelType w:val="multilevel"/>
     <w:tmpl w:val="1CE849FC"/>
@@ -7869,7 +12142,7 @@
       </w:rPr>
     </w:lvl>
   </w:abstractNum>
-  <w:abstractNum w:abstractNumId="23" w15:restartNumberingAfterBreak="0">
+  <w:abstractNum w:abstractNumId="39" w15:restartNumberingAfterBreak="0">
     <w:nsid w:val="796B5219"/>
     <w:multiLevelType w:val="multilevel"/>
     <w:tmpl w:val="941463EA"/>
@@ -8018,7 +12291,7 @@
       </w:rPr>
     </w:lvl>
   </w:abstractNum>
-  <w:abstractNum w:abstractNumId="24" w15:restartNumberingAfterBreak="0">
+  <w:abstractNum w:abstractNumId="40" w15:restartNumberingAfterBreak="0">
     <w:nsid w:val="7A501858"/>
     <w:multiLevelType w:val="multilevel"/>
     <w:tmpl w:val="3740F67E"/>
@@ -8167,7 +12440,7 @@
       </w:rPr>
     </w:lvl>
   </w:abstractNum>
-  <w:abstractNum w:abstractNumId="25" w15:restartNumberingAfterBreak="0">
+  <w:abstractNum w:abstractNumId="41" w15:restartNumberingAfterBreak="0">
     <w:nsid w:val="7EEF7B4F"/>
     <w:multiLevelType w:val="multilevel"/>
     <w:tmpl w:val="D1461E90"/>
@@ -8317,82 +12590,130 @@
     </w:lvl>
   </w:abstractNum>
   <w:num w:numId="1" w16cid:durableId="1601067662">
+    <w:abstractNumId w:val="38"/>
+  </w:num>
+  <w:num w:numId="2" w16cid:durableId="1842160260">
+    <w:abstractNumId w:val="14"/>
+  </w:num>
+  <w:num w:numId="3" w16cid:durableId="427888292">
+    <w:abstractNumId w:val="26"/>
+  </w:num>
+  <w:num w:numId="4" w16cid:durableId="1239897464">
+    <w:abstractNumId w:val="27"/>
+  </w:num>
+  <w:num w:numId="5" w16cid:durableId="1715275080">
+    <w:abstractNumId w:val="6"/>
+  </w:num>
+  <w:num w:numId="6" w16cid:durableId="591793">
+    <w:abstractNumId w:val="20"/>
+  </w:num>
+  <w:num w:numId="7" w16cid:durableId="1668097145">
+    <w:abstractNumId w:val="17"/>
+  </w:num>
+  <w:num w:numId="8" w16cid:durableId="388305022">
+    <w:abstractNumId w:val="33"/>
+  </w:num>
+  <w:num w:numId="9" w16cid:durableId="507983134">
+    <w:abstractNumId w:val="30"/>
+  </w:num>
+  <w:num w:numId="10" w16cid:durableId="1812745135">
+    <w:abstractNumId w:val="40"/>
+  </w:num>
+  <w:num w:numId="11" w16cid:durableId="834338879">
+    <w:abstractNumId w:val="18"/>
+  </w:num>
+  <w:num w:numId="12" w16cid:durableId="2117942136">
+    <w:abstractNumId w:val="13"/>
+  </w:num>
+  <w:num w:numId="13" w16cid:durableId="1863933511">
+    <w:abstractNumId w:val="15"/>
+  </w:num>
+  <w:num w:numId="14" w16cid:durableId="540291627">
+    <w:abstractNumId w:val="5"/>
+  </w:num>
+  <w:num w:numId="15" w16cid:durableId="1636523159">
+    <w:abstractNumId w:val="34"/>
+  </w:num>
+  <w:num w:numId="16" w16cid:durableId="1861624381">
+    <w:abstractNumId w:val="28"/>
+  </w:num>
+  <w:num w:numId="17" w16cid:durableId="1791515050">
     <w:abstractNumId w:val="22"/>
   </w:num>
-  <w:num w:numId="2" w16cid:durableId="1842160260">
+  <w:num w:numId="18" w16cid:durableId="1397700912">
+    <w:abstractNumId w:val="2"/>
+  </w:num>
+  <w:num w:numId="19" w16cid:durableId="991567642">
+    <w:abstractNumId w:val="3"/>
+  </w:num>
+  <w:num w:numId="20" w16cid:durableId="1265844389">
+    <w:abstractNumId w:val="39"/>
+  </w:num>
+  <w:num w:numId="21" w16cid:durableId="603849961">
+    <w:abstractNumId w:val="24"/>
+  </w:num>
+  <w:num w:numId="22" w16cid:durableId="2146654949">
+    <w:abstractNumId w:val="41"/>
+  </w:num>
+  <w:num w:numId="23" w16cid:durableId="1096947934">
+    <w:abstractNumId w:val="21"/>
+  </w:num>
+  <w:num w:numId="24" w16cid:durableId="1818721275">
     <w:abstractNumId w:val="8"/>
   </w:num>
-  <w:num w:numId="3" w16cid:durableId="427888292">
+  <w:num w:numId="25" w16cid:durableId="1656257368">
+    <w:abstractNumId w:val="11"/>
+  </w:num>
+  <w:num w:numId="26" w16cid:durableId="618337997">
+    <w:abstractNumId w:val="12"/>
+  </w:num>
+  <w:num w:numId="27" w16cid:durableId="1167746404">
+    <w:abstractNumId w:val="9"/>
+  </w:num>
+  <w:num w:numId="28" w16cid:durableId="1382366140">
+    <w:abstractNumId w:val="36"/>
+  </w:num>
+  <w:num w:numId="29" w16cid:durableId="394744024">
+    <w:abstractNumId w:val="32"/>
+  </w:num>
+  <w:num w:numId="30" w16cid:durableId="639844085">
+    <w:abstractNumId w:val="10"/>
+  </w:num>
+  <w:num w:numId="31" w16cid:durableId="1792892985">
+    <w:abstractNumId w:val="0"/>
+  </w:num>
+  <w:num w:numId="32" w16cid:durableId="247690888">
     <w:abstractNumId w:val="16"/>
   </w:num>
-  <w:num w:numId="4" w16cid:durableId="1239897464">
-    <w:abstractNumId w:val="17"/>
+  <w:num w:numId="33" w16cid:durableId="158690485">
+    <w:abstractNumId w:val="1"/>
   </w:num>
-  <w:num w:numId="5" w16cid:durableId="1715275080">
-    <w:abstractNumId w:val="3"/>
+  <w:num w:numId="34" w16cid:durableId="1270697427">
+    <w:abstractNumId w:val="4"/>
   </w:num>
-  <w:num w:numId="6" w16cid:durableId="591793">
-    <w:abstractNumId w:val="12"/>
+  <w:num w:numId="35" w16cid:durableId="1026447968">
+    <w:abstractNumId w:val="25"/>
   </w:num>
-  <w:num w:numId="7" w16cid:durableId="1668097145">
-    <w:abstractNumId w:val="10"/>
+  <w:num w:numId="36" w16cid:durableId="895169701">
+    <w:abstractNumId w:val="35"/>
   </w:num>
-  <w:num w:numId="8" w16cid:durableId="388305022">
-    <w:abstractNumId w:val="20"/>
+  <w:num w:numId="37" w16cid:durableId="1054432657">
+    <w:abstractNumId w:val="31"/>
   </w:num>
-  <w:num w:numId="9" w16cid:durableId="507983134">
+  <w:num w:numId="38" w16cid:durableId="982197546">
     <w:abstractNumId w:val="19"/>
   </w:num>
-  <w:num w:numId="10" w16cid:durableId="1812745135">
-    <w:abstractNumId w:val="24"/>
+  <w:num w:numId="39" w16cid:durableId="224730662">
+    <w:abstractNumId w:val="29"/>
   </w:num>
-  <w:num w:numId="11" w16cid:durableId="834338879">
-    <w:abstractNumId w:val="11"/>
+  <w:num w:numId="40" w16cid:durableId="1386877970">
+    <w:abstractNumId w:val="37"/>
   </w:num>
-  <w:num w:numId="12" w16cid:durableId="2117942136">
-    <w:abstractNumId w:val="7"/>
-  </w:num>
-  <w:num w:numId="13" w16cid:durableId="1863933511">
-    <w:abstractNumId w:val="9"/>
-  </w:num>
-  <w:num w:numId="14" w16cid:durableId="540291627">
-    <w:abstractNumId w:val="2"/>
-  </w:num>
-  <w:num w:numId="15" w16cid:durableId="1636523159">
-    <w:abstractNumId w:val="21"/>
-  </w:num>
-  <w:num w:numId="16" w16cid:durableId="1861624381">
-    <w:abstractNumId w:val="18"/>
-  </w:num>
-  <w:num w:numId="17" w16cid:durableId="1791515050">
-    <w:abstractNumId w:val="14"/>
-  </w:num>
-  <w:num w:numId="18" w16cid:durableId="1397700912">
-    <w:abstractNumId w:val="0"/>
-  </w:num>
-  <w:num w:numId="19" w16cid:durableId="991567642">
-    <w:abstractNumId w:val="1"/>
-  </w:num>
-  <w:num w:numId="20" w16cid:durableId="1265844389">
+  <w:num w:numId="41" w16cid:durableId="499856297">
     <w:abstractNumId w:val="23"/>
   </w:num>
-  <w:num w:numId="21" w16cid:durableId="603849961">
-    <w:abstractNumId w:val="15"/>
-  </w:num>
-  <w:num w:numId="22" w16cid:durableId="2146654949">
-    <w:abstractNumId w:val="25"/>
-  </w:num>
-  <w:num w:numId="23" w16cid:durableId="1096947934">
-    <w:abstractNumId w:val="13"/>
-  </w:num>
-  <w:num w:numId="24" w16cid:durableId="1818721275">
-    <w:abstractNumId w:val="4"/>
-  </w:num>
-  <w:num w:numId="25" w16cid:durableId="1656257368">
-    <w:abstractNumId w:val="5"/>
-  </w:num>
-  <w:num w:numId="26" w16cid:durableId="618337997">
-    <w:abstractNumId w:val="6"/>
+  <w:num w:numId="42" w16cid:durableId="348262419">
+    <w:abstractNumId w:val="7"/>
   </w:num>
 </w:numbering>
 </file>
@@ -9027,6 +13348,17 @@
       <w14:ligatures w14:val="none"/>
     </w:rPr>
   </w:style>
+  <w:style w:type="character" w:styleId="Emphasis">
+    <w:name w:val="Emphasis"/>
+    <w:basedOn w:val="DefaultParagraphFont"/>
+    <w:uiPriority w:val="20"/>
+    <w:qFormat/>
+    <w:rsid w:val="001352ED"/>
+    <w:rPr>
+      <w:i/>
+      <w:iCs/>
+    </w:rPr>
+  </w:style>
 </w:styles>
 </file>
 

</xml_diff>

<commit_message>
auto: sync changes at 2026-04-27 12:43:22
</commit_message>
<xml_diff>
--- a/Progress Report.docx
+++ b/Progress Report.docx
@@ -21,29 +21,7 @@
           <w:szCs w:val="32"/>
           <w14:ligatures w14:val="none"/>
         </w:rPr>
-        <w:t xml:space="preserve">Date </w:t>
-      </w:r>
-      <w:proofErr w:type="gramStart"/>
-      <w:r>
-        <w:rPr>
-          <w:rFonts w:ascii="Times New Roman" w:eastAsia="Times New Roman" w:hAnsi="Times New Roman" w:cs="Times New Roman"/>
-          <w:kern w:val="0"/>
-          <w:sz w:val="32"/>
-          <w:szCs w:val="32"/>
-          <w14:ligatures w14:val="none"/>
-        </w:rPr>
-        <w:t>of  Log</w:t>
-      </w:r>
-      <w:proofErr w:type="gramEnd"/>
-      <w:r>
-        <w:rPr>
-          <w:rFonts w:ascii="Times New Roman" w:eastAsia="Times New Roman" w:hAnsi="Times New Roman" w:cs="Times New Roman"/>
-          <w:kern w:val="0"/>
-          <w:sz w:val="32"/>
-          <w:szCs w:val="32"/>
-          <w14:ligatures w14:val="none"/>
-        </w:rPr>
-        <w:t>-1 = 24-04-2026</w:t>
+        <w:t>Date of  Log-1 = 24-04-2026</w:t>
       </w:r>
     </w:p>
     <w:p>
@@ -331,7 +309,6 @@
         </w:rPr>
         <w:t xml:space="preserve">Initialized Node.js project using </w:t>
       </w:r>
-      <w:proofErr w:type="spellStart"/>
       <w:r>
         <w:rPr>
           <w:rFonts w:ascii="Courier New" w:eastAsia="Times New Roman" w:hAnsi="Courier New" w:cs="Courier New"/>
@@ -340,9 +317,34 @@
           <w:szCs w:val="20"/>
           <w14:ligatures w14:val="none"/>
         </w:rPr>
-        <w:t>npm</w:t>
-      </w:r>
-      <w:proofErr w:type="spellEnd"/>
+        <w:t>npm init -y</w:t>
+      </w:r>
+    </w:p>
+    <w:p>
+      <w:pPr>
+        <w:numPr>
+          <w:ilvl w:val="0"/>
+          <w:numId w:val="1"/>
+        </w:numPr>
+        <w:spacing w:before="100" w:beforeAutospacing="1" w:after="100" w:afterAutospacing="1" w:line="240" w:lineRule="auto"/>
+        <w:rPr>
+          <w:rFonts w:ascii="Times New Roman" w:eastAsia="Times New Roman" w:hAnsi="Times New Roman" w:cs="Times New Roman"/>
+          <w:kern w:val="0"/>
+          <w:sz w:val="24"/>
+          <w:szCs w:val="24"/>
+          <w14:ligatures w14:val="none"/>
+        </w:rPr>
+      </w:pPr>
+      <w:r>
+        <w:rPr>
+          <w:rFonts w:ascii="Times New Roman" w:eastAsia="Times New Roman" w:hAnsi="Times New Roman" w:cs="Times New Roman"/>
+          <w:kern w:val="0"/>
+          <w:sz w:val="24"/>
+          <w:szCs w:val="24"/>
+          <w14:ligatures w14:val="none"/>
+        </w:rPr>
+        <w:t>Installed Electron (</w:t>
+      </w:r>
       <w:r>
         <w:rPr>
           <w:rFonts w:ascii="Courier New" w:eastAsia="Times New Roman" w:hAnsi="Courier New" w:cs="Courier New"/>
@@ -351,9 +353,68 @@
           <w:szCs w:val="20"/>
           <w14:ligatures w14:val="none"/>
         </w:rPr>
-        <w:t xml:space="preserve"> </w:t>
-      </w:r>
-      <w:proofErr w:type="spellStart"/>
+        <w:t>npm install electron</w:t>
+      </w:r>
+      <w:r>
+        <w:rPr>
+          <w:rFonts w:ascii="Times New Roman" w:eastAsia="Times New Roman" w:hAnsi="Times New Roman" w:cs="Times New Roman"/>
+          <w:kern w:val="0"/>
+          <w:sz w:val="24"/>
+          <w:szCs w:val="24"/>
+          <w14:ligatures w14:val="none"/>
+        </w:rPr>
+        <w:t>)</w:t>
+      </w:r>
+    </w:p>
+    <w:p>
+      <w:pPr>
+        <w:spacing w:before="100" w:beforeAutospacing="1" w:after="100" w:afterAutospacing="1" w:line="240" w:lineRule="auto"/>
+        <w:rPr>
+          <w:rFonts w:ascii="Times New Roman" w:eastAsia="Times New Roman" w:hAnsi="Times New Roman" w:cs="Times New Roman"/>
+          <w:kern w:val="0"/>
+          <w:sz w:val="24"/>
+          <w:szCs w:val="24"/>
+          <w14:ligatures w14:val="none"/>
+        </w:rPr>
+      </w:pPr>
+      <w:r>
+        <w:rPr>
+          <w:rFonts w:ascii="Times New Roman" w:eastAsia="Times New Roman" w:hAnsi="Times New Roman" w:cs="Times New Roman"/>
+          <w:b/>
+          <w:bCs/>
+          <w:kern w:val="0"/>
+          <w:sz w:val="24"/>
+          <w:szCs w:val="24"/>
+          <w14:ligatures w14:val="none"/>
+        </w:rPr>
+        <w:t>2. Core Application Setup</w:t>
+      </w:r>
+    </w:p>
+    <w:p>
+      <w:pPr>
+        <w:numPr>
+          <w:ilvl w:val="0"/>
+          <w:numId w:val="2"/>
+        </w:numPr>
+        <w:spacing w:before="100" w:beforeAutospacing="1" w:after="100" w:afterAutospacing="1" w:line="240" w:lineRule="auto"/>
+        <w:rPr>
+          <w:rFonts w:ascii="Times New Roman" w:eastAsia="Times New Roman" w:hAnsi="Times New Roman" w:cs="Times New Roman"/>
+          <w:kern w:val="0"/>
+          <w:sz w:val="24"/>
+          <w:szCs w:val="24"/>
+          <w14:ligatures w14:val="none"/>
+        </w:rPr>
+      </w:pPr>
+      <w:r>
+        <w:rPr>
+          <w:rFonts w:ascii="Times New Roman" w:eastAsia="Times New Roman" w:hAnsi="Times New Roman" w:cs="Times New Roman"/>
+          <w:kern w:val="0"/>
+          <w:sz w:val="24"/>
+          <w:szCs w:val="24"/>
+          <w14:ligatures w14:val="none"/>
+        </w:rPr>
+        <w:t xml:space="preserve">Created </w:t>
+      </w:r>
       <w:r>
         <w:rPr>
           <w:rFonts w:ascii="Courier New" w:eastAsia="Times New Roman" w:hAnsi="Courier New" w:cs="Courier New"/>
@@ -362,9 +423,44 @@
           <w:szCs w:val="20"/>
           <w14:ligatures w14:val="none"/>
         </w:rPr>
-        <w:t>init</w:t>
-      </w:r>
-      <w:proofErr w:type="spellEnd"/>
+        <w:t>main.js</w:t>
+      </w:r>
+      <w:r>
+        <w:rPr>
+          <w:rFonts w:ascii="Times New Roman" w:eastAsia="Times New Roman" w:hAnsi="Times New Roman" w:cs="Times New Roman"/>
+          <w:kern w:val="0"/>
+          <w:sz w:val="24"/>
+          <w:szCs w:val="24"/>
+          <w14:ligatures w14:val="none"/>
+        </w:rPr>
+        <w:t xml:space="preserve"> (Electron entry point)</w:t>
+      </w:r>
+    </w:p>
+    <w:p>
+      <w:pPr>
+        <w:numPr>
+          <w:ilvl w:val="0"/>
+          <w:numId w:val="2"/>
+        </w:numPr>
+        <w:spacing w:before="100" w:beforeAutospacing="1" w:after="100" w:afterAutospacing="1" w:line="240" w:lineRule="auto"/>
+        <w:rPr>
+          <w:rFonts w:ascii="Times New Roman" w:eastAsia="Times New Roman" w:hAnsi="Times New Roman" w:cs="Times New Roman"/>
+          <w:kern w:val="0"/>
+          <w:sz w:val="24"/>
+          <w:szCs w:val="24"/>
+          <w14:ligatures w14:val="none"/>
+        </w:rPr>
+      </w:pPr>
+      <w:r>
+        <w:rPr>
+          <w:rFonts w:ascii="Times New Roman" w:eastAsia="Times New Roman" w:hAnsi="Times New Roman" w:cs="Times New Roman"/>
+          <w:kern w:val="0"/>
+          <w:sz w:val="24"/>
+          <w:szCs w:val="24"/>
+          <w14:ligatures w14:val="none"/>
+        </w:rPr>
+        <w:t xml:space="preserve">Configured window creation using </w:t>
+      </w:r>
       <w:r>
         <w:rPr>
           <w:rFonts w:ascii="Courier New" w:eastAsia="Times New Roman" w:hAnsi="Courier New" w:cs="Courier New"/>
@@ -373,14 +469,14 @@
           <w:szCs w:val="20"/>
           <w14:ligatures w14:val="none"/>
         </w:rPr>
-        <w:t xml:space="preserve"> -y</w:t>
+        <w:t>BrowserWindow</w:t>
       </w:r>
     </w:p>
     <w:p>
       <w:pPr>
         <w:numPr>
           <w:ilvl w:val="0"/>
-          <w:numId w:val="1"/>
+          <w:numId w:val="2"/>
         </w:numPr>
         <w:spacing w:before="100" w:beforeAutospacing="1" w:after="100" w:afterAutospacing="1" w:line="240" w:lineRule="auto"/>
         <w:rPr>
@@ -399,9 +495,8 @@
           <w:szCs w:val="24"/>
           <w14:ligatures w14:val="none"/>
         </w:rPr>
-        <w:t>Installed Electron (</w:t>
-      </w:r>
-      <w:proofErr w:type="spellStart"/>
+        <w:t xml:space="preserve">Fixed </w:t>
+      </w:r>
       <w:r>
         <w:rPr>
           <w:rFonts w:ascii="Courier New" w:eastAsia="Times New Roman" w:hAnsi="Courier New" w:cs="Courier New"/>
@@ -410,177 +505,8 @@
           <w:szCs w:val="20"/>
           <w14:ligatures w14:val="none"/>
         </w:rPr>
-        <w:t>npm</w:t>
-      </w:r>
-      <w:proofErr w:type="spellEnd"/>
-      <w:r>
-        <w:rPr>
-          <w:rFonts w:ascii="Courier New" w:eastAsia="Times New Roman" w:hAnsi="Courier New" w:cs="Courier New"/>
-          <w:kern w:val="0"/>
-          <w:sz w:val="20"/>
-          <w:szCs w:val="20"/>
-          <w14:ligatures w14:val="none"/>
-        </w:rPr>
-        <w:t xml:space="preserve"> install electron</w:t>
-      </w:r>
-      <w:r>
-        <w:rPr>
-          <w:rFonts w:ascii="Times New Roman" w:eastAsia="Times New Roman" w:hAnsi="Times New Roman" w:cs="Times New Roman"/>
-          <w:kern w:val="0"/>
-          <w:sz w:val="24"/>
-          <w:szCs w:val="24"/>
-          <w14:ligatures w14:val="none"/>
-        </w:rPr>
-        <w:t>)</w:t>
-      </w:r>
-    </w:p>
-    <w:p>
-      <w:pPr>
-        <w:spacing w:before="100" w:beforeAutospacing="1" w:after="100" w:afterAutospacing="1" w:line="240" w:lineRule="auto"/>
-        <w:rPr>
-          <w:rFonts w:ascii="Times New Roman" w:eastAsia="Times New Roman" w:hAnsi="Times New Roman" w:cs="Times New Roman"/>
-          <w:kern w:val="0"/>
-          <w:sz w:val="24"/>
-          <w:szCs w:val="24"/>
-          <w14:ligatures w14:val="none"/>
-        </w:rPr>
-      </w:pPr>
-      <w:r>
-        <w:rPr>
-          <w:rFonts w:ascii="Times New Roman" w:eastAsia="Times New Roman" w:hAnsi="Times New Roman" w:cs="Times New Roman"/>
-          <w:b/>
-          <w:bCs/>
-          <w:kern w:val="0"/>
-          <w:sz w:val="24"/>
-          <w:szCs w:val="24"/>
-          <w14:ligatures w14:val="none"/>
-        </w:rPr>
-        <w:t>2. Core Application Setup</w:t>
-      </w:r>
-    </w:p>
-    <w:p>
-      <w:pPr>
-        <w:numPr>
-          <w:ilvl w:val="0"/>
-          <w:numId w:val="2"/>
-        </w:numPr>
-        <w:spacing w:before="100" w:beforeAutospacing="1" w:after="100" w:afterAutospacing="1" w:line="240" w:lineRule="auto"/>
-        <w:rPr>
-          <w:rFonts w:ascii="Times New Roman" w:eastAsia="Times New Roman" w:hAnsi="Times New Roman" w:cs="Times New Roman"/>
-          <w:kern w:val="0"/>
-          <w:sz w:val="24"/>
-          <w:szCs w:val="24"/>
-          <w14:ligatures w14:val="none"/>
-        </w:rPr>
-      </w:pPr>
-      <w:r>
-        <w:rPr>
-          <w:rFonts w:ascii="Times New Roman" w:eastAsia="Times New Roman" w:hAnsi="Times New Roman" w:cs="Times New Roman"/>
-          <w:kern w:val="0"/>
-          <w:sz w:val="24"/>
-          <w:szCs w:val="24"/>
-          <w14:ligatures w14:val="none"/>
-        </w:rPr>
-        <w:t xml:space="preserve">Created </w:t>
-      </w:r>
-      <w:r>
-        <w:rPr>
-          <w:rFonts w:ascii="Courier New" w:eastAsia="Times New Roman" w:hAnsi="Courier New" w:cs="Courier New"/>
-          <w:kern w:val="0"/>
-          <w:sz w:val="20"/>
-          <w:szCs w:val="20"/>
-          <w14:ligatures w14:val="none"/>
-        </w:rPr>
-        <w:t>main.js</w:t>
-      </w:r>
-      <w:r>
-        <w:rPr>
-          <w:rFonts w:ascii="Times New Roman" w:eastAsia="Times New Roman" w:hAnsi="Times New Roman" w:cs="Times New Roman"/>
-          <w:kern w:val="0"/>
-          <w:sz w:val="24"/>
-          <w:szCs w:val="24"/>
-          <w14:ligatures w14:val="none"/>
-        </w:rPr>
-        <w:t xml:space="preserve"> (Electron entry point)</w:t>
-      </w:r>
-    </w:p>
-    <w:p>
-      <w:pPr>
-        <w:numPr>
-          <w:ilvl w:val="0"/>
-          <w:numId w:val="2"/>
-        </w:numPr>
-        <w:spacing w:before="100" w:beforeAutospacing="1" w:after="100" w:afterAutospacing="1" w:line="240" w:lineRule="auto"/>
-        <w:rPr>
-          <w:rFonts w:ascii="Times New Roman" w:eastAsia="Times New Roman" w:hAnsi="Times New Roman" w:cs="Times New Roman"/>
-          <w:kern w:val="0"/>
-          <w:sz w:val="24"/>
-          <w:szCs w:val="24"/>
-          <w14:ligatures w14:val="none"/>
-        </w:rPr>
-      </w:pPr>
-      <w:r>
-        <w:rPr>
-          <w:rFonts w:ascii="Times New Roman" w:eastAsia="Times New Roman" w:hAnsi="Times New Roman" w:cs="Times New Roman"/>
-          <w:kern w:val="0"/>
-          <w:sz w:val="24"/>
-          <w:szCs w:val="24"/>
-          <w14:ligatures w14:val="none"/>
-        </w:rPr>
-        <w:t xml:space="preserve">Configured window creation using </w:t>
-      </w:r>
-      <w:proofErr w:type="spellStart"/>
-      <w:r>
-        <w:rPr>
-          <w:rFonts w:ascii="Courier New" w:eastAsia="Times New Roman" w:hAnsi="Courier New" w:cs="Courier New"/>
-          <w:kern w:val="0"/>
-          <w:sz w:val="20"/>
-          <w:szCs w:val="20"/>
-          <w14:ligatures w14:val="none"/>
-        </w:rPr>
-        <w:t>BrowserWindow</w:t>
-      </w:r>
-      <w:proofErr w:type="spellEnd"/>
-    </w:p>
-    <w:p>
-      <w:pPr>
-        <w:numPr>
-          <w:ilvl w:val="0"/>
-          <w:numId w:val="2"/>
-        </w:numPr>
-        <w:spacing w:before="100" w:beforeAutospacing="1" w:after="100" w:afterAutospacing="1" w:line="240" w:lineRule="auto"/>
-        <w:rPr>
-          <w:rFonts w:ascii="Times New Roman" w:eastAsia="Times New Roman" w:hAnsi="Times New Roman" w:cs="Times New Roman"/>
-          <w:kern w:val="0"/>
-          <w:sz w:val="24"/>
-          <w:szCs w:val="24"/>
-          <w14:ligatures w14:val="none"/>
-        </w:rPr>
-      </w:pPr>
-      <w:r>
-        <w:rPr>
-          <w:rFonts w:ascii="Times New Roman" w:eastAsia="Times New Roman" w:hAnsi="Times New Roman" w:cs="Times New Roman"/>
-          <w:kern w:val="0"/>
-          <w:sz w:val="24"/>
-          <w:szCs w:val="24"/>
-          <w14:ligatures w14:val="none"/>
-        </w:rPr>
-        <w:t xml:space="preserve">Fixed </w:t>
-      </w:r>
-      <w:proofErr w:type="spellStart"/>
-      <w:proofErr w:type="gramStart"/>
-      <w:r>
-        <w:rPr>
-          <w:rFonts w:ascii="Courier New" w:eastAsia="Times New Roman" w:hAnsi="Courier New" w:cs="Courier New"/>
-          <w:kern w:val="0"/>
-          <w:sz w:val="20"/>
-          <w:szCs w:val="20"/>
-          <w14:ligatures w14:val="none"/>
-        </w:rPr>
         <w:t>package.json</w:t>
       </w:r>
-      <w:proofErr w:type="spellEnd"/>
-      <w:proofErr w:type="gramEnd"/>
       <w:r>
         <w:rPr>
           <w:rFonts w:ascii="Times New Roman" w:eastAsia="Times New Roman" w:hAnsi="Times New Roman" w:cs="Times New Roman"/>
@@ -1141,8 +1067,6 @@
         </w:rPr>
         <w:t xml:space="preserve">Implemented </w:t>
       </w:r>
-      <w:proofErr w:type="spellStart"/>
-      <w:proofErr w:type="gramStart"/>
       <w:r>
         <w:rPr>
           <w:rFonts w:ascii="Courier New" w:eastAsia="Times New Roman" w:hAnsi="Courier New" w:cs="Courier New"/>
@@ -1151,29 +1075,7 @@
           <w:szCs w:val="20"/>
           <w14:ligatures w14:val="none"/>
         </w:rPr>
-        <w:t>addMessage</w:t>
-      </w:r>
-      <w:proofErr w:type="spellEnd"/>
-      <w:r>
-        <w:rPr>
-          <w:rFonts w:ascii="Courier New" w:eastAsia="Times New Roman" w:hAnsi="Courier New" w:cs="Courier New"/>
-          <w:kern w:val="0"/>
-          <w:sz w:val="20"/>
-          <w:szCs w:val="20"/>
-          <w14:ligatures w14:val="none"/>
-        </w:rPr>
-        <w:t>(</w:t>
-      </w:r>
-      <w:proofErr w:type="gramEnd"/>
-      <w:r>
-        <w:rPr>
-          <w:rFonts w:ascii="Courier New" w:eastAsia="Times New Roman" w:hAnsi="Courier New" w:cs="Courier New"/>
-          <w:kern w:val="0"/>
-          <w:sz w:val="20"/>
-          <w:szCs w:val="20"/>
-          <w14:ligatures w14:val="none"/>
-        </w:rPr>
-        <w:t>)</w:t>
+        <w:t>addMessage()</w:t>
       </w:r>
       <w:r>
         <w:rPr>
@@ -1786,7 +1688,6 @@
         </w:rPr>
         <w:t xml:space="preserve">Introduced </w:t>
       </w:r>
-      <w:proofErr w:type="gramStart"/>
       <w:r>
         <w:rPr>
           <w:rFonts w:ascii="Courier New" w:eastAsia="Times New Roman" w:hAnsi="Courier New" w:cs="Courier New"/>
@@ -1795,18 +1696,7 @@
           <w:szCs w:val="20"/>
           <w14:ligatures w14:val="none"/>
         </w:rPr>
-        <w:t>messages[</w:t>
-      </w:r>
-      <w:proofErr w:type="gramEnd"/>
-      <w:r>
-        <w:rPr>
-          <w:rFonts w:ascii="Courier New" w:eastAsia="Times New Roman" w:hAnsi="Courier New" w:cs="Courier New"/>
-          <w:kern w:val="0"/>
-          <w:sz w:val="20"/>
-          <w:szCs w:val="20"/>
-          <w14:ligatures w14:val="none"/>
-        </w:rPr>
-        <w:t>]</w:t>
+        <w:t>messages[]</w:t>
       </w:r>
       <w:r>
         <w:rPr>
@@ -2112,8 +2002,6 @@
           <w14:ligatures w14:val="none"/>
         </w:rPr>
       </w:pPr>
-      <w:proofErr w:type="spellStart"/>
-      <w:proofErr w:type="gramStart"/>
       <w:r>
         <w:rPr>
           <w:rFonts w:ascii="Courier New" w:eastAsia="Times New Roman" w:hAnsi="Courier New" w:cs="Courier New"/>
@@ -2122,29 +2010,7 @@
           <w:szCs w:val="20"/>
           <w14:ligatures w14:val="none"/>
         </w:rPr>
-        <w:t>messages.pop</w:t>
-      </w:r>
-      <w:proofErr w:type="spellEnd"/>
-      <w:r>
-        <w:rPr>
-          <w:rFonts w:ascii="Courier New" w:eastAsia="Times New Roman" w:hAnsi="Courier New" w:cs="Courier New"/>
-          <w:kern w:val="0"/>
-          <w:sz w:val="20"/>
-          <w:szCs w:val="20"/>
-          <w14:ligatures w14:val="none"/>
-        </w:rPr>
-        <w:t>(</w:t>
-      </w:r>
-      <w:proofErr w:type="gramEnd"/>
-      <w:r>
-        <w:rPr>
-          <w:rFonts w:ascii="Courier New" w:eastAsia="Times New Roman" w:hAnsi="Courier New" w:cs="Courier New"/>
-          <w:kern w:val="0"/>
-          <w:sz w:val="20"/>
-          <w:szCs w:val="20"/>
-          <w14:ligatures w14:val="none"/>
-        </w:rPr>
-        <w:t>)</w:t>
+        <w:t>messages.pop()</w:t>
       </w:r>
       <w:r>
         <w:rPr>
@@ -2518,7 +2384,6 @@
         </w:rPr>
         <w:t>Fixed styling gap for AI typing element (</w:t>
       </w:r>
-      <w:proofErr w:type="spellStart"/>
       <w:r>
         <w:rPr>
           <w:rFonts w:ascii="Courier New" w:eastAsia="Times New Roman" w:hAnsi="Courier New" w:cs="Courier New"/>
@@ -2529,7 +2394,6 @@
         </w:rPr>
         <w:t>typingDiv</w:t>
       </w:r>
-      <w:proofErr w:type="spellEnd"/>
       <w:r>
         <w:rPr>
           <w:rFonts w:ascii="Times New Roman" w:eastAsia="Times New Roman" w:hAnsi="Times New Roman" w:cs="Times New Roman"/>
@@ -2952,29 +2816,7 @@
           <w:szCs w:val="24"/>
           <w14:ligatures w14:val="none"/>
         </w:rPr>
-        <w:t xml:space="preserve">Implement persistence (save UI preferences using </w:t>
-      </w:r>
-      <w:proofErr w:type="spellStart"/>
-      <w:r>
-        <w:rPr>
-          <w:rFonts w:ascii="Times New Roman" w:eastAsia="Times New Roman" w:hAnsi="Times New Roman" w:cs="Times New Roman"/>
-          <w:kern w:val="0"/>
-          <w:sz w:val="24"/>
-          <w:szCs w:val="24"/>
-          <w14:ligatures w14:val="none"/>
-        </w:rPr>
-        <w:t>localStorage</w:t>
-      </w:r>
-      <w:proofErr w:type="spellEnd"/>
-      <w:r>
-        <w:rPr>
-          <w:rFonts w:ascii="Times New Roman" w:eastAsia="Times New Roman" w:hAnsi="Times New Roman" w:cs="Times New Roman"/>
-          <w:kern w:val="0"/>
-          <w:sz w:val="24"/>
-          <w:szCs w:val="24"/>
-          <w14:ligatures w14:val="none"/>
-        </w:rPr>
-        <w:t>)</w:t>
+        <w:t>Implement persistence (save UI preferences using localStorage)</w:t>
       </w:r>
     </w:p>
     <w:p>
@@ -3347,13 +3189,8 @@
         </w:numPr>
       </w:pPr>
       <w:r>
-        <w:t xml:space="preserve">Used </w:t>
-      </w:r>
-      <w:proofErr w:type="spellStart"/>
-      <w:r>
-        <w:t>localStorage</w:t>
-      </w:r>
-      <w:proofErr w:type="spellEnd"/>
+        <w:t>Used localStorage</w:t>
+      </w:r>
     </w:p>
     <w:p>
       <w:pPr>
@@ -3378,21 +3215,7 @@
         <w:rPr>
           <w:rStyle w:val="HTMLCode"/>
         </w:rPr>
-        <w:t>Key: "</w:t>
-      </w:r>
-      <w:proofErr w:type="spellStart"/>
-      <w:r>
-        <w:rPr>
-          <w:rStyle w:val="HTMLCode"/>
-        </w:rPr>
-        <w:t>ui_preferences</w:t>
-      </w:r>
-      <w:proofErr w:type="spellEnd"/>
-      <w:r>
-        <w:rPr>
-          <w:rStyle w:val="HTMLCode"/>
-        </w:rPr>
-        <w:t>"</w:t>
+        <w:t>Key: "ui_preferences"</w:t>
       </w:r>
     </w:p>
     <w:p>
@@ -3423,49 +3246,25 @@
           <w:rStyle w:val="HTMLCode"/>
         </w:rPr>
       </w:pPr>
-      <w:proofErr w:type="spellStart"/>
       <w:r>
         <w:rPr>
           <w:rStyle w:val="HTMLCode"/>
         </w:rPr>
-        <w:t>savePreferences</w:t>
-      </w:r>
-      <w:proofErr w:type="spellEnd"/>
-      <w:r>
+        <w:t>savePreferences(data)</w:t>
+      </w:r>
+    </w:p>
+    <w:p>
+      <w:pPr>
+        <w:pStyle w:val="HTMLPreformatted"/>
         <w:rPr>
           <w:rStyle w:val="HTMLCode"/>
         </w:rPr>
-        <w:t>(data)</w:t>
-      </w:r>
-    </w:p>
-    <w:p>
-      <w:pPr>
-        <w:pStyle w:val="HTMLPreformatted"/>
+      </w:pPr>
+      <w:r>
         <w:rPr>
           <w:rStyle w:val="HTMLCode"/>
         </w:rPr>
-      </w:pPr>
-      <w:proofErr w:type="spellStart"/>
-      <w:proofErr w:type="gramStart"/>
-      <w:r>
-        <w:rPr>
-          <w:rStyle w:val="HTMLCode"/>
-        </w:rPr>
-        <w:t>loadPreferences</w:t>
-      </w:r>
-      <w:proofErr w:type="spellEnd"/>
-      <w:r>
-        <w:rPr>
-          <w:rStyle w:val="HTMLCode"/>
-        </w:rPr>
-        <w:t>(</w:t>
-      </w:r>
-      <w:proofErr w:type="gramEnd"/>
-      <w:r>
-        <w:rPr>
-          <w:rStyle w:val="HTMLCode"/>
-        </w:rPr>
-        <w:t>)</w:t>
+        <w:t>loadPreferences()</w:t>
       </w:r>
     </w:p>
     <w:p>
@@ -3616,36 +3415,30 @@
       <w:r>
         <w:t>Internal state sync (</w:t>
       </w:r>
-      <w:proofErr w:type="spellStart"/>
       <w:r>
         <w:rPr>
           <w:rStyle w:val="HTMLCode"/>
         </w:rPr>
         <w:t>userColor</w:t>
       </w:r>
-      <w:proofErr w:type="spellEnd"/>
       <w:r>
         <w:t xml:space="preserve">, </w:t>
       </w:r>
-      <w:proofErr w:type="spellStart"/>
       <w:r>
         <w:rPr>
           <w:rStyle w:val="HTMLCode"/>
         </w:rPr>
         <w:t>aiColor</w:t>
       </w:r>
-      <w:proofErr w:type="spellEnd"/>
       <w:r>
         <w:t xml:space="preserve">, </w:t>
       </w:r>
-      <w:proofErr w:type="spellStart"/>
       <w:r>
         <w:rPr>
           <w:rStyle w:val="HTMLCode"/>
         </w:rPr>
         <w:t>bgColor</w:t>
       </w:r>
-      <w:proofErr w:type="spellEnd"/>
       <w:r>
         <w:t>)</w:t>
       </w:r>
@@ -3682,14 +3475,12 @@
       <w:r>
         <w:t xml:space="preserve">Event binding via </w:t>
       </w:r>
-      <w:proofErr w:type="spellStart"/>
       <w:r>
         <w:rPr>
           <w:rStyle w:val="HTMLCode"/>
         </w:rPr>
         <w:t>addEventListener</w:t>
       </w:r>
-      <w:proofErr w:type="spellEnd"/>
     </w:p>
     <w:p>
       <w:r>
@@ -3913,18 +3704,8 @@
         <w:rPr>
           <w:rStyle w:val="HTMLCode"/>
         </w:rPr>
-        <w:t xml:space="preserve">Read chunks → split lines → filter "data:" → parse JSON → extract </w:t>
-      </w:r>
-      <w:proofErr w:type="spellStart"/>
-      <w:proofErr w:type="gramStart"/>
-      <w:r>
-        <w:rPr>
-          <w:rStyle w:val="HTMLCode"/>
-        </w:rPr>
-        <w:t>delta.content</w:t>
-      </w:r>
-      <w:proofErr w:type="spellEnd"/>
-      <w:proofErr w:type="gramEnd"/>
+        <w:t>Read chunks → split lines → filter "data:" → parse JSON → extract delta.content</w:t>
+      </w:r>
     </w:p>
     <w:p>
       <w:r>
@@ -4524,7 +4305,6 @@
       <w:r>
         <w:t xml:space="preserve"> using </w:t>
       </w:r>
-      <w:proofErr w:type="spellStart"/>
       <w:r>
         <w:rPr>
           <w:rStyle w:val="HTMLCode"/>
@@ -4532,7 +4312,6 @@
         </w:rPr>
         <w:t>localStorage</w:t>
       </w:r>
-      <w:proofErr w:type="spellEnd"/>
     </w:p>
     <w:p>
       <w:pPr>
@@ -4554,64 +4333,56 @@
           <w:numId w:val="27"/>
         </w:numPr>
       </w:pPr>
-      <w:proofErr w:type="spellStart"/>
-      <w:proofErr w:type="gramStart"/>
       <w:r>
         <w:rPr>
           <w:rStyle w:val="HTMLCode"/>
           <w:rFonts w:eastAsiaTheme="majorEastAsia"/>
         </w:rPr>
-        <w:t>saveConversations</w:t>
-      </w:r>
-      <w:proofErr w:type="spellEnd"/>
+        <w:t>saveConversations()</w:t>
+      </w:r>
+    </w:p>
+    <w:p>
+      <w:pPr>
+        <w:pStyle w:val="NormalWeb"/>
+        <w:numPr>
+          <w:ilvl w:val="1"/>
+          <w:numId w:val="27"/>
+        </w:numPr>
+      </w:pPr>
       <w:r>
         <w:rPr>
           <w:rStyle w:val="HTMLCode"/>
           <w:rFonts w:eastAsiaTheme="majorEastAsia"/>
         </w:rPr>
-        <w:t>(</w:t>
-      </w:r>
-      <w:proofErr w:type="gramEnd"/>
+        <w:t>loadConversations()</w:t>
+      </w:r>
+    </w:p>
+    <w:p>
+      <w:pPr>
+        <w:pStyle w:val="NormalWeb"/>
+        <w:numPr>
+          <w:ilvl w:val="0"/>
+          <w:numId w:val="27"/>
+        </w:numPr>
+      </w:pPr>
+      <w:r>
+        <w:t xml:space="preserve">Established </w:t>
+      </w:r>
+      <w:r>
+        <w:rPr>
+          <w:rStyle w:val="Strong"/>
+        </w:rPr>
+        <w:t>single source of truth</w:t>
+      </w:r>
+      <w:r>
+        <w:t xml:space="preserve"> via </w:t>
+      </w:r>
       <w:r>
         <w:rPr>
           <w:rStyle w:val="HTMLCode"/>
           <w:rFonts w:eastAsiaTheme="majorEastAsia"/>
         </w:rPr>
-        <w:t>)</w:t>
-      </w:r>
-    </w:p>
-    <w:p>
-      <w:pPr>
-        <w:pStyle w:val="NormalWeb"/>
-        <w:numPr>
-          <w:ilvl w:val="1"/>
-          <w:numId w:val="27"/>
-        </w:numPr>
-      </w:pPr>
-      <w:proofErr w:type="spellStart"/>
-      <w:proofErr w:type="gramStart"/>
-      <w:r>
-        <w:rPr>
-          <w:rStyle w:val="HTMLCode"/>
-          <w:rFonts w:eastAsiaTheme="majorEastAsia"/>
-        </w:rPr>
-        <w:t>loadConversations</w:t>
-      </w:r>
-      <w:proofErr w:type="spellEnd"/>
-      <w:r>
-        <w:rPr>
-          <w:rStyle w:val="HTMLCode"/>
-          <w:rFonts w:eastAsiaTheme="majorEastAsia"/>
-        </w:rPr>
-        <w:t>(</w:t>
-      </w:r>
-      <w:proofErr w:type="gramEnd"/>
-      <w:r>
-        <w:rPr>
-          <w:rStyle w:val="HTMLCode"/>
-          <w:rFonts w:eastAsiaTheme="majorEastAsia"/>
-        </w:rPr>
-        <w:t>)</w:t>
+        <w:t>conversations.js</w:t>
       </w:r>
     </w:p>
     <w:p>
@@ -4623,43 +4394,7 @@
         </w:numPr>
       </w:pPr>
       <w:r>
-        <w:t xml:space="preserve">Established </w:t>
-      </w:r>
-      <w:r>
-        <w:rPr>
-          <w:rStyle w:val="Strong"/>
-        </w:rPr>
-        <w:t>single source of truth</w:t>
-      </w:r>
-      <w:r>
-        <w:t xml:space="preserve"> via </w:t>
-      </w:r>
-      <w:r>
-        <w:rPr>
-          <w:rStyle w:val="HTMLCode"/>
-          <w:rFonts w:eastAsiaTheme="majorEastAsia"/>
-        </w:rPr>
-        <w:t>conversations.js</w:t>
-      </w:r>
-    </w:p>
-    <w:p>
-      <w:pPr>
-        <w:pStyle w:val="NormalWeb"/>
-        <w:numPr>
-          <w:ilvl w:val="0"/>
-          <w:numId w:val="27"/>
-        </w:numPr>
-      </w:pPr>
-      <w:r>
-        <w:t xml:space="preserve">Verified persistence through </w:t>
-      </w:r>
-      <w:proofErr w:type="spellStart"/>
-      <w:r>
-        <w:t>DevTools</w:t>
-      </w:r>
-      <w:proofErr w:type="spellEnd"/>
-      <w:r>
-        <w:t xml:space="preserve"> inspection</w:t>
+        <w:t>Verified persistence through DevTools inspection</w:t>
       </w:r>
     </w:p>
     <w:p>
@@ -4717,30 +4452,56 @@
           <w:numId w:val="28"/>
         </w:numPr>
       </w:pPr>
-      <w:proofErr w:type="spellStart"/>
-      <w:proofErr w:type="gramStart"/>
       <w:r>
         <w:rPr>
           <w:rStyle w:val="HTMLCode"/>
           <w:rFonts w:eastAsiaTheme="majorEastAsia"/>
         </w:rPr>
-        <w:t>createConversation</w:t>
-      </w:r>
-      <w:proofErr w:type="spellEnd"/>
+        <w:t>createConversation()</w:t>
+      </w:r>
+    </w:p>
+    <w:p>
+      <w:pPr>
+        <w:pStyle w:val="NormalWeb"/>
+        <w:numPr>
+          <w:ilvl w:val="1"/>
+          <w:numId w:val="28"/>
+        </w:numPr>
+      </w:pPr>
       <w:r>
         <w:rPr>
           <w:rStyle w:val="HTMLCode"/>
           <w:rFonts w:eastAsiaTheme="majorEastAsia"/>
         </w:rPr>
-        <w:t>(</w:t>
-      </w:r>
-      <w:proofErr w:type="gramEnd"/>
+        <w:t>updateConversation()</w:t>
+      </w:r>
+    </w:p>
+    <w:p>
+      <w:pPr>
+        <w:pStyle w:val="NormalWeb"/>
+        <w:numPr>
+          <w:ilvl w:val="1"/>
+          <w:numId w:val="28"/>
+        </w:numPr>
+      </w:pPr>
       <w:r>
         <w:rPr>
           <w:rStyle w:val="HTMLCode"/>
           <w:rFonts w:eastAsiaTheme="majorEastAsia"/>
         </w:rPr>
-        <w:t>)</w:t>
+        <w:t>getAllConversations()</w:t>
+      </w:r>
+    </w:p>
+    <w:p>
+      <w:pPr>
+        <w:pStyle w:val="NormalWeb"/>
+        <w:numPr>
+          <w:ilvl w:val="0"/>
+          <w:numId w:val="28"/>
+        </w:numPr>
+      </w:pPr>
+      <w:r>
+        <w:t>Implemented:</w:t>
       </w:r>
     </w:p>
     <w:p>
@@ -4751,122 +4512,38 @@
           <w:numId w:val="28"/>
         </w:numPr>
       </w:pPr>
-      <w:proofErr w:type="spellStart"/>
-      <w:proofErr w:type="gramStart"/>
+      <w:r>
+        <w:t>Automatic title derivation from first user message</w:t>
+      </w:r>
+    </w:p>
+    <w:p>
+      <w:pPr>
+        <w:pStyle w:val="NormalWeb"/>
+        <w:numPr>
+          <w:ilvl w:val="1"/>
+          <w:numId w:val="28"/>
+        </w:numPr>
+      </w:pPr>
+      <w:r>
+        <w:t>Timestamp tracking (</w:t>
+      </w:r>
       <w:r>
         <w:rPr>
           <w:rStyle w:val="HTMLCode"/>
           <w:rFonts w:eastAsiaTheme="majorEastAsia"/>
         </w:rPr>
-        <w:t>updateConversation</w:t>
-      </w:r>
-      <w:proofErr w:type="spellEnd"/>
+        <w:t>createdAt</w:t>
+      </w:r>
+      <w:r>
+        <w:t xml:space="preserve">, </w:t>
+      </w:r>
       <w:r>
         <w:rPr>
           <w:rStyle w:val="HTMLCode"/>
           <w:rFonts w:eastAsiaTheme="majorEastAsia"/>
         </w:rPr>
-        <w:t>(</w:t>
-      </w:r>
-      <w:proofErr w:type="gramEnd"/>
-      <w:r>
-        <w:rPr>
-          <w:rStyle w:val="HTMLCode"/>
-          <w:rFonts w:eastAsiaTheme="majorEastAsia"/>
-        </w:rPr>
-        <w:t>)</w:t>
-      </w:r>
-    </w:p>
-    <w:p>
-      <w:pPr>
-        <w:pStyle w:val="NormalWeb"/>
-        <w:numPr>
-          <w:ilvl w:val="1"/>
-          <w:numId w:val="28"/>
-        </w:numPr>
-      </w:pPr>
-      <w:proofErr w:type="spellStart"/>
-      <w:proofErr w:type="gramStart"/>
-      <w:r>
-        <w:rPr>
-          <w:rStyle w:val="HTMLCode"/>
-          <w:rFonts w:eastAsiaTheme="majorEastAsia"/>
-        </w:rPr>
-        <w:t>getAllConversations</w:t>
-      </w:r>
-      <w:proofErr w:type="spellEnd"/>
-      <w:r>
-        <w:rPr>
-          <w:rStyle w:val="HTMLCode"/>
-          <w:rFonts w:eastAsiaTheme="majorEastAsia"/>
-        </w:rPr>
-        <w:t>(</w:t>
-      </w:r>
-      <w:proofErr w:type="gramEnd"/>
-      <w:r>
-        <w:rPr>
-          <w:rStyle w:val="HTMLCode"/>
-          <w:rFonts w:eastAsiaTheme="majorEastAsia"/>
-        </w:rPr>
-        <w:t>)</w:t>
-      </w:r>
-    </w:p>
-    <w:p>
-      <w:pPr>
-        <w:pStyle w:val="NormalWeb"/>
-        <w:numPr>
-          <w:ilvl w:val="0"/>
-          <w:numId w:val="28"/>
-        </w:numPr>
-      </w:pPr>
-      <w:r>
-        <w:t>Implemented:</w:t>
-      </w:r>
-    </w:p>
-    <w:p>
-      <w:pPr>
-        <w:pStyle w:val="NormalWeb"/>
-        <w:numPr>
-          <w:ilvl w:val="1"/>
-          <w:numId w:val="28"/>
-        </w:numPr>
-      </w:pPr>
-      <w:r>
-        <w:t>Automatic title derivation from first user message</w:t>
-      </w:r>
-    </w:p>
-    <w:p>
-      <w:pPr>
-        <w:pStyle w:val="NormalWeb"/>
-        <w:numPr>
-          <w:ilvl w:val="1"/>
-          <w:numId w:val="28"/>
-        </w:numPr>
-      </w:pPr>
-      <w:r>
-        <w:t>Timestamp tracking (</w:t>
-      </w:r>
-      <w:proofErr w:type="spellStart"/>
-      <w:r>
-        <w:rPr>
-          <w:rStyle w:val="HTMLCode"/>
-          <w:rFonts w:eastAsiaTheme="majorEastAsia"/>
-        </w:rPr>
-        <w:t>createdAt</w:t>
-      </w:r>
-      <w:proofErr w:type="spellEnd"/>
-      <w:r>
-        <w:t xml:space="preserve">, </w:t>
-      </w:r>
-      <w:proofErr w:type="spellStart"/>
-      <w:r>
-        <w:rPr>
-          <w:rStyle w:val="HTMLCode"/>
-          <w:rFonts w:eastAsiaTheme="majorEastAsia"/>
-        </w:rPr>
         <w:t>updatedAt</w:t>
       </w:r>
-      <w:proofErr w:type="spellEnd"/>
       <w:r>
         <w:t>)</w:t>
       </w:r>
@@ -5076,30 +4753,12 @@
       <w:r>
         <w:t xml:space="preserve">Implemented </w:t>
       </w:r>
-      <w:proofErr w:type="spellStart"/>
-      <w:proofErr w:type="gramStart"/>
       <w:r>
         <w:rPr>
           <w:rStyle w:val="HTMLCode"/>
           <w:rFonts w:eastAsiaTheme="majorEastAsia"/>
         </w:rPr>
-        <w:t>renderConversations</w:t>
-      </w:r>
-      <w:proofErr w:type="spellEnd"/>
-      <w:r>
-        <w:rPr>
-          <w:rStyle w:val="HTMLCode"/>
-          <w:rFonts w:eastAsiaTheme="majorEastAsia"/>
-        </w:rPr>
-        <w:t>(</w:t>
-      </w:r>
-      <w:proofErr w:type="gramEnd"/>
-      <w:r>
-        <w:rPr>
-          <w:rStyle w:val="HTMLCode"/>
-          <w:rFonts w:eastAsiaTheme="majorEastAsia"/>
-        </w:rPr>
-        <w:t>)</w:t>
+        <w:t>renderConversations()</w:t>
       </w:r>
     </w:p>
     <w:p>
@@ -5217,7 +4876,6 @@
           <w:numId w:val="31"/>
         </w:numPr>
       </w:pPr>
-      <w:proofErr w:type="spellStart"/>
       <w:r>
         <w:rPr>
           <w:rStyle w:val="HTMLCode"/>
@@ -5225,7 +4883,6 @@
         </w:rPr>
         <w:t>currentConversation</w:t>
       </w:r>
-      <w:proofErr w:type="spellEnd"/>
     </w:p>
     <w:p>
       <w:pPr>
@@ -5486,30 +5143,12 @@
       <w:r>
         <w:t xml:space="preserve">Implemented </w:t>
       </w:r>
-      <w:proofErr w:type="spellStart"/>
-      <w:proofErr w:type="gramStart"/>
       <w:r>
         <w:rPr>
           <w:rStyle w:val="HTMLCode"/>
           <w:rFonts w:eastAsiaTheme="majorEastAsia"/>
         </w:rPr>
-        <w:t>toggleSidebar</w:t>
-      </w:r>
-      <w:proofErr w:type="spellEnd"/>
-      <w:r>
-        <w:rPr>
-          <w:rStyle w:val="HTMLCode"/>
-          <w:rFonts w:eastAsiaTheme="majorEastAsia"/>
-        </w:rPr>
-        <w:t>(</w:t>
-      </w:r>
-      <w:proofErr w:type="gramEnd"/>
-      <w:r>
-        <w:rPr>
-          <w:rStyle w:val="HTMLCode"/>
-          <w:rFonts w:eastAsiaTheme="majorEastAsia"/>
-        </w:rPr>
-        <w:t>)</w:t>
+        <w:t>toggleSidebar()</w:t>
       </w:r>
     </w:p>
     <w:p>
@@ -5719,7 +5358,6 @@
       <w:r>
         <w:t xml:space="preserve">Eliminated direct </w:t>
       </w:r>
-      <w:proofErr w:type="spellStart"/>
       <w:r>
         <w:rPr>
           <w:rStyle w:val="HTMLCode"/>
@@ -5727,7 +5365,6 @@
         </w:rPr>
         <w:t>localStorage</w:t>
       </w:r>
-      <w:proofErr w:type="spellEnd"/>
       <w:r>
         <w:t xml:space="preserve"> mutation</w:t>
       </w:r>
@@ -5744,30 +5381,12 @@
         <w:lastRenderedPageBreak/>
         <w:t xml:space="preserve">Introduced </w:t>
       </w:r>
-      <w:proofErr w:type="spellStart"/>
-      <w:proofErr w:type="gramStart"/>
       <w:r>
         <w:rPr>
           <w:rStyle w:val="HTMLCode"/>
           <w:rFonts w:eastAsiaTheme="majorEastAsia"/>
         </w:rPr>
-        <w:t>deleteConversation</w:t>
-      </w:r>
-      <w:proofErr w:type="spellEnd"/>
-      <w:r>
-        <w:rPr>
-          <w:rStyle w:val="HTMLCode"/>
-          <w:rFonts w:eastAsiaTheme="majorEastAsia"/>
-        </w:rPr>
-        <w:t>(</w:t>
-      </w:r>
-      <w:proofErr w:type="gramEnd"/>
-      <w:r>
-        <w:rPr>
-          <w:rStyle w:val="HTMLCode"/>
-          <w:rFonts w:eastAsiaTheme="majorEastAsia"/>
-        </w:rPr>
-        <w:t>)</w:t>
+        <w:t>deleteConversation()</w:t>
       </w:r>
       <w:r>
         <w:t xml:space="preserve"> in data layer</w:t>
@@ -6316,6 +5935,974 @@
         <w:rPr>
           <w:sz w:val="32"/>
           <w:szCs w:val="32"/>
+        </w:rPr>
+      </w:pPr>
+    </w:p>
+    <w:p>
+      <w:pPr>
+        <w:rPr>
+          <w:sz w:val="32"/>
+          <w:szCs w:val="32"/>
+        </w:rPr>
+      </w:pPr>
+    </w:p>
+    <w:p>
+      <w:pPr>
+        <w:rPr>
+          <w:sz w:val="52"/>
+          <w:szCs w:val="52"/>
+        </w:rPr>
+      </w:pPr>
+      <w:r>
+        <w:rPr>
+          <w:sz w:val="52"/>
+          <w:szCs w:val="52"/>
+        </w:rPr>
+        <w:t>Date- 26-04-2026</w:t>
+      </w:r>
+    </w:p>
+    <w:p>
+      <w:r>
+        <w:pict w14:anchorId="6F33A6BD">
+          <v:rect id="_x0000_i1071" style="width:0;height:1.5pt" o:hralign="center" o:hrstd="t" o:hr="t" fillcolor="#a0a0a0" stroked="f"/>
+        </w:pict>
+      </w:r>
+    </w:p>
+    <w:p>
+      <w:pPr>
+        <w:pStyle w:val="Heading1"/>
+      </w:pPr>
+      <w:r>
+        <w:rPr>
+          <w:rStyle w:val="Strong"/>
+          <w:b w:val="0"/>
+          <w:bCs w:val="0"/>
+        </w:rPr>
+        <w:t>Session Progress Report — Git Setup &amp; Automation Workflow</w:t>
+      </w:r>
+    </w:p>
+    <w:p>
+      <w:pPr>
+        <w:pStyle w:val="Heading2"/>
+      </w:pPr>
+      <w:r>
+        <w:rPr>
+          <w:rStyle w:val="Strong"/>
+          <w:b/>
+          <w:bCs/>
+        </w:rPr>
+        <w:t>1. Repository Initialization &amp; Reset</w:t>
+      </w:r>
+    </w:p>
+    <w:p>
+      <w:pPr>
+        <w:pStyle w:val="NormalWeb"/>
+        <w:numPr>
+          <w:ilvl w:val="0"/>
+          <w:numId w:val="43"/>
+        </w:numPr>
+      </w:pPr>
+      <w:r>
+        <w:t>Created a repository on GitHub</w:t>
+      </w:r>
+    </w:p>
+    <w:p>
+      <w:pPr>
+        <w:pStyle w:val="NormalWeb"/>
+        <w:numPr>
+          <w:ilvl w:val="0"/>
+          <w:numId w:val="43"/>
+        </w:numPr>
+      </w:pPr>
+      <w:r>
+        <w:t xml:space="preserve">Initialized local Git project inside </w:t>
+      </w:r>
+      <w:r>
+        <w:rPr>
+          <w:rStyle w:val="HTMLCode"/>
+          <w:rFonts w:eastAsiaTheme="majorEastAsia"/>
+        </w:rPr>
+        <w:t>D:\AI_LAB</w:t>
+      </w:r>
+    </w:p>
+    <w:p>
+      <w:pPr>
+        <w:pStyle w:val="NormalWeb"/>
+        <w:numPr>
+          <w:ilvl w:val="0"/>
+          <w:numId w:val="43"/>
+        </w:numPr>
+      </w:pPr>
+      <w:r>
+        <w:t>Encountered pre-existing Git state (not a fresh repo)</w:t>
+      </w:r>
+    </w:p>
+    <w:p>
+      <w:pPr>
+        <w:pStyle w:val="NormalWeb"/>
+        <w:numPr>
+          <w:ilvl w:val="0"/>
+          <w:numId w:val="43"/>
+        </w:numPr>
+      </w:pPr>
+      <w:r>
+        <w:lastRenderedPageBreak/>
+        <w:t>Identified remote branch confusion (</w:t>
+      </w:r>
+      <w:r>
+        <w:rPr>
+          <w:rStyle w:val="HTMLCode"/>
+          <w:rFonts w:eastAsiaTheme="majorEastAsia"/>
+        </w:rPr>
+        <w:t>master</w:t>
+      </w:r>
+      <w:r>
+        <w:t xml:space="preserve"> vs </w:t>
+      </w:r>
+      <w:r>
+        <w:rPr>
+          <w:rStyle w:val="HTMLCode"/>
+          <w:rFonts w:eastAsiaTheme="majorEastAsia"/>
+        </w:rPr>
+        <w:t>main</w:t>
+      </w:r>
+      <w:r>
+        <w:t>)</w:t>
+      </w:r>
+    </w:p>
+    <w:p>
+      <w:pPr>
+        <w:pStyle w:val="NormalWeb"/>
+        <w:numPr>
+          <w:ilvl w:val="0"/>
+          <w:numId w:val="43"/>
+        </w:numPr>
+      </w:pPr>
+      <w:r>
+        <w:t>Deleted and recreated remote repository for a clean reset</w:t>
+      </w:r>
+    </w:p>
+    <w:p>
+      <w:pPr>
+        <w:pStyle w:val="NormalWeb"/>
+        <w:numPr>
+          <w:ilvl w:val="0"/>
+          <w:numId w:val="43"/>
+        </w:numPr>
+      </w:pPr>
+      <w:r>
+        <w:t>Re-linked local project to new remote repository</w:t>
+      </w:r>
+    </w:p>
+    <w:p>
+      <w:r>
+        <w:pict w14:anchorId="2B90A5CF">
+          <v:rect id="_x0000_i1072" style="width:0;height:1.5pt" o:hralign="center" o:hrstd="t" o:hr="t" fillcolor="#a0a0a0" stroked="f"/>
+        </w:pict>
+      </w:r>
+    </w:p>
+    <w:p>
+      <w:pPr>
+        <w:pStyle w:val="Heading2"/>
+      </w:pPr>
+      <w:r>
+        <w:rPr>
+          <w:rStyle w:val="Strong"/>
+          <w:b/>
+          <w:bCs/>
+        </w:rPr>
+        <w:t>2. Git State Cleanup</w:t>
+      </w:r>
+    </w:p>
+    <w:p>
+      <w:pPr>
+        <w:pStyle w:val="NormalWeb"/>
+        <w:numPr>
+          <w:ilvl w:val="0"/>
+          <w:numId w:val="44"/>
+        </w:numPr>
+      </w:pPr>
+      <w:r>
+        <w:t>Removed incorrect or outdated remote connection</w:t>
+      </w:r>
+    </w:p>
+    <w:p>
+      <w:pPr>
+        <w:pStyle w:val="NormalWeb"/>
+        <w:numPr>
+          <w:ilvl w:val="0"/>
+          <w:numId w:val="44"/>
+        </w:numPr>
+      </w:pPr>
+      <w:r>
+        <w:t>Re-attached correct GitHub remote URL</w:t>
+      </w:r>
+    </w:p>
+    <w:p>
+      <w:pPr>
+        <w:pStyle w:val="NormalWeb"/>
+        <w:numPr>
+          <w:ilvl w:val="0"/>
+          <w:numId w:val="44"/>
+        </w:numPr>
+      </w:pPr>
+      <w:r>
+        <w:t xml:space="preserve">Standardized branch to </w:t>
+      </w:r>
+      <w:r>
+        <w:rPr>
+          <w:rStyle w:val="HTMLCode"/>
+          <w:rFonts w:eastAsiaTheme="majorEastAsia"/>
+        </w:rPr>
+        <w:t>main</w:t>
+      </w:r>
+    </w:p>
+    <w:p>
+      <w:pPr>
+        <w:pStyle w:val="NormalWeb"/>
+        <w:numPr>
+          <w:ilvl w:val="0"/>
+          <w:numId w:val="44"/>
+        </w:numPr>
+      </w:pPr>
+      <w:r>
+        <w:t>Ensured clean separation of working tree vs staging area</w:t>
+      </w:r>
+    </w:p>
+    <w:p>
+      <w:r>
+        <w:pict w14:anchorId="6735C77F">
+          <v:rect id="_x0000_i1073" style="width:0;height:1.5pt" o:hralign="center" o:hrstd="t" o:hr="t" fillcolor="#a0a0a0" stroked="f"/>
+        </w:pict>
+      </w:r>
+    </w:p>
+    <w:p>
+      <w:pPr>
+        <w:pStyle w:val="Heading2"/>
+      </w:pPr>
+      <w:r>
+        <w:rPr>
+          <w:rStyle w:val="Strong"/>
+          <w:b/>
+          <w:bCs/>
+        </w:rPr>
+        <w:t>3. Dependency Exclusion (Critical Fix)</w:t>
+      </w:r>
+    </w:p>
+    <w:p>
+      <w:pPr>
+        <w:pStyle w:val="NormalWeb"/>
+        <w:numPr>
+          <w:ilvl w:val="0"/>
+          <w:numId w:val="45"/>
+        </w:numPr>
+      </w:pPr>
+      <w:r>
+        <w:t>Diagnosed unwanted tracking of:</w:t>
+      </w:r>
+    </w:p>
+    <w:p>
+      <w:pPr>
+        <w:pStyle w:val="NormalWeb"/>
+        <w:numPr>
+          <w:ilvl w:val="1"/>
+          <w:numId w:val="45"/>
+        </w:numPr>
+      </w:pPr>
+      <w:r>
+        <w:rPr>
+          <w:rStyle w:val="HTMLCode"/>
+          <w:rFonts w:eastAsiaTheme="majorEastAsia"/>
+        </w:rPr>
+        <w:t>node_modules/</w:t>
+      </w:r>
+    </w:p>
+    <w:p>
+      <w:pPr>
+        <w:pStyle w:val="NormalWeb"/>
+        <w:numPr>
+          <w:ilvl w:val="1"/>
+          <w:numId w:val="45"/>
+        </w:numPr>
+      </w:pPr>
+      <w:r>
+        <w:rPr>
+          <w:rStyle w:val="HTMLCode"/>
+          <w:rFonts w:eastAsiaTheme="majorEastAsia"/>
+        </w:rPr>
+        <w:t>venv/</w:t>
+      </w:r>
+    </w:p>
+    <w:p>
+      <w:pPr>
+        <w:pStyle w:val="NormalWeb"/>
+        <w:numPr>
+          <w:ilvl w:val="0"/>
+          <w:numId w:val="45"/>
+        </w:numPr>
+      </w:pPr>
+      <w:r>
+        <w:t xml:space="preserve">Created and corrected </w:t>
+      </w:r>
+      <w:r>
+        <w:rPr>
+          <w:rStyle w:val="HTMLCode"/>
+          <w:rFonts w:eastAsiaTheme="majorEastAsia"/>
+        </w:rPr>
+        <w:t>.gitignore</w:t>
+      </w:r>
+    </w:p>
+    <w:p>
+      <w:pPr>
+        <w:pStyle w:val="NormalWeb"/>
+        <w:numPr>
+          <w:ilvl w:val="0"/>
+          <w:numId w:val="45"/>
+        </w:numPr>
+      </w:pPr>
+      <w:r>
+        <w:t xml:space="preserve">Verified ignore rules using </w:t>
+      </w:r>
+      <w:r>
+        <w:rPr>
+          <w:rStyle w:val="HTMLCode"/>
+          <w:rFonts w:eastAsiaTheme="majorEastAsia"/>
+        </w:rPr>
+        <w:t>git check-ignore</w:t>
+      </w:r>
+    </w:p>
+    <w:p>
+      <w:pPr>
+        <w:pStyle w:val="NormalWeb"/>
+        <w:numPr>
+          <w:ilvl w:val="0"/>
+          <w:numId w:val="45"/>
+        </w:numPr>
+      </w:pPr>
+      <w:r>
+        <w:t>Established proper exclusion behavior for dependency folders</w:t>
+      </w:r>
+    </w:p>
+    <w:p>
+      <w:r>
+        <w:pict w14:anchorId="1533300D">
+          <v:rect id="_x0000_i1074" style="width:0;height:1.5pt" o:hralign="center" o:hrstd="t" o:hr="t" fillcolor="#a0a0a0" stroked="f"/>
+        </w:pict>
+      </w:r>
+    </w:p>
+    <w:p>
+      <w:pPr>
+        <w:pStyle w:val="Heading2"/>
+      </w:pPr>
+      <w:r>
+        <w:rPr>
+          <w:rStyle w:val="Strong"/>
+          <w:b/>
+          <w:bCs/>
+        </w:rPr>
+        <w:t>4. First Clean Commit Workflow</w:t>
+      </w:r>
+    </w:p>
+    <w:p>
+      <w:pPr>
+        <w:pStyle w:val="NormalWeb"/>
+        <w:numPr>
+          <w:ilvl w:val="0"/>
+          <w:numId w:val="46"/>
+        </w:numPr>
+      </w:pPr>
+      <w:r>
+        <w:t>Staged project files safely</w:t>
+      </w:r>
+    </w:p>
+    <w:p>
+      <w:pPr>
+        <w:pStyle w:val="NormalWeb"/>
+        <w:numPr>
+          <w:ilvl w:val="0"/>
+          <w:numId w:val="46"/>
+        </w:numPr>
+      </w:pPr>
+      <w:r>
+        <w:t>Excluded system/environment folders from commit</w:t>
+      </w:r>
+    </w:p>
+    <w:p>
+      <w:pPr>
+        <w:pStyle w:val="NormalWeb"/>
+        <w:numPr>
+          <w:ilvl w:val="0"/>
+          <w:numId w:val="46"/>
+        </w:numPr>
+      </w:pPr>
+      <w:r>
+        <w:t>Created first structured commit:</w:t>
+      </w:r>
+    </w:p>
+    <w:p>
+      <w:pPr>
+        <w:pStyle w:val="NormalWeb"/>
+        <w:numPr>
+          <w:ilvl w:val="1"/>
+          <w:numId w:val="46"/>
+        </w:numPr>
+      </w:pPr>
+      <w:r>
+        <w:t>“Initial clean commit - project setup with gitignore”</w:t>
+      </w:r>
+    </w:p>
+    <w:p>
+      <w:pPr>
+        <w:pStyle w:val="NormalWeb"/>
+        <w:numPr>
+          <w:ilvl w:val="0"/>
+          <w:numId w:val="46"/>
+        </w:numPr>
+      </w:pPr>
+      <w:r>
+        <w:t>Verified clean working tree state</w:t>
+      </w:r>
+    </w:p>
+    <w:p>
+      <w:r>
+        <w:pict w14:anchorId="67C71F30">
+          <v:rect id="_x0000_i1075" style="width:0;height:1.5pt" o:hralign="center" o:hrstd="t" o:hr="t" fillcolor="#a0a0a0" stroked="f"/>
+        </w:pict>
+      </w:r>
+    </w:p>
+    <w:p>
+      <w:pPr>
+        <w:pStyle w:val="Heading2"/>
+      </w:pPr>
+      <w:r>
+        <w:rPr>
+          <w:rStyle w:val="Strong"/>
+          <w:b/>
+          <w:bCs/>
+        </w:rPr>
+        <w:t>5. Branch Standardization</w:t>
+      </w:r>
+    </w:p>
+    <w:p>
+      <w:pPr>
+        <w:pStyle w:val="NormalWeb"/>
+        <w:numPr>
+          <w:ilvl w:val="0"/>
+          <w:numId w:val="47"/>
+        </w:numPr>
+      </w:pPr>
+      <w:r>
+        <w:t xml:space="preserve">Renamed branch from </w:t>
+      </w:r>
+      <w:r>
+        <w:rPr>
+          <w:rStyle w:val="HTMLCode"/>
+          <w:rFonts w:eastAsiaTheme="majorEastAsia"/>
+        </w:rPr>
+        <w:t>master → main</w:t>
+      </w:r>
+    </w:p>
+    <w:p>
+      <w:pPr>
+        <w:pStyle w:val="NormalWeb"/>
+        <w:numPr>
+          <w:ilvl w:val="0"/>
+          <w:numId w:val="47"/>
+        </w:numPr>
+      </w:pPr>
+      <w:r>
+        <w:t>Aligned project with modern Git standards</w:t>
+      </w:r>
+    </w:p>
+    <w:p>
+      <w:r>
+        <w:pict w14:anchorId="5D0464AE">
+          <v:rect id="_x0000_i1076" style="width:0;height:1.5pt" o:hralign="center" o:hrstd="t" o:hr="t" fillcolor="#a0a0a0" stroked="f"/>
+        </w:pict>
+      </w:r>
+    </w:p>
+    <w:p>
+      <w:pPr>
+        <w:pStyle w:val="Heading2"/>
+      </w:pPr>
+      <w:r>
+        <w:rPr>
+          <w:rStyle w:val="Strong"/>
+          <w:b/>
+          <w:bCs/>
+        </w:rPr>
+        <w:t>6. Remote Synchronization</w:t>
+      </w:r>
+    </w:p>
+    <w:p>
+      <w:pPr>
+        <w:pStyle w:val="NormalWeb"/>
+        <w:numPr>
+          <w:ilvl w:val="0"/>
+          <w:numId w:val="48"/>
+        </w:numPr>
+      </w:pPr>
+      <w:r>
+        <w:lastRenderedPageBreak/>
+        <w:t>Successfully pushed full project to GitHub</w:t>
+      </w:r>
+    </w:p>
+    <w:p>
+      <w:pPr>
+        <w:pStyle w:val="NormalWeb"/>
+        <w:numPr>
+          <w:ilvl w:val="0"/>
+          <w:numId w:val="48"/>
+        </w:numPr>
+      </w:pPr>
+      <w:r>
+        <w:t>Verified:</w:t>
+      </w:r>
+    </w:p>
+    <w:p>
+      <w:pPr>
+        <w:pStyle w:val="NormalWeb"/>
+        <w:numPr>
+          <w:ilvl w:val="1"/>
+          <w:numId w:val="48"/>
+        </w:numPr>
+      </w:pPr>
+      <w:r>
+        <w:t>correct branch tracking (</w:t>
+      </w:r>
+      <w:r>
+        <w:rPr>
+          <w:rStyle w:val="HTMLCode"/>
+          <w:rFonts w:eastAsiaTheme="majorEastAsia"/>
+        </w:rPr>
+        <w:t>main → origin/main</w:t>
+      </w:r>
+      <w:r>
+        <w:t>)</w:t>
+      </w:r>
+    </w:p>
+    <w:p>
+      <w:pPr>
+        <w:pStyle w:val="NormalWeb"/>
+        <w:numPr>
+          <w:ilvl w:val="1"/>
+          <w:numId w:val="48"/>
+        </w:numPr>
+      </w:pPr>
+      <w:r>
+        <w:t>clean upload of project files</w:t>
+      </w:r>
+    </w:p>
+    <w:p>
+      <w:pPr>
+        <w:pStyle w:val="NormalWeb"/>
+        <w:numPr>
+          <w:ilvl w:val="1"/>
+          <w:numId w:val="48"/>
+        </w:numPr>
+      </w:pPr>
+      <w:r>
+        <w:t>exclusion of unwanted directories</w:t>
+      </w:r>
+    </w:p>
+    <w:p>
+      <w:r>
+        <w:pict w14:anchorId="0C9744CD">
+          <v:rect id="_x0000_i1077" style="width:0;height:1.5pt" o:hralign="center" o:hrstd="t" o:hr="t" fillcolor="#a0a0a0" stroked="f"/>
+        </w:pict>
+      </w:r>
+    </w:p>
+    <w:p>
+      <w:pPr>
+        <w:pStyle w:val="Heading2"/>
+      </w:pPr>
+      <w:r>
+        <w:rPr>
+          <w:rStyle w:val="Strong"/>
+          <w:b/>
+          <w:bCs/>
+        </w:rPr>
+        <w:t>7. Automation Script Design (</w:t>
+      </w:r>
+      <w:r>
+        <w:rPr>
+          <w:rStyle w:val="HTMLCode"/>
+          <w:rFonts w:eastAsiaTheme="majorEastAsia"/>
+        </w:rPr>
+        <w:t>update_git.py</w:t>
+      </w:r>
+      <w:r>
+        <w:rPr>
+          <w:rStyle w:val="Strong"/>
+          <w:b/>
+          <w:bCs/>
+        </w:rPr>
+        <w:t>)</w:t>
+      </w:r>
+    </w:p>
+    <w:p>
+      <w:pPr>
+        <w:pStyle w:val="NormalWeb"/>
+        <w:numPr>
+          <w:ilvl w:val="0"/>
+          <w:numId w:val="49"/>
+        </w:numPr>
+      </w:pPr>
+      <w:r>
+        <w:t>Defined a manual sync automation tool</w:t>
+      </w:r>
+    </w:p>
+    <w:p>
+      <w:pPr>
+        <w:pStyle w:val="NormalWeb"/>
+        <w:numPr>
+          <w:ilvl w:val="0"/>
+          <w:numId w:val="49"/>
+        </w:numPr>
+      </w:pPr>
+      <w:r>
+        <w:t>Implemented logic to:</w:t>
+      </w:r>
+    </w:p>
+    <w:p>
+      <w:pPr>
+        <w:pStyle w:val="NormalWeb"/>
+        <w:numPr>
+          <w:ilvl w:val="1"/>
+          <w:numId w:val="49"/>
+        </w:numPr>
+      </w:pPr>
+      <w:r>
+        <w:t>detect changes</w:t>
+      </w:r>
+    </w:p>
+    <w:p>
+      <w:pPr>
+        <w:pStyle w:val="NormalWeb"/>
+        <w:numPr>
+          <w:ilvl w:val="1"/>
+          <w:numId w:val="49"/>
+        </w:numPr>
+      </w:pPr>
+      <w:r>
+        <w:t>stage updates</w:t>
+      </w:r>
+    </w:p>
+    <w:p>
+      <w:pPr>
+        <w:pStyle w:val="NormalWeb"/>
+        <w:numPr>
+          <w:ilvl w:val="1"/>
+          <w:numId w:val="49"/>
+        </w:numPr>
+      </w:pPr>
+      <w:r>
+        <w:t>commit with timestamped message</w:t>
+      </w:r>
+    </w:p>
+    <w:p>
+      <w:pPr>
+        <w:pStyle w:val="NormalWeb"/>
+        <w:numPr>
+          <w:ilvl w:val="1"/>
+          <w:numId w:val="49"/>
+        </w:numPr>
+      </w:pPr>
+      <w:r>
+        <w:t>push to remote repository</w:t>
+      </w:r>
+    </w:p>
+    <w:p>
+      <w:pPr>
+        <w:pStyle w:val="NormalWeb"/>
+        <w:numPr>
+          <w:ilvl w:val="0"/>
+          <w:numId w:val="49"/>
+        </w:numPr>
+      </w:pPr>
+      <w:r>
+        <w:t>Added safety behavior:</w:t>
+      </w:r>
+    </w:p>
+    <w:p>
+      <w:pPr>
+        <w:pStyle w:val="NormalWeb"/>
+        <w:numPr>
+          <w:ilvl w:val="1"/>
+          <w:numId w:val="49"/>
+        </w:numPr>
+      </w:pPr>
+      <w:r>
+        <w:t xml:space="preserve">ignore </w:t>
+      </w:r>
+      <w:r>
+        <w:rPr>
+          <w:rStyle w:val="HTMLCode"/>
+          <w:rFonts w:eastAsiaTheme="majorEastAsia"/>
+        </w:rPr>
+        <w:t>venv</w:t>
+      </w:r>
+      <w:r>
+        <w:t xml:space="preserve"> and </w:t>
+      </w:r>
+      <w:r>
+        <w:rPr>
+          <w:rStyle w:val="HTMLCode"/>
+          <w:rFonts w:eastAsiaTheme="majorEastAsia"/>
+        </w:rPr>
+        <w:t>node_modules</w:t>
+      </w:r>
+      <w:r>
+        <w:t xml:space="preserve"> explicitly</w:t>
+      </w:r>
+    </w:p>
+    <w:p>
+      <w:pPr>
+        <w:pStyle w:val="NormalWeb"/>
+        <w:numPr>
+          <w:ilvl w:val="1"/>
+          <w:numId w:val="49"/>
+        </w:numPr>
+      </w:pPr>
+      <w:r>
+        <w:t>avoid committing empty states</w:t>
+      </w:r>
+    </w:p>
+    <w:p>
+      <w:r>
+        <w:pict w14:anchorId="22371AEE">
+          <v:rect id="_x0000_i1078" style="width:0;height:1.5pt" o:hralign="center" o:hrstd="t" o:hr="t" fillcolor="#a0a0a0" stroked="f"/>
+        </w:pict>
+      </w:r>
+    </w:p>
+    <w:p>
+      <w:pPr>
+        <w:pStyle w:val="Heading2"/>
+      </w:pPr>
+      <w:r>
+        <w:rPr>
+          <w:rStyle w:val="Strong"/>
+          <w:b/>
+          <w:bCs/>
+        </w:rPr>
+        <w:t>8. Conceptual Learning Achieved</w:t>
+      </w:r>
+    </w:p>
+    <w:p>
+      <w:pPr>
+        <w:pStyle w:val="NormalWeb"/>
+        <w:numPr>
+          <w:ilvl w:val="0"/>
+          <w:numId w:val="50"/>
+        </w:numPr>
+      </w:pPr>
+      <w:r>
+        <w:t>Git tracks files, not folders</w:t>
+      </w:r>
+    </w:p>
+    <w:p>
+      <w:pPr>
+        <w:pStyle w:val="NormalWeb"/>
+        <w:numPr>
+          <w:ilvl w:val="0"/>
+          <w:numId w:val="50"/>
+        </w:numPr>
+      </w:pPr>
+      <w:r>
+        <w:rPr>
+          <w:rStyle w:val="HTMLCode"/>
+          <w:rFonts w:eastAsiaTheme="majorEastAsia"/>
+        </w:rPr>
+        <w:t>.gitignore</w:t>
+      </w:r>
+      <w:r>
+        <w:t xml:space="preserve"> only affects untracked/staging behavior</w:t>
+      </w:r>
+    </w:p>
+    <w:p>
+      <w:pPr>
+        <w:pStyle w:val="NormalWeb"/>
+        <w:numPr>
+          <w:ilvl w:val="0"/>
+          <w:numId w:val="50"/>
+        </w:numPr>
+      </w:pPr>
+      <w:r>
+        <w:t>Empty directories are not versioned</w:t>
+      </w:r>
+    </w:p>
+    <w:p>
+      <w:pPr>
+        <w:pStyle w:val="NormalWeb"/>
+        <w:numPr>
+          <w:ilvl w:val="0"/>
+          <w:numId w:val="50"/>
+        </w:numPr>
+      </w:pPr>
+      <w:r>
+        <w:t>Local Git workflow vs remote synchronization model</w:t>
+      </w:r>
+    </w:p>
+    <w:p>
+      <w:pPr>
+        <w:pStyle w:val="NormalWeb"/>
+        <w:numPr>
+          <w:ilvl w:val="0"/>
+          <w:numId w:val="50"/>
+        </w:numPr>
+      </w:pPr>
+      <w:r>
+        <w:t>Difference between continuous monitoring vs manual sync automation</w:t>
+      </w:r>
+    </w:p>
+    <w:p>
+      <w:r>
+        <w:pict w14:anchorId="3710E79D">
+          <v:rect id="_x0000_i1079" style="width:0;height:1.5pt" o:hralign="center" o:hrstd="t" o:hr="t" fillcolor="#a0a0a0" stroked="f"/>
+        </w:pict>
+      </w:r>
+    </w:p>
+    <w:p>
+      <w:pPr>
+        <w:pStyle w:val="Heading2"/>
+      </w:pPr>
+      <w:r>
+        <w:rPr>
+          <w:rStyle w:val="Strong"/>
+          <w:b/>
+          <w:bCs/>
+        </w:rPr>
+        <w:t>Final Outcome</w:t>
+      </w:r>
+    </w:p>
+    <w:p>
+      <w:pPr>
+        <w:pStyle w:val="NormalWeb"/>
+      </w:pPr>
+      <w:r>
+        <w:t>You now have:</w:t>
+      </w:r>
+    </w:p>
+    <w:p>
+      <w:pPr>
+        <w:pStyle w:val="NormalWeb"/>
+        <w:numPr>
+          <w:ilvl w:val="0"/>
+          <w:numId w:val="51"/>
+        </w:numPr>
+      </w:pPr>
+      <w:r>
+        <w:t>A clean, working Git repository</w:t>
+      </w:r>
+    </w:p>
+    <w:p>
+      <w:pPr>
+        <w:pStyle w:val="NormalWeb"/>
+        <w:numPr>
+          <w:ilvl w:val="0"/>
+          <w:numId w:val="51"/>
+        </w:numPr>
+      </w:pPr>
+      <w:r>
+        <w:t>A correctly configured remote on GitHub</w:t>
+      </w:r>
+    </w:p>
+    <w:p>
+      <w:pPr>
+        <w:pStyle w:val="NormalWeb"/>
+        <w:numPr>
+          <w:ilvl w:val="0"/>
+          <w:numId w:val="51"/>
+        </w:numPr>
+      </w:pPr>
+      <w:r>
+        <w:t>A repeatable manual “sync-to-repo” script</w:t>
+      </w:r>
+    </w:p>
+    <w:p>
+      <w:pPr>
+        <w:pStyle w:val="NormalWeb"/>
+        <w:numPr>
+          <w:ilvl w:val="0"/>
+          <w:numId w:val="51"/>
+        </w:numPr>
+      </w:pPr>
+      <w:r>
+        <w:t>A functional understanding of staging, commits, and ignores</w:t>
+      </w:r>
+    </w:p>
+    <w:p>
+      <w:pPr>
+        <w:pStyle w:val="NormalWeb"/>
+        <w:numPr>
+          <w:ilvl w:val="0"/>
+          <w:numId w:val="51"/>
+        </w:numPr>
+      </w:pPr>
+      <w:r>
+        <w:t>A stable baseline development workflow for your project</w:t>
+      </w:r>
+    </w:p>
+    <w:p>
+      <w:r>
+        <w:pict w14:anchorId="1E9252FF">
+          <v:rect id="_x0000_i1080" style="width:0;height:1.5pt" o:hralign="center" o:hrstd="t" o:hr="t" fillcolor="#a0a0a0" stroked="f"/>
+        </w:pict>
+      </w:r>
+    </w:p>
+    <w:p>
+      <w:pPr>
+        <w:pStyle w:val="Heading2"/>
+      </w:pPr>
+      <w:r>
+        <w:rPr>
+          <w:rStyle w:val="Strong"/>
+          <w:b/>
+          <w:bCs/>
+        </w:rPr>
+        <w:lastRenderedPageBreak/>
+        <w:t>Overall Assessment</w:t>
+      </w:r>
+    </w:p>
+    <w:p>
+      <w:pPr>
+        <w:pStyle w:val="NormalWeb"/>
+      </w:pPr>
+      <w:r>
+        <w:t>This session did not focus on feature-building—it focused on:</w:t>
+      </w:r>
+    </w:p>
+    <w:p>
+      <w:pPr>
+        <w:pStyle w:val="NormalWeb"/>
+      </w:pPr>
+      <w:r>
+        <w:rPr>
+          <w:rStyle w:val="Strong"/>
+        </w:rPr>
+        <w:t>establishing a correct development infrastructure and version control pipeline</w:t>
+      </w:r>
+    </w:p>
+    <w:p>
+      <w:pPr>
+        <w:pStyle w:val="NormalWeb"/>
+      </w:pPr>
+      <w:r>
+        <w:t>That is the foundation layer for all future development work.</w:t>
+      </w:r>
+    </w:p>
+    <w:p>
+      <w:r>
+        <w:pict w14:anchorId="6E86B5C2">
+          <v:rect id="_x0000_i1081" style="width:0;height:1.5pt" o:hralign="center" o:hrstd="t" o:hr="t" fillcolor="#a0a0a0" stroked="f"/>
+        </w:pict>
+      </w:r>
+    </w:p>
+    <w:p>
+      <w:pPr>
+        <w:rPr>
+          <w:sz w:val="52"/>
+          <w:szCs w:val="52"/>
         </w:rPr>
       </w:pPr>
     </w:p>
@@ -6481,6 +7068,155 @@
     </w:lvl>
   </w:abstractNum>
   <w:abstractNum w:abstractNumId="1" w15:restartNumberingAfterBreak="0">
+    <w:nsid w:val="03E52080"/>
+    <w:multiLevelType w:val="multilevel"/>
+    <w:tmpl w:val="1CD430A8"/>
+    <w:lvl w:ilvl="0">
+      <w:start w:val="1"/>
+      <w:numFmt w:val="bullet"/>
+      <w:lvlText w:val=""/>
+      <w:lvlJc w:val="left"/>
+      <w:pPr>
+        <w:tabs>
+          <w:tab w:val="num" w:pos="720"/>
+        </w:tabs>
+        <w:ind w:left="720" w:hanging="360"/>
+      </w:pPr>
+      <w:rPr>
+        <w:rFonts w:ascii="Symbol" w:hAnsi="Symbol" w:hint="default"/>
+        <w:sz w:val="20"/>
+      </w:rPr>
+    </w:lvl>
+    <w:lvl w:ilvl="1" w:tentative="1">
+      <w:start w:val="1"/>
+      <w:numFmt w:val="bullet"/>
+      <w:lvlText w:val="o"/>
+      <w:lvlJc w:val="left"/>
+      <w:pPr>
+        <w:tabs>
+          <w:tab w:val="num" w:pos="1440"/>
+        </w:tabs>
+        <w:ind w:left="1440" w:hanging="360"/>
+      </w:pPr>
+      <w:rPr>
+        <w:rFonts w:ascii="Courier New" w:hAnsi="Courier New" w:hint="default"/>
+        <w:sz w:val="20"/>
+      </w:rPr>
+    </w:lvl>
+    <w:lvl w:ilvl="2" w:tentative="1">
+      <w:start w:val="1"/>
+      <w:numFmt w:val="bullet"/>
+      <w:lvlText w:val=""/>
+      <w:lvlJc w:val="left"/>
+      <w:pPr>
+        <w:tabs>
+          <w:tab w:val="num" w:pos="2160"/>
+        </w:tabs>
+        <w:ind w:left="2160" w:hanging="360"/>
+      </w:pPr>
+      <w:rPr>
+        <w:rFonts w:ascii="Wingdings" w:hAnsi="Wingdings" w:hint="default"/>
+        <w:sz w:val="20"/>
+      </w:rPr>
+    </w:lvl>
+    <w:lvl w:ilvl="3" w:tentative="1">
+      <w:start w:val="1"/>
+      <w:numFmt w:val="bullet"/>
+      <w:lvlText w:val=""/>
+      <w:lvlJc w:val="left"/>
+      <w:pPr>
+        <w:tabs>
+          <w:tab w:val="num" w:pos="2880"/>
+        </w:tabs>
+        <w:ind w:left="2880" w:hanging="360"/>
+      </w:pPr>
+      <w:rPr>
+        <w:rFonts w:ascii="Wingdings" w:hAnsi="Wingdings" w:hint="default"/>
+        <w:sz w:val="20"/>
+      </w:rPr>
+    </w:lvl>
+    <w:lvl w:ilvl="4" w:tentative="1">
+      <w:start w:val="1"/>
+      <w:numFmt w:val="bullet"/>
+      <w:lvlText w:val=""/>
+      <w:lvlJc w:val="left"/>
+      <w:pPr>
+        <w:tabs>
+          <w:tab w:val="num" w:pos="3600"/>
+        </w:tabs>
+        <w:ind w:left="3600" w:hanging="360"/>
+      </w:pPr>
+      <w:rPr>
+        <w:rFonts w:ascii="Wingdings" w:hAnsi="Wingdings" w:hint="default"/>
+        <w:sz w:val="20"/>
+      </w:rPr>
+    </w:lvl>
+    <w:lvl w:ilvl="5" w:tentative="1">
+      <w:start w:val="1"/>
+      <w:numFmt w:val="bullet"/>
+      <w:lvlText w:val=""/>
+      <w:lvlJc w:val="left"/>
+      <w:pPr>
+        <w:tabs>
+          <w:tab w:val="num" w:pos="4320"/>
+        </w:tabs>
+        <w:ind w:left="4320" w:hanging="360"/>
+      </w:pPr>
+      <w:rPr>
+        <w:rFonts w:ascii="Wingdings" w:hAnsi="Wingdings" w:hint="default"/>
+        <w:sz w:val="20"/>
+      </w:rPr>
+    </w:lvl>
+    <w:lvl w:ilvl="6" w:tentative="1">
+      <w:start w:val="1"/>
+      <w:numFmt w:val="bullet"/>
+      <w:lvlText w:val=""/>
+      <w:lvlJc w:val="left"/>
+      <w:pPr>
+        <w:tabs>
+          <w:tab w:val="num" w:pos="5040"/>
+        </w:tabs>
+        <w:ind w:left="5040" w:hanging="360"/>
+      </w:pPr>
+      <w:rPr>
+        <w:rFonts w:ascii="Wingdings" w:hAnsi="Wingdings" w:hint="default"/>
+        <w:sz w:val="20"/>
+      </w:rPr>
+    </w:lvl>
+    <w:lvl w:ilvl="7" w:tentative="1">
+      <w:start w:val="1"/>
+      <w:numFmt w:val="bullet"/>
+      <w:lvlText w:val=""/>
+      <w:lvlJc w:val="left"/>
+      <w:pPr>
+        <w:tabs>
+          <w:tab w:val="num" w:pos="5760"/>
+        </w:tabs>
+        <w:ind w:left="5760" w:hanging="360"/>
+      </w:pPr>
+      <w:rPr>
+        <w:rFonts w:ascii="Wingdings" w:hAnsi="Wingdings" w:hint="default"/>
+        <w:sz w:val="20"/>
+      </w:rPr>
+    </w:lvl>
+    <w:lvl w:ilvl="8" w:tentative="1">
+      <w:start w:val="1"/>
+      <w:numFmt w:val="bullet"/>
+      <w:lvlText w:val=""/>
+      <w:lvlJc w:val="left"/>
+      <w:pPr>
+        <w:tabs>
+          <w:tab w:val="num" w:pos="6480"/>
+        </w:tabs>
+        <w:ind w:left="6480" w:hanging="360"/>
+      </w:pPr>
+      <w:rPr>
+        <w:rFonts w:ascii="Wingdings" w:hAnsi="Wingdings" w:hint="default"/>
+        <w:sz w:val="20"/>
+      </w:rPr>
+    </w:lvl>
+  </w:abstractNum>
+  <w:abstractNum w:abstractNumId="2" w15:restartNumberingAfterBreak="0">
     <w:nsid w:val="0E5D3725"/>
     <w:multiLevelType w:val="multilevel"/>
     <w:tmpl w:val="A94A1D8E"/>
@@ -6629,7 +7365,7 @@
       </w:rPr>
     </w:lvl>
   </w:abstractNum>
-  <w:abstractNum w:abstractNumId="2" w15:restartNumberingAfterBreak="0">
+  <w:abstractNum w:abstractNumId="3" w15:restartNumberingAfterBreak="0">
     <w:nsid w:val="152A2023"/>
     <w:multiLevelType w:val="multilevel"/>
     <w:tmpl w:val="2738F738"/>
@@ -6778,7 +7514,7 @@
       </w:rPr>
     </w:lvl>
   </w:abstractNum>
-  <w:abstractNum w:abstractNumId="3" w15:restartNumberingAfterBreak="0">
+  <w:abstractNum w:abstractNumId="4" w15:restartNumberingAfterBreak="0">
     <w:nsid w:val="170F5AFB"/>
     <w:multiLevelType w:val="multilevel"/>
     <w:tmpl w:val="4FA0166C"/>
@@ -6927,7 +7663,7 @@
       </w:rPr>
     </w:lvl>
   </w:abstractNum>
-  <w:abstractNum w:abstractNumId="4" w15:restartNumberingAfterBreak="0">
+  <w:abstractNum w:abstractNumId="5" w15:restartNumberingAfterBreak="0">
     <w:nsid w:val="181C309E"/>
     <w:multiLevelType w:val="multilevel"/>
     <w:tmpl w:val="CCE8601C"/>
@@ -7076,7 +7812,7 @@
       </w:rPr>
     </w:lvl>
   </w:abstractNum>
-  <w:abstractNum w:abstractNumId="5" w15:restartNumberingAfterBreak="0">
+  <w:abstractNum w:abstractNumId="6" w15:restartNumberingAfterBreak="0">
     <w:nsid w:val="197726C7"/>
     <w:multiLevelType w:val="multilevel"/>
     <w:tmpl w:val="AE242412"/>
@@ -7225,7 +7961,7 @@
       </w:rPr>
     </w:lvl>
   </w:abstractNum>
-  <w:abstractNum w:abstractNumId="6" w15:restartNumberingAfterBreak="0">
+  <w:abstractNum w:abstractNumId="7" w15:restartNumberingAfterBreak="0">
     <w:nsid w:val="19BB5737"/>
     <w:multiLevelType w:val="multilevel"/>
     <w:tmpl w:val="6178B8B0"/>
@@ -7374,7 +8110,7 @@
       </w:rPr>
     </w:lvl>
   </w:abstractNum>
-  <w:abstractNum w:abstractNumId="7" w15:restartNumberingAfterBreak="0">
+  <w:abstractNum w:abstractNumId="8" w15:restartNumberingAfterBreak="0">
     <w:nsid w:val="1CDD0AC9"/>
     <w:multiLevelType w:val="multilevel"/>
     <w:tmpl w:val="077A5326"/>
@@ -7523,7 +8259,156 @@
       </w:rPr>
     </w:lvl>
   </w:abstractNum>
-  <w:abstractNum w:abstractNumId="8" w15:restartNumberingAfterBreak="0">
+  <w:abstractNum w:abstractNumId="9" w15:restartNumberingAfterBreak="0">
+    <w:nsid w:val="1E02629D"/>
+    <w:multiLevelType w:val="multilevel"/>
+    <w:tmpl w:val="FD181AAE"/>
+    <w:lvl w:ilvl="0">
+      <w:start w:val="1"/>
+      <w:numFmt w:val="bullet"/>
+      <w:lvlText w:val=""/>
+      <w:lvlJc w:val="left"/>
+      <w:pPr>
+        <w:tabs>
+          <w:tab w:val="num" w:pos="720"/>
+        </w:tabs>
+        <w:ind w:left="720" w:hanging="360"/>
+      </w:pPr>
+      <w:rPr>
+        <w:rFonts w:ascii="Symbol" w:hAnsi="Symbol" w:hint="default"/>
+        <w:sz w:val="20"/>
+      </w:rPr>
+    </w:lvl>
+    <w:lvl w:ilvl="1" w:tentative="1">
+      <w:start w:val="1"/>
+      <w:numFmt w:val="bullet"/>
+      <w:lvlText w:val="o"/>
+      <w:lvlJc w:val="left"/>
+      <w:pPr>
+        <w:tabs>
+          <w:tab w:val="num" w:pos="1440"/>
+        </w:tabs>
+        <w:ind w:left="1440" w:hanging="360"/>
+      </w:pPr>
+      <w:rPr>
+        <w:rFonts w:ascii="Courier New" w:hAnsi="Courier New" w:hint="default"/>
+        <w:sz w:val="20"/>
+      </w:rPr>
+    </w:lvl>
+    <w:lvl w:ilvl="2" w:tentative="1">
+      <w:start w:val="1"/>
+      <w:numFmt w:val="bullet"/>
+      <w:lvlText w:val=""/>
+      <w:lvlJc w:val="left"/>
+      <w:pPr>
+        <w:tabs>
+          <w:tab w:val="num" w:pos="2160"/>
+        </w:tabs>
+        <w:ind w:left="2160" w:hanging="360"/>
+      </w:pPr>
+      <w:rPr>
+        <w:rFonts w:ascii="Wingdings" w:hAnsi="Wingdings" w:hint="default"/>
+        <w:sz w:val="20"/>
+      </w:rPr>
+    </w:lvl>
+    <w:lvl w:ilvl="3" w:tentative="1">
+      <w:start w:val="1"/>
+      <w:numFmt w:val="bullet"/>
+      <w:lvlText w:val=""/>
+      <w:lvlJc w:val="left"/>
+      <w:pPr>
+        <w:tabs>
+          <w:tab w:val="num" w:pos="2880"/>
+        </w:tabs>
+        <w:ind w:left="2880" w:hanging="360"/>
+      </w:pPr>
+      <w:rPr>
+        <w:rFonts w:ascii="Wingdings" w:hAnsi="Wingdings" w:hint="default"/>
+        <w:sz w:val="20"/>
+      </w:rPr>
+    </w:lvl>
+    <w:lvl w:ilvl="4" w:tentative="1">
+      <w:start w:val="1"/>
+      <w:numFmt w:val="bullet"/>
+      <w:lvlText w:val=""/>
+      <w:lvlJc w:val="left"/>
+      <w:pPr>
+        <w:tabs>
+          <w:tab w:val="num" w:pos="3600"/>
+        </w:tabs>
+        <w:ind w:left="3600" w:hanging="360"/>
+      </w:pPr>
+      <w:rPr>
+        <w:rFonts w:ascii="Wingdings" w:hAnsi="Wingdings" w:hint="default"/>
+        <w:sz w:val="20"/>
+      </w:rPr>
+    </w:lvl>
+    <w:lvl w:ilvl="5" w:tentative="1">
+      <w:start w:val="1"/>
+      <w:numFmt w:val="bullet"/>
+      <w:lvlText w:val=""/>
+      <w:lvlJc w:val="left"/>
+      <w:pPr>
+        <w:tabs>
+          <w:tab w:val="num" w:pos="4320"/>
+        </w:tabs>
+        <w:ind w:left="4320" w:hanging="360"/>
+      </w:pPr>
+      <w:rPr>
+        <w:rFonts w:ascii="Wingdings" w:hAnsi="Wingdings" w:hint="default"/>
+        <w:sz w:val="20"/>
+      </w:rPr>
+    </w:lvl>
+    <w:lvl w:ilvl="6" w:tentative="1">
+      <w:start w:val="1"/>
+      <w:numFmt w:val="bullet"/>
+      <w:lvlText w:val=""/>
+      <w:lvlJc w:val="left"/>
+      <w:pPr>
+        <w:tabs>
+          <w:tab w:val="num" w:pos="5040"/>
+        </w:tabs>
+        <w:ind w:left="5040" w:hanging="360"/>
+      </w:pPr>
+      <w:rPr>
+        <w:rFonts w:ascii="Wingdings" w:hAnsi="Wingdings" w:hint="default"/>
+        <w:sz w:val="20"/>
+      </w:rPr>
+    </w:lvl>
+    <w:lvl w:ilvl="7" w:tentative="1">
+      <w:start w:val="1"/>
+      <w:numFmt w:val="bullet"/>
+      <w:lvlText w:val=""/>
+      <w:lvlJc w:val="left"/>
+      <w:pPr>
+        <w:tabs>
+          <w:tab w:val="num" w:pos="5760"/>
+        </w:tabs>
+        <w:ind w:left="5760" w:hanging="360"/>
+      </w:pPr>
+      <w:rPr>
+        <w:rFonts w:ascii="Wingdings" w:hAnsi="Wingdings" w:hint="default"/>
+        <w:sz w:val="20"/>
+      </w:rPr>
+    </w:lvl>
+    <w:lvl w:ilvl="8" w:tentative="1">
+      <w:start w:val="1"/>
+      <w:numFmt w:val="bullet"/>
+      <w:lvlText w:val=""/>
+      <w:lvlJc w:val="left"/>
+      <w:pPr>
+        <w:tabs>
+          <w:tab w:val="num" w:pos="6480"/>
+        </w:tabs>
+        <w:ind w:left="6480" w:hanging="360"/>
+      </w:pPr>
+      <w:rPr>
+        <w:rFonts w:ascii="Wingdings" w:hAnsi="Wingdings" w:hint="default"/>
+        <w:sz w:val="20"/>
+      </w:rPr>
+    </w:lvl>
+  </w:abstractNum>
+  <w:abstractNum w:abstractNumId="10" w15:restartNumberingAfterBreak="0">
     <w:nsid w:val="234E24EF"/>
     <w:multiLevelType w:val="multilevel"/>
     <w:tmpl w:val="42FC2EEE"/>
@@ -7672,7 +8557,7 @@
       </w:rPr>
     </w:lvl>
   </w:abstractNum>
-  <w:abstractNum w:abstractNumId="9" w15:restartNumberingAfterBreak="0">
+  <w:abstractNum w:abstractNumId="11" w15:restartNumberingAfterBreak="0">
     <w:nsid w:val="26BC218B"/>
     <w:multiLevelType w:val="multilevel"/>
     <w:tmpl w:val="04F0A698"/>
@@ -7821,7 +8706,7 @@
       </w:rPr>
     </w:lvl>
   </w:abstractNum>
-  <w:abstractNum w:abstractNumId="10" w15:restartNumberingAfterBreak="0">
+  <w:abstractNum w:abstractNumId="12" w15:restartNumberingAfterBreak="0">
     <w:nsid w:val="29903720"/>
     <w:multiLevelType w:val="multilevel"/>
     <w:tmpl w:val="E69469C6"/>
@@ -7970,7 +8855,7 @@
       </w:rPr>
     </w:lvl>
   </w:abstractNum>
-  <w:abstractNum w:abstractNumId="11" w15:restartNumberingAfterBreak="0">
+  <w:abstractNum w:abstractNumId="13" w15:restartNumberingAfterBreak="0">
     <w:nsid w:val="2A037951"/>
     <w:multiLevelType w:val="multilevel"/>
     <w:tmpl w:val="F6744FDA"/>
@@ -8119,7 +9004,7 @@
       </w:rPr>
     </w:lvl>
   </w:abstractNum>
-  <w:abstractNum w:abstractNumId="12" w15:restartNumberingAfterBreak="0">
+  <w:abstractNum w:abstractNumId="14" w15:restartNumberingAfterBreak="0">
     <w:nsid w:val="2B686062"/>
     <w:multiLevelType w:val="multilevel"/>
     <w:tmpl w:val="BD9C8A84"/>
@@ -8268,7 +9153,7 @@
       </w:rPr>
     </w:lvl>
   </w:abstractNum>
-  <w:abstractNum w:abstractNumId="13" w15:restartNumberingAfterBreak="0">
+  <w:abstractNum w:abstractNumId="15" w15:restartNumberingAfterBreak="0">
     <w:nsid w:val="2BBC7F70"/>
     <w:multiLevelType w:val="multilevel"/>
     <w:tmpl w:val="5ABC69CA"/>
@@ -8417,7 +9302,7 @@
       </w:rPr>
     </w:lvl>
   </w:abstractNum>
-  <w:abstractNum w:abstractNumId="14" w15:restartNumberingAfterBreak="0">
+  <w:abstractNum w:abstractNumId="16" w15:restartNumberingAfterBreak="0">
     <w:nsid w:val="31892256"/>
     <w:multiLevelType w:val="multilevel"/>
     <w:tmpl w:val="0ADCED9A"/>
@@ -8566,7 +9451,7 @@
       </w:rPr>
     </w:lvl>
   </w:abstractNum>
-  <w:abstractNum w:abstractNumId="15" w15:restartNumberingAfterBreak="0">
+  <w:abstractNum w:abstractNumId="17" w15:restartNumberingAfterBreak="0">
     <w:nsid w:val="33BE49A5"/>
     <w:multiLevelType w:val="multilevel"/>
     <w:tmpl w:val="1778D452"/>
@@ -8715,7 +9600,7 @@
       </w:rPr>
     </w:lvl>
   </w:abstractNum>
-  <w:abstractNum w:abstractNumId="16" w15:restartNumberingAfterBreak="0">
+  <w:abstractNum w:abstractNumId="18" w15:restartNumberingAfterBreak="0">
     <w:nsid w:val="347E1320"/>
     <w:multiLevelType w:val="multilevel"/>
     <w:tmpl w:val="EB44296A"/>
@@ -8864,7 +9749,156 @@
       </w:rPr>
     </w:lvl>
   </w:abstractNum>
-  <w:abstractNum w:abstractNumId="17" w15:restartNumberingAfterBreak="0">
+  <w:abstractNum w:abstractNumId="19" w15:restartNumberingAfterBreak="0">
+    <w:nsid w:val="34FB49FE"/>
+    <w:multiLevelType w:val="multilevel"/>
+    <w:tmpl w:val="C75003F8"/>
+    <w:lvl w:ilvl="0">
+      <w:start w:val="1"/>
+      <w:numFmt w:val="bullet"/>
+      <w:lvlText w:val=""/>
+      <w:lvlJc w:val="left"/>
+      <w:pPr>
+        <w:tabs>
+          <w:tab w:val="num" w:pos="720"/>
+        </w:tabs>
+        <w:ind w:left="720" w:hanging="360"/>
+      </w:pPr>
+      <w:rPr>
+        <w:rFonts w:ascii="Symbol" w:hAnsi="Symbol" w:hint="default"/>
+        <w:sz w:val="20"/>
+      </w:rPr>
+    </w:lvl>
+    <w:lvl w:ilvl="1" w:tentative="1">
+      <w:start w:val="1"/>
+      <w:numFmt w:val="bullet"/>
+      <w:lvlText w:val="o"/>
+      <w:lvlJc w:val="left"/>
+      <w:pPr>
+        <w:tabs>
+          <w:tab w:val="num" w:pos="1440"/>
+        </w:tabs>
+        <w:ind w:left="1440" w:hanging="360"/>
+      </w:pPr>
+      <w:rPr>
+        <w:rFonts w:ascii="Courier New" w:hAnsi="Courier New" w:hint="default"/>
+        <w:sz w:val="20"/>
+      </w:rPr>
+    </w:lvl>
+    <w:lvl w:ilvl="2" w:tentative="1">
+      <w:start w:val="1"/>
+      <w:numFmt w:val="bullet"/>
+      <w:lvlText w:val=""/>
+      <w:lvlJc w:val="left"/>
+      <w:pPr>
+        <w:tabs>
+          <w:tab w:val="num" w:pos="2160"/>
+        </w:tabs>
+        <w:ind w:left="2160" w:hanging="360"/>
+      </w:pPr>
+      <w:rPr>
+        <w:rFonts w:ascii="Wingdings" w:hAnsi="Wingdings" w:hint="default"/>
+        <w:sz w:val="20"/>
+      </w:rPr>
+    </w:lvl>
+    <w:lvl w:ilvl="3" w:tentative="1">
+      <w:start w:val="1"/>
+      <w:numFmt w:val="bullet"/>
+      <w:lvlText w:val=""/>
+      <w:lvlJc w:val="left"/>
+      <w:pPr>
+        <w:tabs>
+          <w:tab w:val="num" w:pos="2880"/>
+        </w:tabs>
+        <w:ind w:left="2880" w:hanging="360"/>
+      </w:pPr>
+      <w:rPr>
+        <w:rFonts w:ascii="Wingdings" w:hAnsi="Wingdings" w:hint="default"/>
+        <w:sz w:val="20"/>
+      </w:rPr>
+    </w:lvl>
+    <w:lvl w:ilvl="4" w:tentative="1">
+      <w:start w:val="1"/>
+      <w:numFmt w:val="bullet"/>
+      <w:lvlText w:val=""/>
+      <w:lvlJc w:val="left"/>
+      <w:pPr>
+        <w:tabs>
+          <w:tab w:val="num" w:pos="3600"/>
+        </w:tabs>
+        <w:ind w:left="3600" w:hanging="360"/>
+      </w:pPr>
+      <w:rPr>
+        <w:rFonts w:ascii="Wingdings" w:hAnsi="Wingdings" w:hint="default"/>
+        <w:sz w:val="20"/>
+      </w:rPr>
+    </w:lvl>
+    <w:lvl w:ilvl="5" w:tentative="1">
+      <w:start w:val="1"/>
+      <w:numFmt w:val="bullet"/>
+      <w:lvlText w:val=""/>
+      <w:lvlJc w:val="left"/>
+      <w:pPr>
+        <w:tabs>
+          <w:tab w:val="num" w:pos="4320"/>
+        </w:tabs>
+        <w:ind w:left="4320" w:hanging="360"/>
+      </w:pPr>
+      <w:rPr>
+        <w:rFonts w:ascii="Wingdings" w:hAnsi="Wingdings" w:hint="default"/>
+        <w:sz w:val="20"/>
+      </w:rPr>
+    </w:lvl>
+    <w:lvl w:ilvl="6" w:tentative="1">
+      <w:start w:val="1"/>
+      <w:numFmt w:val="bullet"/>
+      <w:lvlText w:val=""/>
+      <w:lvlJc w:val="left"/>
+      <w:pPr>
+        <w:tabs>
+          <w:tab w:val="num" w:pos="5040"/>
+        </w:tabs>
+        <w:ind w:left="5040" w:hanging="360"/>
+      </w:pPr>
+      <w:rPr>
+        <w:rFonts w:ascii="Wingdings" w:hAnsi="Wingdings" w:hint="default"/>
+        <w:sz w:val="20"/>
+      </w:rPr>
+    </w:lvl>
+    <w:lvl w:ilvl="7" w:tentative="1">
+      <w:start w:val="1"/>
+      <w:numFmt w:val="bullet"/>
+      <w:lvlText w:val=""/>
+      <w:lvlJc w:val="left"/>
+      <w:pPr>
+        <w:tabs>
+          <w:tab w:val="num" w:pos="5760"/>
+        </w:tabs>
+        <w:ind w:left="5760" w:hanging="360"/>
+      </w:pPr>
+      <w:rPr>
+        <w:rFonts w:ascii="Wingdings" w:hAnsi="Wingdings" w:hint="default"/>
+        <w:sz w:val="20"/>
+      </w:rPr>
+    </w:lvl>
+    <w:lvl w:ilvl="8" w:tentative="1">
+      <w:start w:val="1"/>
+      <w:numFmt w:val="bullet"/>
+      <w:lvlText w:val=""/>
+      <w:lvlJc w:val="left"/>
+      <w:pPr>
+        <w:tabs>
+          <w:tab w:val="num" w:pos="6480"/>
+        </w:tabs>
+        <w:ind w:left="6480" w:hanging="360"/>
+      </w:pPr>
+      <w:rPr>
+        <w:rFonts w:ascii="Wingdings" w:hAnsi="Wingdings" w:hint="default"/>
+        <w:sz w:val="20"/>
+      </w:rPr>
+    </w:lvl>
+  </w:abstractNum>
+  <w:abstractNum w:abstractNumId="20" w15:restartNumberingAfterBreak="0">
     <w:nsid w:val="3BEB578A"/>
     <w:multiLevelType w:val="multilevel"/>
     <w:tmpl w:val="418E5F56"/>
@@ -9013,7 +10047,7 @@
       </w:rPr>
     </w:lvl>
   </w:abstractNum>
-  <w:abstractNum w:abstractNumId="18" w15:restartNumberingAfterBreak="0">
+  <w:abstractNum w:abstractNumId="21" w15:restartNumberingAfterBreak="0">
     <w:nsid w:val="3D5C293C"/>
     <w:multiLevelType w:val="multilevel"/>
     <w:tmpl w:val="1500FEFA"/>
@@ -9162,7 +10196,156 @@
       </w:rPr>
     </w:lvl>
   </w:abstractNum>
-  <w:abstractNum w:abstractNumId="19" w15:restartNumberingAfterBreak="0">
+  <w:abstractNum w:abstractNumId="22" w15:restartNumberingAfterBreak="0">
+    <w:nsid w:val="3F491717"/>
+    <w:multiLevelType w:val="multilevel"/>
+    <w:tmpl w:val="F37C5BAC"/>
+    <w:lvl w:ilvl="0">
+      <w:start w:val="1"/>
+      <w:numFmt w:val="bullet"/>
+      <w:lvlText w:val=""/>
+      <w:lvlJc w:val="left"/>
+      <w:pPr>
+        <w:tabs>
+          <w:tab w:val="num" w:pos="720"/>
+        </w:tabs>
+        <w:ind w:left="720" w:hanging="360"/>
+      </w:pPr>
+      <w:rPr>
+        <w:rFonts w:ascii="Symbol" w:hAnsi="Symbol" w:hint="default"/>
+        <w:sz w:val="20"/>
+      </w:rPr>
+    </w:lvl>
+    <w:lvl w:ilvl="1">
+      <w:start w:val="1"/>
+      <w:numFmt w:val="bullet"/>
+      <w:lvlText w:val="o"/>
+      <w:lvlJc w:val="left"/>
+      <w:pPr>
+        <w:tabs>
+          <w:tab w:val="num" w:pos="1440"/>
+        </w:tabs>
+        <w:ind w:left="1440" w:hanging="360"/>
+      </w:pPr>
+      <w:rPr>
+        <w:rFonts w:ascii="Courier New" w:hAnsi="Courier New" w:hint="default"/>
+        <w:sz w:val="20"/>
+      </w:rPr>
+    </w:lvl>
+    <w:lvl w:ilvl="2" w:tentative="1">
+      <w:start w:val="1"/>
+      <w:numFmt w:val="bullet"/>
+      <w:lvlText w:val=""/>
+      <w:lvlJc w:val="left"/>
+      <w:pPr>
+        <w:tabs>
+          <w:tab w:val="num" w:pos="2160"/>
+        </w:tabs>
+        <w:ind w:left="2160" w:hanging="360"/>
+      </w:pPr>
+      <w:rPr>
+        <w:rFonts w:ascii="Wingdings" w:hAnsi="Wingdings" w:hint="default"/>
+        <w:sz w:val="20"/>
+      </w:rPr>
+    </w:lvl>
+    <w:lvl w:ilvl="3" w:tentative="1">
+      <w:start w:val="1"/>
+      <w:numFmt w:val="bullet"/>
+      <w:lvlText w:val=""/>
+      <w:lvlJc w:val="left"/>
+      <w:pPr>
+        <w:tabs>
+          <w:tab w:val="num" w:pos="2880"/>
+        </w:tabs>
+        <w:ind w:left="2880" w:hanging="360"/>
+      </w:pPr>
+      <w:rPr>
+        <w:rFonts w:ascii="Wingdings" w:hAnsi="Wingdings" w:hint="default"/>
+        <w:sz w:val="20"/>
+      </w:rPr>
+    </w:lvl>
+    <w:lvl w:ilvl="4" w:tentative="1">
+      <w:start w:val="1"/>
+      <w:numFmt w:val="bullet"/>
+      <w:lvlText w:val=""/>
+      <w:lvlJc w:val="left"/>
+      <w:pPr>
+        <w:tabs>
+          <w:tab w:val="num" w:pos="3600"/>
+        </w:tabs>
+        <w:ind w:left="3600" w:hanging="360"/>
+      </w:pPr>
+      <w:rPr>
+        <w:rFonts w:ascii="Wingdings" w:hAnsi="Wingdings" w:hint="default"/>
+        <w:sz w:val="20"/>
+      </w:rPr>
+    </w:lvl>
+    <w:lvl w:ilvl="5" w:tentative="1">
+      <w:start w:val="1"/>
+      <w:numFmt w:val="bullet"/>
+      <w:lvlText w:val=""/>
+      <w:lvlJc w:val="left"/>
+      <w:pPr>
+        <w:tabs>
+          <w:tab w:val="num" w:pos="4320"/>
+        </w:tabs>
+        <w:ind w:left="4320" w:hanging="360"/>
+      </w:pPr>
+      <w:rPr>
+        <w:rFonts w:ascii="Wingdings" w:hAnsi="Wingdings" w:hint="default"/>
+        <w:sz w:val="20"/>
+      </w:rPr>
+    </w:lvl>
+    <w:lvl w:ilvl="6" w:tentative="1">
+      <w:start w:val="1"/>
+      <w:numFmt w:val="bullet"/>
+      <w:lvlText w:val=""/>
+      <w:lvlJc w:val="left"/>
+      <w:pPr>
+        <w:tabs>
+          <w:tab w:val="num" w:pos="5040"/>
+        </w:tabs>
+        <w:ind w:left="5040" w:hanging="360"/>
+      </w:pPr>
+      <w:rPr>
+        <w:rFonts w:ascii="Wingdings" w:hAnsi="Wingdings" w:hint="default"/>
+        <w:sz w:val="20"/>
+      </w:rPr>
+    </w:lvl>
+    <w:lvl w:ilvl="7" w:tentative="1">
+      <w:start w:val="1"/>
+      <w:numFmt w:val="bullet"/>
+      <w:lvlText w:val=""/>
+      <w:lvlJc w:val="left"/>
+      <w:pPr>
+        <w:tabs>
+          <w:tab w:val="num" w:pos="5760"/>
+        </w:tabs>
+        <w:ind w:left="5760" w:hanging="360"/>
+      </w:pPr>
+      <w:rPr>
+        <w:rFonts w:ascii="Wingdings" w:hAnsi="Wingdings" w:hint="default"/>
+        <w:sz w:val="20"/>
+      </w:rPr>
+    </w:lvl>
+    <w:lvl w:ilvl="8" w:tentative="1">
+      <w:start w:val="1"/>
+      <w:numFmt w:val="bullet"/>
+      <w:lvlText w:val=""/>
+      <w:lvlJc w:val="left"/>
+      <w:pPr>
+        <w:tabs>
+          <w:tab w:val="num" w:pos="6480"/>
+        </w:tabs>
+        <w:ind w:left="6480" w:hanging="360"/>
+      </w:pPr>
+      <w:rPr>
+        <w:rFonts w:ascii="Wingdings" w:hAnsi="Wingdings" w:hint="default"/>
+        <w:sz w:val="20"/>
+      </w:rPr>
+    </w:lvl>
+  </w:abstractNum>
+  <w:abstractNum w:abstractNumId="23" w15:restartNumberingAfterBreak="0">
     <w:nsid w:val="3FBE1FE5"/>
     <w:multiLevelType w:val="multilevel"/>
     <w:tmpl w:val="74A44AC2"/>
@@ -9311,7 +10494,7 @@
       </w:rPr>
     </w:lvl>
   </w:abstractNum>
-  <w:abstractNum w:abstractNumId="20" w15:restartNumberingAfterBreak="0">
+  <w:abstractNum w:abstractNumId="24" w15:restartNumberingAfterBreak="0">
     <w:nsid w:val="4022142D"/>
     <w:multiLevelType w:val="multilevel"/>
     <w:tmpl w:val="91CE0946"/>
@@ -9460,7 +10643,7 @@
       </w:rPr>
     </w:lvl>
   </w:abstractNum>
-  <w:abstractNum w:abstractNumId="21" w15:restartNumberingAfterBreak="0">
+  <w:abstractNum w:abstractNumId="25" w15:restartNumberingAfterBreak="0">
     <w:nsid w:val="42295FD5"/>
     <w:multiLevelType w:val="multilevel"/>
     <w:tmpl w:val="5678AC2C"/>
@@ -9609,7 +10792,7 @@
       </w:rPr>
     </w:lvl>
   </w:abstractNum>
-  <w:abstractNum w:abstractNumId="22" w15:restartNumberingAfterBreak="0">
+  <w:abstractNum w:abstractNumId="26" w15:restartNumberingAfterBreak="0">
     <w:nsid w:val="486D547F"/>
     <w:multiLevelType w:val="multilevel"/>
     <w:tmpl w:val="8CE231FA"/>
@@ -9758,7 +10941,7 @@
       </w:rPr>
     </w:lvl>
   </w:abstractNum>
-  <w:abstractNum w:abstractNumId="23" w15:restartNumberingAfterBreak="0">
+  <w:abstractNum w:abstractNumId="27" w15:restartNumberingAfterBreak="0">
     <w:nsid w:val="4E072FF2"/>
     <w:multiLevelType w:val="multilevel"/>
     <w:tmpl w:val="0570E538"/>
@@ -9907,7 +11090,7 @@
       </w:rPr>
     </w:lvl>
   </w:abstractNum>
-  <w:abstractNum w:abstractNumId="24" w15:restartNumberingAfterBreak="0">
+  <w:abstractNum w:abstractNumId="28" w15:restartNumberingAfterBreak="0">
     <w:nsid w:val="4E84565A"/>
     <w:multiLevelType w:val="multilevel"/>
     <w:tmpl w:val="E7BEE546"/>
@@ -10056,7 +11239,7 @@
       </w:rPr>
     </w:lvl>
   </w:abstractNum>
-  <w:abstractNum w:abstractNumId="25" w15:restartNumberingAfterBreak="0">
+  <w:abstractNum w:abstractNumId="29" w15:restartNumberingAfterBreak="0">
     <w:nsid w:val="53982AAB"/>
     <w:multiLevelType w:val="multilevel"/>
     <w:tmpl w:val="3BE8998E"/>
@@ -10205,7 +11388,7 @@
       </w:rPr>
     </w:lvl>
   </w:abstractNum>
-  <w:abstractNum w:abstractNumId="26" w15:restartNumberingAfterBreak="0">
+  <w:abstractNum w:abstractNumId="30" w15:restartNumberingAfterBreak="0">
     <w:nsid w:val="54064360"/>
     <w:multiLevelType w:val="multilevel"/>
     <w:tmpl w:val="E56AAC72"/>
@@ -10354,7 +11537,305 @@
       </w:rPr>
     </w:lvl>
   </w:abstractNum>
-  <w:abstractNum w:abstractNumId="27" w15:restartNumberingAfterBreak="0">
+  <w:abstractNum w:abstractNumId="31" w15:restartNumberingAfterBreak="0">
+    <w:nsid w:val="5CDE7704"/>
+    <w:multiLevelType w:val="multilevel"/>
+    <w:tmpl w:val="5E9054A0"/>
+    <w:lvl w:ilvl="0">
+      <w:start w:val="1"/>
+      <w:numFmt w:val="bullet"/>
+      <w:lvlText w:val=""/>
+      <w:lvlJc w:val="left"/>
+      <w:pPr>
+        <w:tabs>
+          <w:tab w:val="num" w:pos="720"/>
+        </w:tabs>
+        <w:ind w:left="720" w:hanging="360"/>
+      </w:pPr>
+      <w:rPr>
+        <w:rFonts w:ascii="Symbol" w:hAnsi="Symbol" w:hint="default"/>
+        <w:sz w:val="20"/>
+      </w:rPr>
+    </w:lvl>
+    <w:lvl w:ilvl="1">
+      <w:start w:val="1"/>
+      <w:numFmt w:val="bullet"/>
+      <w:lvlText w:val="o"/>
+      <w:lvlJc w:val="left"/>
+      <w:pPr>
+        <w:tabs>
+          <w:tab w:val="num" w:pos="1440"/>
+        </w:tabs>
+        <w:ind w:left="1440" w:hanging="360"/>
+      </w:pPr>
+      <w:rPr>
+        <w:rFonts w:ascii="Courier New" w:hAnsi="Courier New" w:hint="default"/>
+        <w:sz w:val="20"/>
+      </w:rPr>
+    </w:lvl>
+    <w:lvl w:ilvl="2" w:tentative="1">
+      <w:start w:val="1"/>
+      <w:numFmt w:val="bullet"/>
+      <w:lvlText w:val=""/>
+      <w:lvlJc w:val="left"/>
+      <w:pPr>
+        <w:tabs>
+          <w:tab w:val="num" w:pos="2160"/>
+        </w:tabs>
+        <w:ind w:left="2160" w:hanging="360"/>
+      </w:pPr>
+      <w:rPr>
+        <w:rFonts w:ascii="Wingdings" w:hAnsi="Wingdings" w:hint="default"/>
+        <w:sz w:val="20"/>
+      </w:rPr>
+    </w:lvl>
+    <w:lvl w:ilvl="3" w:tentative="1">
+      <w:start w:val="1"/>
+      <w:numFmt w:val="bullet"/>
+      <w:lvlText w:val=""/>
+      <w:lvlJc w:val="left"/>
+      <w:pPr>
+        <w:tabs>
+          <w:tab w:val="num" w:pos="2880"/>
+        </w:tabs>
+        <w:ind w:left="2880" w:hanging="360"/>
+      </w:pPr>
+      <w:rPr>
+        <w:rFonts w:ascii="Wingdings" w:hAnsi="Wingdings" w:hint="default"/>
+        <w:sz w:val="20"/>
+      </w:rPr>
+    </w:lvl>
+    <w:lvl w:ilvl="4" w:tentative="1">
+      <w:start w:val="1"/>
+      <w:numFmt w:val="bullet"/>
+      <w:lvlText w:val=""/>
+      <w:lvlJc w:val="left"/>
+      <w:pPr>
+        <w:tabs>
+          <w:tab w:val="num" w:pos="3600"/>
+        </w:tabs>
+        <w:ind w:left="3600" w:hanging="360"/>
+      </w:pPr>
+      <w:rPr>
+        <w:rFonts w:ascii="Wingdings" w:hAnsi="Wingdings" w:hint="default"/>
+        <w:sz w:val="20"/>
+      </w:rPr>
+    </w:lvl>
+    <w:lvl w:ilvl="5" w:tentative="1">
+      <w:start w:val="1"/>
+      <w:numFmt w:val="bullet"/>
+      <w:lvlText w:val=""/>
+      <w:lvlJc w:val="left"/>
+      <w:pPr>
+        <w:tabs>
+          <w:tab w:val="num" w:pos="4320"/>
+        </w:tabs>
+        <w:ind w:left="4320" w:hanging="360"/>
+      </w:pPr>
+      <w:rPr>
+        <w:rFonts w:ascii="Wingdings" w:hAnsi="Wingdings" w:hint="default"/>
+        <w:sz w:val="20"/>
+      </w:rPr>
+    </w:lvl>
+    <w:lvl w:ilvl="6" w:tentative="1">
+      <w:start w:val="1"/>
+      <w:numFmt w:val="bullet"/>
+      <w:lvlText w:val=""/>
+      <w:lvlJc w:val="left"/>
+      <w:pPr>
+        <w:tabs>
+          <w:tab w:val="num" w:pos="5040"/>
+        </w:tabs>
+        <w:ind w:left="5040" w:hanging="360"/>
+      </w:pPr>
+      <w:rPr>
+        <w:rFonts w:ascii="Wingdings" w:hAnsi="Wingdings" w:hint="default"/>
+        <w:sz w:val="20"/>
+      </w:rPr>
+    </w:lvl>
+    <w:lvl w:ilvl="7" w:tentative="1">
+      <w:start w:val="1"/>
+      <w:numFmt w:val="bullet"/>
+      <w:lvlText w:val=""/>
+      <w:lvlJc w:val="left"/>
+      <w:pPr>
+        <w:tabs>
+          <w:tab w:val="num" w:pos="5760"/>
+        </w:tabs>
+        <w:ind w:left="5760" w:hanging="360"/>
+      </w:pPr>
+      <w:rPr>
+        <w:rFonts w:ascii="Wingdings" w:hAnsi="Wingdings" w:hint="default"/>
+        <w:sz w:val="20"/>
+      </w:rPr>
+    </w:lvl>
+    <w:lvl w:ilvl="8" w:tentative="1">
+      <w:start w:val="1"/>
+      <w:numFmt w:val="bullet"/>
+      <w:lvlText w:val=""/>
+      <w:lvlJc w:val="left"/>
+      <w:pPr>
+        <w:tabs>
+          <w:tab w:val="num" w:pos="6480"/>
+        </w:tabs>
+        <w:ind w:left="6480" w:hanging="360"/>
+      </w:pPr>
+      <w:rPr>
+        <w:rFonts w:ascii="Wingdings" w:hAnsi="Wingdings" w:hint="default"/>
+        <w:sz w:val="20"/>
+      </w:rPr>
+    </w:lvl>
+  </w:abstractNum>
+  <w:abstractNum w:abstractNumId="32" w15:restartNumberingAfterBreak="0">
+    <w:nsid w:val="5E6341BC"/>
+    <w:multiLevelType w:val="multilevel"/>
+    <w:tmpl w:val="FC52693A"/>
+    <w:lvl w:ilvl="0">
+      <w:start w:val="1"/>
+      <w:numFmt w:val="bullet"/>
+      <w:lvlText w:val=""/>
+      <w:lvlJc w:val="left"/>
+      <w:pPr>
+        <w:tabs>
+          <w:tab w:val="num" w:pos="720"/>
+        </w:tabs>
+        <w:ind w:left="720" w:hanging="360"/>
+      </w:pPr>
+      <w:rPr>
+        <w:rFonts w:ascii="Symbol" w:hAnsi="Symbol" w:hint="default"/>
+        <w:sz w:val="20"/>
+      </w:rPr>
+    </w:lvl>
+    <w:lvl w:ilvl="1">
+      <w:start w:val="1"/>
+      <w:numFmt w:val="bullet"/>
+      <w:lvlText w:val="o"/>
+      <w:lvlJc w:val="left"/>
+      <w:pPr>
+        <w:tabs>
+          <w:tab w:val="num" w:pos="1440"/>
+        </w:tabs>
+        <w:ind w:left="1440" w:hanging="360"/>
+      </w:pPr>
+      <w:rPr>
+        <w:rFonts w:ascii="Courier New" w:hAnsi="Courier New" w:hint="default"/>
+        <w:sz w:val="20"/>
+      </w:rPr>
+    </w:lvl>
+    <w:lvl w:ilvl="2" w:tentative="1">
+      <w:start w:val="1"/>
+      <w:numFmt w:val="bullet"/>
+      <w:lvlText w:val=""/>
+      <w:lvlJc w:val="left"/>
+      <w:pPr>
+        <w:tabs>
+          <w:tab w:val="num" w:pos="2160"/>
+        </w:tabs>
+        <w:ind w:left="2160" w:hanging="360"/>
+      </w:pPr>
+      <w:rPr>
+        <w:rFonts w:ascii="Wingdings" w:hAnsi="Wingdings" w:hint="default"/>
+        <w:sz w:val="20"/>
+      </w:rPr>
+    </w:lvl>
+    <w:lvl w:ilvl="3" w:tentative="1">
+      <w:start w:val="1"/>
+      <w:numFmt w:val="bullet"/>
+      <w:lvlText w:val=""/>
+      <w:lvlJc w:val="left"/>
+      <w:pPr>
+        <w:tabs>
+          <w:tab w:val="num" w:pos="2880"/>
+        </w:tabs>
+        <w:ind w:left="2880" w:hanging="360"/>
+      </w:pPr>
+      <w:rPr>
+        <w:rFonts w:ascii="Wingdings" w:hAnsi="Wingdings" w:hint="default"/>
+        <w:sz w:val="20"/>
+      </w:rPr>
+    </w:lvl>
+    <w:lvl w:ilvl="4" w:tentative="1">
+      <w:start w:val="1"/>
+      <w:numFmt w:val="bullet"/>
+      <w:lvlText w:val=""/>
+      <w:lvlJc w:val="left"/>
+      <w:pPr>
+        <w:tabs>
+          <w:tab w:val="num" w:pos="3600"/>
+        </w:tabs>
+        <w:ind w:left="3600" w:hanging="360"/>
+      </w:pPr>
+      <w:rPr>
+        <w:rFonts w:ascii="Wingdings" w:hAnsi="Wingdings" w:hint="default"/>
+        <w:sz w:val="20"/>
+      </w:rPr>
+    </w:lvl>
+    <w:lvl w:ilvl="5" w:tentative="1">
+      <w:start w:val="1"/>
+      <w:numFmt w:val="bullet"/>
+      <w:lvlText w:val=""/>
+      <w:lvlJc w:val="left"/>
+      <w:pPr>
+        <w:tabs>
+          <w:tab w:val="num" w:pos="4320"/>
+        </w:tabs>
+        <w:ind w:left="4320" w:hanging="360"/>
+      </w:pPr>
+      <w:rPr>
+        <w:rFonts w:ascii="Wingdings" w:hAnsi="Wingdings" w:hint="default"/>
+        <w:sz w:val="20"/>
+      </w:rPr>
+    </w:lvl>
+    <w:lvl w:ilvl="6" w:tentative="1">
+      <w:start w:val="1"/>
+      <w:numFmt w:val="bullet"/>
+      <w:lvlText w:val=""/>
+      <w:lvlJc w:val="left"/>
+      <w:pPr>
+        <w:tabs>
+          <w:tab w:val="num" w:pos="5040"/>
+        </w:tabs>
+        <w:ind w:left="5040" w:hanging="360"/>
+      </w:pPr>
+      <w:rPr>
+        <w:rFonts w:ascii="Wingdings" w:hAnsi="Wingdings" w:hint="default"/>
+        <w:sz w:val="20"/>
+      </w:rPr>
+    </w:lvl>
+    <w:lvl w:ilvl="7" w:tentative="1">
+      <w:start w:val="1"/>
+      <w:numFmt w:val="bullet"/>
+      <w:lvlText w:val=""/>
+      <w:lvlJc w:val="left"/>
+      <w:pPr>
+        <w:tabs>
+          <w:tab w:val="num" w:pos="5760"/>
+        </w:tabs>
+        <w:ind w:left="5760" w:hanging="360"/>
+      </w:pPr>
+      <w:rPr>
+        <w:rFonts w:ascii="Wingdings" w:hAnsi="Wingdings" w:hint="default"/>
+        <w:sz w:val="20"/>
+      </w:rPr>
+    </w:lvl>
+    <w:lvl w:ilvl="8" w:tentative="1">
+      <w:start w:val="1"/>
+      <w:numFmt w:val="bullet"/>
+      <w:lvlText w:val=""/>
+      <w:lvlJc w:val="left"/>
+      <w:pPr>
+        <w:tabs>
+          <w:tab w:val="num" w:pos="6480"/>
+        </w:tabs>
+        <w:ind w:left="6480" w:hanging="360"/>
+      </w:pPr>
+      <w:rPr>
+        <w:rFonts w:ascii="Wingdings" w:hAnsi="Wingdings" w:hint="default"/>
+        <w:sz w:val="20"/>
+      </w:rPr>
+    </w:lvl>
+  </w:abstractNum>
+  <w:abstractNum w:abstractNumId="33" w15:restartNumberingAfterBreak="0">
     <w:nsid w:val="5FB26915"/>
     <w:multiLevelType w:val="multilevel"/>
     <w:tmpl w:val="1DD4BD44"/>
@@ -10503,7 +11984,7 @@
       </w:rPr>
     </w:lvl>
   </w:abstractNum>
-  <w:abstractNum w:abstractNumId="28" w15:restartNumberingAfterBreak="0">
+  <w:abstractNum w:abstractNumId="34" w15:restartNumberingAfterBreak="0">
     <w:nsid w:val="605C6834"/>
     <w:multiLevelType w:val="multilevel"/>
     <w:tmpl w:val="A288BBDE"/>
@@ -10652,7 +12133,7 @@
       </w:rPr>
     </w:lvl>
   </w:abstractNum>
-  <w:abstractNum w:abstractNumId="29" w15:restartNumberingAfterBreak="0">
+  <w:abstractNum w:abstractNumId="35" w15:restartNumberingAfterBreak="0">
     <w:nsid w:val="638127B1"/>
     <w:multiLevelType w:val="multilevel"/>
     <w:tmpl w:val="E6A4D87E"/>
@@ -10801,7 +12282,7 @@
       </w:rPr>
     </w:lvl>
   </w:abstractNum>
-  <w:abstractNum w:abstractNumId="30" w15:restartNumberingAfterBreak="0">
+  <w:abstractNum w:abstractNumId="36" w15:restartNumberingAfterBreak="0">
     <w:nsid w:val="63FD2244"/>
     <w:multiLevelType w:val="multilevel"/>
     <w:tmpl w:val="7A78F2A4"/>
@@ -10950,7 +12431,7 @@
       </w:rPr>
     </w:lvl>
   </w:abstractNum>
-  <w:abstractNum w:abstractNumId="31" w15:restartNumberingAfterBreak="0">
+  <w:abstractNum w:abstractNumId="37" w15:restartNumberingAfterBreak="0">
     <w:nsid w:val="647661AA"/>
     <w:multiLevelType w:val="multilevel"/>
     <w:tmpl w:val="2530F62C"/>
@@ -11099,7 +12580,156 @@
       </w:rPr>
     </w:lvl>
   </w:abstractNum>
-  <w:abstractNum w:abstractNumId="32" w15:restartNumberingAfterBreak="0">
+  <w:abstractNum w:abstractNumId="38" w15:restartNumberingAfterBreak="0">
+    <w:nsid w:val="64D34A4E"/>
+    <w:multiLevelType w:val="multilevel"/>
+    <w:tmpl w:val="BB4270B8"/>
+    <w:lvl w:ilvl="0">
+      <w:start w:val="1"/>
+      <w:numFmt w:val="bullet"/>
+      <w:lvlText w:val=""/>
+      <w:lvlJc w:val="left"/>
+      <w:pPr>
+        <w:tabs>
+          <w:tab w:val="num" w:pos="720"/>
+        </w:tabs>
+        <w:ind w:left="720" w:hanging="360"/>
+      </w:pPr>
+      <w:rPr>
+        <w:rFonts w:ascii="Symbol" w:hAnsi="Symbol" w:hint="default"/>
+        <w:sz w:val="20"/>
+      </w:rPr>
+    </w:lvl>
+    <w:lvl w:ilvl="1" w:tentative="1">
+      <w:start w:val="1"/>
+      <w:numFmt w:val="bullet"/>
+      <w:lvlText w:val="o"/>
+      <w:lvlJc w:val="left"/>
+      <w:pPr>
+        <w:tabs>
+          <w:tab w:val="num" w:pos="1440"/>
+        </w:tabs>
+        <w:ind w:left="1440" w:hanging="360"/>
+      </w:pPr>
+      <w:rPr>
+        <w:rFonts w:ascii="Courier New" w:hAnsi="Courier New" w:hint="default"/>
+        <w:sz w:val="20"/>
+      </w:rPr>
+    </w:lvl>
+    <w:lvl w:ilvl="2" w:tentative="1">
+      <w:start w:val="1"/>
+      <w:numFmt w:val="bullet"/>
+      <w:lvlText w:val=""/>
+      <w:lvlJc w:val="left"/>
+      <w:pPr>
+        <w:tabs>
+          <w:tab w:val="num" w:pos="2160"/>
+        </w:tabs>
+        <w:ind w:left="2160" w:hanging="360"/>
+      </w:pPr>
+      <w:rPr>
+        <w:rFonts w:ascii="Wingdings" w:hAnsi="Wingdings" w:hint="default"/>
+        <w:sz w:val="20"/>
+      </w:rPr>
+    </w:lvl>
+    <w:lvl w:ilvl="3" w:tentative="1">
+      <w:start w:val="1"/>
+      <w:numFmt w:val="bullet"/>
+      <w:lvlText w:val=""/>
+      <w:lvlJc w:val="left"/>
+      <w:pPr>
+        <w:tabs>
+          <w:tab w:val="num" w:pos="2880"/>
+        </w:tabs>
+        <w:ind w:left="2880" w:hanging="360"/>
+      </w:pPr>
+      <w:rPr>
+        <w:rFonts w:ascii="Wingdings" w:hAnsi="Wingdings" w:hint="default"/>
+        <w:sz w:val="20"/>
+      </w:rPr>
+    </w:lvl>
+    <w:lvl w:ilvl="4" w:tentative="1">
+      <w:start w:val="1"/>
+      <w:numFmt w:val="bullet"/>
+      <w:lvlText w:val=""/>
+      <w:lvlJc w:val="left"/>
+      <w:pPr>
+        <w:tabs>
+          <w:tab w:val="num" w:pos="3600"/>
+        </w:tabs>
+        <w:ind w:left="3600" w:hanging="360"/>
+      </w:pPr>
+      <w:rPr>
+        <w:rFonts w:ascii="Wingdings" w:hAnsi="Wingdings" w:hint="default"/>
+        <w:sz w:val="20"/>
+      </w:rPr>
+    </w:lvl>
+    <w:lvl w:ilvl="5" w:tentative="1">
+      <w:start w:val="1"/>
+      <w:numFmt w:val="bullet"/>
+      <w:lvlText w:val=""/>
+      <w:lvlJc w:val="left"/>
+      <w:pPr>
+        <w:tabs>
+          <w:tab w:val="num" w:pos="4320"/>
+        </w:tabs>
+        <w:ind w:left="4320" w:hanging="360"/>
+      </w:pPr>
+      <w:rPr>
+        <w:rFonts w:ascii="Wingdings" w:hAnsi="Wingdings" w:hint="default"/>
+        <w:sz w:val="20"/>
+      </w:rPr>
+    </w:lvl>
+    <w:lvl w:ilvl="6" w:tentative="1">
+      <w:start w:val="1"/>
+      <w:numFmt w:val="bullet"/>
+      <w:lvlText w:val=""/>
+      <w:lvlJc w:val="left"/>
+      <w:pPr>
+        <w:tabs>
+          <w:tab w:val="num" w:pos="5040"/>
+        </w:tabs>
+        <w:ind w:left="5040" w:hanging="360"/>
+      </w:pPr>
+      <w:rPr>
+        <w:rFonts w:ascii="Wingdings" w:hAnsi="Wingdings" w:hint="default"/>
+        <w:sz w:val="20"/>
+      </w:rPr>
+    </w:lvl>
+    <w:lvl w:ilvl="7" w:tentative="1">
+      <w:start w:val="1"/>
+      <w:numFmt w:val="bullet"/>
+      <w:lvlText w:val=""/>
+      <w:lvlJc w:val="left"/>
+      <w:pPr>
+        <w:tabs>
+          <w:tab w:val="num" w:pos="5760"/>
+        </w:tabs>
+        <w:ind w:left="5760" w:hanging="360"/>
+      </w:pPr>
+      <w:rPr>
+        <w:rFonts w:ascii="Wingdings" w:hAnsi="Wingdings" w:hint="default"/>
+        <w:sz w:val="20"/>
+      </w:rPr>
+    </w:lvl>
+    <w:lvl w:ilvl="8" w:tentative="1">
+      <w:start w:val="1"/>
+      <w:numFmt w:val="bullet"/>
+      <w:lvlText w:val=""/>
+      <w:lvlJc w:val="left"/>
+      <w:pPr>
+        <w:tabs>
+          <w:tab w:val="num" w:pos="6480"/>
+        </w:tabs>
+        <w:ind w:left="6480" w:hanging="360"/>
+      </w:pPr>
+      <w:rPr>
+        <w:rFonts w:ascii="Wingdings" w:hAnsi="Wingdings" w:hint="default"/>
+        <w:sz w:val="20"/>
+      </w:rPr>
+    </w:lvl>
+  </w:abstractNum>
+  <w:abstractNum w:abstractNumId="39" w15:restartNumberingAfterBreak="0">
     <w:nsid w:val="660E6280"/>
     <w:multiLevelType w:val="multilevel"/>
     <w:tmpl w:val="19A42C26"/>
@@ -11248,7 +12878,156 @@
       </w:rPr>
     </w:lvl>
   </w:abstractNum>
-  <w:abstractNum w:abstractNumId="33" w15:restartNumberingAfterBreak="0">
+  <w:abstractNum w:abstractNumId="40" w15:restartNumberingAfterBreak="0">
+    <w:nsid w:val="66D54201"/>
+    <w:multiLevelType w:val="multilevel"/>
+    <w:tmpl w:val="BCA6AD92"/>
+    <w:lvl w:ilvl="0">
+      <w:start w:val="1"/>
+      <w:numFmt w:val="bullet"/>
+      <w:lvlText w:val=""/>
+      <w:lvlJc w:val="left"/>
+      <w:pPr>
+        <w:tabs>
+          <w:tab w:val="num" w:pos="720"/>
+        </w:tabs>
+        <w:ind w:left="720" w:hanging="360"/>
+      </w:pPr>
+      <w:rPr>
+        <w:rFonts w:ascii="Symbol" w:hAnsi="Symbol" w:hint="default"/>
+        <w:sz w:val="20"/>
+      </w:rPr>
+    </w:lvl>
+    <w:lvl w:ilvl="1" w:tentative="1">
+      <w:start w:val="1"/>
+      <w:numFmt w:val="bullet"/>
+      <w:lvlText w:val="o"/>
+      <w:lvlJc w:val="left"/>
+      <w:pPr>
+        <w:tabs>
+          <w:tab w:val="num" w:pos="1440"/>
+        </w:tabs>
+        <w:ind w:left="1440" w:hanging="360"/>
+      </w:pPr>
+      <w:rPr>
+        <w:rFonts w:ascii="Courier New" w:hAnsi="Courier New" w:hint="default"/>
+        <w:sz w:val="20"/>
+      </w:rPr>
+    </w:lvl>
+    <w:lvl w:ilvl="2" w:tentative="1">
+      <w:start w:val="1"/>
+      <w:numFmt w:val="bullet"/>
+      <w:lvlText w:val=""/>
+      <w:lvlJc w:val="left"/>
+      <w:pPr>
+        <w:tabs>
+          <w:tab w:val="num" w:pos="2160"/>
+        </w:tabs>
+        <w:ind w:left="2160" w:hanging="360"/>
+      </w:pPr>
+      <w:rPr>
+        <w:rFonts w:ascii="Wingdings" w:hAnsi="Wingdings" w:hint="default"/>
+        <w:sz w:val="20"/>
+      </w:rPr>
+    </w:lvl>
+    <w:lvl w:ilvl="3" w:tentative="1">
+      <w:start w:val="1"/>
+      <w:numFmt w:val="bullet"/>
+      <w:lvlText w:val=""/>
+      <w:lvlJc w:val="left"/>
+      <w:pPr>
+        <w:tabs>
+          <w:tab w:val="num" w:pos="2880"/>
+        </w:tabs>
+        <w:ind w:left="2880" w:hanging="360"/>
+      </w:pPr>
+      <w:rPr>
+        <w:rFonts w:ascii="Wingdings" w:hAnsi="Wingdings" w:hint="default"/>
+        <w:sz w:val="20"/>
+      </w:rPr>
+    </w:lvl>
+    <w:lvl w:ilvl="4" w:tentative="1">
+      <w:start w:val="1"/>
+      <w:numFmt w:val="bullet"/>
+      <w:lvlText w:val=""/>
+      <w:lvlJc w:val="left"/>
+      <w:pPr>
+        <w:tabs>
+          <w:tab w:val="num" w:pos="3600"/>
+        </w:tabs>
+        <w:ind w:left="3600" w:hanging="360"/>
+      </w:pPr>
+      <w:rPr>
+        <w:rFonts w:ascii="Wingdings" w:hAnsi="Wingdings" w:hint="default"/>
+        <w:sz w:val="20"/>
+      </w:rPr>
+    </w:lvl>
+    <w:lvl w:ilvl="5" w:tentative="1">
+      <w:start w:val="1"/>
+      <w:numFmt w:val="bullet"/>
+      <w:lvlText w:val=""/>
+      <w:lvlJc w:val="left"/>
+      <w:pPr>
+        <w:tabs>
+          <w:tab w:val="num" w:pos="4320"/>
+        </w:tabs>
+        <w:ind w:left="4320" w:hanging="360"/>
+      </w:pPr>
+      <w:rPr>
+        <w:rFonts w:ascii="Wingdings" w:hAnsi="Wingdings" w:hint="default"/>
+        <w:sz w:val="20"/>
+      </w:rPr>
+    </w:lvl>
+    <w:lvl w:ilvl="6" w:tentative="1">
+      <w:start w:val="1"/>
+      <w:numFmt w:val="bullet"/>
+      <w:lvlText w:val=""/>
+      <w:lvlJc w:val="left"/>
+      <w:pPr>
+        <w:tabs>
+          <w:tab w:val="num" w:pos="5040"/>
+        </w:tabs>
+        <w:ind w:left="5040" w:hanging="360"/>
+      </w:pPr>
+      <w:rPr>
+        <w:rFonts w:ascii="Wingdings" w:hAnsi="Wingdings" w:hint="default"/>
+        <w:sz w:val="20"/>
+      </w:rPr>
+    </w:lvl>
+    <w:lvl w:ilvl="7" w:tentative="1">
+      <w:start w:val="1"/>
+      <w:numFmt w:val="bullet"/>
+      <w:lvlText w:val=""/>
+      <w:lvlJc w:val="left"/>
+      <w:pPr>
+        <w:tabs>
+          <w:tab w:val="num" w:pos="5760"/>
+        </w:tabs>
+        <w:ind w:left="5760" w:hanging="360"/>
+      </w:pPr>
+      <w:rPr>
+        <w:rFonts w:ascii="Wingdings" w:hAnsi="Wingdings" w:hint="default"/>
+        <w:sz w:val="20"/>
+      </w:rPr>
+    </w:lvl>
+    <w:lvl w:ilvl="8" w:tentative="1">
+      <w:start w:val="1"/>
+      <w:numFmt w:val="bullet"/>
+      <w:lvlText w:val=""/>
+      <w:lvlJc w:val="left"/>
+      <w:pPr>
+        <w:tabs>
+          <w:tab w:val="num" w:pos="6480"/>
+        </w:tabs>
+        <w:ind w:left="6480" w:hanging="360"/>
+      </w:pPr>
+      <w:rPr>
+        <w:rFonts w:ascii="Wingdings" w:hAnsi="Wingdings" w:hint="default"/>
+        <w:sz w:val="20"/>
+      </w:rPr>
+    </w:lvl>
+  </w:abstractNum>
+  <w:abstractNum w:abstractNumId="41" w15:restartNumberingAfterBreak="0">
     <w:nsid w:val="686F2F06"/>
     <w:multiLevelType w:val="multilevel"/>
     <w:tmpl w:val="543276EE"/>
@@ -11397,7 +13176,7 @@
       </w:rPr>
     </w:lvl>
   </w:abstractNum>
-  <w:abstractNum w:abstractNumId="34" w15:restartNumberingAfterBreak="0">
+  <w:abstractNum w:abstractNumId="42" w15:restartNumberingAfterBreak="0">
     <w:nsid w:val="6A0E646F"/>
     <w:multiLevelType w:val="multilevel"/>
     <w:tmpl w:val="98B25B0E"/>
@@ -11546,7 +13325,7 @@
       </w:rPr>
     </w:lvl>
   </w:abstractNum>
-  <w:abstractNum w:abstractNumId="35" w15:restartNumberingAfterBreak="0">
+  <w:abstractNum w:abstractNumId="43" w15:restartNumberingAfterBreak="0">
     <w:nsid w:val="6B4B6A21"/>
     <w:multiLevelType w:val="multilevel"/>
     <w:tmpl w:val="92FE7EDE"/>
@@ -11695,7 +13474,156 @@
       </w:rPr>
     </w:lvl>
   </w:abstractNum>
-  <w:abstractNum w:abstractNumId="36" w15:restartNumberingAfterBreak="0">
+  <w:abstractNum w:abstractNumId="44" w15:restartNumberingAfterBreak="0">
+    <w:nsid w:val="6BFA2976"/>
+    <w:multiLevelType w:val="multilevel"/>
+    <w:tmpl w:val="7F6A6AAE"/>
+    <w:lvl w:ilvl="0">
+      <w:start w:val="1"/>
+      <w:numFmt w:val="bullet"/>
+      <w:lvlText w:val=""/>
+      <w:lvlJc w:val="left"/>
+      <w:pPr>
+        <w:tabs>
+          <w:tab w:val="num" w:pos="720"/>
+        </w:tabs>
+        <w:ind w:left="720" w:hanging="360"/>
+      </w:pPr>
+      <w:rPr>
+        <w:rFonts w:ascii="Symbol" w:hAnsi="Symbol" w:hint="default"/>
+        <w:sz w:val="20"/>
+      </w:rPr>
+    </w:lvl>
+    <w:lvl w:ilvl="1">
+      <w:start w:val="1"/>
+      <w:numFmt w:val="bullet"/>
+      <w:lvlText w:val="o"/>
+      <w:lvlJc w:val="left"/>
+      <w:pPr>
+        <w:tabs>
+          <w:tab w:val="num" w:pos="1440"/>
+        </w:tabs>
+        <w:ind w:left="1440" w:hanging="360"/>
+      </w:pPr>
+      <w:rPr>
+        <w:rFonts w:ascii="Courier New" w:hAnsi="Courier New" w:hint="default"/>
+        <w:sz w:val="20"/>
+      </w:rPr>
+    </w:lvl>
+    <w:lvl w:ilvl="2" w:tentative="1">
+      <w:start w:val="1"/>
+      <w:numFmt w:val="bullet"/>
+      <w:lvlText w:val=""/>
+      <w:lvlJc w:val="left"/>
+      <w:pPr>
+        <w:tabs>
+          <w:tab w:val="num" w:pos="2160"/>
+        </w:tabs>
+        <w:ind w:left="2160" w:hanging="360"/>
+      </w:pPr>
+      <w:rPr>
+        <w:rFonts w:ascii="Wingdings" w:hAnsi="Wingdings" w:hint="default"/>
+        <w:sz w:val="20"/>
+      </w:rPr>
+    </w:lvl>
+    <w:lvl w:ilvl="3" w:tentative="1">
+      <w:start w:val="1"/>
+      <w:numFmt w:val="bullet"/>
+      <w:lvlText w:val=""/>
+      <w:lvlJc w:val="left"/>
+      <w:pPr>
+        <w:tabs>
+          <w:tab w:val="num" w:pos="2880"/>
+        </w:tabs>
+        <w:ind w:left="2880" w:hanging="360"/>
+      </w:pPr>
+      <w:rPr>
+        <w:rFonts w:ascii="Wingdings" w:hAnsi="Wingdings" w:hint="default"/>
+        <w:sz w:val="20"/>
+      </w:rPr>
+    </w:lvl>
+    <w:lvl w:ilvl="4" w:tentative="1">
+      <w:start w:val="1"/>
+      <w:numFmt w:val="bullet"/>
+      <w:lvlText w:val=""/>
+      <w:lvlJc w:val="left"/>
+      <w:pPr>
+        <w:tabs>
+          <w:tab w:val="num" w:pos="3600"/>
+        </w:tabs>
+        <w:ind w:left="3600" w:hanging="360"/>
+      </w:pPr>
+      <w:rPr>
+        <w:rFonts w:ascii="Wingdings" w:hAnsi="Wingdings" w:hint="default"/>
+        <w:sz w:val="20"/>
+      </w:rPr>
+    </w:lvl>
+    <w:lvl w:ilvl="5" w:tentative="1">
+      <w:start w:val="1"/>
+      <w:numFmt w:val="bullet"/>
+      <w:lvlText w:val=""/>
+      <w:lvlJc w:val="left"/>
+      <w:pPr>
+        <w:tabs>
+          <w:tab w:val="num" w:pos="4320"/>
+        </w:tabs>
+        <w:ind w:left="4320" w:hanging="360"/>
+      </w:pPr>
+      <w:rPr>
+        <w:rFonts w:ascii="Wingdings" w:hAnsi="Wingdings" w:hint="default"/>
+        <w:sz w:val="20"/>
+      </w:rPr>
+    </w:lvl>
+    <w:lvl w:ilvl="6" w:tentative="1">
+      <w:start w:val="1"/>
+      <w:numFmt w:val="bullet"/>
+      <w:lvlText w:val=""/>
+      <w:lvlJc w:val="left"/>
+      <w:pPr>
+        <w:tabs>
+          <w:tab w:val="num" w:pos="5040"/>
+        </w:tabs>
+        <w:ind w:left="5040" w:hanging="360"/>
+      </w:pPr>
+      <w:rPr>
+        <w:rFonts w:ascii="Wingdings" w:hAnsi="Wingdings" w:hint="default"/>
+        <w:sz w:val="20"/>
+      </w:rPr>
+    </w:lvl>
+    <w:lvl w:ilvl="7" w:tentative="1">
+      <w:start w:val="1"/>
+      <w:numFmt w:val="bullet"/>
+      <w:lvlText w:val=""/>
+      <w:lvlJc w:val="left"/>
+      <w:pPr>
+        <w:tabs>
+          <w:tab w:val="num" w:pos="5760"/>
+        </w:tabs>
+        <w:ind w:left="5760" w:hanging="360"/>
+      </w:pPr>
+      <w:rPr>
+        <w:rFonts w:ascii="Wingdings" w:hAnsi="Wingdings" w:hint="default"/>
+        <w:sz w:val="20"/>
+      </w:rPr>
+    </w:lvl>
+    <w:lvl w:ilvl="8" w:tentative="1">
+      <w:start w:val="1"/>
+      <w:numFmt w:val="bullet"/>
+      <w:lvlText w:val=""/>
+      <w:lvlJc w:val="left"/>
+      <w:pPr>
+        <w:tabs>
+          <w:tab w:val="num" w:pos="6480"/>
+        </w:tabs>
+        <w:ind w:left="6480" w:hanging="360"/>
+      </w:pPr>
+      <w:rPr>
+        <w:rFonts w:ascii="Wingdings" w:hAnsi="Wingdings" w:hint="default"/>
+        <w:sz w:val="20"/>
+      </w:rPr>
+    </w:lvl>
+  </w:abstractNum>
+  <w:abstractNum w:abstractNumId="45" w15:restartNumberingAfterBreak="0">
     <w:nsid w:val="6C1C365F"/>
     <w:multiLevelType w:val="multilevel"/>
     <w:tmpl w:val="438810AA"/>
@@ -11844,7 +13772,7 @@
       </w:rPr>
     </w:lvl>
   </w:abstractNum>
-  <w:abstractNum w:abstractNumId="37" w15:restartNumberingAfterBreak="0">
+  <w:abstractNum w:abstractNumId="46" w15:restartNumberingAfterBreak="0">
     <w:nsid w:val="6C333C24"/>
     <w:multiLevelType w:val="multilevel"/>
     <w:tmpl w:val="E3AA6D26"/>
@@ -11993,7 +13921,7 @@
       </w:rPr>
     </w:lvl>
   </w:abstractNum>
-  <w:abstractNum w:abstractNumId="38" w15:restartNumberingAfterBreak="0">
+  <w:abstractNum w:abstractNumId="47" w15:restartNumberingAfterBreak="0">
     <w:nsid w:val="76AC05B5"/>
     <w:multiLevelType w:val="multilevel"/>
     <w:tmpl w:val="1CE849FC"/>
@@ -12142,7 +14070,7 @@
       </w:rPr>
     </w:lvl>
   </w:abstractNum>
-  <w:abstractNum w:abstractNumId="39" w15:restartNumberingAfterBreak="0">
+  <w:abstractNum w:abstractNumId="48" w15:restartNumberingAfterBreak="0">
     <w:nsid w:val="796B5219"/>
     <w:multiLevelType w:val="multilevel"/>
     <w:tmpl w:val="941463EA"/>
@@ -12291,7 +14219,7 @@
       </w:rPr>
     </w:lvl>
   </w:abstractNum>
-  <w:abstractNum w:abstractNumId="40" w15:restartNumberingAfterBreak="0">
+  <w:abstractNum w:abstractNumId="49" w15:restartNumberingAfterBreak="0">
     <w:nsid w:val="7A501858"/>
     <w:multiLevelType w:val="multilevel"/>
     <w:tmpl w:val="3740F67E"/>
@@ -12440,7 +14368,156 @@
       </w:rPr>
     </w:lvl>
   </w:abstractNum>
-  <w:abstractNum w:abstractNumId="41" w15:restartNumberingAfterBreak="0">
+  <w:abstractNum w:abstractNumId="50" w15:restartNumberingAfterBreak="0">
+    <w:nsid w:val="7A684783"/>
+    <w:multiLevelType w:val="multilevel"/>
+    <w:tmpl w:val="8270A7D8"/>
+    <w:lvl w:ilvl="0">
+      <w:start w:val="1"/>
+      <w:numFmt w:val="bullet"/>
+      <w:lvlText w:val=""/>
+      <w:lvlJc w:val="left"/>
+      <w:pPr>
+        <w:tabs>
+          <w:tab w:val="num" w:pos="720"/>
+        </w:tabs>
+        <w:ind w:left="720" w:hanging="360"/>
+      </w:pPr>
+      <w:rPr>
+        <w:rFonts w:ascii="Symbol" w:hAnsi="Symbol" w:hint="default"/>
+        <w:sz w:val="20"/>
+      </w:rPr>
+    </w:lvl>
+    <w:lvl w:ilvl="1" w:tentative="1">
+      <w:start w:val="1"/>
+      <w:numFmt w:val="bullet"/>
+      <w:lvlText w:val="o"/>
+      <w:lvlJc w:val="left"/>
+      <w:pPr>
+        <w:tabs>
+          <w:tab w:val="num" w:pos="1440"/>
+        </w:tabs>
+        <w:ind w:left="1440" w:hanging="360"/>
+      </w:pPr>
+      <w:rPr>
+        <w:rFonts w:ascii="Courier New" w:hAnsi="Courier New" w:hint="default"/>
+        <w:sz w:val="20"/>
+      </w:rPr>
+    </w:lvl>
+    <w:lvl w:ilvl="2" w:tentative="1">
+      <w:start w:val="1"/>
+      <w:numFmt w:val="bullet"/>
+      <w:lvlText w:val=""/>
+      <w:lvlJc w:val="left"/>
+      <w:pPr>
+        <w:tabs>
+          <w:tab w:val="num" w:pos="2160"/>
+        </w:tabs>
+        <w:ind w:left="2160" w:hanging="360"/>
+      </w:pPr>
+      <w:rPr>
+        <w:rFonts w:ascii="Wingdings" w:hAnsi="Wingdings" w:hint="default"/>
+        <w:sz w:val="20"/>
+      </w:rPr>
+    </w:lvl>
+    <w:lvl w:ilvl="3" w:tentative="1">
+      <w:start w:val="1"/>
+      <w:numFmt w:val="bullet"/>
+      <w:lvlText w:val=""/>
+      <w:lvlJc w:val="left"/>
+      <w:pPr>
+        <w:tabs>
+          <w:tab w:val="num" w:pos="2880"/>
+        </w:tabs>
+        <w:ind w:left="2880" w:hanging="360"/>
+      </w:pPr>
+      <w:rPr>
+        <w:rFonts w:ascii="Wingdings" w:hAnsi="Wingdings" w:hint="default"/>
+        <w:sz w:val="20"/>
+      </w:rPr>
+    </w:lvl>
+    <w:lvl w:ilvl="4" w:tentative="1">
+      <w:start w:val="1"/>
+      <w:numFmt w:val="bullet"/>
+      <w:lvlText w:val=""/>
+      <w:lvlJc w:val="left"/>
+      <w:pPr>
+        <w:tabs>
+          <w:tab w:val="num" w:pos="3600"/>
+        </w:tabs>
+        <w:ind w:left="3600" w:hanging="360"/>
+      </w:pPr>
+      <w:rPr>
+        <w:rFonts w:ascii="Wingdings" w:hAnsi="Wingdings" w:hint="default"/>
+        <w:sz w:val="20"/>
+      </w:rPr>
+    </w:lvl>
+    <w:lvl w:ilvl="5" w:tentative="1">
+      <w:start w:val="1"/>
+      <w:numFmt w:val="bullet"/>
+      <w:lvlText w:val=""/>
+      <w:lvlJc w:val="left"/>
+      <w:pPr>
+        <w:tabs>
+          <w:tab w:val="num" w:pos="4320"/>
+        </w:tabs>
+        <w:ind w:left="4320" w:hanging="360"/>
+      </w:pPr>
+      <w:rPr>
+        <w:rFonts w:ascii="Wingdings" w:hAnsi="Wingdings" w:hint="default"/>
+        <w:sz w:val="20"/>
+      </w:rPr>
+    </w:lvl>
+    <w:lvl w:ilvl="6" w:tentative="1">
+      <w:start w:val="1"/>
+      <w:numFmt w:val="bullet"/>
+      <w:lvlText w:val=""/>
+      <w:lvlJc w:val="left"/>
+      <w:pPr>
+        <w:tabs>
+          <w:tab w:val="num" w:pos="5040"/>
+        </w:tabs>
+        <w:ind w:left="5040" w:hanging="360"/>
+      </w:pPr>
+      <w:rPr>
+        <w:rFonts w:ascii="Wingdings" w:hAnsi="Wingdings" w:hint="default"/>
+        <w:sz w:val="20"/>
+      </w:rPr>
+    </w:lvl>
+    <w:lvl w:ilvl="7" w:tentative="1">
+      <w:start w:val="1"/>
+      <w:numFmt w:val="bullet"/>
+      <w:lvlText w:val=""/>
+      <w:lvlJc w:val="left"/>
+      <w:pPr>
+        <w:tabs>
+          <w:tab w:val="num" w:pos="5760"/>
+        </w:tabs>
+        <w:ind w:left="5760" w:hanging="360"/>
+      </w:pPr>
+      <w:rPr>
+        <w:rFonts w:ascii="Wingdings" w:hAnsi="Wingdings" w:hint="default"/>
+        <w:sz w:val="20"/>
+      </w:rPr>
+    </w:lvl>
+    <w:lvl w:ilvl="8" w:tentative="1">
+      <w:start w:val="1"/>
+      <w:numFmt w:val="bullet"/>
+      <w:lvlText w:val=""/>
+      <w:lvlJc w:val="left"/>
+      <w:pPr>
+        <w:tabs>
+          <w:tab w:val="num" w:pos="6480"/>
+        </w:tabs>
+        <w:ind w:left="6480" w:hanging="360"/>
+      </w:pPr>
+      <w:rPr>
+        <w:rFonts w:ascii="Wingdings" w:hAnsi="Wingdings" w:hint="default"/>
+        <w:sz w:val="20"/>
+      </w:rPr>
+    </w:lvl>
+  </w:abstractNum>
+  <w:abstractNum w:abstractNumId="51" w15:restartNumberingAfterBreak="0">
     <w:nsid w:val="7EEF7B4F"/>
     <w:multiLevelType w:val="multilevel"/>
     <w:tmpl w:val="D1461E90"/>
@@ -12590,130 +14667,160 @@
     </w:lvl>
   </w:abstractNum>
   <w:num w:numId="1" w16cid:durableId="1601067662">
-    <w:abstractNumId w:val="38"/>
+    <w:abstractNumId w:val="47"/>
   </w:num>
   <w:num w:numId="2" w16cid:durableId="1842160260">
+    <w:abstractNumId w:val="16"/>
+  </w:num>
+  <w:num w:numId="3" w16cid:durableId="427888292">
+    <w:abstractNumId w:val="30"/>
+  </w:num>
+  <w:num w:numId="4" w16cid:durableId="1239897464">
+    <w:abstractNumId w:val="33"/>
+  </w:num>
+  <w:num w:numId="5" w16cid:durableId="1715275080">
+    <w:abstractNumId w:val="7"/>
+  </w:num>
+  <w:num w:numId="6" w16cid:durableId="591793">
+    <w:abstractNumId w:val="24"/>
+  </w:num>
+  <w:num w:numId="7" w16cid:durableId="1668097145">
+    <w:abstractNumId w:val="20"/>
+  </w:num>
+  <w:num w:numId="8" w16cid:durableId="388305022">
+    <w:abstractNumId w:val="41"/>
+  </w:num>
+  <w:num w:numId="9" w16cid:durableId="507983134">
+    <w:abstractNumId w:val="36"/>
+  </w:num>
+  <w:num w:numId="10" w16cid:durableId="1812745135">
+    <w:abstractNumId w:val="49"/>
+  </w:num>
+  <w:num w:numId="11" w16cid:durableId="834338879">
+    <w:abstractNumId w:val="21"/>
+  </w:num>
+  <w:num w:numId="12" w16cid:durableId="2117942136">
+    <w:abstractNumId w:val="15"/>
+  </w:num>
+  <w:num w:numId="13" w16cid:durableId="1863933511">
+    <w:abstractNumId w:val="17"/>
+  </w:num>
+  <w:num w:numId="14" w16cid:durableId="540291627">
+    <w:abstractNumId w:val="6"/>
+  </w:num>
+  <w:num w:numId="15" w16cid:durableId="1636523159">
+    <w:abstractNumId w:val="42"/>
+  </w:num>
+  <w:num w:numId="16" w16cid:durableId="1861624381">
+    <w:abstractNumId w:val="34"/>
+  </w:num>
+  <w:num w:numId="17" w16cid:durableId="1791515050">
+    <w:abstractNumId w:val="26"/>
+  </w:num>
+  <w:num w:numId="18" w16cid:durableId="1397700912">
+    <w:abstractNumId w:val="3"/>
+  </w:num>
+  <w:num w:numId="19" w16cid:durableId="991567642">
+    <w:abstractNumId w:val="4"/>
+  </w:num>
+  <w:num w:numId="20" w16cid:durableId="1265844389">
+    <w:abstractNumId w:val="48"/>
+  </w:num>
+  <w:num w:numId="21" w16cid:durableId="603849961">
+    <w:abstractNumId w:val="28"/>
+  </w:num>
+  <w:num w:numId="22" w16cid:durableId="2146654949">
+    <w:abstractNumId w:val="51"/>
+  </w:num>
+  <w:num w:numId="23" w16cid:durableId="1096947934">
+    <w:abstractNumId w:val="25"/>
+  </w:num>
+  <w:num w:numId="24" w16cid:durableId="1818721275">
+    <w:abstractNumId w:val="10"/>
+  </w:num>
+  <w:num w:numId="25" w16cid:durableId="1656257368">
+    <w:abstractNumId w:val="13"/>
+  </w:num>
+  <w:num w:numId="26" w16cid:durableId="618337997">
     <w:abstractNumId w:val="14"/>
   </w:num>
-  <w:num w:numId="3" w16cid:durableId="427888292">
-    <w:abstractNumId w:val="26"/>
+  <w:num w:numId="27" w16cid:durableId="1167746404">
+    <w:abstractNumId w:val="11"/>
   </w:num>
-  <w:num w:numId="4" w16cid:durableId="1239897464">
-    <w:abstractNumId w:val="27"/>
+  <w:num w:numId="28" w16cid:durableId="1382366140">
+    <w:abstractNumId w:val="45"/>
   </w:num>
-  <w:num w:numId="5" w16cid:durableId="1715275080">
-    <w:abstractNumId w:val="6"/>
-  </w:num>
-  <w:num w:numId="6" w16cid:durableId="591793">
-    <w:abstractNumId w:val="20"/>
-  </w:num>
-  <w:num w:numId="7" w16cid:durableId="1668097145">
-    <w:abstractNumId w:val="17"/>
-  </w:num>
-  <w:num w:numId="8" w16cid:durableId="388305022">
-    <w:abstractNumId w:val="33"/>
-  </w:num>
-  <w:num w:numId="9" w16cid:durableId="507983134">
-    <w:abstractNumId w:val="30"/>
-  </w:num>
-  <w:num w:numId="10" w16cid:durableId="1812745135">
-    <w:abstractNumId w:val="40"/>
-  </w:num>
-  <w:num w:numId="11" w16cid:durableId="834338879">
-    <w:abstractNumId w:val="18"/>
-  </w:num>
-  <w:num w:numId="12" w16cid:durableId="2117942136">
-    <w:abstractNumId w:val="13"/>
-  </w:num>
-  <w:num w:numId="13" w16cid:durableId="1863933511">
-    <w:abstractNumId w:val="15"/>
-  </w:num>
-  <w:num w:numId="14" w16cid:durableId="540291627">
-    <w:abstractNumId w:val="5"/>
-  </w:num>
-  <w:num w:numId="15" w16cid:durableId="1636523159">
-    <w:abstractNumId w:val="34"/>
-  </w:num>
-  <w:num w:numId="16" w16cid:durableId="1861624381">
-    <w:abstractNumId w:val="28"/>
-  </w:num>
-  <w:num w:numId="17" w16cid:durableId="1791515050">
-    <w:abstractNumId w:val="22"/>
-  </w:num>
-  <w:num w:numId="18" w16cid:durableId="1397700912">
-    <w:abstractNumId w:val="2"/>
-  </w:num>
-  <w:num w:numId="19" w16cid:durableId="991567642">
-    <w:abstractNumId w:val="3"/>
-  </w:num>
-  <w:num w:numId="20" w16cid:durableId="1265844389">
+  <w:num w:numId="29" w16cid:durableId="394744024">
     <w:abstractNumId w:val="39"/>
   </w:num>
-  <w:num w:numId="21" w16cid:durableId="603849961">
-    <w:abstractNumId w:val="24"/>
-  </w:num>
-  <w:num w:numId="22" w16cid:durableId="2146654949">
-    <w:abstractNumId w:val="41"/>
-  </w:num>
-  <w:num w:numId="23" w16cid:durableId="1096947934">
-    <w:abstractNumId w:val="21"/>
-  </w:num>
-  <w:num w:numId="24" w16cid:durableId="1818721275">
-    <w:abstractNumId w:val="8"/>
-  </w:num>
-  <w:num w:numId="25" w16cid:durableId="1656257368">
-    <w:abstractNumId w:val="11"/>
-  </w:num>
-  <w:num w:numId="26" w16cid:durableId="618337997">
+  <w:num w:numId="30" w16cid:durableId="639844085">
     <w:abstractNumId w:val="12"/>
-  </w:num>
-  <w:num w:numId="27" w16cid:durableId="1167746404">
-    <w:abstractNumId w:val="9"/>
-  </w:num>
-  <w:num w:numId="28" w16cid:durableId="1382366140">
-    <w:abstractNumId w:val="36"/>
-  </w:num>
-  <w:num w:numId="29" w16cid:durableId="394744024">
-    <w:abstractNumId w:val="32"/>
-  </w:num>
-  <w:num w:numId="30" w16cid:durableId="639844085">
-    <w:abstractNumId w:val="10"/>
   </w:num>
   <w:num w:numId="31" w16cid:durableId="1792892985">
     <w:abstractNumId w:val="0"/>
   </w:num>
   <w:num w:numId="32" w16cid:durableId="247690888">
-    <w:abstractNumId w:val="16"/>
+    <w:abstractNumId w:val="18"/>
   </w:num>
   <w:num w:numId="33" w16cid:durableId="158690485">
+    <w:abstractNumId w:val="2"/>
+  </w:num>
+  <w:num w:numId="34" w16cid:durableId="1270697427">
+    <w:abstractNumId w:val="5"/>
+  </w:num>
+  <w:num w:numId="35" w16cid:durableId="1026447968">
+    <w:abstractNumId w:val="29"/>
+  </w:num>
+  <w:num w:numId="36" w16cid:durableId="895169701">
+    <w:abstractNumId w:val="43"/>
+  </w:num>
+  <w:num w:numId="37" w16cid:durableId="1054432657">
+    <w:abstractNumId w:val="37"/>
+  </w:num>
+  <w:num w:numId="38" w16cid:durableId="982197546">
+    <w:abstractNumId w:val="23"/>
+  </w:num>
+  <w:num w:numId="39" w16cid:durableId="224730662">
+    <w:abstractNumId w:val="35"/>
+  </w:num>
+  <w:num w:numId="40" w16cid:durableId="1386877970">
+    <w:abstractNumId w:val="46"/>
+  </w:num>
+  <w:num w:numId="41" w16cid:durableId="499856297">
+    <w:abstractNumId w:val="27"/>
+  </w:num>
+  <w:num w:numId="42" w16cid:durableId="348262419">
+    <w:abstractNumId w:val="8"/>
+  </w:num>
+  <w:num w:numId="43" w16cid:durableId="1433235826">
+    <w:abstractNumId w:val="19"/>
+  </w:num>
+  <w:num w:numId="44" w16cid:durableId="1570723628">
+    <w:abstractNumId w:val="38"/>
+  </w:num>
+  <w:num w:numId="45" w16cid:durableId="186212376">
+    <w:abstractNumId w:val="44"/>
+  </w:num>
+  <w:num w:numId="46" w16cid:durableId="735325319">
+    <w:abstractNumId w:val="22"/>
+  </w:num>
+  <w:num w:numId="47" w16cid:durableId="1140532661">
+    <w:abstractNumId w:val="50"/>
+  </w:num>
+  <w:num w:numId="48" w16cid:durableId="190192697">
+    <w:abstractNumId w:val="31"/>
+  </w:num>
+  <w:num w:numId="49" w16cid:durableId="752816508">
+    <w:abstractNumId w:val="32"/>
+  </w:num>
+  <w:num w:numId="50" w16cid:durableId="383259824">
     <w:abstractNumId w:val="1"/>
   </w:num>
-  <w:num w:numId="34" w16cid:durableId="1270697427">
-    <w:abstractNumId w:val="4"/>
+  <w:num w:numId="51" w16cid:durableId="479468768">
+    <w:abstractNumId w:val="40"/>
   </w:num>
-  <w:num w:numId="35" w16cid:durableId="1026447968">
-    <w:abstractNumId w:val="25"/>
-  </w:num>
-  <w:num w:numId="36" w16cid:durableId="895169701">
-    <w:abstractNumId w:val="35"/>
-  </w:num>
-  <w:num w:numId="37" w16cid:durableId="1054432657">
-    <w:abstractNumId w:val="31"/>
-  </w:num>
-  <w:num w:numId="38" w16cid:durableId="982197546">
-    <w:abstractNumId w:val="19"/>
-  </w:num>
-  <w:num w:numId="39" w16cid:durableId="224730662">
-    <w:abstractNumId w:val="29"/>
-  </w:num>
-  <w:num w:numId="40" w16cid:durableId="1386877970">
-    <w:abstractNumId w:val="37"/>
-  </w:num>
-  <w:num w:numId="41" w16cid:durableId="499856297">
-    <w:abstractNumId w:val="23"/>
-  </w:num>
-  <w:num w:numId="42" w16cid:durableId="348262419">
-    <w:abstractNumId w:val="7"/>
+  <w:num w:numId="52" w16cid:durableId="1928154536">
+    <w:abstractNumId w:val="9"/>
   </w:num>
 </w:numbering>
 </file>

</xml_diff>

<commit_message>
auto: sync changes at 2026-04-27 13:56:26
</commit_message>
<xml_diff>
--- a/Progress Report.docx
+++ b/Progress Report.docx
@@ -21,7 +21,29 @@
           <w:szCs w:val="32"/>
           <w14:ligatures w14:val="none"/>
         </w:rPr>
-        <w:t>Date of  Log-1 = 24-04-2026</w:t>
+        <w:t xml:space="preserve">Date </w:t>
+      </w:r>
+      <w:proofErr w:type="gramStart"/>
+      <w:r>
+        <w:rPr>
+          <w:rFonts w:ascii="Times New Roman" w:eastAsia="Times New Roman" w:hAnsi="Times New Roman" w:cs="Times New Roman"/>
+          <w:kern w:val="0"/>
+          <w:sz w:val="32"/>
+          <w:szCs w:val="32"/>
+          <w14:ligatures w14:val="none"/>
+        </w:rPr>
+        <w:t>of  Log</w:t>
+      </w:r>
+      <w:proofErr w:type="gramEnd"/>
+      <w:r>
+        <w:rPr>
+          <w:rFonts w:ascii="Times New Roman" w:eastAsia="Times New Roman" w:hAnsi="Times New Roman" w:cs="Times New Roman"/>
+          <w:kern w:val="0"/>
+          <w:sz w:val="32"/>
+          <w:szCs w:val="32"/>
+          <w14:ligatures w14:val="none"/>
+        </w:rPr>
+        <w:t>-1 = 24-04-2026</w:t>
       </w:r>
     </w:p>
     <w:p>
@@ -309,6 +331,7 @@
         </w:rPr>
         <w:t xml:space="preserve">Initialized Node.js project using </w:t>
       </w:r>
+      <w:proofErr w:type="spellStart"/>
       <w:r>
         <w:rPr>
           <w:rFonts w:ascii="Courier New" w:eastAsia="Times New Roman" w:hAnsi="Courier New" w:cs="Courier New"/>
@@ -317,7 +340,40 @@
           <w:szCs w:val="20"/>
           <w14:ligatures w14:val="none"/>
         </w:rPr>
-        <w:t>npm init -y</w:t>
+        <w:t>npm</w:t>
+      </w:r>
+      <w:proofErr w:type="spellEnd"/>
+      <w:r>
+        <w:rPr>
+          <w:rFonts w:ascii="Courier New" w:eastAsia="Times New Roman" w:hAnsi="Courier New" w:cs="Courier New"/>
+          <w:kern w:val="0"/>
+          <w:sz w:val="20"/>
+          <w:szCs w:val="20"/>
+          <w14:ligatures w14:val="none"/>
+        </w:rPr>
+        <w:t xml:space="preserve"> </w:t>
+      </w:r>
+      <w:proofErr w:type="spellStart"/>
+      <w:r>
+        <w:rPr>
+          <w:rFonts w:ascii="Courier New" w:eastAsia="Times New Roman" w:hAnsi="Courier New" w:cs="Courier New"/>
+          <w:kern w:val="0"/>
+          <w:sz w:val="20"/>
+          <w:szCs w:val="20"/>
+          <w14:ligatures w14:val="none"/>
+        </w:rPr>
+        <w:t>init</w:t>
+      </w:r>
+      <w:proofErr w:type="spellEnd"/>
+      <w:r>
+        <w:rPr>
+          <w:rFonts w:ascii="Courier New" w:eastAsia="Times New Roman" w:hAnsi="Courier New" w:cs="Courier New"/>
+          <w:kern w:val="0"/>
+          <w:sz w:val="20"/>
+          <w:szCs w:val="20"/>
+          <w14:ligatures w14:val="none"/>
+        </w:rPr>
+        <w:t xml:space="preserve"> -y</w:t>
       </w:r>
     </w:p>
     <w:p>
@@ -345,6 +401,7 @@
         </w:rPr>
         <w:t>Installed Electron (</w:t>
       </w:r>
+      <w:proofErr w:type="spellStart"/>
       <w:r>
         <w:rPr>
           <w:rFonts w:ascii="Courier New" w:eastAsia="Times New Roman" w:hAnsi="Courier New" w:cs="Courier New"/>
@@ -353,7 +410,18 @@
           <w:szCs w:val="20"/>
           <w14:ligatures w14:val="none"/>
         </w:rPr>
-        <w:t>npm install electron</w:t>
+        <w:t>npm</w:t>
+      </w:r>
+      <w:proofErr w:type="spellEnd"/>
+      <w:r>
+        <w:rPr>
+          <w:rFonts w:ascii="Courier New" w:eastAsia="Times New Roman" w:hAnsi="Courier New" w:cs="Courier New"/>
+          <w:kern w:val="0"/>
+          <w:sz w:val="20"/>
+          <w:szCs w:val="20"/>
+          <w14:ligatures w14:val="none"/>
+        </w:rPr>
+        <w:t xml:space="preserve"> install electron</w:t>
       </w:r>
       <w:r>
         <w:rPr>
@@ -461,6 +529,7 @@
         </w:rPr>
         <w:t xml:space="preserve">Configured window creation using </w:t>
       </w:r>
+      <w:proofErr w:type="spellStart"/>
       <w:r>
         <w:rPr>
           <w:rFonts w:ascii="Courier New" w:eastAsia="Times New Roman" w:hAnsi="Courier New" w:cs="Courier New"/>
@@ -471,6 +540,7 @@
         </w:rPr>
         <w:t>BrowserWindow</w:t>
       </w:r>
+      <w:proofErr w:type="spellEnd"/>
     </w:p>
     <w:p>
       <w:pPr>
@@ -497,6 +567,8 @@
         </w:rPr>
         <w:t xml:space="preserve">Fixed </w:t>
       </w:r>
+      <w:proofErr w:type="spellStart"/>
+      <w:proofErr w:type="gramStart"/>
       <w:r>
         <w:rPr>
           <w:rFonts w:ascii="Courier New" w:eastAsia="Times New Roman" w:hAnsi="Courier New" w:cs="Courier New"/>
@@ -507,6 +579,8 @@
         </w:rPr>
         <w:t>package.json</w:t>
       </w:r>
+      <w:proofErr w:type="spellEnd"/>
+      <w:proofErr w:type="gramEnd"/>
       <w:r>
         <w:rPr>
           <w:rFonts w:ascii="Times New Roman" w:eastAsia="Times New Roman" w:hAnsi="Times New Roman" w:cs="Times New Roman"/>
@@ -1067,6 +1141,8 @@
         </w:rPr>
         <w:t xml:space="preserve">Implemented </w:t>
       </w:r>
+      <w:proofErr w:type="spellStart"/>
+      <w:proofErr w:type="gramStart"/>
       <w:r>
         <w:rPr>
           <w:rFonts w:ascii="Courier New" w:eastAsia="Times New Roman" w:hAnsi="Courier New" w:cs="Courier New"/>
@@ -1075,7 +1151,29 @@
           <w:szCs w:val="20"/>
           <w14:ligatures w14:val="none"/>
         </w:rPr>
-        <w:t>addMessage()</w:t>
+        <w:t>addMessage</w:t>
+      </w:r>
+      <w:proofErr w:type="spellEnd"/>
+      <w:r>
+        <w:rPr>
+          <w:rFonts w:ascii="Courier New" w:eastAsia="Times New Roman" w:hAnsi="Courier New" w:cs="Courier New"/>
+          <w:kern w:val="0"/>
+          <w:sz w:val="20"/>
+          <w:szCs w:val="20"/>
+          <w14:ligatures w14:val="none"/>
+        </w:rPr>
+        <w:t>(</w:t>
+      </w:r>
+      <w:proofErr w:type="gramEnd"/>
+      <w:r>
+        <w:rPr>
+          <w:rFonts w:ascii="Courier New" w:eastAsia="Times New Roman" w:hAnsi="Courier New" w:cs="Courier New"/>
+          <w:kern w:val="0"/>
+          <w:sz w:val="20"/>
+          <w:szCs w:val="20"/>
+          <w14:ligatures w14:val="none"/>
+        </w:rPr>
+        <w:t>)</w:t>
       </w:r>
       <w:r>
         <w:rPr>
@@ -1688,6 +1786,7 @@
         </w:rPr>
         <w:t xml:space="preserve">Introduced </w:t>
       </w:r>
+      <w:proofErr w:type="gramStart"/>
       <w:r>
         <w:rPr>
           <w:rFonts w:ascii="Courier New" w:eastAsia="Times New Roman" w:hAnsi="Courier New" w:cs="Courier New"/>
@@ -1696,7 +1795,18 @@
           <w:szCs w:val="20"/>
           <w14:ligatures w14:val="none"/>
         </w:rPr>
-        <w:t>messages[]</w:t>
+        <w:t>messages[</w:t>
+      </w:r>
+      <w:proofErr w:type="gramEnd"/>
+      <w:r>
+        <w:rPr>
+          <w:rFonts w:ascii="Courier New" w:eastAsia="Times New Roman" w:hAnsi="Courier New" w:cs="Courier New"/>
+          <w:kern w:val="0"/>
+          <w:sz w:val="20"/>
+          <w:szCs w:val="20"/>
+          <w14:ligatures w14:val="none"/>
+        </w:rPr>
+        <w:t>]</w:t>
       </w:r>
       <w:r>
         <w:rPr>
@@ -2002,6 +2112,8 @@
           <w14:ligatures w14:val="none"/>
         </w:rPr>
       </w:pPr>
+      <w:proofErr w:type="spellStart"/>
+      <w:proofErr w:type="gramStart"/>
       <w:r>
         <w:rPr>
           <w:rFonts w:ascii="Courier New" w:eastAsia="Times New Roman" w:hAnsi="Courier New" w:cs="Courier New"/>
@@ -2010,7 +2122,29 @@
           <w:szCs w:val="20"/>
           <w14:ligatures w14:val="none"/>
         </w:rPr>
-        <w:t>messages.pop()</w:t>
+        <w:t>messages.pop</w:t>
+      </w:r>
+      <w:proofErr w:type="spellEnd"/>
+      <w:r>
+        <w:rPr>
+          <w:rFonts w:ascii="Courier New" w:eastAsia="Times New Roman" w:hAnsi="Courier New" w:cs="Courier New"/>
+          <w:kern w:val="0"/>
+          <w:sz w:val="20"/>
+          <w:szCs w:val="20"/>
+          <w14:ligatures w14:val="none"/>
+        </w:rPr>
+        <w:t>(</w:t>
+      </w:r>
+      <w:proofErr w:type="gramEnd"/>
+      <w:r>
+        <w:rPr>
+          <w:rFonts w:ascii="Courier New" w:eastAsia="Times New Roman" w:hAnsi="Courier New" w:cs="Courier New"/>
+          <w:kern w:val="0"/>
+          <w:sz w:val="20"/>
+          <w:szCs w:val="20"/>
+          <w14:ligatures w14:val="none"/>
+        </w:rPr>
+        <w:t>)</w:t>
       </w:r>
       <w:r>
         <w:rPr>
@@ -2384,6 +2518,7 @@
         </w:rPr>
         <w:t>Fixed styling gap for AI typing element (</w:t>
       </w:r>
+      <w:proofErr w:type="spellStart"/>
       <w:r>
         <w:rPr>
           <w:rFonts w:ascii="Courier New" w:eastAsia="Times New Roman" w:hAnsi="Courier New" w:cs="Courier New"/>
@@ -2394,6 +2529,7 @@
         </w:rPr>
         <w:t>typingDiv</w:t>
       </w:r>
+      <w:proofErr w:type="spellEnd"/>
       <w:r>
         <w:rPr>
           <w:rFonts w:ascii="Times New Roman" w:eastAsia="Times New Roman" w:hAnsi="Times New Roman" w:cs="Times New Roman"/>
@@ -2816,7 +2952,29 @@
           <w:szCs w:val="24"/>
           <w14:ligatures w14:val="none"/>
         </w:rPr>
-        <w:t>Implement persistence (save UI preferences using localStorage)</w:t>
+        <w:t xml:space="preserve">Implement persistence (save UI preferences using </w:t>
+      </w:r>
+      <w:proofErr w:type="spellStart"/>
+      <w:r>
+        <w:rPr>
+          <w:rFonts w:ascii="Times New Roman" w:eastAsia="Times New Roman" w:hAnsi="Times New Roman" w:cs="Times New Roman"/>
+          <w:kern w:val="0"/>
+          <w:sz w:val="24"/>
+          <w:szCs w:val="24"/>
+          <w14:ligatures w14:val="none"/>
+        </w:rPr>
+        <w:t>localStorage</w:t>
+      </w:r>
+      <w:proofErr w:type="spellEnd"/>
+      <w:r>
+        <w:rPr>
+          <w:rFonts w:ascii="Times New Roman" w:eastAsia="Times New Roman" w:hAnsi="Times New Roman" w:cs="Times New Roman"/>
+          <w:kern w:val="0"/>
+          <w:sz w:val="24"/>
+          <w:szCs w:val="24"/>
+          <w14:ligatures w14:val="none"/>
+        </w:rPr>
+        <w:t>)</w:t>
       </w:r>
     </w:p>
     <w:p>
@@ -3189,8 +3347,13 @@
         </w:numPr>
       </w:pPr>
       <w:r>
-        <w:t>Used localStorage</w:t>
-      </w:r>
+        <w:t xml:space="preserve">Used </w:t>
+      </w:r>
+      <w:proofErr w:type="spellStart"/>
+      <w:r>
+        <w:t>localStorage</w:t>
+      </w:r>
+      <w:proofErr w:type="spellEnd"/>
     </w:p>
     <w:p>
       <w:pPr>
@@ -3215,7 +3378,21 @@
         <w:rPr>
           <w:rStyle w:val="HTMLCode"/>
         </w:rPr>
-        <w:t>Key: "ui_preferences"</w:t>
+        <w:t>Key: "</w:t>
+      </w:r>
+      <w:proofErr w:type="spellStart"/>
+      <w:r>
+        <w:rPr>
+          <w:rStyle w:val="HTMLCode"/>
+        </w:rPr>
+        <w:t>ui_preferences</w:t>
+      </w:r>
+      <w:proofErr w:type="spellEnd"/>
+      <w:r>
+        <w:rPr>
+          <w:rStyle w:val="HTMLCode"/>
+        </w:rPr>
+        <w:t>"</w:t>
       </w:r>
     </w:p>
     <w:p>
@@ -3246,11 +3423,19 @@
           <w:rStyle w:val="HTMLCode"/>
         </w:rPr>
       </w:pPr>
+      <w:proofErr w:type="spellStart"/>
       <w:r>
         <w:rPr>
           <w:rStyle w:val="HTMLCode"/>
         </w:rPr>
-        <w:t>savePreferences(data)</w:t>
+        <w:t>savePreferences</w:t>
+      </w:r>
+      <w:proofErr w:type="spellEnd"/>
+      <w:r>
+        <w:rPr>
+          <w:rStyle w:val="HTMLCode"/>
+        </w:rPr>
+        <w:t>(data)</w:t>
       </w:r>
     </w:p>
     <w:p>
@@ -3260,11 +3445,27 @@
           <w:rStyle w:val="HTMLCode"/>
         </w:rPr>
       </w:pPr>
+      <w:proofErr w:type="spellStart"/>
+      <w:proofErr w:type="gramStart"/>
       <w:r>
         <w:rPr>
           <w:rStyle w:val="HTMLCode"/>
         </w:rPr>
-        <w:t>loadPreferences()</w:t>
+        <w:t>loadPreferences</w:t>
+      </w:r>
+      <w:proofErr w:type="spellEnd"/>
+      <w:r>
+        <w:rPr>
+          <w:rStyle w:val="HTMLCode"/>
+        </w:rPr>
+        <w:t>(</w:t>
+      </w:r>
+      <w:proofErr w:type="gramEnd"/>
+      <w:r>
+        <w:rPr>
+          <w:rStyle w:val="HTMLCode"/>
+        </w:rPr>
+        <w:t>)</w:t>
       </w:r>
     </w:p>
     <w:p>
@@ -3415,30 +3616,36 @@
       <w:r>
         <w:t>Internal state sync (</w:t>
       </w:r>
+      <w:proofErr w:type="spellStart"/>
       <w:r>
         <w:rPr>
           <w:rStyle w:val="HTMLCode"/>
         </w:rPr>
         <w:t>userColor</w:t>
       </w:r>
+      <w:proofErr w:type="spellEnd"/>
       <w:r>
         <w:t xml:space="preserve">, </w:t>
       </w:r>
+      <w:proofErr w:type="spellStart"/>
       <w:r>
         <w:rPr>
           <w:rStyle w:val="HTMLCode"/>
         </w:rPr>
         <w:t>aiColor</w:t>
       </w:r>
+      <w:proofErr w:type="spellEnd"/>
       <w:r>
         <w:t xml:space="preserve">, </w:t>
       </w:r>
+      <w:proofErr w:type="spellStart"/>
       <w:r>
         <w:rPr>
           <w:rStyle w:val="HTMLCode"/>
         </w:rPr>
         <w:t>bgColor</w:t>
       </w:r>
+      <w:proofErr w:type="spellEnd"/>
       <w:r>
         <w:t>)</w:t>
       </w:r>
@@ -3475,12 +3682,14 @@
       <w:r>
         <w:t xml:space="preserve">Event binding via </w:t>
       </w:r>
+      <w:proofErr w:type="spellStart"/>
       <w:r>
         <w:rPr>
           <w:rStyle w:val="HTMLCode"/>
         </w:rPr>
         <w:t>addEventListener</w:t>
       </w:r>
+      <w:proofErr w:type="spellEnd"/>
     </w:p>
     <w:p>
       <w:r>
@@ -3704,8 +3913,18 @@
         <w:rPr>
           <w:rStyle w:val="HTMLCode"/>
         </w:rPr>
-        <w:t>Read chunks → split lines → filter "data:" → parse JSON → extract delta.content</w:t>
-      </w:r>
+        <w:t xml:space="preserve">Read chunks → split lines → filter "data:" → parse JSON → extract </w:t>
+      </w:r>
+      <w:proofErr w:type="spellStart"/>
+      <w:proofErr w:type="gramStart"/>
+      <w:r>
+        <w:rPr>
+          <w:rStyle w:val="HTMLCode"/>
+        </w:rPr>
+        <w:t>delta.content</w:t>
+      </w:r>
+      <w:proofErr w:type="spellEnd"/>
+      <w:proofErr w:type="gramEnd"/>
     </w:p>
     <w:p>
       <w:r>
@@ -4305,6 +4524,7 @@
       <w:r>
         <w:t xml:space="preserve"> using </w:t>
       </w:r>
+      <w:proofErr w:type="spellStart"/>
       <w:r>
         <w:rPr>
           <w:rStyle w:val="HTMLCode"/>
@@ -4312,6 +4532,7 @@
         </w:rPr>
         <w:t>localStorage</w:t>
       </w:r>
+      <w:proofErr w:type="spellEnd"/>
     </w:p>
     <w:p>
       <w:pPr>
@@ -4333,12 +4554,30 @@
           <w:numId w:val="27"/>
         </w:numPr>
       </w:pPr>
+      <w:proofErr w:type="spellStart"/>
+      <w:proofErr w:type="gramStart"/>
       <w:r>
         <w:rPr>
           <w:rStyle w:val="HTMLCode"/>
           <w:rFonts w:eastAsiaTheme="majorEastAsia"/>
         </w:rPr>
-        <w:t>saveConversations()</w:t>
+        <w:t>saveConversations</w:t>
+      </w:r>
+      <w:proofErr w:type="spellEnd"/>
+      <w:r>
+        <w:rPr>
+          <w:rStyle w:val="HTMLCode"/>
+          <w:rFonts w:eastAsiaTheme="majorEastAsia"/>
+        </w:rPr>
+        <w:t>(</w:t>
+      </w:r>
+      <w:proofErr w:type="gramEnd"/>
+      <w:r>
+        <w:rPr>
+          <w:rStyle w:val="HTMLCode"/>
+          <w:rFonts w:eastAsiaTheme="majorEastAsia"/>
+        </w:rPr>
+        <w:t>)</w:t>
       </w:r>
     </w:p>
     <w:p>
@@ -4349,12 +4588,30 @@
           <w:numId w:val="27"/>
         </w:numPr>
       </w:pPr>
+      <w:proofErr w:type="spellStart"/>
+      <w:proofErr w:type="gramStart"/>
       <w:r>
         <w:rPr>
           <w:rStyle w:val="HTMLCode"/>
           <w:rFonts w:eastAsiaTheme="majorEastAsia"/>
         </w:rPr>
-        <w:t>loadConversations()</w:t>
+        <w:t>loadConversations</w:t>
+      </w:r>
+      <w:proofErr w:type="spellEnd"/>
+      <w:r>
+        <w:rPr>
+          <w:rStyle w:val="HTMLCode"/>
+          <w:rFonts w:eastAsiaTheme="majorEastAsia"/>
+        </w:rPr>
+        <w:t>(</w:t>
+      </w:r>
+      <w:proofErr w:type="gramEnd"/>
+      <w:r>
+        <w:rPr>
+          <w:rStyle w:val="HTMLCode"/>
+          <w:rFonts w:eastAsiaTheme="majorEastAsia"/>
+        </w:rPr>
+        <w:t>)</w:t>
       </w:r>
     </w:p>
     <w:p>
@@ -4394,7 +4651,15 @@
         </w:numPr>
       </w:pPr>
       <w:r>
-        <w:t>Verified persistence through DevTools inspection</w:t>
+        <w:t xml:space="preserve">Verified persistence through </w:t>
+      </w:r>
+      <w:proofErr w:type="spellStart"/>
+      <w:r>
+        <w:t>DevTools</w:t>
+      </w:r>
+      <w:proofErr w:type="spellEnd"/>
+      <w:r>
+        <w:t xml:space="preserve"> inspection</w:t>
       </w:r>
     </w:p>
     <w:p>
@@ -4452,12 +4717,30 @@
           <w:numId w:val="28"/>
         </w:numPr>
       </w:pPr>
+      <w:proofErr w:type="spellStart"/>
+      <w:proofErr w:type="gramStart"/>
       <w:r>
         <w:rPr>
           <w:rStyle w:val="HTMLCode"/>
           <w:rFonts w:eastAsiaTheme="majorEastAsia"/>
         </w:rPr>
-        <w:t>createConversation()</w:t>
+        <w:t>createConversation</w:t>
+      </w:r>
+      <w:proofErr w:type="spellEnd"/>
+      <w:r>
+        <w:rPr>
+          <w:rStyle w:val="HTMLCode"/>
+          <w:rFonts w:eastAsiaTheme="majorEastAsia"/>
+        </w:rPr>
+        <w:t>(</w:t>
+      </w:r>
+      <w:proofErr w:type="gramEnd"/>
+      <w:r>
+        <w:rPr>
+          <w:rStyle w:val="HTMLCode"/>
+          <w:rFonts w:eastAsiaTheme="majorEastAsia"/>
+        </w:rPr>
+        <w:t>)</w:t>
       </w:r>
     </w:p>
     <w:p>
@@ -4468,12 +4751,30 @@
           <w:numId w:val="28"/>
         </w:numPr>
       </w:pPr>
+      <w:proofErr w:type="spellStart"/>
+      <w:proofErr w:type="gramStart"/>
       <w:r>
         <w:rPr>
           <w:rStyle w:val="HTMLCode"/>
           <w:rFonts w:eastAsiaTheme="majorEastAsia"/>
         </w:rPr>
-        <w:t>updateConversation()</w:t>
+        <w:t>updateConversation</w:t>
+      </w:r>
+      <w:proofErr w:type="spellEnd"/>
+      <w:r>
+        <w:rPr>
+          <w:rStyle w:val="HTMLCode"/>
+          <w:rFonts w:eastAsiaTheme="majorEastAsia"/>
+        </w:rPr>
+        <w:t>(</w:t>
+      </w:r>
+      <w:proofErr w:type="gramEnd"/>
+      <w:r>
+        <w:rPr>
+          <w:rStyle w:val="HTMLCode"/>
+          <w:rFonts w:eastAsiaTheme="majorEastAsia"/>
+        </w:rPr>
+        <w:t>)</w:t>
       </w:r>
     </w:p>
     <w:p>
@@ -4484,12 +4785,30 @@
           <w:numId w:val="28"/>
         </w:numPr>
       </w:pPr>
+      <w:proofErr w:type="spellStart"/>
+      <w:proofErr w:type="gramStart"/>
       <w:r>
         <w:rPr>
           <w:rStyle w:val="HTMLCode"/>
           <w:rFonts w:eastAsiaTheme="majorEastAsia"/>
         </w:rPr>
-        <w:t>getAllConversations()</w:t>
+        <w:t>getAllConversations</w:t>
+      </w:r>
+      <w:proofErr w:type="spellEnd"/>
+      <w:r>
+        <w:rPr>
+          <w:rStyle w:val="HTMLCode"/>
+          <w:rFonts w:eastAsiaTheme="majorEastAsia"/>
+        </w:rPr>
+        <w:t>(</w:t>
+      </w:r>
+      <w:proofErr w:type="gramEnd"/>
+      <w:r>
+        <w:rPr>
+          <w:rStyle w:val="HTMLCode"/>
+          <w:rFonts w:eastAsiaTheme="majorEastAsia"/>
+        </w:rPr>
+        <w:t>)</w:t>
       </w:r>
     </w:p>
     <w:p>
@@ -4527,6 +4846,7 @@
       <w:r>
         <w:t>Timestamp tracking (</w:t>
       </w:r>
+      <w:proofErr w:type="spellStart"/>
       <w:r>
         <w:rPr>
           <w:rStyle w:val="HTMLCode"/>
@@ -4534,9 +4854,11 @@
         </w:rPr>
         <w:t>createdAt</w:t>
       </w:r>
+      <w:proofErr w:type="spellEnd"/>
       <w:r>
         <w:t xml:space="preserve">, </w:t>
       </w:r>
+      <w:proofErr w:type="spellStart"/>
       <w:r>
         <w:rPr>
           <w:rStyle w:val="HTMLCode"/>
@@ -4544,6 +4866,7 @@
         </w:rPr>
         <w:t>updatedAt</w:t>
       </w:r>
+      <w:proofErr w:type="spellEnd"/>
       <w:r>
         <w:t>)</w:t>
       </w:r>
@@ -4753,12 +5076,30 @@
       <w:r>
         <w:t xml:space="preserve">Implemented </w:t>
       </w:r>
+      <w:proofErr w:type="spellStart"/>
+      <w:proofErr w:type="gramStart"/>
       <w:r>
         <w:rPr>
           <w:rStyle w:val="HTMLCode"/>
           <w:rFonts w:eastAsiaTheme="majorEastAsia"/>
         </w:rPr>
-        <w:t>renderConversations()</w:t>
+        <w:t>renderConversations</w:t>
+      </w:r>
+      <w:proofErr w:type="spellEnd"/>
+      <w:r>
+        <w:rPr>
+          <w:rStyle w:val="HTMLCode"/>
+          <w:rFonts w:eastAsiaTheme="majorEastAsia"/>
+        </w:rPr>
+        <w:t>(</w:t>
+      </w:r>
+      <w:proofErr w:type="gramEnd"/>
+      <w:r>
+        <w:rPr>
+          <w:rStyle w:val="HTMLCode"/>
+          <w:rFonts w:eastAsiaTheme="majorEastAsia"/>
+        </w:rPr>
+        <w:t>)</w:t>
       </w:r>
     </w:p>
     <w:p>
@@ -4876,6 +5217,7 @@
           <w:numId w:val="31"/>
         </w:numPr>
       </w:pPr>
+      <w:proofErr w:type="spellStart"/>
       <w:r>
         <w:rPr>
           <w:rStyle w:val="HTMLCode"/>
@@ -4883,6 +5225,7 @@
         </w:rPr>
         <w:t>currentConversation</w:t>
       </w:r>
+      <w:proofErr w:type="spellEnd"/>
     </w:p>
     <w:p>
       <w:pPr>
@@ -5143,12 +5486,30 @@
       <w:r>
         <w:t xml:space="preserve">Implemented </w:t>
       </w:r>
+      <w:proofErr w:type="spellStart"/>
+      <w:proofErr w:type="gramStart"/>
       <w:r>
         <w:rPr>
           <w:rStyle w:val="HTMLCode"/>
           <w:rFonts w:eastAsiaTheme="majorEastAsia"/>
         </w:rPr>
-        <w:t>toggleSidebar()</w:t>
+        <w:t>toggleSidebar</w:t>
+      </w:r>
+      <w:proofErr w:type="spellEnd"/>
+      <w:r>
+        <w:rPr>
+          <w:rStyle w:val="HTMLCode"/>
+          <w:rFonts w:eastAsiaTheme="majorEastAsia"/>
+        </w:rPr>
+        <w:t>(</w:t>
+      </w:r>
+      <w:proofErr w:type="gramEnd"/>
+      <w:r>
+        <w:rPr>
+          <w:rStyle w:val="HTMLCode"/>
+          <w:rFonts w:eastAsiaTheme="majorEastAsia"/>
+        </w:rPr>
+        <w:t>)</w:t>
       </w:r>
     </w:p>
     <w:p>
@@ -5358,6 +5719,7 @@
       <w:r>
         <w:t xml:space="preserve">Eliminated direct </w:t>
       </w:r>
+      <w:proofErr w:type="spellStart"/>
       <w:r>
         <w:rPr>
           <w:rStyle w:val="HTMLCode"/>
@@ -5365,6 +5727,7 @@
         </w:rPr>
         <w:t>localStorage</w:t>
       </w:r>
+      <w:proofErr w:type="spellEnd"/>
       <w:r>
         <w:t xml:space="preserve"> mutation</w:t>
       </w:r>
@@ -5381,12 +5744,30 @@
         <w:lastRenderedPageBreak/>
         <w:t xml:space="preserve">Introduced </w:t>
       </w:r>
+      <w:proofErr w:type="spellStart"/>
+      <w:proofErr w:type="gramStart"/>
       <w:r>
         <w:rPr>
           <w:rStyle w:val="HTMLCode"/>
           <w:rFonts w:eastAsiaTheme="majorEastAsia"/>
         </w:rPr>
-        <w:t>deleteConversation()</w:t>
+        <w:t>deleteConversation</w:t>
+      </w:r>
+      <w:proofErr w:type="spellEnd"/>
+      <w:r>
+        <w:rPr>
+          <w:rStyle w:val="HTMLCode"/>
+          <w:rFonts w:eastAsiaTheme="majorEastAsia"/>
+        </w:rPr>
+        <w:t>(</w:t>
+      </w:r>
+      <w:proofErr w:type="gramEnd"/>
+      <w:r>
+        <w:rPr>
+          <w:rStyle w:val="HTMLCode"/>
+          <w:rFonts w:eastAsiaTheme="majorEastAsia"/>
+        </w:rPr>
+        <w:t>)</w:t>
       </w:r>
       <w:r>
         <w:t xml:space="preserve"> in data layer</w:t>
@@ -6209,12 +6590,21 @@
           <w:numId w:val="45"/>
         </w:numPr>
       </w:pPr>
+      <w:proofErr w:type="spellStart"/>
       <w:r>
         <w:rPr>
           <w:rStyle w:val="HTMLCode"/>
           <w:rFonts w:eastAsiaTheme="majorEastAsia"/>
         </w:rPr>
-        <w:t>node_modules/</w:t>
+        <w:t>node_modules</w:t>
+      </w:r>
+      <w:proofErr w:type="spellEnd"/>
+      <w:r>
+        <w:rPr>
+          <w:rStyle w:val="HTMLCode"/>
+          <w:rFonts w:eastAsiaTheme="majorEastAsia"/>
+        </w:rPr>
+        <w:t>/</w:t>
       </w:r>
     </w:p>
     <w:p>
@@ -6225,12 +6615,21 @@
           <w:numId w:val="45"/>
         </w:numPr>
       </w:pPr>
+      <w:proofErr w:type="spellStart"/>
       <w:r>
         <w:rPr>
           <w:rStyle w:val="HTMLCode"/>
           <w:rFonts w:eastAsiaTheme="majorEastAsia"/>
         </w:rPr>
-        <w:t>venv/</w:t>
+        <w:t>venv</w:t>
+      </w:r>
+      <w:proofErr w:type="spellEnd"/>
+      <w:r>
+        <w:rPr>
+          <w:rStyle w:val="HTMLCode"/>
+          <w:rFonts w:eastAsiaTheme="majorEastAsia"/>
+        </w:rPr>
+        <w:t>/</w:t>
       </w:r>
     </w:p>
     <w:p>
@@ -6242,15 +6641,29 @@
         </w:numPr>
       </w:pPr>
       <w:r>
-        <w:t xml:space="preserve">Created and corrected </w:t>
+        <w:t xml:space="preserve">Created and </w:t>
+      </w:r>
+      <w:proofErr w:type="gramStart"/>
+      <w:r>
+        <w:t xml:space="preserve">corrected </w:t>
       </w:r>
       <w:r>
         <w:rPr>
           <w:rStyle w:val="HTMLCode"/>
           <w:rFonts w:eastAsiaTheme="majorEastAsia"/>
         </w:rPr>
-        <w:t>.gitignore</w:t>
-      </w:r>
+        <w:t>.</w:t>
+      </w:r>
+      <w:proofErr w:type="spellStart"/>
+      <w:r>
+        <w:rPr>
+          <w:rStyle w:val="HTMLCode"/>
+          <w:rFonts w:eastAsiaTheme="majorEastAsia"/>
+        </w:rPr>
+        <w:t>gitignore</w:t>
+      </w:r>
+      <w:proofErr w:type="spellEnd"/>
+      <w:proofErr w:type="gramEnd"/>
     </w:p>
     <w:p>
       <w:pPr>
@@ -6348,7 +6761,15 @@
         </w:numPr>
       </w:pPr>
       <w:r>
-        <w:t>“Initial clean commit - project setup with gitignore”</w:t>
+        <w:t xml:space="preserve">“Initial clean commit - project setup with </w:t>
+      </w:r>
+      <w:proofErr w:type="spellStart"/>
+      <w:r>
+        <w:t>gitignore</w:t>
+      </w:r>
+      <w:proofErr w:type="spellEnd"/>
+      <w:r>
+        <w:t>”</w:t>
       </w:r>
     </w:p>
     <w:p>
@@ -6635,6 +7056,7 @@
       <w:r>
         <w:t xml:space="preserve">ignore </w:t>
       </w:r>
+      <w:proofErr w:type="spellStart"/>
       <w:r>
         <w:rPr>
           <w:rStyle w:val="HTMLCode"/>
@@ -6642,9 +7064,11 @@
         </w:rPr>
         <w:t>venv</w:t>
       </w:r>
+      <w:proofErr w:type="spellEnd"/>
       <w:r>
         <w:t xml:space="preserve"> and </w:t>
       </w:r>
+      <w:proofErr w:type="spellStart"/>
       <w:r>
         <w:rPr>
           <w:rStyle w:val="HTMLCode"/>
@@ -6652,6 +7076,7 @@
         </w:rPr>
         <w:t>node_modules</w:t>
       </w:r>
+      <w:proofErr w:type="spellEnd"/>
       <w:r>
         <w:t xml:space="preserve"> explicitly</w:t>
       </w:r>
@@ -6708,13 +7133,24 @@
           <w:numId w:val="50"/>
         </w:numPr>
       </w:pPr>
+      <w:proofErr w:type="gramStart"/>
       <w:r>
         <w:rPr>
           <w:rStyle w:val="HTMLCode"/>
           <w:rFonts w:eastAsiaTheme="majorEastAsia"/>
         </w:rPr>
-        <w:t>.gitignore</w:t>
-      </w:r>
+        <w:t>.</w:t>
+      </w:r>
+      <w:proofErr w:type="spellStart"/>
+      <w:r>
+        <w:rPr>
+          <w:rStyle w:val="HTMLCode"/>
+          <w:rFonts w:eastAsiaTheme="majorEastAsia"/>
+        </w:rPr>
+        <w:t>gitignore</w:t>
+      </w:r>
+      <w:proofErr w:type="spellEnd"/>
+      <w:proofErr w:type="gramEnd"/>
       <w:r>
         <w:t xml:space="preserve"> only affects untracked/staging behavior</w:t>
       </w:r>
@@ -6900,11 +7336,225 @@
     </w:p>
     <w:p>
       <w:pPr>
+        <w:tabs>
+          <w:tab w:val="left" w:pos="3975"/>
+        </w:tabs>
         <w:rPr>
           <w:sz w:val="52"/>
           <w:szCs w:val="52"/>
         </w:rPr>
       </w:pPr>
+    </w:p>
+    <w:p>
+      <w:pPr>
+        <w:tabs>
+          <w:tab w:val="left" w:pos="3975"/>
+        </w:tabs>
+        <w:rPr>
+          <w:sz w:val="52"/>
+          <w:szCs w:val="52"/>
+        </w:rPr>
+      </w:pPr>
+      <w:r>
+        <w:rPr>
+          <w:sz w:val="52"/>
+          <w:szCs w:val="52"/>
+        </w:rPr>
+        <w:t>Date- 27-04-2026</w:t>
+      </w:r>
+    </w:p>
+    <w:p>
+      <w:pPr>
+        <w:pStyle w:val="NormalWeb"/>
+      </w:pPr>
+      <w:r>
+        <w:t>We have successfully transitioned your project into a modular, organized structure. Here is the summary of what was achieved:</w:t>
+      </w:r>
+    </w:p>
+    <w:p>
+      <w:pPr>
+        <w:pStyle w:val="Heading3"/>
+      </w:pPr>
+      <w:r>
+        <w:t>1. Structural Reorganization</w:t>
+      </w:r>
+    </w:p>
+    <w:p>
+      <w:pPr>
+        <w:pStyle w:val="NormalWeb"/>
+        <w:numPr>
+          <w:ilvl w:val="0"/>
+          <w:numId w:val="53"/>
+        </w:numPr>
+      </w:pPr>
+      <w:r>
+        <w:rPr>
+          <w:b/>
+          <w:bCs/>
+        </w:rPr>
+        <w:t>Directory Migration:</w:t>
+      </w:r>
+      <w:r>
+        <w:t xml:space="preserve"> You successfully moved your core logic and UI files into a new </w:t>
+      </w:r>
+      <w:proofErr w:type="spellStart"/>
+      <w:r>
+        <w:rPr>
+          <w:rStyle w:val="HTMLCode"/>
+        </w:rPr>
+        <w:t>Bone_Code</w:t>
+      </w:r>
+      <w:proofErr w:type="spellEnd"/>
+      <w:r>
+        <w:rPr>
+          <w:rStyle w:val="HTMLCode"/>
+        </w:rPr>
+        <w:t>/</w:t>
+      </w:r>
+      <w:r>
+        <w:t xml:space="preserve"> directory, separating concerns into </w:t>
+      </w:r>
+      <w:proofErr w:type="spellStart"/>
+      <w:r>
+        <w:rPr>
+          <w:rStyle w:val="HTMLCode"/>
+        </w:rPr>
+        <w:t>css</w:t>
+      </w:r>
+      <w:proofErr w:type="spellEnd"/>
+      <w:r>
+        <w:rPr>
+          <w:rStyle w:val="HTMLCode"/>
+        </w:rPr>
+        <w:t>/</w:t>
+      </w:r>
+      <w:r>
+        <w:t xml:space="preserve">, </w:t>
+      </w:r>
+      <w:proofErr w:type="spellStart"/>
+      <w:r>
+        <w:rPr>
+          <w:rStyle w:val="HTMLCode"/>
+        </w:rPr>
+        <w:t>js</w:t>
+      </w:r>
+      <w:proofErr w:type="spellEnd"/>
+      <w:r>
+        <w:rPr>
+          <w:rStyle w:val="HTMLCode"/>
+        </w:rPr>
+        <w:t>/</w:t>
+      </w:r>
+      <w:r>
+        <w:t xml:space="preserve">, and </w:t>
+      </w:r>
+      <w:r>
+        <w:rPr>
+          <w:rStyle w:val="HTMLCode"/>
+        </w:rPr>
+        <w:t>html/</w:t>
+      </w:r>
+      <w:r>
+        <w:t xml:space="preserve"> folders.</w:t>
+      </w:r>
+    </w:p>
+    <w:p>
+      <w:pPr>
+        <w:pStyle w:val="NormalWeb"/>
+        <w:numPr>
+          <w:ilvl w:val="0"/>
+          <w:numId w:val="53"/>
+        </w:numPr>
+      </w:pPr>
+      <w:r>
+        <w:rPr>
+          <w:b/>
+          <w:bCs/>
+        </w:rPr>
+        <w:t>Path Correction:</w:t>
+      </w:r>
+      <w:r>
+        <w:t xml:space="preserve"> We updated the Electron entry point in </w:t>
+      </w:r>
+      <w:r>
+        <w:rPr>
+          <w:rStyle w:val="HTMLCode"/>
+        </w:rPr>
+        <w:t>main.js</w:t>
+      </w:r>
+      <w:r>
+        <w:t xml:space="preserve"> and the </w:t>
+      </w:r>
+      <w:r>
+        <w:rPr>
+          <w:rStyle w:val="HTMLCode"/>
+        </w:rPr>
+        <w:t>&lt;script&gt;</w:t>
+      </w:r>
+      <w:r>
+        <w:t xml:space="preserve"> imports in </w:t>
+      </w:r>
+      <w:r>
+        <w:rPr>
+          <w:rStyle w:val="HTMLCode"/>
+        </w:rPr>
+        <w:t>index.html</w:t>
+      </w:r>
+      <w:r>
+        <w:t xml:space="preserve"> to reflect the new file locations using relative paths </w:t>
+      </w:r>
+      <w:proofErr w:type="gramStart"/>
+      <w:r>
+        <w:t>(</w:t>
+      </w:r>
+      <w:r>
+        <w:rPr>
+          <w:rStyle w:val="HTMLCode"/>
+        </w:rPr>
+        <w:t>..</w:t>
+      </w:r>
+      <w:proofErr w:type="gramEnd"/>
+      <w:r>
+        <w:rPr>
+          <w:rStyle w:val="HTMLCode"/>
+        </w:rPr>
+        <w:t>/</w:t>
+      </w:r>
+      <w:proofErr w:type="spellStart"/>
+      <w:r>
+        <w:rPr>
+          <w:rStyle w:val="HTMLCode"/>
+        </w:rPr>
+        <w:t>js</w:t>
+      </w:r>
+      <w:proofErr w:type="spellEnd"/>
+      <w:r>
+        <w:rPr>
+          <w:rStyle w:val="HTMLCode"/>
+        </w:rPr>
+        <w:t>/</w:t>
+      </w:r>
+      <w:r>
+        <w:t>).</w:t>
+      </w:r>
+    </w:p>
+    <w:p>
+      <w:pPr>
+        <w:tabs>
+          <w:tab w:val="left" w:pos="3975"/>
+        </w:tabs>
+        <w:rPr>
+          <w:sz w:val="52"/>
+          <w:szCs w:val="52"/>
+        </w:rPr>
+      </w:pPr>
+      <w:r>
+        <w:rPr>
+          <w:sz w:val="52"/>
+          <w:szCs w:val="52"/>
+        </w:rPr>
+        <w:tab/>
+      </w:r>
     </w:p>
     <w:sectPr>
       <w:pgSz w:w="12240" w:h="15840"/>
@@ -10495,6 +11145,155 @@
     </w:lvl>
   </w:abstractNum>
   <w:abstractNum w:abstractNumId="24" w15:restartNumberingAfterBreak="0">
+    <w:nsid w:val="3FEC0747"/>
+    <w:multiLevelType w:val="multilevel"/>
+    <w:tmpl w:val="D902D9FA"/>
+    <w:lvl w:ilvl="0">
+      <w:start w:val="1"/>
+      <w:numFmt w:val="bullet"/>
+      <w:lvlText w:val=""/>
+      <w:lvlJc w:val="left"/>
+      <w:pPr>
+        <w:tabs>
+          <w:tab w:val="num" w:pos="720"/>
+        </w:tabs>
+        <w:ind w:left="720" w:hanging="360"/>
+      </w:pPr>
+      <w:rPr>
+        <w:rFonts w:ascii="Symbol" w:hAnsi="Symbol" w:hint="default"/>
+        <w:sz w:val="20"/>
+      </w:rPr>
+    </w:lvl>
+    <w:lvl w:ilvl="1" w:tentative="1">
+      <w:start w:val="1"/>
+      <w:numFmt w:val="bullet"/>
+      <w:lvlText w:val="o"/>
+      <w:lvlJc w:val="left"/>
+      <w:pPr>
+        <w:tabs>
+          <w:tab w:val="num" w:pos="1440"/>
+        </w:tabs>
+        <w:ind w:left="1440" w:hanging="360"/>
+      </w:pPr>
+      <w:rPr>
+        <w:rFonts w:ascii="Courier New" w:hAnsi="Courier New" w:hint="default"/>
+        <w:sz w:val="20"/>
+      </w:rPr>
+    </w:lvl>
+    <w:lvl w:ilvl="2" w:tentative="1">
+      <w:start w:val="1"/>
+      <w:numFmt w:val="bullet"/>
+      <w:lvlText w:val=""/>
+      <w:lvlJc w:val="left"/>
+      <w:pPr>
+        <w:tabs>
+          <w:tab w:val="num" w:pos="2160"/>
+        </w:tabs>
+        <w:ind w:left="2160" w:hanging="360"/>
+      </w:pPr>
+      <w:rPr>
+        <w:rFonts w:ascii="Wingdings" w:hAnsi="Wingdings" w:hint="default"/>
+        <w:sz w:val="20"/>
+      </w:rPr>
+    </w:lvl>
+    <w:lvl w:ilvl="3" w:tentative="1">
+      <w:start w:val="1"/>
+      <w:numFmt w:val="bullet"/>
+      <w:lvlText w:val=""/>
+      <w:lvlJc w:val="left"/>
+      <w:pPr>
+        <w:tabs>
+          <w:tab w:val="num" w:pos="2880"/>
+        </w:tabs>
+        <w:ind w:left="2880" w:hanging="360"/>
+      </w:pPr>
+      <w:rPr>
+        <w:rFonts w:ascii="Wingdings" w:hAnsi="Wingdings" w:hint="default"/>
+        <w:sz w:val="20"/>
+      </w:rPr>
+    </w:lvl>
+    <w:lvl w:ilvl="4" w:tentative="1">
+      <w:start w:val="1"/>
+      <w:numFmt w:val="bullet"/>
+      <w:lvlText w:val=""/>
+      <w:lvlJc w:val="left"/>
+      <w:pPr>
+        <w:tabs>
+          <w:tab w:val="num" w:pos="3600"/>
+        </w:tabs>
+        <w:ind w:left="3600" w:hanging="360"/>
+      </w:pPr>
+      <w:rPr>
+        <w:rFonts w:ascii="Wingdings" w:hAnsi="Wingdings" w:hint="default"/>
+        <w:sz w:val="20"/>
+      </w:rPr>
+    </w:lvl>
+    <w:lvl w:ilvl="5" w:tentative="1">
+      <w:start w:val="1"/>
+      <w:numFmt w:val="bullet"/>
+      <w:lvlText w:val=""/>
+      <w:lvlJc w:val="left"/>
+      <w:pPr>
+        <w:tabs>
+          <w:tab w:val="num" w:pos="4320"/>
+        </w:tabs>
+        <w:ind w:left="4320" w:hanging="360"/>
+      </w:pPr>
+      <w:rPr>
+        <w:rFonts w:ascii="Wingdings" w:hAnsi="Wingdings" w:hint="default"/>
+        <w:sz w:val="20"/>
+      </w:rPr>
+    </w:lvl>
+    <w:lvl w:ilvl="6" w:tentative="1">
+      <w:start w:val="1"/>
+      <w:numFmt w:val="bullet"/>
+      <w:lvlText w:val=""/>
+      <w:lvlJc w:val="left"/>
+      <w:pPr>
+        <w:tabs>
+          <w:tab w:val="num" w:pos="5040"/>
+        </w:tabs>
+        <w:ind w:left="5040" w:hanging="360"/>
+      </w:pPr>
+      <w:rPr>
+        <w:rFonts w:ascii="Wingdings" w:hAnsi="Wingdings" w:hint="default"/>
+        <w:sz w:val="20"/>
+      </w:rPr>
+    </w:lvl>
+    <w:lvl w:ilvl="7" w:tentative="1">
+      <w:start w:val="1"/>
+      <w:numFmt w:val="bullet"/>
+      <w:lvlText w:val=""/>
+      <w:lvlJc w:val="left"/>
+      <w:pPr>
+        <w:tabs>
+          <w:tab w:val="num" w:pos="5760"/>
+        </w:tabs>
+        <w:ind w:left="5760" w:hanging="360"/>
+      </w:pPr>
+      <w:rPr>
+        <w:rFonts w:ascii="Wingdings" w:hAnsi="Wingdings" w:hint="default"/>
+        <w:sz w:val="20"/>
+      </w:rPr>
+    </w:lvl>
+    <w:lvl w:ilvl="8" w:tentative="1">
+      <w:start w:val="1"/>
+      <w:numFmt w:val="bullet"/>
+      <w:lvlText w:val=""/>
+      <w:lvlJc w:val="left"/>
+      <w:pPr>
+        <w:tabs>
+          <w:tab w:val="num" w:pos="6480"/>
+        </w:tabs>
+        <w:ind w:left="6480" w:hanging="360"/>
+      </w:pPr>
+      <w:rPr>
+        <w:rFonts w:ascii="Wingdings" w:hAnsi="Wingdings" w:hint="default"/>
+        <w:sz w:val="20"/>
+      </w:rPr>
+    </w:lvl>
+  </w:abstractNum>
+  <w:abstractNum w:abstractNumId="25" w15:restartNumberingAfterBreak="0">
     <w:nsid w:val="4022142D"/>
     <w:multiLevelType w:val="multilevel"/>
     <w:tmpl w:val="91CE0946"/>
@@ -10643,7 +11442,7 @@
       </w:rPr>
     </w:lvl>
   </w:abstractNum>
-  <w:abstractNum w:abstractNumId="25" w15:restartNumberingAfterBreak="0">
+  <w:abstractNum w:abstractNumId="26" w15:restartNumberingAfterBreak="0">
     <w:nsid w:val="42295FD5"/>
     <w:multiLevelType w:val="multilevel"/>
     <w:tmpl w:val="5678AC2C"/>
@@ -10792,7 +11591,7 @@
       </w:rPr>
     </w:lvl>
   </w:abstractNum>
-  <w:abstractNum w:abstractNumId="26" w15:restartNumberingAfterBreak="0">
+  <w:abstractNum w:abstractNumId="27" w15:restartNumberingAfterBreak="0">
     <w:nsid w:val="486D547F"/>
     <w:multiLevelType w:val="multilevel"/>
     <w:tmpl w:val="8CE231FA"/>
@@ -10941,7 +11740,7 @@
       </w:rPr>
     </w:lvl>
   </w:abstractNum>
-  <w:abstractNum w:abstractNumId="27" w15:restartNumberingAfterBreak="0">
+  <w:abstractNum w:abstractNumId="28" w15:restartNumberingAfterBreak="0">
     <w:nsid w:val="4E072FF2"/>
     <w:multiLevelType w:val="multilevel"/>
     <w:tmpl w:val="0570E538"/>
@@ -11090,7 +11889,7 @@
       </w:rPr>
     </w:lvl>
   </w:abstractNum>
-  <w:abstractNum w:abstractNumId="28" w15:restartNumberingAfterBreak="0">
+  <w:abstractNum w:abstractNumId="29" w15:restartNumberingAfterBreak="0">
     <w:nsid w:val="4E84565A"/>
     <w:multiLevelType w:val="multilevel"/>
     <w:tmpl w:val="E7BEE546"/>
@@ -11239,7 +12038,7 @@
       </w:rPr>
     </w:lvl>
   </w:abstractNum>
-  <w:abstractNum w:abstractNumId="29" w15:restartNumberingAfterBreak="0">
+  <w:abstractNum w:abstractNumId="30" w15:restartNumberingAfterBreak="0">
     <w:nsid w:val="53982AAB"/>
     <w:multiLevelType w:val="multilevel"/>
     <w:tmpl w:val="3BE8998E"/>
@@ -11388,7 +12187,7 @@
       </w:rPr>
     </w:lvl>
   </w:abstractNum>
-  <w:abstractNum w:abstractNumId="30" w15:restartNumberingAfterBreak="0">
+  <w:abstractNum w:abstractNumId="31" w15:restartNumberingAfterBreak="0">
     <w:nsid w:val="54064360"/>
     <w:multiLevelType w:val="multilevel"/>
     <w:tmpl w:val="E56AAC72"/>
@@ -11537,7 +12336,7 @@
       </w:rPr>
     </w:lvl>
   </w:abstractNum>
-  <w:abstractNum w:abstractNumId="31" w15:restartNumberingAfterBreak="0">
+  <w:abstractNum w:abstractNumId="32" w15:restartNumberingAfterBreak="0">
     <w:nsid w:val="5CDE7704"/>
     <w:multiLevelType w:val="multilevel"/>
     <w:tmpl w:val="5E9054A0"/>
@@ -11686,7 +12485,7 @@
       </w:rPr>
     </w:lvl>
   </w:abstractNum>
-  <w:abstractNum w:abstractNumId="32" w15:restartNumberingAfterBreak="0">
+  <w:abstractNum w:abstractNumId="33" w15:restartNumberingAfterBreak="0">
     <w:nsid w:val="5E6341BC"/>
     <w:multiLevelType w:val="multilevel"/>
     <w:tmpl w:val="FC52693A"/>
@@ -11835,7 +12634,7 @@
       </w:rPr>
     </w:lvl>
   </w:abstractNum>
-  <w:abstractNum w:abstractNumId="33" w15:restartNumberingAfterBreak="0">
+  <w:abstractNum w:abstractNumId="34" w15:restartNumberingAfterBreak="0">
     <w:nsid w:val="5FB26915"/>
     <w:multiLevelType w:val="multilevel"/>
     <w:tmpl w:val="1DD4BD44"/>
@@ -11984,7 +12783,7 @@
       </w:rPr>
     </w:lvl>
   </w:abstractNum>
-  <w:abstractNum w:abstractNumId="34" w15:restartNumberingAfterBreak="0">
+  <w:abstractNum w:abstractNumId="35" w15:restartNumberingAfterBreak="0">
     <w:nsid w:val="605C6834"/>
     <w:multiLevelType w:val="multilevel"/>
     <w:tmpl w:val="A288BBDE"/>
@@ -12133,7 +12932,7 @@
       </w:rPr>
     </w:lvl>
   </w:abstractNum>
-  <w:abstractNum w:abstractNumId="35" w15:restartNumberingAfterBreak="0">
+  <w:abstractNum w:abstractNumId="36" w15:restartNumberingAfterBreak="0">
     <w:nsid w:val="638127B1"/>
     <w:multiLevelType w:val="multilevel"/>
     <w:tmpl w:val="E6A4D87E"/>
@@ -12282,7 +13081,7 @@
       </w:rPr>
     </w:lvl>
   </w:abstractNum>
-  <w:abstractNum w:abstractNumId="36" w15:restartNumberingAfterBreak="0">
+  <w:abstractNum w:abstractNumId="37" w15:restartNumberingAfterBreak="0">
     <w:nsid w:val="63FD2244"/>
     <w:multiLevelType w:val="multilevel"/>
     <w:tmpl w:val="7A78F2A4"/>
@@ -12431,7 +13230,7 @@
       </w:rPr>
     </w:lvl>
   </w:abstractNum>
-  <w:abstractNum w:abstractNumId="37" w15:restartNumberingAfterBreak="0">
+  <w:abstractNum w:abstractNumId="38" w15:restartNumberingAfterBreak="0">
     <w:nsid w:val="647661AA"/>
     <w:multiLevelType w:val="multilevel"/>
     <w:tmpl w:val="2530F62C"/>
@@ -12580,7 +13379,7 @@
       </w:rPr>
     </w:lvl>
   </w:abstractNum>
-  <w:abstractNum w:abstractNumId="38" w15:restartNumberingAfterBreak="0">
+  <w:abstractNum w:abstractNumId="39" w15:restartNumberingAfterBreak="0">
     <w:nsid w:val="64D34A4E"/>
     <w:multiLevelType w:val="multilevel"/>
     <w:tmpl w:val="BB4270B8"/>
@@ -12729,7 +13528,7 @@
       </w:rPr>
     </w:lvl>
   </w:abstractNum>
-  <w:abstractNum w:abstractNumId="39" w15:restartNumberingAfterBreak="0">
+  <w:abstractNum w:abstractNumId="40" w15:restartNumberingAfterBreak="0">
     <w:nsid w:val="660E6280"/>
     <w:multiLevelType w:val="multilevel"/>
     <w:tmpl w:val="19A42C26"/>
@@ -12878,7 +13677,7 @@
       </w:rPr>
     </w:lvl>
   </w:abstractNum>
-  <w:abstractNum w:abstractNumId="40" w15:restartNumberingAfterBreak="0">
+  <w:abstractNum w:abstractNumId="41" w15:restartNumberingAfterBreak="0">
     <w:nsid w:val="66D54201"/>
     <w:multiLevelType w:val="multilevel"/>
     <w:tmpl w:val="BCA6AD92"/>
@@ -13027,7 +13826,7 @@
       </w:rPr>
     </w:lvl>
   </w:abstractNum>
-  <w:abstractNum w:abstractNumId="41" w15:restartNumberingAfterBreak="0">
+  <w:abstractNum w:abstractNumId="42" w15:restartNumberingAfterBreak="0">
     <w:nsid w:val="686F2F06"/>
     <w:multiLevelType w:val="multilevel"/>
     <w:tmpl w:val="543276EE"/>
@@ -13176,7 +13975,7 @@
       </w:rPr>
     </w:lvl>
   </w:abstractNum>
-  <w:abstractNum w:abstractNumId="42" w15:restartNumberingAfterBreak="0">
+  <w:abstractNum w:abstractNumId="43" w15:restartNumberingAfterBreak="0">
     <w:nsid w:val="6A0E646F"/>
     <w:multiLevelType w:val="multilevel"/>
     <w:tmpl w:val="98B25B0E"/>
@@ -13325,7 +14124,7 @@
       </w:rPr>
     </w:lvl>
   </w:abstractNum>
-  <w:abstractNum w:abstractNumId="43" w15:restartNumberingAfterBreak="0">
+  <w:abstractNum w:abstractNumId="44" w15:restartNumberingAfterBreak="0">
     <w:nsid w:val="6B4B6A21"/>
     <w:multiLevelType w:val="multilevel"/>
     <w:tmpl w:val="92FE7EDE"/>
@@ -13474,7 +14273,7 @@
       </w:rPr>
     </w:lvl>
   </w:abstractNum>
-  <w:abstractNum w:abstractNumId="44" w15:restartNumberingAfterBreak="0">
+  <w:abstractNum w:abstractNumId="45" w15:restartNumberingAfterBreak="0">
     <w:nsid w:val="6BFA2976"/>
     <w:multiLevelType w:val="multilevel"/>
     <w:tmpl w:val="7F6A6AAE"/>
@@ -13623,7 +14422,7 @@
       </w:rPr>
     </w:lvl>
   </w:abstractNum>
-  <w:abstractNum w:abstractNumId="45" w15:restartNumberingAfterBreak="0">
+  <w:abstractNum w:abstractNumId="46" w15:restartNumberingAfterBreak="0">
     <w:nsid w:val="6C1C365F"/>
     <w:multiLevelType w:val="multilevel"/>
     <w:tmpl w:val="438810AA"/>
@@ -13772,7 +14571,7 @@
       </w:rPr>
     </w:lvl>
   </w:abstractNum>
-  <w:abstractNum w:abstractNumId="46" w15:restartNumberingAfterBreak="0">
+  <w:abstractNum w:abstractNumId="47" w15:restartNumberingAfterBreak="0">
     <w:nsid w:val="6C333C24"/>
     <w:multiLevelType w:val="multilevel"/>
     <w:tmpl w:val="E3AA6D26"/>
@@ -13921,7 +14720,7 @@
       </w:rPr>
     </w:lvl>
   </w:abstractNum>
-  <w:abstractNum w:abstractNumId="47" w15:restartNumberingAfterBreak="0">
+  <w:abstractNum w:abstractNumId="48" w15:restartNumberingAfterBreak="0">
     <w:nsid w:val="76AC05B5"/>
     <w:multiLevelType w:val="multilevel"/>
     <w:tmpl w:val="1CE849FC"/>
@@ -14070,7 +14869,7 @@
       </w:rPr>
     </w:lvl>
   </w:abstractNum>
-  <w:abstractNum w:abstractNumId="48" w15:restartNumberingAfterBreak="0">
+  <w:abstractNum w:abstractNumId="49" w15:restartNumberingAfterBreak="0">
     <w:nsid w:val="796B5219"/>
     <w:multiLevelType w:val="multilevel"/>
     <w:tmpl w:val="941463EA"/>
@@ -14219,7 +15018,7 @@
       </w:rPr>
     </w:lvl>
   </w:abstractNum>
-  <w:abstractNum w:abstractNumId="49" w15:restartNumberingAfterBreak="0">
+  <w:abstractNum w:abstractNumId="50" w15:restartNumberingAfterBreak="0">
     <w:nsid w:val="7A501858"/>
     <w:multiLevelType w:val="multilevel"/>
     <w:tmpl w:val="3740F67E"/>
@@ -14368,7 +15167,7 @@
       </w:rPr>
     </w:lvl>
   </w:abstractNum>
-  <w:abstractNum w:abstractNumId="50" w15:restartNumberingAfterBreak="0">
+  <w:abstractNum w:abstractNumId="51" w15:restartNumberingAfterBreak="0">
     <w:nsid w:val="7A684783"/>
     <w:multiLevelType w:val="multilevel"/>
     <w:tmpl w:val="8270A7D8"/>
@@ -14517,7 +15316,7 @@
       </w:rPr>
     </w:lvl>
   </w:abstractNum>
-  <w:abstractNum w:abstractNumId="51" w15:restartNumberingAfterBreak="0">
+  <w:abstractNum w:abstractNumId="52" w15:restartNumberingAfterBreak="0">
     <w:nsid w:val="7EEF7B4F"/>
     <w:multiLevelType w:val="multilevel"/>
     <w:tmpl w:val="D1461E90"/>
@@ -14667,34 +15466,34 @@
     </w:lvl>
   </w:abstractNum>
   <w:num w:numId="1" w16cid:durableId="1601067662">
-    <w:abstractNumId w:val="47"/>
+    <w:abstractNumId w:val="48"/>
   </w:num>
   <w:num w:numId="2" w16cid:durableId="1842160260">
     <w:abstractNumId w:val="16"/>
   </w:num>
   <w:num w:numId="3" w16cid:durableId="427888292">
-    <w:abstractNumId w:val="30"/>
+    <w:abstractNumId w:val="31"/>
   </w:num>
   <w:num w:numId="4" w16cid:durableId="1239897464">
-    <w:abstractNumId w:val="33"/>
+    <w:abstractNumId w:val="34"/>
   </w:num>
   <w:num w:numId="5" w16cid:durableId="1715275080">
     <w:abstractNumId w:val="7"/>
   </w:num>
   <w:num w:numId="6" w16cid:durableId="591793">
-    <w:abstractNumId w:val="24"/>
+    <w:abstractNumId w:val="25"/>
   </w:num>
   <w:num w:numId="7" w16cid:durableId="1668097145">
     <w:abstractNumId w:val="20"/>
   </w:num>
   <w:num w:numId="8" w16cid:durableId="388305022">
-    <w:abstractNumId w:val="41"/>
+    <w:abstractNumId w:val="42"/>
   </w:num>
   <w:num w:numId="9" w16cid:durableId="507983134">
-    <w:abstractNumId w:val="36"/>
+    <w:abstractNumId w:val="37"/>
   </w:num>
   <w:num w:numId="10" w16cid:durableId="1812745135">
-    <w:abstractNumId w:val="49"/>
+    <w:abstractNumId w:val="50"/>
   </w:num>
   <w:num w:numId="11" w16cid:durableId="834338879">
     <w:abstractNumId w:val="21"/>
@@ -14709,13 +15508,13 @@
     <w:abstractNumId w:val="6"/>
   </w:num>
   <w:num w:numId="15" w16cid:durableId="1636523159">
-    <w:abstractNumId w:val="42"/>
+    <w:abstractNumId w:val="43"/>
   </w:num>
   <w:num w:numId="16" w16cid:durableId="1861624381">
-    <w:abstractNumId w:val="34"/>
+    <w:abstractNumId w:val="35"/>
   </w:num>
   <w:num w:numId="17" w16cid:durableId="1791515050">
-    <w:abstractNumId w:val="26"/>
+    <w:abstractNumId w:val="27"/>
   </w:num>
   <w:num w:numId="18" w16cid:durableId="1397700912">
     <w:abstractNumId w:val="3"/>
@@ -14724,16 +15523,16 @@
     <w:abstractNumId w:val="4"/>
   </w:num>
   <w:num w:numId="20" w16cid:durableId="1265844389">
-    <w:abstractNumId w:val="48"/>
+    <w:abstractNumId w:val="49"/>
   </w:num>
   <w:num w:numId="21" w16cid:durableId="603849961">
-    <w:abstractNumId w:val="28"/>
+    <w:abstractNumId w:val="29"/>
   </w:num>
   <w:num w:numId="22" w16cid:durableId="2146654949">
-    <w:abstractNumId w:val="51"/>
+    <w:abstractNumId w:val="52"/>
   </w:num>
   <w:num w:numId="23" w16cid:durableId="1096947934">
-    <w:abstractNumId w:val="25"/>
+    <w:abstractNumId w:val="26"/>
   </w:num>
   <w:num w:numId="24" w16cid:durableId="1818721275">
     <w:abstractNumId w:val="10"/>
@@ -14748,10 +15547,10 @@
     <w:abstractNumId w:val="11"/>
   </w:num>
   <w:num w:numId="28" w16cid:durableId="1382366140">
-    <w:abstractNumId w:val="45"/>
+    <w:abstractNumId w:val="46"/>
   </w:num>
   <w:num w:numId="29" w16cid:durableId="394744024">
-    <w:abstractNumId w:val="39"/>
+    <w:abstractNumId w:val="40"/>
   </w:num>
   <w:num w:numId="30" w16cid:durableId="639844085">
     <w:abstractNumId w:val="12"/>
@@ -14769,25 +15568,25 @@
     <w:abstractNumId w:val="5"/>
   </w:num>
   <w:num w:numId="35" w16cid:durableId="1026447968">
-    <w:abstractNumId w:val="29"/>
+    <w:abstractNumId w:val="30"/>
   </w:num>
   <w:num w:numId="36" w16cid:durableId="895169701">
-    <w:abstractNumId w:val="43"/>
+    <w:abstractNumId w:val="44"/>
   </w:num>
   <w:num w:numId="37" w16cid:durableId="1054432657">
-    <w:abstractNumId w:val="37"/>
+    <w:abstractNumId w:val="38"/>
   </w:num>
   <w:num w:numId="38" w16cid:durableId="982197546">
     <w:abstractNumId w:val="23"/>
   </w:num>
   <w:num w:numId="39" w16cid:durableId="224730662">
-    <w:abstractNumId w:val="35"/>
+    <w:abstractNumId w:val="36"/>
   </w:num>
   <w:num w:numId="40" w16cid:durableId="1386877970">
-    <w:abstractNumId w:val="46"/>
+    <w:abstractNumId w:val="47"/>
   </w:num>
   <w:num w:numId="41" w16cid:durableId="499856297">
-    <w:abstractNumId w:val="27"/>
+    <w:abstractNumId w:val="28"/>
   </w:num>
   <w:num w:numId="42" w16cid:durableId="348262419">
     <w:abstractNumId w:val="8"/>
@@ -14796,31 +15595,34 @@
     <w:abstractNumId w:val="19"/>
   </w:num>
   <w:num w:numId="44" w16cid:durableId="1570723628">
-    <w:abstractNumId w:val="38"/>
+    <w:abstractNumId w:val="39"/>
   </w:num>
   <w:num w:numId="45" w16cid:durableId="186212376">
-    <w:abstractNumId w:val="44"/>
+    <w:abstractNumId w:val="45"/>
   </w:num>
   <w:num w:numId="46" w16cid:durableId="735325319">
     <w:abstractNumId w:val="22"/>
   </w:num>
   <w:num w:numId="47" w16cid:durableId="1140532661">
-    <w:abstractNumId w:val="50"/>
+    <w:abstractNumId w:val="51"/>
   </w:num>
   <w:num w:numId="48" w16cid:durableId="190192697">
-    <w:abstractNumId w:val="31"/>
+    <w:abstractNumId w:val="32"/>
   </w:num>
   <w:num w:numId="49" w16cid:durableId="752816508">
-    <w:abstractNumId w:val="32"/>
+    <w:abstractNumId w:val="33"/>
   </w:num>
   <w:num w:numId="50" w16cid:durableId="383259824">
     <w:abstractNumId w:val="1"/>
   </w:num>
   <w:num w:numId="51" w16cid:durableId="479468768">
-    <w:abstractNumId w:val="40"/>
+    <w:abstractNumId w:val="41"/>
   </w:num>
   <w:num w:numId="52" w16cid:durableId="1928154536">
     <w:abstractNumId w:val="9"/>
+  </w:num>
+  <w:num w:numId="53" w16cid:durableId="1687440873">
+    <w:abstractNumId w:val="24"/>
   </w:num>
 </w:numbering>
 </file>

</xml_diff>

<commit_message>
auto: sync changes at 2026-04-30 15:06:27
</commit_message>
<xml_diff>
--- a/Progress Report.docx
+++ b/Progress Report.docx
@@ -21,7 +21,29 @@
           <w:szCs w:val="32"/>
           <w14:ligatures w14:val="none"/>
         </w:rPr>
-        <w:t>Date of  Log-1 = 24-04-2026</w:t>
+        <w:t xml:space="preserve">Date </w:t>
+      </w:r>
+      <w:proofErr w:type="gramStart"/>
+      <w:r>
+        <w:rPr>
+          <w:rFonts w:ascii="Times New Roman" w:eastAsia="Times New Roman" w:hAnsi="Times New Roman" w:cs="Times New Roman"/>
+          <w:kern w:val="0"/>
+          <w:sz w:val="32"/>
+          <w:szCs w:val="32"/>
+          <w14:ligatures w14:val="none"/>
+        </w:rPr>
+        <w:t>of  Log</w:t>
+      </w:r>
+      <w:proofErr w:type="gramEnd"/>
+      <w:r>
+        <w:rPr>
+          <w:rFonts w:ascii="Times New Roman" w:eastAsia="Times New Roman" w:hAnsi="Times New Roman" w:cs="Times New Roman"/>
+          <w:kern w:val="0"/>
+          <w:sz w:val="32"/>
+          <w:szCs w:val="32"/>
+          <w14:ligatures w14:val="none"/>
+        </w:rPr>
+        <w:t>-1 = 24-04-2026</w:t>
       </w:r>
     </w:p>
     <w:p>
@@ -309,6 +331,7 @@
         </w:rPr>
         <w:t xml:space="preserve">Initialized Node.js project using </w:t>
       </w:r>
+      <w:proofErr w:type="spellStart"/>
       <w:r>
         <w:rPr>
           <w:rFonts w:ascii="Courier New" w:eastAsia="Times New Roman" w:hAnsi="Courier New" w:cs="Courier New"/>
@@ -317,7 +340,40 @@
           <w:szCs w:val="20"/>
           <w14:ligatures w14:val="none"/>
         </w:rPr>
-        <w:t>npm init -y</w:t>
+        <w:t>npm</w:t>
+      </w:r>
+      <w:proofErr w:type="spellEnd"/>
+      <w:r>
+        <w:rPr>
+          <w:rFonts w:ascii="Courier New" w:eastAsia="Times New Roman" w:hAnsi="Courier New" w:cs="Courier New"/>
+          <w:kern w:val="0"/>
+          <w:sz w:val="20"/>
+          <w:szCs w:val="20"/>
+          <w14:ligatures w14:val="none"/>
+        </w:rPr>
+        <w:t xml:space="preserve"> </w:t>
+      </w:r>
+      <w:proofErr w:type="spellStart"/>
+      <w:r>
+        <w:rPr>
+          <w:rFonts w:ascii="Courier New" w:eastAsia="Times New Roman" w:hAnsi="Courier New" w:cs="Courier New"/>
+          <w:kern w:val="0"/>
+          <w:sz w:val="20"/>
+          <w:szCs w:val="20"/>
+          <w14:ligatures w14:val="none"/>
+        </w:rPr>
+        <w:t>init</w:t>
+      </w:r>
+      <w:proofErr w:type="spellEnd"/>
+      <w:r>
+        <w:rPr>
+          <w:rFonts w:ascii="Courier New" w:eastAsia="Times New Roman" w:hAnsi="Courier New" w:cs="Courier New"/>
+          <w:kern w:val="0"/>
+          <w:sz w:val="20"/>
+          <w:szCs w:val="20"/>
+          <w14:ligatures w14:val="none"/>
+        </w:rPr>
+        <w:t xml:space="preserve"> -y</w:t>
       </w:r>
     </w:p>
     <w:p>
@@ -345,6 +401,7 @@
         </w:rPr>
         <w:t>Installed Electron (</w:t>
       </w:r>
+      <w:proofErr w:type="spellStart"/>
       <w:r>
         <w:rPr>
           <w:rFonts w:ascii="Courier New" w:eastAsia="Times New Roman" w:hAnsi="Courier New" w:cs="Courier New"/>
@@ -353,7 +410,18 @@
           <w:szCs w:val="20"/>
           <w14:ligatures w14:val="none"/>
         </w:rPr>
-        <w:t>npm install electron</w:t>
+        <w:t>npm</w:t>
+      </w:r>
+      <w:proofErr w:type="spellEnd"/>
+      <w:r>
+        <w:rPr>
+          <w:rFonts w:ascii="Courier New" w:eastAsia="Times New Roman" w:hAnsi="Courier New" w:cs="Courier New"/>
+          <w:kern w:val="0"/>
+          <w:sz w:val="20"/>
+          <w:szCs w:val="20"/>
+          <w14:ligatures w14:val="none"/>
+        </w:rPr>
+        <w:t xml:space="preserve"> install electron</w:t>
       </w:r>
       <w:r>
         <w:rPr>
@@ -461,6 +529,7 @@
         </w:rPr>
         <w:t xml:space="preserve">Configured window creation using </w:t>
       </w:r>
+      <w:proofErr w:type="spellStart"/>
       <w:r>
         <w:rPr>
           <w:rFonts w:ascii="Courier New" w:eastAsia="Times New Roman" w:hAnsi="Courier New" w:cs="Courier New"/>
@@ -471,6 +540,7 @@
         </w:rPr>
         <w:t>BrowserWindow</w:t>
       </w:r>
+      <w:proofErr w:type="spellEnd"/>
     </w:p>
     <w:p>
       <w:pPr>
@@ -497,6 +567,8 @@
         </w:rPr>
         <w:t xml:space="preserve">Fixed </w:t>
       </w:r>
+      <w:proofErr w:type="spellStart"/>
+      <w:proofErr w:type="gramStart"/>
       <w:r>
         <w:rPr>
           <w:rFonts w:ascii="Courier New" w:eastAsia="Times New Roman" w:hAnsi="Courier New" w:cs="Courier New"/>
@@ -507,6 +579,8 @@
         </w:rPr>
         <w:t>package.json</w:t>
       </w:r>
+      <w:proofErr w:type="spellEnd"/>
+      <w:proofErr w:type="gramEnd"/>
       <w:r>
         <w:rPr>
           <w:rFonts w:ascii="Times New Roman" w:eastAsia="Times New Roman" w:hAnsi="Times New Roman" w:cs="Times New Roman"/>
@@ -1067,6 +1141,8 @@
         </w:rPr>
         <w:t xml:space="preserve">Implemented </w:t>
       </w:r>
+      <w:proofErr w:type="spellStart"/>
+      <w:proofErr w:type="gramStart"/>
       <w:r>
         <w:rPr>
           <w:rFonts w:ascii="Courier New" w:eastAsia="Times New Roman" w:hAnsi="Courier New" w:cs="Courier New"/>
@@ -1075,7 +1151,29 @@
           <w:szCs w:val="20"/>
           <w14:ligatures w14:val="none"/>
         </w:rPr>
-        <w:t>addMessage()</w:t>
+        <w:t>addMessage</w:t>
+      </w:r>
+      <w:proofErr w:type="spellEnd"/>
+      <w:r>
+        <w:rPr>
+          <w:rFonts w:ascii="Courier New" w:eastAsia="Times New Roman" w:hAnsi="Courier New" w:cs="Courier New"/>
+          <w:kern w:val="0"/>
+          <w:sz w:val="20"/>
+          <w:szCs w:val="20"/>
+          <w14:ligatures w14:val="none"/>
+        </w:rPr>
+        <w:t>(</w:t>
+      </w:r>
+      <w:proofErr w:type="gramEnd"/>
+      <w:r>
+        <w:rPr>
+          <w:rFonts w:ascii="Courier New" w:eastAsia="Times New Roman" w:hAnsi="Courier New" w:cs="Courier New"/>
+          <w:kern w:val="0"/>
+          <w:sz w:val="20"/>
+          <w:szCs w:val="20"/>
+          <w14:ligatures w14:val="none"/>
+        </w:rPr>
+        <w:t>)</w:t>
       </w:r>
       <w:r>
         <w:rPr>
@@ -1688,6 +1786,7 @@
         </w:rPr>
         <w:t xml:space="preserve">Introduced </w:t>
       </w:r>
+      <w:proofErr w:type="gramStart"/>
       <w:r>
         <w:rPr>
           <w:rFonts w:ascii="Courier New" w:eastAsia="Times New Roman" w:hAnsi="Courier New" w:cs="Courier New"/>
@@ -1696,7 +1795,18 @@
           <w:szCs w:val="20"/>
           <w14:ligatures w14:val="none"/>
         </w:rPr>
-        <w:t>messages[]</w:t>
+        <w:t>messages[</w:t>
+      </w:r>
+      <w:proofErr w:type="gramEnd"/>
+      <w:r>
+        <w:rPr>
+          <w:rFonts w:ascii="Courier New" w:eastAsia="Times New Roman" w:hAnsi="Courier New" w:cs="Courier New"/>
+          <w:kern w:val="0"/>
+          <w:sz w:val="20"/>
+          <w:szCs w:val="20"/>
+          <w14:ligatures w14:val="none"/>
+        </w:rPr>
+        <w:t>]</w:t>
       </w:r>
       <w:r>
         <w:rPr>
@@ -2002,6 +2112,8 @@
           <w14:ligatures w14:val="none"/>
         </w:rPr>
       </w:pPr>
+      <w:proofErr w:type="spellStart"/>
+      <w:proofErr w:type="gramStart"/>
       <w:r>
         <w:rPr>
           <w:rFonts w:ascii="Courier New" w:eastAsia="Times New Roman" w:hAnsi="Courier New" w:cs="Courier New"/>
@@ -2010,7 +2122,29 @@
           <w:szCs w:val="20"/>
           <w14:ligatures w14:val="none"/>
         </w:rPr>
-        <w:t>messages.pop()</w:t>
+        <w:t>messages.pop</w:t>
+      </w:r>
+      <w:proofErr w:type="spellEnd"/>
+      <w:r>
+        <w:rPr>
+          <w:rFonts w:ascii="Courier New" w:eastAsia="Times New Roman" w:hAnsi="Courier New" w:cs="Courier New"/>
+          <w:kern w:val="0"/>
+          <w:sz w:val="20"/>
+          <w:szCs w:val="20"/>
+          <w14:ligatures w14:val="none"/>
+        </w:rPr>
+        <w:t>(</w:t>
+      </w:r>
+      <w:proofErr w:type="gramEnd"/>
+      <w:r>
+        <w:rPr>
+          <w:rFonts w:ascii="Courier New" w:eastAsia="Times New Roman" w:hAnsi="Courier New" w:cs="Courier New"/>
+          <w:kern w:val="0"/>
+          <w:sz w:val="20"/>
+          <w:szCs w:val="20"/>
+          <w14:ligatures w14:val="none"/>
+        </w:rPr>
+        <w:t>)</w:t>
       </w:r>
       <w:r>
         <w:rPr>
@@ -2384,6 +2518,7 @@
         </w:rPr>
         <w:t>Fixed styling gap for AI typing element (</w:t>
       </w:r>
+      <w:proofErr w:type="spellStart"/>
       <w:r>
         <w:rPr>
           <w:rFonts w:ascii="Courier New" w:eastAsia="Times New Roman" w:hAnsi="Courier New" w:cs="Courier New"/>
@@ -2394,6 +2529,7 @@
         </w:rPr>
         <w:t>typingDiv</w:t>
       </w:r>
+      <w:proofErr w:type="spellEnd"/>
       <w:r>
         <w:rPr>
           <w:rFonts w:ascii="Times New Roman" w:eastAsia="Times New Roman" w:hAnsi="Times New Roman" w:cs="Times New Roman"/>
@@ -2816,7 +2952,29 @@
           <w:szCs w:val="24"/>
           <w14:ligatures w14:val="none"/>
         </w:rPr>
-        <w:t>Implement persistence (save UI preferences using localStorage)</w:t>
+        <w:t xml:space="preserve">Implement persistence (save UI preferences using </w:t>
+      </w:r>
+      <w:proofErr w:type="spellStart"/>
+      <w:r>
+        <w:rPr>
+          <w:rFonts w:ascii="Times New Roman" w:eastAsia="Times New Roman" w:hAnsi="Times New Roman" w:cs="Times New Roman"/>
+          <w:kern w:val="0"/>
+          <w:sz w:val="24"/>
+          <w:szCs w:val="24"/>
+          <w14:ligatures w14:val="none"/>
+        </w:rPr>
+        <w:t>localStorage</w:t>
+      </w:r>
+      <w:proofErr w:type="spellEnd"/>
+      <w:r>
+        <w:rPr>
+          <w:rFonts w:ascii="Times New Roman" w:eastAsia="Times New Roman" w:hAnsi="Times New Roman" w:cs="Times New Roman"/>
+          <w:kern w:val="0"/>
+          <w:sz w:val="24"/>
+          <w:szCs w:val="24"/>
+          <w14:ligatures w14:val="none"/>
+        </w:rPr>
+        <w:t>)</w:t>
       </w:r>
     </w:p>
     <w:p>
@@ -3189,8 +3347,13 @@
         </w:numPr>
       </w:pPr>
       <w:r>
-        <w:t>Used localStorage</w:t>
-      </w:r>
+        <w:t xml:space="preserve">Used </w:t>
+      </w:r>
+      <w:proofErr w:type="spellStart"/>
+      <w:r>
+        <w:t>localStorage</w:t>
+      </w:r>
+      <w:proofErr w:type="spellEnd"/>
     </w:p>
     <w:p>
       <w:pPr>
@@ -3215,7 +3378,21 @@
         <w:rPr>
           <w:rStyle w:val="HTMLCode"/>
         </w:rPr>
-        <w:t>Key: "ui_preferences"</w:t>
+        <w:t>Key: "</w:t>
+      </w:r>
+      <w:proofErr w:type="spellStart"/>
+      <w:r>
+        <w:rPr>
+          <w:rStyle w:val="HTMLCode"/>
+        </w:rPr>
+        <w:t>ui_preferences</w:t>
+      </w:r>
+      <w:proofErr w:type="spellEnd"/>
+      <w:r>
+        <w:rPr>
+          <w:rStyle w:val="HTMLCode"/>
+        </w:rPr>
+        <w:t>"</w:t>
       </w:r>
     </w:p>
     <w:p>
@@ -3246,11 +3423,19 @@
           <w:rStyle w:val="HTMLCode"/>
         </w:rPr>
       </w:pPr>
+      <w:proofErr w:type="spellStart"/>
       <w:r>
         <w:rPr>
           <w:rStyle w:val="HTMLCode"/>
         </w:rPr>
-        <w:t>savePreferences(data)</w:t>
+        <w:t>savePreferences</w:t>
+      </w:r>
+      <w:proofErr w:type="spellEnd"/>
+      <w:r>
+        <w:rPr>
+          <w:rStyle w:val="HTMLCode"/>
+        </w:rPr>
+        <w:t>(data)</w:t>
       </w:r>
     </w:p>
     <w:p>
@@ -3260,11 +3445,27 @@
           <w:rStyle w:val="HTMLCode"/>
         </w:rPr>
       </w:pPr>
+      <w:proofErr w:type="spellStart"/>
+      <w:proofErr w:type="gramStart"/>
       <w:r>
         <w:rPr>
           <w:rStyle w:val="HTMLCode"/>
         </w:rPr>
-        <w:t>loadPreferences()</w:t>
+        <w:t>loadPreferences</w:t>
+      </w:r>
+      <w:proofErr w:type="spellEnd"/>
+      <w:r>
+        <w:rPr>
+          <w:rStyle w:val="HTMLCode"/>
+        </w:rPr>
+        <w:t>(</w:t>
+      </w:r>
+      <w:proofErr w:type="gramEnd"/>
+      <w:r>
+        <w:rPr>
+          <w:rStyle w:val="HTMLCode"/>
+        </w:rPr>
+        <w:t>)</w:t>
       </w:r>
     </w:p>
     <w:p>
@@ -3415,30 +3616,36 @@
       <w:r>
         <w:t>Internal state sync (</w:t>
       </w:r>
+      <w:proofErr w:type="spellStart"/>
       <w:r>
         <w:rPr>
           <w:rStyle w:val="HTMLCode"/>
         </w:rPr>
         <w:t>userColor</w:t>
       </w:r>
+      <w:proofErr w:type="spellEnd"/>
       <w:r>
         <w:t xml:space="preserve">, </w:t>
       </w:r>
+      <w:proofErr w:type="spellStart"/>
       <w:r>
         <w:rPr>
           <w:rStyle w:val="HTMLCode"/>
         </w:rPr>
         <w:t>aiColor</w:t>
       </w:r>
+      <w:proofErr w:type="spellEnd"/>
       <w:r>
         <w:t xml:space="preserve">, </w:t>
       </w:r>
+      <w:proofErr w:type="spellStart"/>
       <w:r>
         <w:rPr>
           <w:rStyle w:val="HTMLCode"/>
         </w:rPr>
         <w:t>bgColor</w:t>
       </w:r>
+      <w:proofErr w:type="spellEnd"/>
       <w:r>
         <w:t>)</w:t>
       </w:r>
@@ -3475,12 +3682,14 @@
       <w:r>
         <w:t xml:space="preserve">Event binding via </w:t>
       </w:r>
+      <w:proofErr w:type="spellStart"/>
       <w:r>
         <w:rPr>
           <w:rStyle w:val="HTMLCode"/>
         </w:rPr>
         <w:t>addEventListener</w:t>
       </w:r>
+      <w:proofErr w:type="spellEnd"/>
     </w:p>
     <w:p>
       <w:r>
@@ -3704,8 +3913,18 @@
         <w:rPr>
           <w:rStyle w:val="HTMLCode"/>
         </w:rPr>
-        <w:t>Read chunks → split lines → filter "data:" → parse JSON → extract delta.content</w:t>
-      </w:r>
+        <w:t xml:space="preserve">Read chunks → split lines → filter "data:" → parse JSON → extract </w:t>
+      </w:r>
+      <w:proofErr w:type="spellStart"/>
+      <w:proofErr w:type="gramStart"/>
+      <w:r>
+        <w:rPr>
+          <w:rStyle w:val="HTMLCode"/>
+        </w:rPr>
+        <w:t>delta.content</w:t>
+      </w:r>
+      <w:proofErr w:type="spellEnd"/>
+      <w:proofErr w:type="gramEnd"/>
     </w:p>
     <w:p>
       <w:r>
@@ -4305,6 +4524,7 @@
       <w:r>
         <w:t xml:space="preserve"> using </w:t>
       </w:r>
+      <w:proofErr w:type="spellStart"/>
       <w:r>
         <w:rPr>
           <w:rStyle w:val="HTMLCode"/>
@@ -4312,6 +4532,7 @@
         </w:rPr>
         <w:t>localStorage</w:t>
       </w:r>
+      <w:proofErr w:type="spellEnd"/>
     </w:p>
     <w:p>
       <w:pPr>
@@ -4333,12 +4554,30 @@
           <w:numId w:val="27"/>
         </w:numPr>
       </w:pPr>
+      <w:proofErr w:type="spellStart"/>
+      <w:proofErr w:type="gramStart"/>
       <w:r>
         <w:rPr>
           <w:rStyle w:val="HTMLCode"/>
           <w:rFonts w:eastAsiaTheme="majorEastAsia"/>
         </w:rPr>
-        <w:t>saveConversations()</w:t>
+        <w:t>saveConversations</w:t>
+      </w:r>
+      <w:proofErr w:type="spellEnd"/>
+      <w:r>
+        <w:rPr>
+          <w:rStyle w:val="HTMLCode"/>
+          <w:rFonts w:eastAsiaTheme="majorEastAsia"/>
+        </w:rPr>
+        <w:t>(</w:t>
+      </w:r>
+      <w:proofErr w:type="gramEnd"/>
+      <w:r>
+        <w:rPr>
+          <w:rStyle w:val="HTMLCode"/>
+          <w:rFonts w:eastAsiaTheme="majorEastAsia"/>
+        </w:rPr>
+        <w:t>)</w:t>
       </w:r>
     </w:p>
     <w:p>
@@ -4349,12 +4588,30 @@
           <w:numId w:val="27"/>
         </w:numPr>
       </w:pPr>
+      <w:proofErr w:type="spellStart"/>
+      <w:proofErr w:type="gramStart"/>
       <w:r>
         <w:rPr>
           <w:rStyle w:val="HTMLCode"/>
           <w:rFonts w:eastAsiaTheme="majorEastAsia"/>
         </w:rPr>
-        <w:t>loadConversations()</w:t>
+        <w:t>loadConversations</w:t>
+      </w:r>
+      <w:proofErr w:type="spellEnd"/>
+      <w:r>
+        <w:rPr>
+          <w:rStyle w:val="HTMLCode"/>
+          <w:rFonts w:eastAsiaTheme="majorEastAsia"/>
+        </w:rPr>
+        <w:t>(</w:t>
+      </w:r>
+      <w:proofErr w:type="gramEnd"/>
+      <w:r>
+        <w:rPr>
+          <w:rStyle w:val="HTMLCode"/>
+          <w:rFonts w:eastAsiaTheme="majorEastAsia"/>
+        </w:rPr>
+        <w:t>)</w:t>
       </w:r>
     </w:p>
     <w:p>
@@ -4394,7 +4651,15 @@
         </w:numPr>
       </w:pPr>
       <w:r>
-        <w:t>Verified persistence through DevTools inspection</w:t>
+        <w:t xml:space="preserve">Verified persistence through </w:t>
+      </w:r>
+      <w:proofErr w:type="spellStart"/>
+      <w:r>
+        <w:t>DevTools</w:t>
+      </w:r>
+      <w:proofErr w:type="spellEnd"/>
+      <w:r>
+        <w:t xml:space="preserve"> inspection</w:t>
       </w:r>
     </w:p>
     <w:p>
@@ -4452,12 +4717,30 @@
           <w:numId w:val="28"/>
         </w:numPr>
       </w:pPr>
+      <w:proofErr w:type="spellStart"/>
+      <w:proofErr w:type="gramStart"/>
       <w:r>
         <w:rPr>
           <w:rStyle w:val="HTMLCode"/>
           <w:rFonts w:eastAsiaTheme="majorEastAsia"/>
         </w:rPr>
-        <w:t>createConversation()</w:t>
+        <w:t>createConversation</w:t>
+      </w:r>
+      <w:proofErr w:type="spellEnd"/>
+      <w:r>
+        <w:rPr>
+          <w:rStyle w:val="HTMLCode"/>
+          <w:rFonts w:eastAsiaTheme="majorEastAsia"/>
+        </w:rPr>
+        <w:t>(</w:t>
+      </w:r>
+      <w:proofErr w:type="gramEnd"/>
+      <w:r>
+        <w:rPr>
+          <w:rStyle w:val="HTMLCode"/>
+          <w:rFonts w:eastAsiaTheme="majorEastAsia"/>
+        </w:rPr>
+        <w:t>)</w:t>
       </w:r>
     </w:p>
     <w:p>
@@ -4468,12 +4751,30 @@
           <w:numId w:val="28"/>
         </w:numPr>
       </w:pPr>
+      <w:proofErr w:type="spellStart"/>
+      <w:proofErr w:type="gramStart"/>
       <w:r>
         <w:rPr>
           <w:rStyle w:val="HTMLCode"/>
           <w:rFonts w:eastAsiaTheme="majorEastAsia"/>
         </w:rPr>
-        <w:t>updateConversation()</w:t>
+        <w:t>updateConversation</w:t>
+      </w:r>
+      <w:proofErr w:type="spellEnd"/>
+      <w:r>
+        <w:rPr>
+          <w:rStyle w:val="HTMLCode"/>
+          <w:rFonts w:eastAsiaTheme="majorEastAsia"/>
+        </w:rPr>
+        <w:t>(</w:t>
+      </w:r>
+      <w:proofErr w:type="gramEnd"/>
+      <w:r>
+        <w:rPr>
+          <w:rStyle w:val="HTMLCode"/>
+          <w:rFonts w:eastAsiaTheme="majorEastAsia"/>
+        </w:rPr>
+        <w:t>)</w:t>
       </w:r>
     </w:p>
     <w:p>
@@ -4484,12 +4785,30 @@
           <w:numId w:val="28"/>
         </w:numPr>
       </w:pPr>
+      <w:proofErr w:type="spellStart"/>
+      <w:proofErr w:type="gramStart"/>
       <w:r>
         <w:rPr>
           <w:rStyle w:val="HTMLCode"/>
           <w:rFonts w:eastAsiaTheme="majorEastAsia"/>
         </w:rPr>
-        <w:t>getAllConversations()</w:t>
+        <w:t>getAllConversations</w:t>
+      </w:r>
+      <w:proofErr w:type="spellEnd"/>
+      <w:r>
+        <w:rPr>
+          <w:rStyle w:val="HTMLCode"/>
+          <w:rFonts w:eastAsiaTheme="majorEastAsia"/>
+        </w:rPr>
+        <w:t>(</w:t>
+      </w:r>
+      <w:proofErr w:type="gramEnd"/>
+      <w:r>
+        <w:rPr>
+          <w:rStyle w:val="HTMLCode"/>
+          <w:rFonts w:eastAsiaTheme="majorEastAsia"/>
+        </w:rPr>
+        <w:t>)</w:t>
       </w:r>
     </w:p>
     <w:p>
@@ -4527,6 +4846,7 @@
       <w:r>
         <w:t>Timestamp tracking (</w:t>
       </w:r>
+      <w:proofErr w:type="spellStart"/>
       <w:r>
         <w:rPr>
           <w:rStyle w:val="HTMLCode"/>
@@ -4534,9 +4854,11 @@
         </w:rPr>
         <w:t>createdAt</w:t>
       </w:r>
+      <w:proofErr w:type="spellEnd"/>
       <w:r>
         <w:t xml:space="preserve">, </w:t>
       </w:r>
+      <w:proofErr w:type="spellStart"/>
       <w:r>
         <w:rPr>
           <w:rStyle w:val="HTMLCode"/>
@@ -4544,6 +4866,7 @@
         </w:rPr>
         <w:t>updatedAt</w:t>
       </w:r>
+      <w:proofErr w:type="spellEnd"/>
       <w:r>
         <w:t>)</w:t>
       </w:r>
@@ -4753,12 +5076,30 @@
       <w:r>
         <w:t xml:space="preserve">Implemented </w:t>
       </w:r>
+      <w:proofErr w:type="spellStart"/>
+      <w:proofErr w:type="gramStart"/>
       <w:r>
         <w:rPr>
           <w:rStyle w:val="HTMLCode"/>
           <w:rFonts w:eastAsiaTheme="majorEastAsia"/>
         </w:rPr>
-        <w:t>renderConversations()</w:t>
+        <w:t>renderConversations</w:t>
+      </w:r>
+      <w:proofErr w:type="spellEnd"/>
+      <w:r>
+        <w:rPr>
+          <w:rStyle w:val="HTMLCode"/>
+          <w:rFonts w:eastAsiaTheme="majorEastAsia"/>
+        </w:rPr>
+        <w:t>(</w:t>
+      </w:r>
+      <w:proofErr w:type="gramEnd"/>
+      <w:r>
+        <w:rPr>
+          <w:rStyle w:val="HTMLCode"/>
+          <w:rFonts w:eastAsiaTheme="majorEastAsia"/>
+        </w:rPr>
+        <w:t>)</w:t>
       </w:r>
     </w:p>
     <w:p>
@@ -4876,6 +5217,7 @@
           <w:numId w:val="31"/>
         </w:numPr>
       </w:pPr>
+      <w:proofErr w:type="spellStart"/>
       <w:r>
         <w:rPr>
           <w:rStyle w:val="HTMLCode"/>
@@ -4883,6 +5225,7 @@
         </w:rPr>
         <w:t>currentConversation</w:t>
       </w:r>
+      <w:proofErr w:type="spellEnd"/>
     </w:p>
     <w:p>
       <w:pPr>
@@ -5143,12 +5486,30 @@
       <w:r>
         <w:t xml:space="preserve">Implemented </w:t>
       </w:r>
+      <w:proofErr w:type="spellStart"/>
+      <w:proofErr w:type="gramStart"/>
       <w:r>
         <w:rPr>
           <w:rStyle w:val="HTMLCode"/>
           <w:rFonts w:eastAsiaTheme="majorEastAsia"/>
         </w:rPr>
-        <w:t>toggleSidebar()</w:t>
+        <w:t>toggleSidebar</w:t>
+      </w:r>
+      <w:proofErr w:type="spellEnd"/>
+      <w:r>
+        <w:rPr>
+          <w:rStyle w:val="HTMLCode"/>
+          <w:rFonts w:eastAsiaTheme="majorEastAsia"/>
+        </w:rPr>
+        <w:t>(</w:t>
+      </w:r>
+      <w:proofErr w:type="gramEnd"/>
+      <w:r>
+        <w:rPr>
+          <w:rStyle w:val="HTMLCode"/>
+          <w:rFonts w:eastAsiaTheme="majorEastAsia"/>
+        </w:rPr>
+        <w:t>)</w:t>
       </w:r>
     </w:p>
     <w:p>
@@ -5358,6 +5719,7 @@
       <w:r>
         <w:t xml:space="preserve">Eliminated direct </w:t>
       </w:r>
+      <w:proofErr w:type="spellStart"/>
       <w:r>
         <w:rPr>
           <w:rStyle w:val="HTMLCode"/>
@@ -5365,6 +5727,7 @@
         </w:rPr>
         <w:t>localStorage</w:t>
       </w:r>
+      <w:proofErr w:type="spellEnd"/>
       <w:r>
         <w:t xml:space="preserve"> mutation</w:t>
       </w:r>
@@ -5381,12 +5744,30 @@
         <w:lastRenderedPageBreak/>
         <w:t xml:space="preserve">Introduced </w:t>
       </w:r>
+      <w:proofErr w:type="spellStart"/>
+      <w:proofErr w:type="gramStart"/>
       <w:r>
         <w:rPr>
           <w:rStyle w:val="HTMLCode"/>
           <w:rFonts w:eastAsiaTheme="majorEastAsia"/>
         </w:rPr>
-        <w:t>deleteConversation()</w:t>
+        <w:t>deleteConversation</w:t>
+      </w:r>
+      <w:proofErr w:type="spellEnd"/>
+      <w:r>
+        <w:rPr>
+          <w:rStyle w:val="HTMLCode"/>
+          <w:rFonts w:eastAsiaTheme="majorEastAsia"/>
+        </w:rPr>
+        <w:t>(</w:t>
+      </w:r>
+      <w:proofErr w:type="gramEnd"/>
+      <w:r>
+        <w:rPr>
+          <w:rStyle w:val="HTMLCode"/>
+          <w:rFonts w:eastAsiaTheme="majorEastAsia"/>
+        </w:rPr>
+        <w:t>)</w:t>
       </w:r>
       <w:r>
         <w:t xml:space="preserve"> in data layer</w:t>
@@ -6209,12 +6590,21 @@
           <w:numId w:val="45"/>
         </w:numPr>
       </w:pPr>
+      <w:proofErr w:type="spellStart"/>
       <w:r>
         <w:rPr>
           <w:rStyle w:val="HTMLCode"/>
           <w:rFonts w:eastAsiaTheme="majorEastAsia"/>
         </w:rPr>
-        <w:t>node_modules/</w:t>
+        <w:t>node_modules</w:t>
+      </w:r>
+      <w:proofErr w:type="spellEnd"/>
+      <w:r>
+        <w:rPr>
+          <w:rStyle w:val="HTMLCode"/>
+          <w:rFonts w:eastAsiaTheme="majorEastAsia"/>
+        </w:rPr>
+        <w:t>/</w:t>
       </w:r>
     </w:p>
     <w:p>
@@ -6225,12 +6615,21 @@
           <w:numId w:val="45"/>
         </w:numPr>
       </w:pPr>
+      <w:proofErr w:type="spellStart"/>
       <w:r>
         <w:rPr>
           <w:rStyle w:val="HTMLCode"/>
           <w:rFonts w:eastAsiaTheme="majorEastAsia"/>
         </w:rPr>
-        <w:t>venv/</w:t>
+        <w:t>venv</w:t>
+      </w:r>
+      <w:proofErr w:type="spellEnd"/>
+      <w:r>
+        <w:rPr>
+          <w:rStyle w:val="HTMLCode"/>
+          <w:rFonts w:eastAsiaTheme="majorEastAsia"/>
+        </w:rPr>
+        <w:t>/</w:t>
       </w:r>
     </w:p>
     <w:p>
@@ -6242,15 +6641,29 @@
         </w:numPr>
       </w:pPr>
       <w:r>
-        <w:t xml:space="preserve">Created and corrected </w:t>
+        <w:t xml:space="preserve">Created and </w:t>
+      </w:r>
+      <w:proofErr w:type="gramStart"/>
+      <w:r>
+        <w:t xml:space="preserve">corrected </w:t>
       </w:r>
       <w:r>
         <w:rPr>
           <w:rStyle w:val="HTMLCode"/>
           <w:rFonts w:eastAsiaTheme="majorEastAsia"/>
         </w:rPr>
-        <w:t>.gitignore</w:t>
-      </w:r>
+        <w:t>.</w:t>
+      </w:r>
+      <w:proofErr w:type="spellStart"/>
+      <w:r>
+        <w:rPr>
+          <w:rStyle w:val="HTMLCode"/>
+          <w:rFonts w:eastAsiaTheme="majorEastAsia"/>
+        </w:rPr>
+        <w:t>gitignore</w:t>
+      </w:r>
+      <w:proofErr w:type="spellEnd"/>
+      <w:proofErr w:type="gramEnd"/>
     </w:p>
     <w:p>
       <w:pPr>
@@ -6348,7 +6761,15 @@
         </w:numPr>
       </w:pPr>
       <w:r>
-        <w:t>“Initial clean commit - project setup with gitignore”</w:t>
+        <w:t xml:space="preserve">“Initial clean commit - project setup with </w:t>
+      </w:r>
+      <w:proofErr w:type="spellStart"/>
+      <w:r>
+        <w:t>gitignore</w:t>
+      </w:r>
+      <w:proofErr w:type="spellEnd"/>
+      <w:r>
+        <w:t>”</w:t>
       </w:r>
     </w:p>
     <w:p>
@@ -6635,6 +7056,7 @@
       <w:r>
         <w:t xml:space="preserve">ignore </w:t>
       </w:r>
+      <w:proofErr w:type="spellStart"/>
       <w:r>
         <w:rPr>
           <w:rStyle w:val="HTMLCode"/>
@@ -6642,9 +7064,11 @@
         </w:rPr>
         <w:t>venv</w:t>
       </w:r>
+      <w:proofErr w:type="spellEnd"/>
       <w:r>
         <w:t xml:space="preserve"> and </w:t>
       </w:r>
+      <w:proofErr w:type="spellStart"/>
       <w:r>
         <w:rPr>
           <w:rStyle w:val="HTMLCode"/>
@@ -6652,6 +7076,7 @@
         </w:rPr>
         <w:t>node_modules</w:t>
       </w:r>
+      <w:proofErr w:type="spellEnd"/>
       <w:r>
         <w:t xml:space="preserve"> explicitly</w:t>
       </w:r>
@@ -6708,13 +7133,24 @@
           <w:numId w:val="50"/>
         </w:numPr>
       </w:pPr>
+      <w:proofErr w:type="gramStart"/>
       <w:r>
         <w:rPr>
           <w:rStyle w:val="HTMLCode"/>
           <w:rFonts w:eastAsiaTheme="majorEastAsia"/>
         </w:rPr>
-        <w:t>.gitignore</w:t>
-      </w:r>
+        <w:t>.</w:t>
+      </w:r>
+      <w:proofErr w:type="spellStart"/>
+      <w:r>
+        <w:rPr>
+          <w:rStyle w:val="HTMLCode"/>
+          <w:rFonts w:eastAsiaTheme="majorEastAsia"/>
+        </w:rPr>
+        <w:t>gitignore</w:t>
+      </w:r>
+      <w:proofErr w:type="spellEnd"/>
+      <w:proofErr w:type="gramEnd"/>
       <w:r>
         <w:t xml:space="preserve"> only affects untracked/staging behavior</w:t>
       </w:r>
@@ -6961,29 +7397,53 @@
       <w:r>
         <w:t xml:space="preserve"> You successfully moved your core logic and UI files into a new </w:t>
       </w:r>
+      <w:proofErr w:type="spellStart"/>
       <w:r>
         <w:rPr>
           <w:rStyle w:val="HTMLCode"/>
         </w:rPr>
-        <w:t>Bone_Code/</w:t>
+        <w:t>Bone_Code</w:t>
+      </w:r>
+      <w:proofErr w:type="spellEnd"/>
+      <w:r>
+        <w:rPr>
+          <w:rStyle w:val="HTMLCode"/>
+        </w:rPr>
+        <w:t>/</w:t>
       </w:r>
       <w:r>
         <w:t xml:space="preserve"> directory, separating concerns into </w:t>
       </w:r>
+      <w:proofErr w:type="spellStart"/>
       <w:r>
         <w:rPr>
           <w:rStyle w:val="HTMLCode"/>
         </w:rPr>
-        <w:t>css/</w:t>
+        <w:t>css</w:t>
+      </w:r>
+      <w:proofErr w:type="spellEnd"/>
+      <w:r>
+        <w:rPr>
+          <w:rStyle w:val="HTMLCode"/>
+        </w:rPr>
+        <w:t>/</w:t>
       </w:r>
       <w:r>
         <w:t xml:space="preserve">, </w:t>
       </w:r>
+      <w:proofErr w:type="spellStart"/>
       <w:r>
         <w:rPr>
           <w:rStyle w:val="HTMLCode"/>
         </w:rPr>
-        <w:t>js/</w:t>
+        <w:t>js</w:t>
+      </w:r>
+      <w:proofErr w:type="spellEnd"/>
+      <w:r>
+        <w:rPr>
+          <w:rStyle w:val="HTMLCode"/>
+        </w:rPr>
+        <w:t>/</w:t>
       </w:r>
       <w:r>
         <w:t xml:space="preserve">, and </w:t>
@@ -7041,13 +7501,38 @@
         <w:t>index.html</w:t>
       </w:r>
       <w:r>
-        <w:t xml:space="preserve"> to reflect the new file locations using relative paths (</w:t>
+        <w:t xml:space="preserve"> to reflect the new file locations using relative paths </w:t>
+      </w:r>
+      <w:proofErr w:type="gramStart"/>
+      <w:r>
+        <w:t>(</w:t>
       </w:r>
       <w:r>
         <w:rPr>
           <w:rStyle w:val="HTMLCode"/>
         </w:rPr>
-        <w:t>../js/</w:t>
+        <w:t>..</w:t>
+      </w:r>
+      <w:proofErr w:type="gramEnd"/>
+      <w:r>
+        <w:rPr>
+          <w:rStyle w:val="HTMLCode"/>
+        </w:rPr>
+        <w:t>/</w:t>
+      </w:r>
+      <w:proofErr w:type="spellStart"/>
+      <w:r>
+        <w:rPr>
+          <w:rStyle w:val="HTMLCode"/>
+        </w:rPr>
+        <w:t>js</w:t>
+      </w:r>
+      <w:proofErr w:type="spellEnd"/>
+      <w:r>
+        <w:rPr>
+          <w:rStyle w:val="HTMLCode"/>
+        </w:rPr>
+        <w:t>/</w:t>
       </w:r>
       <w:r>
         <w:t>).</w:t>
@@ -8079,7 +8564,29 @@
           <w:szCs w:val="20"/>
           <w14:ligatures w14:val="none"/>
         </w:rPr>
-        <w:t>Uncaught TypeError: Failed to resolve module specifier "marked".</w:t>
+        <w:t xml:space="preserve">Uncaught </w:t>
+      </w:r>
+      <w:proofErr w:type="spellStart"/>
+      <w:r>
+        <w:rPr>
+          <w:rFonts w:ascii="Courier New" w:eastAsia="Times New Roman" w:hAnsi="Courier New" w:cs="Courier New"/>
+          <w:kern w:val="0"/>
+          <w:sz w:val="20"/>
+          <w:szCs w:val="20"/>
+          <w14:ligatures w14:val="none"/>
+        </w:rPr>
+        <w:t>TypeError</w:t>
+      </w:r>
+      <w:proofErr w:type="spellEnd"/>
+      <w:r>
+        <w:rPr>
+          <w:rFonts w:ascii="Courier New" w:eastAsia="Times New Roman" w:hAnsi="Courier New" w:cs="Courier New"/>
+          <w:kern w:val="0"/>
+          <w:sz w:val="20"/>
+          <w:szCs w:val="20"/>
+          <w14:ligatures w14:val="none"/>
+        </w:rPr>
+        <w:t>: Failed to resolve module specifier "marked".</w:t>
       </w:r>
     </w:p>
     <w:p>
@@ -8458,6 +8965,8 @@
         </w:rPr>
         <w:t xml:space="preserve">Updated </w:t>
       </w:r>
+      <w:proofErr w:type="spellStart"/>
+      <w:proofErr w:type="gramStart"/>
       <w:r>
         <w:rPr>
           <w:rFonts w:ascii="Courier New" w:eastAsia="Times New Roman" w:hAnsi="Courier New" w:cs="Courier New"/>
@@ -8466,18 +8975,9 @@
           <w:szCs w:val="20"/>
           <w14:ligatures w14:val="none"/>
         </w:rPr>
-        <w:t>addMessage()</w:t>
-      </w:r>
-      <w:r>
-        <w:rPr>
-          <w:rFonts w:ascii="Times New Roman" w:eastAsia="Times New Roman" w:hAnsi="Times New Roman" w:cs="Times New Roman"/>
-          <w:kern w:val="0"/>
-          <w:sz w:val="24"/>
-          <w:szCs w:val="24"/>
-          <w14:ligatures w14:val="none"/>
-        </w:rPr>
-        <w:t xml:space="preserve"> to use </w:t>
-      </w:r>
+        <w:t>addMessage</w:t>
+      </w:r>
+      <w:proofErr w:type="spellEnd"/>
       <w:r>
         <w:rPr>
           <w:rFonts w:ascii="Courier New" w:eastAsia="Times New Roman" w:hAnsi="Courier New" w:cs="Courier New"/>
@@ -8486,7 +8986,50 @@
           <w:szCs w:val="20"/>
           <w14:ligatures w14:val="none"/>
         </w:rPr>
-        <w:t>marked.parse(text)</w:t>
+        <w:t>(</w:t>
+      </w:r>
+      <w:proofErr w:type="gramEnd"/>
+      <w:r>
+        <w:rPr>
+          <w:rFonts w:ascii="Courier New" w:eastAsia="Times New Roman" w:hAnsi="Courier New" w:cs="Courier New"/>
+          <w:kern w:val="0"/>
+          <w:sz w:val="20"/>
+          <w:szCs w:val="20"/>
+          <w14:ligatures w14:val="none"/>
+        </w:rPr>
+        <w:t>)</w:t>
+      </w:r>
+      <w:r>
+        <w:rPr>
+          <w:rFonts w:ascii="Times New Roman" w:eastAsia="Times New Roman" w:hAnsi="Times New Roman" w:cs="Times New Roman"/>
+          <w:kern w:val="0"/>
+          <w:sz w:val="24"/>
+          <w:szCs w:val="24"/>
+          <w14:ligatures w14:val="none"/>
+        </w:rPr>
+        <w:t xml:space="preserve"> to use </w:t>
+      </w:r>
+      <w:proofErr w:type="spellStart"/>
+      <w:r>
+        <w:rPr>
+          <w:rFonts w:ascii="Courier New" w:eastAsia="Times New Roman" w:hAnsi="Courier New" w:cs="Courier New"/>
+          <w:kern w:val="0"/>
+          <w:sz w:val="20"/>
+          <w:szCs w:val="20"/>
+          <w14:ligatures w14:val="none"/>
+        </w:rPr>
+        <w:t>marked.parse</w:t>
+      </w:r>
+      <w:proofErr w:type="spellEnd"/>
+      <w:r>
+        <w:rPr>
+          <w:rFonts w:ascii="Courier New" w:eastAsia="Times New Roman" w:hAnsi="Courier New" w:cs="Courier New"/>
+          <w:kern w:val="0"/>
+          <w:sz w:val="20"/>
+          <w:szCs w:val="20"/>
+          <w14:ligatures w14:val="none"/>
+        </w:rPr>
+        <w:t>(text)</w:t>
       </w:r>
       <w:r>
         <w:rPr>
@@ -9088,6 +9631,7 @@
       <w:r>
         <w:t xml:space="preserve">Corrected the </w:t>
       </w:r>
+      <w:proofErr w:type="spellStart"/>
       <w:r>
         <w:rPr>
           <w:rStyle w:val="HTMLCode"/>
@@ -9095,6 +9639,7 @@
         </w:rPr>
         <w:t>updateConversation</w:t>
       </w:r>
+      <w:proofErr w:type="spellEnd"/>
       <w:r>
         <w:t xml:space="preserve"> call in the rename logic to use the active </w:t>
       </w:r>
@@ -9108,6 +9653,8 @@
       <w:r>
         <w:t xml:space="preserve"> array instead of </w:t>
       </w:r>
+      <w:proofErr w:type="spellStart"/>
+      <w:proofErr w:type="gramStart"/>
       <w:r>
         <w:rPr>
           <w:rStyle w:val="HTMLCode"/>
@@ -9115,6 +9662,8 @@
         </w:rPr>
         <w:t>conv.messages</w:t>
       </w:r>
+      <w:proofErr w:type="spellEnd"/>
+      <w:proofErr w:type="gramEnd"/>
       <w:r>
         <w:t>.</w:t>
       </w:r>
@@ -9198,12 +9747,21 @@
       <w:r>
         <w:t xml:space="preserve">Removed unsupported </w:t>
       </w:r>
+      <w:proofErr w:type="gramStart"/>
       <w:r>
         <w:rPr>
           <w:rStyle w:val="HTMLCode"/>
           <w:rFonts w:eastAsiaTheme="minorHAnsi"/>
         </w:rPr>
-        <w:t>prompt()</w:t>
+        <w:t>prompt(</w:t>
+      </w:r>
+      <w:proofErr w:type="gramEnd"/>
+      <w:r>
+        <w:rPr>
+          <w:rStyle w:val="HTMLCode"/>
+          <w:rFonts w:eastAsiaTheme="minorHAnsi"/>
+        </w:rPr>
+        <w:t>)</w:t>
       </w:r>
       <w:r>
         <w:t xml:space="preserve"> calls, which previously caused runtime errors.</w:t>
@@ -9262,12 +9820,30 @@
       <w:r>
         <w:t xml:space="preserve">Introduced </w:t>
       </w:r>
+      <w:proofErr w:type="spellStart"/>
+      <w:proofErr w:type="gramStart"/>
       <w:r>
         <w:rPr>
           <w:rStyle w:val="HTMLCode"/>
           <w:rFonts w:eastAsiaTheme="minorHAnsi"/>
         </w:rPr>
-        <w:t>stopPropagation()</w:t>
+        <w:t>stopPropagation</w:t>
+      </w:r>
+      <w:proofErr w:type="spellEnd"/>
+      <w:r>
+        <w:rPr>
+          <w:rStyle w:val="HTMLCode"/>
+          <w:rFonts w:eastAsiaTheme="minorHAnsi"/>
+        </w:rPr>
+        <w:t>(</w:t>
+      </w:r>
+      <w:proofErr w:type="gramEnd"/>
+      <w:r>
+        <w:rPr>
+          <w:rStyle w:val="HTMLCode"/>
+          <w:rFonts w:eastAsiaTheme="minorHAnsi"/>
+        </w:rPr>
+        <w:t>)</w:t>
       </w:r>
       <w:r>
         <w:t xml:space="preserve"> on input clicks to prevent the global listener from closing the dropdown prematurely.</w:t>
@@ -9921,7 +10497,18 @@
           <w:szCs w:val="24"/>
           <w14:ligatures w14:val="none"/>
         </w:rPr>
-        <w:t xml:space="preserve">Implemented a robust solution using a </w:t>
+        <w:t xml:space="preserve">Implemented a robust solution using </w:t>
+      </w:r>
+      <w:proofErr w:type="gramStart"/>
+      <w:r>
+        <w:rPr>
+          <w:rFonts w:ascii="Times New Roman" w:eastAsia="Times New Roman" w:hAnsi="Times New Roman" w:cs="Times New Roman"/>
+          <w:kern w:val="0"/>
+          <w:sz w:val="24"/>
+          <w:szCs w:val="24"/>
+          <w14:ligatures w14:val="none"/>
+        </w:rPr>
+        <w:t xml:space="preserve">a </w:t>
       </w:r>
       <w:r>
         <w:rPr>
@@ -9933,6 +10520,7 @@
         </w:rPr>
         <w:t>.hidden</w:t>
       </w:r>
+      <w:proofErr w:type="gramEnd"/>
       <w:r>
         <w:rPr>
           <w:rFonts w:ascii="Times New Roman" w:eastAsia="Times New Roman" w:hAnsi="Times New Roman" w:cs="Times New Roman"/>
@@ -10183,6 +10771,7 @@
           <w14:ligatures w14:val="none"/>
         </w:rPr>
       </w:pPr>
+      <w:proofErr w:type="spellStart"/>
       <w:r>
         <w:rPr>
           <w:rFonts w:ascii="Times New Roman" w:eastAsia="Times New Roman" w:hAnsi="Times New Roman" w:cs="Times New Roman"/>
@@ -10193,7 +10782,20 @@
           <w:szCs w:val="24"/>
           <w14:ligatures w14:val="none"/>
         </w:rPr>
-        <w:t>AIConnector Design</w:t>
+        <w:t>AIConnector</w:t>
+      </w:r>
+      <w:proofErr w:type="spellEnd"/>
+      <w:r>
+        <w:rPr>
+          <w:rFonts w:ascii="Times New Roman" w:eastAsia="Times New Roman" w:hAnsi="Times New Roman" w:cs="Times New Roman"/>
+          <w:b/>
+          <w:bCs/>
+          <w:kern w:val="0"/>
+          <w:sz w:val="24"/>
+          <w:szCs w:val="24"/>
+          <w14:ligatures w14:val="none"/>
+        </w:rPr>
+        <w:t xml:space="preserve"> Design</w:t>
       </w:r>
     </w:p>
     <w:p>
@@ -10287,6 +10889,7 @@
         </w:rPr>
         <w:t xml:space="preserve">Defined </w:t>
       </w:r>
+      <w:proofErr w:type="gramStart"/>
       <w:r>
         <w:rPr>
           <w:rFonts w:ascii="Courier New" w:eastAsia="Times New Roman" w:hAnsi="Courier New" w:cs="Courier New"/>
@@ -10295,18 +10898,9 @@
           <w:szCs w:val="20"/>
           <w14:ligatures w14:val="none"/>
         </w:rPr>
-        <w:t>send()</w:t>
-      </w:r>
-      <w:r>
-        <w:rPr>
-          <w:rFonts w:ascii="Times New Roman" w:eastAsia="Times New Roman" w:hAnsi="Times New Roman" w:cs="Times New Roman"/>
-          <w:kern w:val="0"/>
-          <w:sz w:val="24"/>
-          <w:szCs w:val="24"/>
-          <w14:ligatures w14:val="none"/>
-        </w:rPr>
-        <w:t xml:space="preserve"> and </w:t>
-      </w:r>
+        <w:t>send(</w:t>
+      </w:r>
+      <w:proofErr w:type="gramEnd"/>
       <w:r>
         <w:rPr>
           <w:rFonts w:ascii="Courier New" w:eastAsia="Times New Roman" w:hAnsi="Courier New" w:cs="Courier New"/>
@@ -10315,7 +10909,39 @@
           <w:szCs w:val="20"/>
           <w14:ligatures w14:val="none"/>
         </w:rPr>
-        <w:t>analyzeLogs()</w:t>
+        <w:t>)</w:t>
+      </w:r>
+      <w:r>
+        <w:rPr>
+          <w:rFonts w:ascii="Times New Roman" w:eastAsia="Times New Roman" w:hAnsi="Times New Roman" w:cs="Times New Roman"/>
+          <w:kern w:val="0"/>
+          <w:sz w:val="24"/>
+          <w:szCs w:val="24"/>
+          <w14:ligatures w14:val="none"/>
+        </w:rPr>
+        <w:t xml:space="preserve"> and </w:t>
+      </w:r>
+      <w:proofErr w:type="spellStart"/>
+      <w:r>
+        <w:rPr>
+          <w:rFonts w:ascii="Courier New" w:eastAsia="Times New Roman" w:hAnsi="Courier New" w:cs="Courier New"/>
+          <w:kern w:val="0"/>
+          <w:sz w:val="20"/>
+          <w:szCs w:val="20"/>
+          <w14:ligatures w14:val="none"/>
+        </w:rPr>
+        <w:t>analyzeLogs</w:t>
+      </w:r>
+      <w:proofErr w:type="spellEnd"/>
+      <w:r>
+        <w:rPr>
+          <w:rFonts w:ascii="Courier New" w:eastAsia="Times New Roman" w:hAnsi="Courier New" w:cs="Courier New"/>
+          <w:kern w:val="0"/>
+          <w:sz w:val="20"/>
+          <w:szCs w:val="20"/>
+          <w14:ligatures w14:val="none"/>
+        </w:rPr>
+        <w:t>()</w:t>
       </w:r>
       <w:r>
         <w:rPr>
@@ -10407,6 +11033,7 @@
         </w:rPr>
         <w:t xml:space="preserve">Import </w:t>
       </w:r>
+      <w:proofErr w:type="spellStart"/>
       <w:r>
         <w:rPr>
           <w:rFonts w:ascii="Courier New" w:eastAsia="Times New Roman" w:hAnsi="Courier New" w:cs="Courier New"/>
@@ -10417,6 +11044,7 @@
         </w:rPr>
         <w:t>AIConnector</w:t>
       </w:r>
+      <w:proofErr w:type="spellEnd"/>
       <w:r>
         <w:rPr>
           <w:rFonts w:ascii="Times New Roman" w:eastAsia="Times New Roman" w:hAnsi="Times New Roman" w:cs="Times New Roman"/>
@@ -10427,6 +11055,7 @@
         </w:rPr>
         <w:t xml:space="preserve"> and </w:t>
       </w:r>
+      <w:proofErr w:type="spellStart"/>
       <w:r>
         <w:rPr>
           <w:rFonts w:ascii="Courier New" w:eastAsia="Times New Roman" w:hAnsi="Courier New" w:cs="Courier New"/>
@@ -10437,6 +11066,7 @@
         </w:rPr>
         <w:t>LogPipeline</w:t>
       </w:r>
+      <w:proofErr w:type="spellEnd"/>
       <w:r>
         <w:rPr>
           <w:rFonts w:ascii="Times New Roman" w:eastAsia="Times New Roman" w:hAnsi="Times New Roman" w:cs="Times New Roman"/>
@@ -11049,6 +11679,8 @@
         </w:rPr>
         <w:t xml:space="preserve">: Without wiring </w:t>
       </w:r>
+      <w:proofErr w:type="spellStart"/>
+      <w:proofErr w:type="gramStart"/>
       <w:r>
         <w:rPr>
           <w:rFonts w:ascii="Courier New" w:eastAsia="Times New Roman" w:hAnsi="Courier New" w:cs="Courier New"/>
@@ -11057,7 +11689,29 @@
           <w:szCs w:val="20"/>
           <w14:ligatures w14:val="none"/>
         </w:rPr>
-        <w:t>pipeline.add()</w:t>
+        <w:t>pipeline.add</w:t>
+      </w:r>
+      <w:proofErr w:type="spellEnd"/>
+      <w:r>
+        <w:rPr>
+          <w:rFonts w:ascii="Courier New" w:eastAsia="Times New Roman" w:hAnsi="Courier New" w:cs="Courier New"/>
+          <w:kern w:val="0"/>
+          <w:sz w:val="20"/>
+          <w:szCs w:val="20"/>
+          <w14:ligatures w14:val="none"/>
+        </w:rPr>
+        <w:t>(</w:t>
+      </w:r>
+      <w:proofErr w:type="gramEnd"/>
+      <w:r>
+        <w:rPr>
+          <w:rFonts w:ascii="Courier New" w:eastAsia="Times New Roman" w:hAnsi="Courier New" w:cs="Courier New"/>
+          <w:kern w:val="0"/>
+          <w:sz w:val="20"/>
+          <w:szCs w:val="20"/>
+          <w14:ligatures w14:val="none"/>
+        </w:rPr>
+        <w:t>)</w:t>
       </w:r>
       <w:r>
         <w:rPr>
@@ -11374,6 +12028,703 @@
           <w14:ligatures w14:val="none"/>
         </w:rPr>
         <w:t xml:space="preserve"> and confirm real log flow. Copy that. Over.</w:t>
+      </w:r>
+    </w:p>
+    <w:p>
+      <w:pPr>
+        <w:tabs>
+          <w:tab w:val="left" w:pos="3975"/>
+        </w:tabs>
+        <w:rPr>
+          <w:sz w:val="52"/>
+          <w:szCs w:val="52"/>
+        </w:rPr>
+      </w:pPr>
+    </w:p>
+    <w:p>
+      <w:pPr>
+        <w:tabs>
+          <w:tab w:val="left" w:pos="3975"/>
+        </w:tabs>
+        <w:rPr>
+          <w:sz w:val="52"/>
+          <w:szCs w:val="52"/>
+        </w:rPr>
+      </w:pPr>
+      <w:r>
+        <w:rPr>
+          <w:sz w:val="52"/>
+          <w:szCs w:val="52"/>
+        </w:rPr>
+        <w:lastRenderedPageBreak/>
+        <w:t>Date- 30-04-2026</w:t>
+      </w:r>
+    </w:p>
+    <w:p>
+      <w:pPr>
+        <w:pStyle w:val="NormalWeb"/>
+      </w:pPr>
+      <w:r>
+        <w:t>Copy that. Over.</w:t>
+      </w:r>
+    </w:p>
+    <w:p>
+      <w:pPr>
+        <w:pStyle w:val="Heading3"/>
+      </w:pPr>
+      <w:r>
+        <w:t>Progress Report — Thursday, April 30, 2026</w:t>
+      </w:r>
+    </w:p>
+    <w:p>
+      <w:pPr>
+        <w:pStyle w:val="Heading4"/>
+      </w:pPr>
+      <w:r>
+        <w:rPr>
+          <w:rStyle w:val="Strong"/>
+          <w:b w:val="0"/>
+          <w:bCs w:val="0"/>
+        </w:rPr>
+        <w:t>Foundation Setup</w:t>
+      </w:r>
+    </w:p>
+    <w:p>
+      <w:pPr>
+        <w:numPr>
+          <w:ilvl w:val="0"/>
+          <w:numId w:val="71"/>
+        </w:numPr>
+        <w:spacing w:before="100" w:beforeAutospacing="1" w:after="100" w:afterAutospacing="1" w:line="240" w:lineRule="auto"/>
+      </w:pPr>
+      <w:r>
+        <w:rPr>
+          <w:rStyle w:val="Strong"/>
+        </w:rPr>
+        <w:t>Initial schema alignment</w:t>
+      </w:r>
+      <w:r>
+        <w:t xml:space="preserve">: Confirmed </w:t>
+      </w:r>
+      <w:proofErr w:type="spellStart"/>
+      <w:r>
+        <w:rPr>
+          <w:rStyle w:val="HTMLCode"/>
+          <w:rFonts w:eastAsiaTheme="majorEastAsia"/>
+        </w:rPr>
+        <w:t>logs.db</w:t>
+      </w:r>
+      <w:proofErr w:type="spellEnd"/>
+      <w:r>
+        <w:t xml:space="preserve"> structure with fields </w:t>
+      </w:r>
+      <w:r>
+        <w:rPr>
+          <w:rStyle w:val="HTMLCode"/>
+          <w:rFonts w:eastAsiaTheme="majorEastAsia"/>
+        </w:rPr>
+        <w:t>timestamp</w:t>
+      </w:r>
+      <w:r>
+        <w:t xml:space="preserve">, </w:t>
+      </w:r>
+      <w:r>
+        <w:rPr>
+          <w:rStyle w:val="HTMLCode"/>
+          <w:rFonts w:eastAsiaTheme="majorEastAsia"/>
+        </w:rPr>
+        <w:t>type</w:t>
+      </w:r>
+      <w:r>
+        <w:t xml:space="preserve">, </w:t>
+      </w:r>
+      <w:r>
+        <w:rPr>
+          <w:rStyle w:val="HTMLCode"/>
+          <w:rFonts w:eastAsiaTheme="majorEastAsia"/>
+        </w:rPr>
+        <w:t>event</w:t>
+      </w:r>
+      <w:r>
+        <w:t xml:space="preserve">, </w:t>
+      </w:r>
+      <w:r>
+        <w:rPr>
+          <w:rStyle w:val="HTMLCode"/>
+          <w:rFonts w:eastAsiaTheme="majorEastAsia"/>
+        </w:rPr>
+        <w:t>details</w:t>
+      </w:r>
+      <w:r>
+        <w:t>.</w:t>
+      </w:r>
+    </w:p>
+    <w:p>
+      <w:pPr>
+        <w:numPr>
+          <w:ilvl w:val="0"/>
+          <w:numId w:val="71"/>
+        </w:numPr>
+        <w:spacing w:before="100" w:beforeAutospacing="1" w:after="100" w:afterAutospacing="1" w:line="240" w:lineRule="auto"/>
+      </w:pPr>
+      <w:r>
+        <w:rPr>
+          <w:rStyle w:val="Strong"/>
+        </w:rPr>
+        <w:t>Decision to remove in</w:t>
+      </w:r>
+      <w:r>
+        <w:rPr>
+          <w:rStyle w:val="Strong"/>
+        </w:rPr>
+        <w:noBreakHyphen/>
+        <w:t>memory storage</w:t>
+      </w:r>
+      <w:r>
+        <w:t>: Migrated logging exclusively to SQLite persistence.</w:t>
+      </w:r>
+    </w:p>
+    <w:p>
+      <w:pPr>
+        <w:pStyle w:val="Heading4"/>
+      </w:pPr>
+      <w:r>
+        <w:rPr>
+          <w:rStyle w:val="Strong"/>
+          <w:b w:val="0"/>
+          <w:bCs w:val="0"/>
+        </w:rPr>
+        <w:t>Refactor &amp; Error Correction</w:t>
+      </w:r>
+    </w:p>
+    <w:p>
+      <w:pPr>
+        <w:numPr>
+          <w:ilvl w:val="0"/>
+          <w:numId w:val="72"/>
+        </w:numPr>
+        <w:spacing w:before="100" w:beforeAutospacing="1" w:after="100" w:afterAutospacing="1" w:line="240" w:lineRule="auto"/>
+      </w:pPr>
+      <w:r>
+        <w:rPr>
+          <w:rStyle w:val="Strong"/>
+        </w:rPr>
+        <w:t xml:space="preserve">Fresh </w:t>
+      </w:r>
+      <w:r>
+        <w:rPr>
+          <w:rStyle w:val="HTMLCode"/>
+          <w:rFonts w:eastAsiaTheme="majorEastAsia"/>
+          <w:b/>
+          <w:bCs/>
+        </w:rPr>
+        <w:t>logSystem.js</w:t>
+      </w:r>
+      <w:r>
+        <w:rPr>
+          <w:rStyle w:val="Strong"/>
+        </w:rPr>
+        <w:t xml:space="preserve"> design</w:t>
+      </w:r>
+      <w:r>
+        <w:t>: Rebuilt from scratch to capture four event types (clicks, user messages, AI messages, errors).</w:t>
+      </w:r>
+    </w:p>
+    <w:p>
+      <w:pPr>
+        <w:numPr>
+          <w:ilvl w:val="0"/>
+          <w:numId w:val="72"/>
+        </w:numPr>
+        <w:spacing w:before="100" w:beforeAutospacing="1" w:after="100" w:afterAutospacing="1" w:line="240" w:lineRule="auto"/>
+      </w:pPr>
+      <w:r>
+        <w:rPr>
+          <w:rStyle w:val="Strong"/>
+        </w:rPr>
+        <w:t>Develop mode toggle</w:t>
+      </w:r>
+      <w:r>
+        <w:t xml:space="preserve">: Added enable/disable functions tied to </w:t>
+      </w:r>
+      <w:r>
+        <w:rPr>
+          <w:rStyle w:val="HTMLCode"/>
+          <w:rFonts w:eastAsiaTheme="majorEastAsia"/>
+        </w:rPr>
+        <w:t>"Develop"</w:t>
+      </w:r>
+      <w:r>
+        <w:t xml:space="preserve"> button.</w:t>
+      </w:r>
+    </w:p>
+    <w:p>
+      <w:pPr>
+        <w:numPr>
+          <w:ilvl w:val="0"/>
+          <w:numId w:val="72"/>
+        </w:numPr>
+        <w:spacing w:before="100" w:beforeAutospacing="1" w:after="100" w:afterAutospacing="1" w:line="240" w:lineRule="auto"/>
+      </w:pPr>
+      <w:r>
+        <w:rPr>
+          <w:rStyle w:val="Strong"/>
+        </w:rPr>
+        <w:t>Console integration</w:t>
+      </w:r>
+      <w:r>
+        <w:t>: Logs streamed to bottom console panel in JSON format.</w:t>
+      </w:r>
+    </w:p>
+    <w:p>
+      <w:pPr>
+        <w:numPr>
+          <w:ilvl w:val="0"/>
+          <w:numId w:val="72"/>
+        </w:numPr>
+        <w:spacing w:before="100" w:beforeAutospacing="1" w:after="100" w:afterAutospacing="1" w:line="240" w:lineRule="auto"/>
+      </w:pPr>
+      <w:r>
+        <w:rPr>
+          <w:rStyle w:val="Strong"/>
+        </w:rPr>
+        <w:t>Database persistence</w:t>
+      </w:r>
+      <w:r>
+        <w:t xml:space="preserve">: Ensured </w:t>
+      </w:r>
+      <w:proofErr w:type="spellStart"/>
+      <w:r>
+        <w:rPr>
+          <w:rStyle w:val="HTMLCode"/>
+          <w:rFonts w:eastAsiaTheme="majorEastAsia"/>
+        </w:rPr>
+        <w:t>log_events.db</w:t>
+      </w:r>
+      <w:proofErr w:type="spellEnd"/>
+      <w:r>
+        <w:t xml:space="preserve"> auto</w:t>
+      </w:r>
+      <w:r>
+        <w:noBreakHyphen/>
+        <w:t xml:space="preserve">creates once in </w:t>
+      </w:r>
+      <w:r>
+        <w:rPr>
+          <w:rStyle w:val="HTMLCode"/>
+          <w:rFonts w:eastAsiaTheme="majorEastAsia"/>
+        </w:rPr>
+        <w:t>D:\AI_LAB\Database\</w:t>
+      </w:r>
+      <w:r>
+        <w:t>.</w:t>
+      </w:r>
+    </w:p>
+    <w:p>
+      <w:pPr>
+        <w:pStyle w:val="Heading4"/>
+      </w:pPr>
+      <w:r>
+        <w:rPr>
+          <w:rStyle w:val="Strong"/>
+          <w:b w:val="0"/>
+          <w:bCs w:val="0"/>
+        </w:rPr>
+        <w:t>Renderer &amp; IPC Wiring</w:t>
+      </w:r>
+    </w:p>
+    <w:p>
+      <w:pPr>
+        <w:numPr>
+          <w:ilvl w:val="0"/>
+          <w:numId w:val="73"/>
+        </w:numPr>
+        <w:spacing w:before="100" w:beforeAutospacing="1" w:after="100" w:afterAutospacing="1" w:line="240" w:lineRule="auto"/>
+      </w:pPr>
+      <w:r>
+        <w:rPr>
+          <w:rStyle w:val="Strong"/>
+        </w:rPr>
+        <w:t>Error surfaced</w:t>
+      </w:r>
+      <w:r>
+        <w:t xml:space="preserve">: </w:t>
+      </w:r>
+      <w:r>
+        <w:rPr>
+          <w:rStyle w:val="HTMLCode"/>
+          <w:rFonts w:eastAsiaTheme="majorEastAsia"/>
+        </w:rPr>
+        <w:t>"Failed to resolve module specifier 'better-sqlite3'"</w:t>
+      </w:r>
+      <w:r>
+        <w:t xml:space="preserve"> due to browser context.</w:t>
+      </w:r>
+    </w:p>
+    <w:p>
+      <w:pPr>
+        <w:numPr>
+          <w:ilvl w:val="0"/>
+          <w:numId w:val="73"/>
+        </w:numPr>
+        <w:spacing w:before="100" w:beforeAutospacing="1" w:after="100" w:afterAutospacing="1" w:line="240" w:lineRule="auto"/>
+      </w:pPr>
+      <w:r>
+        <w:rPr>
+          <w:rStyle w:val="Strong"/>
+        </w:rPr>
+        <w:t>Correction</w:t>
+      </w:r>
+      <w:r>
+        <w:t>: Moved DB logic to backend (Electron main process).</w:t>
+      </w:r>
+    </w:p>
+    <w:p>
+      <w:pPr>
+        <w:numPr>
+          <w:ilvl w:val="0"/>
+          <w:numId w:val="73"/>
+        </w:numPr>
+        <w:spacing w:before="100" w:beforeAutospacing="1" w:after="100" w:afterAutospacing="1" w:line="240" w:lineRule="auto"/>
+      </w:pPr>
+      <w:r>
+        <w:rPr>
+          <w:rStyle w:val="Strong"/>
+        </w:rPr>
+        <w:t>IPC bridge</w:t>
+      </w:r>
+      <w:r>
+        <w:t xml:space="preserve">: Renderer captures events → sends via </w:t>
+      </w:r>
+      <w:proofErr w:type="spellStart"/>
+      <w:r>
+        <w:rPr>
+          <w:rStyle w:val="HTMLCode"/>
+          <w:rFonts w:eastAsiaTheme="majorEastAsia"/>
+        </w:rPr>
+        <w:t>ipcRenderer.send</w:t>
+      </w:r>
+      <w:proofErr w:type="spellEnd"/>
+      <w:r>
+        <w:rPr>
+          <w:rStyle w:val="HTMLCode"/>
+          <w:rFonts w:eastAsiaTheme="majorEastAsia"/>
+        </w:rPr>
+        <w:t>('log-event', {...})</w:t>
+      </w:r>
+      <w:r>
+        <w:t>.</w:t>
+      </w:r>
+    </w:p>
+    <w:p>
+      <w:pPr>
+        <w:numPr>
+          <w:ilvl w:val="0"/>
+          <w:numId w:val="73"/>
+        </w:numPr>
+        <w:spacing w:before="100" w:beforeAutospacing="1" w:after="100" w:afterAutospacing="1" w:line="240" w:lineRule="auto"/>
+      </w:pPr>
+      <w:r>
+        <w:rPr>
+          <w:rStyle w:val="Strong"/>
+        </w:rPr>
+        <w:t>Main process listener</w:t>
+      </w:r>
+      <w:r>
+        <w:t xml:space="preserve">: </w:t>
+      </w:r>
+      <w:proofErr w:type="spellStart"/>
+      <w:r>
+        <w:rPr>
+          <w:rStyle w:val="HTMLCode"/>
+          <w:rFonts w:eastAsiaTheme="majorEastAsia"/>
+        </w:rPr>
+        <w:t>ipcMain.on</w:t>
+      </w:r>
+      <w:proofErr w:type="spellEnd"/>
+      <w:r>
+        <w:rPr>
+          <w:rStyle w:val="HTMLCode"/>
+          <w:rFonts w:eastAsiaTheme="majorEastAsia"/>
+        </w:rPr>
+        <w:t>('log-event', handler)</w:t>
+      </w:r>
+      <w:r>
+        <w:t xml:space="preserve"> → writes logs to DB.</w:t>
+      </w:r>
+    </w:p>
+    <w:p>
+      <w:pPr>
+        <w:pStyle w:val="Heading4"/>
+      </w:pPr>
+      <w:r>
+        <w:rPr>
+          <w:rStyle w:val="Strong"/>
+          <w:b w:val="0"/>
+          <w:bCs w:val="0"/>
+        </w:rPr>
+        <w:t>Event Capture Implementation</w:t>
+      </w:r>
+    </w:p>
+    <w:p>
+      <w:pPr>
+        <w:numPr>
+          <w:ilvl w:val="0"/>
+          <w:numId w:val="74"/>
+        </w:numPr>
+        <w:spacing w:before="100" w:beforeAutospacing="1" w:after="100" w:afterAutospacing="1" w:line="240" w:lineRule="auto"/>
+      </w:pPr>
+      <w:r>
+        <w:rPr>
+          <w:rStyle w:val="Strong"/>
+        </w:rPr>
+        <w:t>Click events</w:t>
+      </w:r>
+      <w:r>
+        <w:t>: Global listener records all clicks.</w:t>
+      </w:r>
+    </w:p>
+    <w:p>
+      <w:pPr>
+        <w:numPr>
+          <w:ilvl w:val="0"/>
+          <w:numId w:val="74"/>
+        </w:numPr>
+        <w:spacing w:before="100" w:beforeAutospacing="1" w:after="100" w:afterAutospacing="1" w:line="240" w:lineRule="auto"/>
+      </w:pPr>
+      <w:r>
+        <w:rPr>
+          <w:rStyle w:val="Strong"/>
+        </w:rPr>
+        <w:t>User messages</w:t>
+      </w:r>
+      <w:r>
+        <w:t>: Captures content + message number.</w:t>
+      </w:r>
+    </w:p>
+    <w:p>
+      <w:pPr>
+        <w:numPr>
+          <w:ilvl w:val="0"/>
+          <w:numId w:val="74"/>
+        </w:numPr>
+        <w:spacing w:before="100" w:beforeAutospacing="1" w:after="100" w:afterAutospacing="1" w:line="240" w:lineRule="auto"/>
+      </w:pPr>
+      <w:r>
+        <w:rPr>
+          <w:rStyle w:val="Strong"/>
+        </w:rPr>
+        <w:t>AI messages</w:t>
+      </w:r>
+      <w:r>
+        <w:t>: Captures content + message number.</w:t>
+      </w:r>
+    </w:p>
+    <w:p>
+      <w:pPr>
+        <w:numPr>
+          <w:ilvl w:val="0"/>
+          <w:numId w:val="74"/>
+        </w:numPr>
+        <w:spacing w:before="100" w:beforeAutospacing="1" w:after="100" w:afterAutospacing="1" w:line="240" w:lineRule="auto"/>
+      </w:pPr>
+      <w:r>
+        <w:rPr>
+          <w:rStyle w:val="Strong"/>
+        </w:rPr>
+        <w:t>Errors</w:t>
+      </w:r>
+      <w:r>
+        <w:t>: Captures exact file name + line number.</w:t>
+      </w:r>
+    </w:p>
+    <w:p>
+      <w:pPr>
+        <w:pStyle w:val="Heading4"/>
+      </w:pPr>
+      <w:r>
+        <w:rPr>
+          <w:rStyle w:val="Strong"/>
+          <w:b w:val="0"/>
+          <w:bCs w:val="0"/>
+        </w:rPr>
+        <w:t>Testing &amp; Validation</w:t>
+      </w:r>
+    </w:p>
+    <w:p>
+      <w:pPr>
+        <w:numPr>
+          <w:ilvl w:val="0"/>
+          <w:numId w:val="75"/>
+        </w:numPr>
+        <w:spacing w:before="100" w:beforeAutospacing="1" w:after="100" w:afterAutospacing="1" w:line="240" w:lineRule="auto"/>
+      </w:pPr>
+      <w:r>
+        <w:rPr>
+          <w:rStyle w:val="Strong"/>
+        </w:rPr>
+        <w:t>Pipeline test plan</w:t>
+      </w:r>
+      <w:r>
+        <w:t xml:space="preserve">: </w:t>
+      </w:r>
+    </w:p>
+    <w:p>
+      <w:pPr>
+        <w:numPr>
+          <w:ilvl w:val="1"/>
+          <w:numId w:val="75"/>
+        </w:numPr>
+        <w:spacing w:before="100" w:beforeAutospacing="1" w:after="100" w:afterAutospacing="1" w:line="240" w:lineRule="auto"/>
+      </w:pPr>
+      <w:r>
+        <w:t xml:space="preserve">Toggle </w:t>
+      </w:r>
+      <w:r>
+        <w:rPr>
+          <w:rStyle w:val="HTMLCode"/>
+          <w:rFonts w:eastAsiaTheme="majorEastAsia"/>
+        </w:rPr>
+        <w:t>"Develop"</w:t>
+      </w:r>
+      <w:r>
+        <w:t xml:space="preserve"> mode.</w:t>
+      </w:r>
+    </w:p>
+    <w:p>
+      <w:pPr>
+        <w:numPr>
+          <w:ilvl w:val="1"/>
+          <w:numId w:val="75"/>
+        </w:numPr>
+        <w:spacing w:before="100" w:beforeAutospacing="1" w:after="100" w:afterAutospacing="1" w:line="240" w:lineRule="auto"/>
+      </w:pPr>
+      <w:r>
+        <w:t>Trigger click, send user message, receive AI message, force error.</w:t>
+      </w:r>
+    </w:p>
+    <w:p>
+      <w:pPr>
+        <w:numPr>
+          <w:ilvl w:val="1"/>
+          <w:numId w:val="75"/>
+        </w:numPr>
+        <w:spacing w:before="100" w:beforeAutospacing="1" w:after="100" w:afterAutospacing="1" w:line="240" w:lineRule="auto"/>
+      </w:pPr>
+      <w:r>
+        <w:t>Confirm logs in bottom console.</w:t>
+      </w:r>
+    </w:p>
+    <w:p>
+      <w:pPr>
+        <w:numPr>
+          <w:ilvl w:val="1"/>
+          <w:numId w:val="75"/>
+        </w:numPr>
+        <w:spacing w:before="100" w:beforeAutospacing="1" w:after="100" w:afterAutospacing="1" w:line="240" w:lineRule="auto"/>
+      </w:pPr>
+      <w:r>
+        <w:t xml:space="preserve">Inspect </w:t>
+      </w:r>
+      <w:proofErr w:type="spellStart"/>
+      <w:r>
+        <w:rPr>
+          <w:rStyle w:val="HTMLCode"/>
+          <w:rFonts w:eastAsiaTheme="majorEastAsia"/>
+        </w:rPr>
+        <w:t>log_events.db</w:t>
+      </w:r>
+      <w:proofErr w:type="spellEnd"/>
+      <w:r>
+        <w:t xml:space="preserve"> entries with SQLite viewer.</w:t>
+      </w:r>
+    </w:p>
+    <w:p>
+      <w:pPr>
+        <w:spacing w:after="0"/>
+      </w:pPr>
+      <w:r>
+        <w:pict w14:anchorId="413C6801">
+          <v:rect id="_x0000_i1092" style="width:0;height:1.5pt" o:hralign="center" o:hrstd="t" o:hr="t" fillcolor="#a0a0a0" stroked="f"/>
+        </w:pict>
+      </w:r>
+    </w:p>
+    <w:p>
+      <w:pPr>
+        <w:pStyle w:val="Heading3"/>
+      </w:pPr>
+      <w:r>
+        <w:rPr>
+          <w:rStyle w:val="Strong"/>
+          <w:b/>
+          <w:bCs/>
+        </w:rPr>
+        <w:lastRenderedPageBreak/>
+        <w:t>Status</w:t>
+      </w:r>
+    </w:p>
+    <w:p>
+      <w:pPr>
+        <w:numPr>
+          <w:ilvl w:val="0"/>
+          <w:numId w:val="76"/>
+        </w:numPr>
+        <w:spacing w:before="100" w:beforeAutospacing="1" w:after="100" w:afterAutospacing="1" w:line="240" w:lineRule="auto"/>
+      </w:pPr>
+      <w:r>
+        <w:t>Backend logging system operational.</w:t>
+      </w:r>
+    </w:p>
+    <w:p>
+      <w:pPr>
+        <w:numPr>
+          <w:ilvl w:val="0"/>
+          <w:numId w:val="76"/>
+        </w:numPr>
+        <w:spacing w:before="100" w:beforeAutospacing="1" w:after="100" w:afterAutospacing="1" w:line="240" w:lineRule="auto"/>
+      </w:pPr>
+      <w:r>
+        <w:t>Renderer events wired through IPC.</w:t>
+      </w:r>
+    </w:p>
+    <w:p>
+      <w:pPr>
+        <w:numPr>
+          <w:ilvl w:val="0"/>
+          <w:numId w:val="76"/>
+        </w:numPr>
+        <w:spacing w:before="100" w:beforeAutospacing="1" w:after="100" w:afterAutospacing="1" w:line="240" w:lineRule="auto"/>
+      </w:pPr>
+      <w:r>
+        <w:t>Database persistence confirmed.</w:t>
+      </w:r>
+    </w:p>
+    <w:p>
+      <w:pPr>
+        <w:numPr>
+          <w:ilvl w:val="0"/>
+          <w:numId w:val="76"/>
+        </w:numPr>
+        <w:spacing w:before="100" w:beforeAutospacing="1" w:after="100" w:afterAutospacing="1" w:line="240" w:lineRule="auto"/>
+      </w:pPr>
+      <w:r>
+        <w:t>Console output integrated.</w:t>
+      </w:r>
+    </w:p>
+    <w:p>
+      <w:pPr>
+        <w:pStyle w:val="NormalWeb"/>
+      </w:pPr>
+      <w:r>
+        <w:t>System context is clear, failures corrected, and logging pipeline now fully functional.</w:t>
+      </w:r>
+    </w:p>
+    <w:p>
+      <w:pPr>
+        <w:pStyle w:val="NormalWeb"/>
+      </w:pPr>
+      <w:r>
+        <w:t>Mission accomplished. Over.</w:t>
       </w:r>
     </w:p>
     <w:p>
@@ -13301,6 +14652,155 @@
     </w:lvl>
   </w:abstractNum>
   <w:abstractNum w:abstractNumId="13" w15:restartNumberingAfterBreak="0">
+    <w:nsid w:val="1FC15C87"/>
+    <w:multiLevelType w:val="multilevel"/>
+    <w:tmpl w:val="ED94D9EA"/>
+    <w:lvl w:ilvl="0">
+      <w:start w:val="1"/>
+      <w:numFmt w:val="bullet"/>
+      <w:lvlText w:val=""/>
+      <w:lvlJc w:val="left"/>
+      <w:pPr>
+        <w:tabs>
+          <w:tab w:val="num" w:pos="720"/>
+        </w:tabs>
+        <w:ind w:left="720" w:hanging="360"/>
+      </w:pPr>
+      <w:rPr>
+        <w:rFonts w:ascii="Symbol" w:hAnsi="Symbol" w:hint="default"/>
+        <w:sz w:val="20"/>
+      </w:rPr>
+    </w:lvl>
+    <w:lvl w:ilvl="1" w:tentative="1">
+      <w:start w:val="1"/>
+      <w:numFmt w:val="bullet"/>
+      <w:lvlText w:val="o"/>
+      <w:lvlJc w:val="left"/>
+      <w:pPr>
+        <w:tabs>
+          <w:tab w:val="num" w:pos="1440"/>
+        </w:tabs>
+        <w:ind w:left="1440" w:hanging="360"/>
+      </w:pPr>
+      <w:rPr>
+        <w:rFonts w:ascii="Courier New" w:hAnsi="Courier New" w:hint="default"/>
+        <w:sz w:val="20"/>
+      </w:rPr>
+    </w:lvl>
+    <w:lvl w:ilvl="2" w:tentative="1">
+      <w:start w:val="1"/>
+      <w:numFmt w:val="bullet"/>
+      <w:lvlText w:val=""/>
+      <w:lvlJc w:val="left"/>
+      <w:pPr>
+        <w:tabs>
+          <w:tab w:val="num" w:pos="2160"/>
+        </w:tabs>
+        <w:ind w:left="2160" w:hanging="360"/>
+      </w:pPr>
+      <w:rPr>
+        <w:rFonts w:ascii="Wingdings" w:hAnsi="Wingdings" w:hint="default"/>
+        <w:sz w:val="20"/>
+      </w:rPr>
+    </w:lvl>
+    <w:lvl w:ilvl="3" w:tentative="1">
+      <w:start w:val="1"/>
+      <w:numFmt w:val="bullet"/>
+      <w:lvlText w:val=""/>
+      <w:lvlJc w:val="left"/>
+      <w:pPr>
+        <w:tabs>
+          <w:tab w:val="num" w:pos="2880"/>
+        </w:tabs>
+        <w:ind w:left="2880" w:hanging="360"/>
+      </w:pPr>
+      <w:rPr>
+        <w:rFonts w:ascii="Wingdings" w:hAnsi="Wingdings" w:hint="default"/>
+        <w:sz w:val="20"/>
+      </w:rPr>
+    </w:lvl>
+    <w:lvl w:ilvl="4" w:tentative="1">
+      <w:start w:val="1"/>
+      <w:numFmt w:val="bullet"/>
+      <w:lvlText w:val=""/>
+      <w:lvlJc w:val="left"/>
+      <w:pPr>
+        <w:tabs>
+          <w:tab w:val="num" w:pos="3600"/>
+        </w:tabs>
+        <w:ind w:left="3600" w:hanging="360"/>
+      </w:pPr>
+      <w:rPr>
+        <w:rFonts w:ascii="Wingdings" w:hAnsi="Wingdings" w:hint="default"/>
+        <w:sz w:val="20"/>
+      </w:rPr>
+    </w:lvl>
+    <w:lvl w:ilvl="5" w:tentative="1">
+      <w:start w:val="1"/>
+      <w:numFmt w:val="bullet"/>
+      <w:lvlText w:val=""/>
+      <w:lvlJc w:val="left"/>
+      <w:pPr>
+        <w:tabs>
+          <w:tab w:val="num" w:pos="4320"/>
+        </w:tabs>
+        <w:ind w:left="4320" w:hanging="360"/>
+      </w:pPr>
+      <w:rPr>
+        <w:rFonts w:ascii="Wingdings" w:hAnsi="Wingdings" w:hint="default"/>
+        <w:sz w:val="20"/>
+      </w:rPr>
+    </w:lvl>
+    <w:lvl w:ilvl="6" w:tentative="1">
+      <w:start w:val="1"/>
+      <w:numFmt w:val="bullet"/>
+      <w:lvlText w:val=""/>
+      <w:lvlJc w:val="left"/>
+      <w:pPr>
+        <w:tabs>
+          <w:tab w:val="num" w:pos="5040"/>
+        </w:tabs>
+        <w:ind w:left="5040" w:hanging="360"/>
+      </w:pPr>
+      <w:rPr>
+        <w:rFonts w:ascii="Wingdings" w:hAnsi="Wingdings" w:hint="default"/>
+        <w:sz w:val="20"/>
+      </w:rPr>
+    </w:lvl>
+    <w:lvl w:ilvl="7" w:tentative="1">
+      <w:start w:val="1"/>
+      <w:numFmt w:val="bullet"/>
+      <w:lvlText w:val=""/>
+      <w:lvlJc w:val="left"/>
+      <w:pPr>
+        <w:tabs>
+          <w:tab w:val="num" w:pos="5760"/>
+        </w:tabs>
+        <w:ind w:left="5760" w:hanging="360"/>
+      </w:pPr>
+      <w:rPr>
+        <w:rFonts w:ascii="Wingdings" w:hAnsi="Wingdings" w:hint="default"/>
+        <w:sz w:val="20"/>
+      </w:rPr>
+    </w:lvl>
+    <w:lvl w:ilvl="8" w:tentative="1">
+      <w:start w:val="1"/>
+      <w:numFmt w:val="bullet"/>
+      <w:lvlText w:val=""/>
+      <w:lvlJc w:val="left"/>
+      <w:pPr>
+        <w:tabs>
+          <w:tab w:val="num" w:pos="6480"/>
+        </w:tabs>
+        <w:ind w:left="6480" w:hanging="360"/>
+      </w:pPr>
+      <w:rPr>
+        <w:rFonts w:ascii="Wingdings" w:hAnsi="Wingdings" w:hint="default"/>
+        <w:sz w:val="20"/>
+      </w:rPr>
+    </w:lvl>
+  </w:abstractNum>
+  <w:abstractNum w:abstractNumId="14" w15:restartNumberingAfterBreak="0">
     <w:nsid w:val="20662D03"/>
     <w:multiLevelType w:val="multilevel"/>
     <w:tmpl w:val="F9A825EE"/>
@@ -13421,7 +14921,7 @@
       </w:pPr>
     </w:lvl>
   </w:abstractNum>
-  <w:abstractNum w:abstractNumId="14" w15:restartNumberingAfterBreak="0">
+  <w:abstractNum w:abstractNumId="15" w15:restartNumberingAfterBreak="0">
     <w:nsid w:val="234E24EF"/>
     <w:multiLevelType w:val="multilevel"/>
     <w:tmpl w:val="42FC2EEE"/>
@@ -13570,7 +15070,7 @@
       </w:rPr>
     </w:lvl>
   </w:abstractNum>
-  <w:abstractNum w:abstractNumId="15" w15:restartNumberingAfterBreak="0">
+  <w:abstractNum w:abstractNumId="16" w15:restartNumberingAfterBreak="0">
     <w:nsid w:val="26BC218B"/>
     <w:multiLevelType w:val="multilevel"/>
     <w:tmpl w:val="04F0A698"/>
@@ -13719,7 +15219,7 @@
       </w:rPr>
     </w:lvl>
   </w:abstractNum>
-  <w:abstractNum w:abstractNumId="16" w15:restartNumberingAfterBreak="0">
+  <w:abstractNum w:abstractNumId="17" w15:restartNumberingAfterBreak="0">
     <w:nsid w:val="29903720"/>
     <w:multiLevelType w:val="multilevel"/>
     <w:tmpl w:val="E69469C6"/>
@@ -13868,7 +15368,7 @@
       </w:rPr>
     </w:lvl>
   </w:abstractNum>
-  <w:abstractNum w:abstractNumId="17" w15:restartNumberingAfterBreak="0">
+  <w:abstractNum w:abstractNumId="18" w15:restartNumberingAfterBreak="0">
     <w:nsid w:val="2A037951"/>
     <w:multiLevelType w:val="multilevel"/>
     <w:tmpl w:val="F6744FDA"/>
@@ -14017,7 +15517,7 @@
       </w:rPr>
     </w:lvl>
   </w:abstractNum>
-  <w:abstractNum w:abstractNumId="18" w15:restartNumberingAfterBreak="0">
+  <w:abstractNum w:abstractNumId="19" w15:restartNumberingAfterBreak="0">
     <w:nsid w:val="2A3F6EC5"/>
     <w:multiLevelType w:val="multilevel"/>
     <w:tmpl w:val="A23200A8"/>
@@ -14166,7 +15666,7 @@
       </w:rPr>
     </w:lvl>
   </w:abstractNum>
-  <w:abstractNum w:abstractNumId="19" w15:restartNumberingAfterBreak="0">
+  <w:abstractNum w:abstractNumId="20" w15:restartNumberingAfterBreak="0">
     <w:nsid w:val="2B686062"/>
     <w:multiLevelType w:val="multilevel"/>
     <w:tmpl w:val="BD9C8A84"/>
@@ -14315,7 +15815,7 @@
       </w:rPr>
     </w:lvl>
   </w:abstractNum>
-  <w:abstractNum w:abstractNumId="20" w15:restartNumberingAfterBreak="0">
+  <w:abstractNum w:abstractNumId="21" w15:restartNumberingAfterBreak="0">
     <w:nsid w:val="2BBC7F70"/>
     <w:multiLevelType w:val="multilevel"/>
     <w:tmpl w:val="5ABC69CA"/>
@@ -14464,7 +15964,305 @@
       </w:rPr>
     </w:lvl>
   </w:abstractNum>
-  <w:abstractNum w:abstractNumId="21" w15:restartNumberingAfterBreak="0">
+  <w:abstractNum w:abstractNumId="22" w15:restartNumberingAfterBreak="0">
+    <w:nsid w:val="2D2E6985"/>
+    <w:multiLevelType w:val="multilevel"/>
+    <w:tmpl w:val="D416F21A"/>
+    <w:lvl w:ilvl="0">
+      <w:start w:val="1"/>
+      <w:numFmt w:val="bullet"/>
+      <w:lvlText w:val=""/>
+      <w:lvlJc w:val="left"/>
+      <w:pPr>
+        <w:tabs>
+          <w:tab w:val="num" w:pos="720"/>
+        </w:tabs>
+        <w:ind w:left="720" w:hanging="360"/>
+      </w:pPr>
+      <w:rPr>
+        <w:rFonts w:ascii="Symbol" w:hAnsi="Symbol" w:hint="default"/>
+        <w:sz w:val="20"/>
+      </w:rPr>
+    </w:lvl>
+    <w:lvl w:ilvl="1" w:tentative="1">
+      <w:start w:val="1"/>
+      <w:numFmt w:val="bullet"/>
+      <w:lvlText w:val="o"/>
+      <w:lvlJc w:val="left"/>
+      <w:pPr>
+        <w:tabs>
+          <w:tab w:val="num" w:pos="1440"/>
+        </w:tabs>
+        <w:ind w:left="1440" w:hanging="360"/>
+      </w:pPr>
+      <w:rPr>
+        <w:rFonts w:ascii="Courier New" w:hAnsi="Courier New" w:hint="default"/>
+        <w:sz w:val="20"/>
+      </w:rPr>
+    </w:lvl>
+    <w:lvl w:ilvl="2" w:tentative="1">
+      <w:start w:val="1"/>
+      <w:numFmt w:val="bullet"/>
+      <w:lvlText w:val=""/>
+      <w:lvlJc w:val="left"/>
+      <w:pPr>
+        <w:tabs>
+          <w:tab w:val="num" w:pos="2160"/>
+        </w:tabs>
+        <w:ind w:left="2160" w:hanging="360"/>
+      </w:pPr>
+      <w:rPr>
+        <w:rFonts w:ascii="Wingdings" w:hAnsi="Wingdings" w:hint="default"/>
+        <w:sz w:val="20"/>
+      </w:rPr>
+    </w:lvl>
+    <w:lvl w:ilvl="3" w:tentative="1">
+      <w:start w:val="1"/>
+      <w:numFmt w:val="bullet"/>
+      <w:lvlText w:val=""/>
+      <w:lvlJc w:val="left"/>
+      <w:pPr>
+        <w:tabs>
+          <w:tab w:val="num" w:pos="2880"/>
+        </w:tabs>
+        <w:ind w:left="2880" w:hanging="360"/>
+      </w:pPr>
+      <w:rPr>
+        <w:rFonts w:ascii="Wingdings" w:hAnsi="Wingdings" w:hint="default"/>
+        <w:sz w:val="20"/>
+      </w:rPr>
+    </w:lvl>
+    <w:lvl w:ilvl="4" w:tentative="1">
+      <w:start w:val="1"/>
+      <w:numFmt w:val="bullet"/>
+      <w:lvlText w:val=""/>
+      <w:lvlJc w:val="left"/>
+      <w:pPr>
+        <w:tabs>
+          <w:tab w:val="num" w:pos="3600"/>
+        </w:tabs>
+        <w:ind w:left="3600" w:hanging="360"/>
+      </w:pPr>
+      <w:rPr>
+        <w:rFonts w:ascii="Wingdings" w:hAnsi="Wingdings" w:hint="default"/>
+        <w:sz w:val="20"/>
+      </w:rPr>
+    </w:lvl>
+    <w:lvl w:ilvl="5" w:tentative="1">
+      <w:start w:val="1"/>
+      <w:numFmt w:val="bullet"/>
+      <w:lvlText w:val=""/>
+      <w:lvlJc w:val="left"/>
+      <w:pPr>
+        <w:tabs>
+          <w:tab w:val="num" w:pos="4320"/>
+        </w:tabs>
+        <w:ind w:left="4320" w:hanging="360"/>
+      </w:pPr>
+      <w:rPr>
+        <w:rFonts w:ascii="Wingdings" w:hAnsi="Wingdings" w:hint="default"/>
+        <w:sz w:val="20"/>
+      </w:rPr>
+    </w:lvl>
+    <w:lvl w:ilvl="6" w:tentative="1">
+      <w:start w:val="1"/>
+      <w:numFmt w:val="bullet"/>
+      <w:lvlText w:val=""/>
+      <w:lvlJc w:val="left"/>
+      <w:pPr>
+        <w:tabs>
+          <w:tab w:val="num" w:pos="5040"/>
+        </w:tabs>
+        <w:ind w:left="5040" w:hanging="360"/>
+      </w:pPr>
+      <w:rPr>
+        <w:rFonts w:ascii="Wingdings" w:hAnsi="Wingdings" w:hint="default"/>
+        <w:sz w:val="20"/>
+      </w:rPr>
+    </w:lvl>
+    <w:lvl w:ilvl="7" w:tentative="1">
+      <w:start w:val="1"/>
+      <w:numFmt w:val="bullet"/>
+      <w:lvlText w:val=""/>
+      <w:lvlJc w:val="left"/>
+      <w:pPr>
+        <w:tabs>
+          <w:tab w:val="num" w:pos="5760"/>
+        </w:tabs>
+        <w:ind w:left="5760" w:hanging="360"/>
+      </w:pPr>
+      <w:rPr>
+        <w:rFonts w:ascii="Wingdings" w:hAnsi="Wingdings" w:hint="default"/>
+        <w:sz w:val="20"/>
+      </w:rPr>
+    </w:lvl>
+    <w:lvl w:ilvl="8" w:tentative="1">
+      <w:start w:val="1"/>
+      <w:numFmt w:val="bullet"/>
+      <w:lvlText w:val=""/>
+      <w:lvlJc w:val="left"/>
+      <w:pPr>
+        <w:tabs>
+          <w:tab w:val="num" w:pos="6480"/>
+        </w:tabs>
+        <w:ind w:left="6480" w:hanging="360"/>
+      </w:pPr>
+      <w:rPr>
+        <w:rFonts w:ascii="Wingdings" w:hAnsi="Wingdings" w:hint="default"/>
+        <w:sz w:val="20"/>
+      </w:rPr>
+    </w:lvl>
+  </w:abstractNum>
+  <w:abstractNum w:abstractNumId="23" w15:restartNumberingAfterBreak="0">
+    <w:nsid w:val="30A975E7"/>
+    <w:multiLevelType w:val="multilevel"/>
+    <w:tmpl w:val="EB92C834"/>
+    <w:lvl w:ilvl="0">
+      <w:start w:val="1"/>
+      <w:numFmt w:val="bullet"/>
+      <w:lvlText w:val=""/>
+      <w:lvlJc w:val="left"/>
+      <w:pPr>
+        <w:tabs>
+          <w:tab w:val="num" w:pos="720"/>
+        </w:tabs>
+        <w:ind w:left="720" w:hanging="360"/>
+      </w:pPr>
+      <w:rPr>
+        <w:rFonts w:ascii="Symbol" w:hAnsi="Symbol" w:hint="default"/>
+        <w:sz w:val="20"/>
+      </w:rPr>
+    </w:lvl>
+    <w:lvl w:ilvl="1" w:tentative="1">
+      <w:start w:val="1"/>
+      <w:numFmt w:val="bullet"/>
+      <w:lvlText w:val="o"/>
+      <w:lvlJc w:val="left"/>
+      <w:pPr>
+        <w:tabs>
+          <w:tab w:val="num" w:pos="1440"/>
+        </w:tabs>
+        <w:ind w:left="1440" w:hanging="360"/>
+      </w:pPr>
+      <w:rPr>
+        <w:rFonts w:ascii="Courier New" w:hAnsi="Courier New" w:hint="default"/>
+        <w:sz w:val="20"/>
+      </w:rPr>
+    </w:lvl>
+    <w:lvl w:ilvl="2" w:tentative="1">
+      <w:start w:val="1"/>
+      <w:numFmt w:val="bullet"/>
+      <w:lvlText w:val=""/>
+      <w:lvlJc w:val="left"/>
+      <w:pPr>
+        <w:tabs>
+          <w:tab w:val="num" w:pos="2160"/>
+        </w:tabs>
+        <w:ind w:left="2160" w:hanging="360"/>
+      </w:pPr>
+      <w:rPr>
+        <w:rFonts w:ascii="Wingdings" w:hAnsi="Wingdings" w:hint="default"/>
+        <w:sz w:val="20"/>
+      </w:rPr>
+    </w:lvl>
+    <w:lvl w:ilvl="3" w:tentative="1">
+      <w:start w:val="1"/>
+      <w:numFmt w:val="bullet"/>
+      <w:lvlText w:val=""/>
+      <w:lvlJc w:val="left"/>
+      <w:pPr>
+        <w:tabs>
+          <w:tab w:val="num" w:pos="2880"/>
+        </w:tabs>
+        <w:ind w:left="2880" w:hanging="360"/>
+      </w:pPr>
+      <w:rPr>
+        <w:rFonts w:ascii="Wingdings" w:hAnsi="Wingdings" w:hint="default"/>
+        <w:sz w:val="20"/>
+      </w:rPr>
+    </w:lvl>
+    <w:lvl w:ilvl="4" w:tentative="1">
+      <w:start w:val="1"/>
+      <w:numFmt w:val="bullet"/>
+      <w:lvlText w:val=""/>
+      <w:lvlJc w:val="left"/>
+      <w:pPr>
+        <w:tabs>
+          <w:tab w:val="num" w:pos="3600"/>
+        </w:tabs>
+        <w:ind w:left="3600" w:hanging="360"/>
+      </w:pPr>
+      <w:rPr>
+        <w:rFonts w:ascii="Wingdings" w:hAnsi="Wingdings" w:hint="default"/>
+        <w:sz w:val="20"/>
+      </w:rPr>
+    </w:lvl>
+    <w:lvl w:ilvl="5" w:tentative="1">
+      <w:start w:val="1"/>
+      <w:numFmt w:val="bullet"/>
+      <w:lvlText w:val=""/>
+      <w:lvlJc w:val="left"/>
+      <w:pPr>
+        <w:tabs>
+          <w:tab w:val="num" w:pos="4320"/>
+        </w:tabs>
+        <w:ind w:left="4320" w:hanging="360"/>
+      </w:pPr>
+      <w:rPr>
+        <w:rFonts w:ascii="Wingdings" w:hAnsi="Wingdings" w:hint="default"/>
+        <w:sz w:val="20"/>
+      </w:rPr>
+    </w:lvl>
+    <w:lvl w:ilvl="6" w:tentative="1">
+      <w:start w:val="1"/>
+      <w:numFmt w:val="bullet"/>
+      <w:lvlText w:val=""/>
+      <w:lvlJc w:val="left"/>
+      <w:pPr>
+        <w:tabs>
+          <w:tab w:val="num" w:pos="5040"/>
+        </w:tabs>
+        <w:ind w:left="5040" w:hanging="360"/>
+      </w:pPr>
+      <w:rPr>
+        <w:rFonts w:ascii="Wingdings" w:hAnsi="Wingdings" w:hint="default"/>
+        <w:sz w:val="20"/>
+      </w:rPr>
+    </w:lvl>
+    <w:lvl w:ilvl="7" w:tentative="1">
+      <w:start w:val="1"/>
+      <w:numFmt w:val="bullet"/>
+      <w:lvlText w:val=""/>
+      <w:lvlJc w:val="left"/>
+      <w:pPr>
+        <w:tabs>
+          <w:tab w:val="num" w:pos="5760"/>
+        </w:tabs>
+        <w:ind w:left="5760" w:hanging="360"/>
+      </w:pPr>
+      <w:rPr>
+        <w:rFonts w:ascii="Wingdings" w:hAnsi="Wingdings" w:hint="default"/>
+        <w:sz w:val="20"/>
+      </w:rPr>
+    </w:lvl>
+    <w:lvl w:ilvl="8" w:tentative="1">
+      <w:start w:val="1"/>
+      <w:numFmt w:val="bullet"/>
+      <w:lvlText w:val=""/>
+      <w:lvlJc w:val="left"/>
+      <w:pPr>
+        <w:tabs>
+          <w:tab w:val="num" w:pos="6480"/>
+        </w:tabs>
+        <w:ind w:left="6480" w:hanging="360"/>
+      </w:pPr>
+      <w:rPr>
+        <w:rFonts w:ascii="Wingdings" w:hAnsi="Wingdings" w:hint="default"/>
+        <w:sz w:val="20"/>
+      </w:rPr>
+    </w:lvl>
+  </w:abstractNum>
+  <w:abstractNum w:abstractNumId="24" w15:restartNumberingAfterBreak="0">
     <w:nsid w:val="31892256"/>
     <w:multiLevelType w:val="multilevel"/>
     <w:tmpl w:val="0ADCED9A"/>
@@ -14613,7 +16411,7 @@
       </w:rPr>
     </w:lvl>
   </w:abstractNum>
-  <w:abstractNum w:abstractNumId="22" w15:restartNumberingAfterBreak="0">
+  <w:abstractNum w:abstractNumId="25" w15:restartNumberingAfterBreak="0">
     <w:nsid w:val="33BE49A5"/>
     <w:multiLevelType w:val="multilevel"/>
     <w:tmpl w:val="1778D452"/>
@@ -14762,7 +16560,7 @@
       </w:rPr>
     </w:lvl>
   </w:abstractNum>
-  <w:abstractNum w:abstractNumId="23" w15:restartNumberingAfterBreak="0">
+  <w:abstractNum w:abstractNumId="26" w15:restartNumberingAfterBreak="0">
     <w:nsid w:val="3411318E"/>
     <w:multiLevelType w:val="multilevel"/>
     <w:tmpl w:val="B2B8ADFC"/>
@@ -14911,7 +16709,7 @@
       </w:rPr>
     </w:lvl>
   </w:abstractNum>
-  <w:abstractNum w:abstractNumId="24" w15:restartNumberingAfterBreak="0">
+  <w:abstractNum w:abstractNumId="27" w15:restartNumberingAfterBreak="0">
     <w:nsid w:val="347E1320"/>
     <w:multiLevelType w:val="multilevel"/>
     <w:tmpl w:val="EB44296A"/>
@@ -15060,7 +16858,7 @@
       </w:rPr>
     </w:lvl>
   </w:abstractNum>
-  <w:abstractNum w:abstractNumId="25" w15:restartNumberingAfterBreak="0">
+  <w:abstractNum w:abstractNumId="28" w15:restartNumberingAfterBreak="0">
     <w:nsid w:val="34FB49FE"/>
     <w:multiLevelType w:val="multilevel"/>
     <w:tmpl w:val="C75003F8"/>
@@ -15209,7 +17007,7 @@
       </w:rPr>
     </w:lvl>
   </w:abstractNum>
-  <w:abstractNum w:abstractNumId="26" w15:restartNumberingAfterBreak="0">
+  <w:abstractNum w:abstractNumId="29" w15:restartNumberingAfterBreak="0">
     <w:nsid w:val="3BEB578A"/>
     <w:multiLevelType w:val="multilevel"/>
     <w:tmpl w:val="418E5F56"/>
@@ -15358,7 +17156,7 @@
       </w:rPr>
     </w:lvl>
   </w:abstractNum>
-  <w:abstractNum w:abstractNumId="27" w15:restartNumberingAfterBreak="0">
+  <w:abstractNum w:abstractNumId="30" w15:restartNumberingAfterBreak="0">
     <w:nsid w:val="3D5C293C"/>
     <w:multiLevelType w:val="multilevel"/>
     <w:tmpl w:val="1500FEFA"/>
@@ -15507,7 +17305,7 @@
       </w:rPr>
     </w:lvl>
   </w:abstractNum>
-  <w:abstractNum w:abstractNumId="28" w15:restartNumberingAfterBreak="0">
+  <w:abstractNum w:abstractNumId="31" w15:restartNumberingAfterBreak="0">
     <w:nsid w:val="3F060C0A"/>
     <w:multiLevelType w:val="multilevel"/>
     <w:tmpl w:val="21B231A6"/>
@@ -15656,7 +17454,7 @@
       </w:rPr>
     </w:lvl>
   </w:abstractNum>
-  <w:abstractNum w:abstractNumId="29" w15:restartNumberingAfterBreak="0">
+  <w:abstractNum w:abstractNumId="32" w15:restartNumberingAfterBreak="0">
     <w:nsid w:val="3F491717"/>
     <w:multiLevelType w:val="multilevel"/>
     <w:tmpl w:val="F37C5BAC"/>
@@ -15805,7 +17603,7 @@
       </w:rPr>
     </w:lvl>
   </w:abstractNum>
-  <w:abstractNum w:abstractNumId="30" w15:restartNumberingAfterBreak="0">
+  <w:abstractNum w:abstractNumId="33" w15:restartNumberingAfterBreak="0">
     <w:nsid w:val="3FBE1FE5"/>
     <w:multiLevelType w:val="multilevel"/>
     <w:tmpl w:val="74A44AC2"/>
@@ -15954,7 +17752,7 @@
       </w:rPr>
     </w:lvl>
   </w:abstractNum>
-  <w:abstractNum w:abstractNumId="31" w15:restartNumberingAfterBreak="0">
+  <w:abstractNum w:abstractNumId="34" w15:restartNumberingAfterBreak="0">
     <w:nsid w:val="3FEC0747"/>
     <w:multiLevelType w:val="multilevel"/>
     <w:tmpl w:val="D902D9FA"/>
@@ -16103,7 +17901,7 @@
       </w:rPr>
     </w:lvl>
   </w:abstractNum>
-  <w:abstractNum w:abstractNumId="32" w15:restartNumberingAfterBreak="0">
+  <w:abstractNum w:abstractNumId="35" w15:restartNumberingAfterBreak="0">
     <w:nsid w:val="4022142D"/>
     <w:multiLevelType w:val="multilevel"/>
     <w:tmpl w:val="91CE0946"/>
@@ -16252,7 +18050,7 @@
       </w:rPr>
     </w:lvl>
   </w:abstractNum>
-  <w:abstractNum w:abstractNumId="33" w15:restartNumberingAfterBreak="0">
+  <w:abstractNum w:abstractNumId="36" w15:restartNumberingAfterBreak="0">
     <w:nsid w:val="414376EC"/>
     <w:multiLevelType w:val="multilevel"/>
     <w:tmpl w:val="336AC92E"/>
@@ -16373,7 +18171,7 @@
       </w:pPr>
     </w:lvl>
   </w:abstractNum>
-  <w:abstractNum w:abstractNumId="34" w15:restartNumberingAfterBreak="0">
+  <w:abstractNum w:abstractNumId="37" w15:restartNumberingAfterBreak="0">
     <w:nsid w:val="42295FD5"/>
     <w:multiLevelType w:val="multilevel"/>
     <w:tmpl w:val="5678AC2C"/>
@@ -16522,7 +18320,152 @@
       </w:rPr>
     </w:lvl>
   </w:abstractNum>
-  <w:abstractNum w:abstractNumId="35" w15:restartNumberingAfterBreak="0">
+  <w:abstractNum w:abstractNumId="38" w15:restartNumberingAfterBreak="0">
+    <w:nsid w:val="4384673A"/>
+    <w:multiLevelType w:val="multilevel"/>
+    <w:tmpl w:val="B40A7566"/>
+    <w:lvl w:ilvl="0">
+      <w:start w:val="1"/>
+      <w:numFmt w:val="bullet"/>
+      <w:lvlText w:val=""/>
+      <w:lvlJc w:val="left"/>
+      <w:pPr>
+        <w:tabs>
+          <w:tab w:val="num" w:pos="720"/>
+        </w:tabs>
+        <w:ind w:left="720" w:hanging="360"/>
+      </w:pPr>
+      <w:rPr>
+        <w:rFonts w:ascii="Symbol" w:hAnsi="Symbol" w:hint="default"/>
+        <w:sz w:val="20"/>
+      </w:rPr>
+    </w:lvl>
+    <w:lvl w:ilvl="1">
+      <w:start w:val="1"/>
+      <w:numFmt w:val="decimal"/>
+      <w:lvlText w:val="%2."/>
+      <w:lvlJc w:val="left"/>
+      <w:pPr>
+        <w:tabs>
+          <w:tab w:val="num" w:pos="1440"/>
+        </w:tabs>
+        <w:ind w:left="1440" w:hanging="360"/>
+      </w:pPr>
+    </w:lvl>
+    <w:lvl w:ilvl="2" w:tentative="1">
+      <w:start w:val="1"/>
+      <w:numFmt w:val="bullet"/>
+      <w:lvlText w:val=""/>
+      <w:lvlJc w:val="left"/>
+      <w:pPr>
+        <w:tabs>
+          <w:tab w:val="num" w:pos="2160"/>
+        </w:tabs>
+        <w:ind w:left="2160" w:hanging="360"/>
+      </w:pPr>
+      <w:rPr>
+        <w:rFonts w:ascii="Wingdings" w:hAnsi="Wingdings" w:hint="default"/>
+        <w:sz w:val="20"/>
+      </w:rPr>
+    </w:lvl>
+    <w:lvl w:ilvl="3" w:tentative="1">
+      <w:start w:val="1"/>
+      <w:numFmt w:val="bullet"/>
+      <w:lvlText w:val=""/>
+      <w:lvlJc w:val="left"/>
+      <w:pPr>
+        <w:tabs>
+          <w:tab w:val="num" w:pos="2880"/>
+        </w:tabs>
+        <w:ind w:left="2880" w:hanging="360"/>
+      </w:pPr>
+      <w:rPr>
+        <w:rFonts w:ascii="Wingdings" w:hAnsi="Wingdings" w:hint="default"/>
+        <w:sz w:val="20"/>
+      </w:rPr>
+    </w:lvl>
+    <w:lvl w:ilvl="4" w:tentative="1">
+      <w:start w:val="1"/>
+      <w:numFmt w:val="bullet"/>
+      <w:lvlText w:val=""/>
+      <w:lvlJc w:val="left"/>
+      <w:pPr>
+        <w:tabs>
+          <w:tab w:val="num" w:pos="3600"/>
+        </w:tabs>
+        <w:ind w:left="3600" w:hanging="360"/>
+      </w:pPr>
+      <w:rPr>
+        <w:rFonts w:ascii="Wingdings" w:hAnsi="Wingdings" w:hint="default"/>
+        <w:sz w:val="20"/>
+      </w:rPr>
+    </w:lvl>
+    <w:lvl w:ilvl="5" w:tentative="1">
+      <w:start w:val="1"/>
+      <w:numFmt w:val="bullet"/>
+      <w:lvlText w:val=""/>
+      <w:lvlJc w:val="left"/>
+      <w:pPr>
+        <w:tabs>
+          <w:tab w:val="num" w:pos="4320"/>
+        </w:tabs>
+        <w:ind w:left="4320" w:hanging="360"/>
+      </w:pPr>
+      <w:rPr>
+        <w:rFonts w:ascii="Wingdings" w:hAnsi="Wingdings" w:hint="default"/>
+        <w:sz w:val="20"/>
+      </w:rPr>
+    </w:lvl>
+    <w:lvl w:ilvl="6" w:tentative="1">
+      <w:start w:val="1"/>
+      <w:numFmt w:val="bullet"/>
+      <w:lvlText w:val=""/>
+      <w:lvlJc w:val="left"/>
+      <w:pPr>
+        <w:tabs>
+          <w:tab w:val="num" w:pos="5040"/>
+        </w:tabs>
+        <w:ind w:left="5040" w:hanging="360"/>
+      </w:pPr>
+      <w:rPr>
+        <w:rFonts w:ascii="Wingdings" w:hAnsi="Wingdings" w:hint="default"/>
+        <w:sz w:val="20"/>
+      </w:rPr>
+    </w:lvl>
+    <w:lvl w:ilvl="7" w:tentative="1">
+      <w:start w:val="1"/>
+      <w:numFmt w:val="bullet"/>
+      <w:lvlText w:val=""/>
+      <w:lvlJc w:val="left"/>
+      <w:pPr>
+        <w:tabs>
+          <w:tab w:val="num" w:pos="5760"/>
+        </w:tabs>
+        <w:ind w:left="5760" w:hanging="360"/>
+      </w:pPr>
+      <w:rPr>
+        <w:rFonts w:ascii="Wingdings" w:hAnsi="Wingdings" w:hint="default"/>
+        <w:sz w:val="20"/>
+      </w:rPr>
+    </w:lvl>
+    <w:lvl w:ilvl="8" w:tentative="1">
+      <w:start w:val="1"/>
+      <w:numFmt w:val="bullet"/>
+      <w:lvlText w:val=""/>
+      <w:lvlJc w:val="left"/>
+      <w:pPr>
+        <w:tabs>
+          <w:tab w:val="num" w:pos="6480"/>
+        </w:tabs>
+        <w:ind w:left="6480" w:hanging="360"/>
+      </w:pPr>
+      <w:rPr>
+        <w:rFonts w:ascii="Wingdings" w:hAnsi="Wingdings" w:hint="default"/>
+        <w:sz w:val="20"/>
+      </w:rPr>
+    </w:lvl>
+  </w:abstractNum>
+  <w:abstractNum w:abstractNumId="39" w15:restartNumberingAfterBreak="0">
     <w:nsid w:val="44B17DA9"/>
     <w:multiLevelType w:val="multilevel"/>
     <w:tmpl w:val="3662BEB4"/>
@@ -16635,7 +18578,7 @@
       </w:pPr>
     </w:lvl>
   </w:abstractNum>
-  <w:abstractNum w:abstractNumId="36" w15:restartNumberingAfterBreak="0">
+  <w:abstractNum w:abstractNumId="40" w15:restartNumberingAfterBreak="0">
     <w:nsid w:val="486D547F"/>
     <w:multiLevelType w:val="multilevel"/>
     <w:tmpl w:val="8CE231FA"/>
@@ -16784,7 +18727,7 @@
       </w:rPr>
     </w:lvl>
   </w:abstractNum>
-  <w:abstractNum w:abstractNumId="37" w15:restartNumberingAfterBreak="0">
+  <w:abstractNum w:abstractNumId="41" w15:restartNumberingAfterBreak="0">
     <w:nsid w:val="4E072FF2"/>
     <w:multiLevelType w:val="multilevel"/>
     <w:tmpl w:val="0570E538"/>
@@ -16933,7 +18876,7 @@
       </w:rPr>
     </w:lvl>
   </w:abstractNum>
-  <w:abstractNum w:abstractNumId="38" w15:restartNumberingAfterBreak="0">
+  <w:abstractNum w:abstractNumId="42" w15:restartNumberingAfterBreak="0">
     <w:nsid w:val="4E84565A"/>
     <w:multiLevelType w:val="multilevel"/>
     <w:tmpl w:val="E7BEE546"/>
@@ -17082,7 +19025,7 @@
       </w:rPr>
     </w:lvl>
   </w:abstractNum>
-  <w:abstractNum w:abstractNumId="39" w15:restartNumberingAfterBreak="0">
+  <w:abstractNum w:abstractNumId="43" w15:restartNumberingAfterBreak="0">
     <w:nsid w:val="53982AAB"/>
     <w:multiLevelType w:val="multilevel"/>
     <w:tmpl w:val="3BE8998E"/>
@@ -17231,7 +19174,7 @@
       </w:rPr>
     </w:lvl>
   </w:abstractNum>
-  <w:abstractNum w:abstractNumId="40" w15:restartNumberingAfterBreak="0">
+  <w:abstractNum w:abstractNumId="44" w15:restartNumberingAfterBreak="0">
     <w:nsid w:val="54064360"/>
     <w:multiLevelType w:val="multilevel"/>
     <w:tmpl w:val="E56AAC72"/>
@@ -17380,7 +19323,156 @@
       </w:rPr>
     </w:lvl>
   </w:abstractNum>
-  <w:abstractNum w:abstractNumId="41" w15:restartNumberingAfterBreak="0">
+  <w:abstractNum w:abstractNumId="45" w15:restartNumberingAfterBreak="0">
+    <w:nsid w:val="542C6EED"/>
+    <w:multiLevelType w:val="multilevel"/>
+    <w:tmpl w:val="B2BC62E6"/>
+    <w:lvl w:ilvl="0">
+      <w:start w:val="1"/>
+      <w:numFmt w:val="bullet"/>
+      <w:lvlText w:val=""/>
+      <w:lvlJc w:val="left"/>
+      <w:pPr>
+        <w:tabs>
+          <w:tab w:val="num" w:pos="720"/>
+        </w:tabs>
+        <w:ind w:left="720" w:hanging="360"/>
+      </w:pPr>
+      <w:rPr>
+        <w:rFonts w:ascii="Symbol" w:hAnsi="Symbol" w:hint="default"/>
+        <w:sz w:val="20"/>
+      </w:rPr>
+    </w:lvl>
+    <w:lvl w:ilvl="1" w:tentative="1">
+      <w:start w:val="1"/>
+      <w:numFmt w:val="bullet"/>
+      <w:lvlText w:val="o"/>
+      <w:lvlJc w:val="left"/>
+      <w:pPr>
+        <w:tabs>
+          <w:tab w:val="num" w:pos="1440"/>
+        </w:tabs>
+        <w:ind w:left="1440" w:hanging="360"/>
+      </w:pPr>
+      <w:rPr>
+        <w:rFonts w:ascii="Courier New" w:hAnsi="Courier New" w:hint="default"/>
+        <w:sz w:val="20"/>
+      </w:rPr>
+    </w:lvl>
+    <w:lvl w:ilvl="2" w:tentative="1">
+      <w:start w:val="1"/>
+      <w:numFmt w:val="bullet"/>
+      <w:lvlText w:val=""/>
+      <w:lvlJc w:val="left"/>
+      <w:pPr>
+        <w:tabs>
+          <w:tab w:val="num" w:pos="2160"/>
+        </w:tabs>
+        <w:ind w:left="2160" w:hanging="360"/>
+      </w:pPr>
+      <w:rPr>
+        <w:rFonts w:ascii="Wingdings" w:hAnsi="Wingdings" w:hint="default"/>
+        <w:sz w:val="20"/>
+      </w:rPr>
+    </w:lvl>
+    <w:lvl w:ilvl="3" w:tentative="1">
+      <w:start w:val="1"/>
+      <w:numFmt w:val="bullet"/>
+      <w:lvlText w:val=""/>
+      <w:lvlJc w:val="left"/>
+      <w:pPr>
+        <w:tabs>
+          <w:tab w:val="num" w:pos="2880"/>
+        </w:tabs>
+        <w:ind w:left="2880" w:hanging="360"/>
+      </w:pPr>
+      <w:rPr>
+        <w:rFonts w:ascii="Wingdings" w:hAnsi="Wingdings" w:hint="default"/>
+        <w:sz w:val="20"/>
+      </w:rPr>
+    </w:lvl>
+    <w:lvl w:ilvl="4" w:tentative="1">
+      <w:start w:val="1"/>
+      <w:numFmt w:val="bullet"/>
+      <w:lvlText w:val=""/>
+      <w:lvlJc w:val="left"/>
+      <w:pPr>
+        <w:tabs>
+          <w:tab w:val="num" w:pos="3600"/>
+        </w:tabs>
+        <w:ind w:left="3600" w:hanging="360"/>
+      </w:pPr>
+      <w:rPr>
+        <w:rFonts w:ascii="Wingdings" w:hAnsi="Wingdings" w:hint="default"/>
+        <w:sz w:val="20"/>
+      </w:rPr>
+    </w:lvl>
+    <w:lvl w:ilvl="5" w:tentative="1">
+      <w:start w:val="1"/>
+      <w:numFmt w:val="bullet"/>
+      <w:lvlText w:val=""/>
+      <w:lvlJc w:val="left"/>
+      <w:pPr>
+        <w:tabs>
+          <w:tab w:val="num" w:pos="4320"/>
+        </w:tabs>
+        <w:ind w:left="4320" w:hanging="360"/>
+      </w:pPr>
+      <w:rPr>
+        <w:rFonts w:ascii="Wingdings" w:hAnsi="Wingdings" w:hint="default"/>
+        <w:sz w:val="20"/>
+      </w:rPr>
+    </w:lvl>
+    <w:lvl w:ilvl="6" w:tentative="1">
+      <w:start w:val="1"/>
+      <w:numFmt w:val="bullet"/>
+      <w:lvlText w:val=""/>
+      <w:lvlJc w:val="left"/>
+      <w:pPr>
+        <w:tabs>
+          <w:tab w:val="num" w:pos="5040"/>
+        </w:tabs>
+        <w:ind w:left="5040" w:hanging="360"/>
+      </w:pPr>
+      <w:rPr>
+        <w:rFonts w:ascii="Wingdings" w:hAnsi="Wingdings" w:hint="default"/>
+        <w:sz w:val="20"/>
+      </w:rPr>
+    </w:lvl>
+    <w:lvl w:ilvl="7" w:tentative="1">
+      <w:start w:val="1"/>
+      <w:numFmt w:val="bullet"/>
+      <w:lvlText w:val=""/>
+      <w:lvlJc w:val="left"/>
+      <w:pPr>
+        <w:tabs>
+          <w:tab w:val="num" w:pos="5760"/>
+        </w:tabs>
+        <w:ind w:left="5760" w:hanging="360"/>
+      </w:pPr>
+      <w:rPr>
+        <w:rFonts w:ascii="Wingdings" w:hAnsi="Wingdings" w:hint="default"/>
+        <w:sz w:val="20"/>
+      </w:rPr>
+    </w:lvl>
+    <w:lvl w:ilvl="8" w:tentative="1">
+      <w:start w:val="1"/>
+      <w:numFmt w:val="bullet"/>
+      <w:lvlText w:val=""/>
+      <w:lvlJc w:val="left"/>
+      <w:pPr>
+        <w:tabs>
+          <w:tab w:val="num" w:pos="6480"/>
+        </w:tabs>
+        <w:ind w:left="6480" w:hanging="360"/>
+      </w:pPr>
+      <w:rPr>
+        <w:rFonts w:ascii="Wingdings" w:hAnsi="Wingdings" w:hint="default"/>
+        <w:sz w:val="20"/>
+      </w:rPr>
+    </w:lvl>
+  </w:abstractNum>
+  <w:abstractNum w:abstractNumId="46" w15:restartNumberingAfterBreak="0">
     <w:nsid w:val="5A1F2437"/>
     <w:multiLevelType w:val="multilevel"/>
     <w:tmpl w:val="18CA3C0C"/>
@@ -17497,7 +19589,7 @@
       </w:pPr>
     </w:lvl>
   </w:abstractNum>
-  <w:abstractNum w:abstractNumId="42" w15:restartNumberingAfterBreak="0">
+  <w:abstractNum w:abstractNumId="47" w15:restartNumberingAfterBreak="0">
     <w:nsid w:val="5CDE7704"/>
     <w:multiLevelType w:val="multilevel"/>
     <w:tmpl w:val="5E9054A0"/>
@@ -17646,7 +19738,7 @@
       </w:rPr>
     </w:lvl>
   </w:abstractNum>
-  <w:abstractNum w:abstractNumId="43" w15:restartNumberingAfterBreak="0">
+  <w:abstractNum w:abstractNumId="48" w15:restartNumberingAfterBreak="0">
     <w:nsid w:val="5E442BAC"/>
     <w:multiLevelType w:val="multilevel"/>
     <w:tmpl w:val="21B45664"/>
@@ -17795,7 +19887,7 @@
       </w:rPr>
     </w:lvl>
   </w:abstractNum>
-  <w:abstractNum w:abstractNumId="44" w15:restartNumberingAfterBreak="0">
+  <w:abstractNum w:abstractNumId="49" w15:restartNumberingAfterBreak="0">
     <w:nsid w:val="5E6341BC"/>
     <w:multiLevelType w:val="multilevel"/>
     <w:tmpl w:val="FC52693A"/>
@@ -17944,7 +20036,7 @@
       </w:rPr>
     </w:lvl>
   </w:abstractNum>
-  <w:abstractNum w:abstractNumId="45" w15:restartNumberingAfterBreak="0">
+  <w:abstractNum w:abstractNumId="50" w15:restartNumberingAfterBreak="0">
     <w:nsid w:val="5EC97F19"/>
     <w:multiLevelType w:val="multilevel"/>
     <w:tmpl w:val="49FCB750"/>
@@ -18093,7 +20185,7 @@
       </w:rPr>
     </w:lvl>
   </w:abstractNum>
-  <w:abstractNum w:abstractNumId="46" w15:restartNumberingAfterBreak="0">
+  <w:abstractNum w:abstractNumId="51" w15:restartNumberingAfterBreak="0">
     <w:nsid w:val="5FB26915"/>
     <w:multiLevelType w:val="multilevel"/>
     <w:tmpl w:val="1DD4BD44"/>
@@ -18242,7 +20334,7 @@
       </w:rPr>
     </w:lvl>
   </w:abstractNum>
-  <w:abstractNum w:abstractNumId="47" w15:restartNumberingAfterBreak="0">
+  <w:abstractNum w:abstractNumId="52" w15:restartNumberingAfterBreak="0">
     <w:nsid w:val="605C6834"/>
     <w:multiLevelType w:val="multilevel"/>
     <w:tmpl w:val="A288BBDE"/>
@@ -18391,7 +20483,7 @@
       </w:rPr>
     </w:lvl>
   </w:abstractNum>
-  <w:abstractNum w:abstractNumId="48" w15:restartNumberingAfterBreak="0">
+  <w:abstractNum w:abstractNumId="53" w15:restartNumberingAfterBreak="0">
     <w:nsid w:val="638127B1"/>
     <w:multiLevelType w:val="multilevel"/>
     <w:tmpl w:val="E6A4D87E"/>
@@ -18540,7 +20632,7 @@
       </w:rPr>
     </w:lvl>
   </w:abstractNum>
-  <w:abstractNum w:abstractNumId="49" w15:restartNumberingAfterBreak="0">
+  <w:abstractNum w:abstractNumId="54" w15:restartNumberingAfterBreak="0">
     <w:nsid w:val="63FD2244"/>
     <w:multiLevelType w:val="multilevel"/>
     <w:tmpl w:val="7A78F2A4"/>
@@ -18689,7 +20781,7 @@
       </w:rPr>
     </w:lvl>
   </w:abstractNum>
-  <w:abstractNum w:abstractNumId="50" w15:restartNumberingAfterBreak="0">
+  <w:abstractNum w:abstractNumId="55" w15:restartNumberingAfterBreak="0">
     <w:nsid w:val="647661AA"/>
     <w:multiLevelType w:val="multilevel"/>
     <w:tmpl w:val="2530F62C"/>
@@ -18838,7 +20930,7 @@
       </w:rPr>
     </w:lvl>
   </w:abstractNum>
-  <w:abstractNum w:abstractNumId="51" w15:restartNumberingAfterBreak="0">
+  <w:abstractNum w:abstractNumId="56" w15:restartNumberingAfterBreak="0">
     <w:nsid w:val="64D34A4E"/>
     <w:multiLevelType w:val="multilevel"/>
     <w:tmpl w:val="BB4270B8"/>
@@ -18987,7 +21079,7 @@
       </w:rPr>
     </w:lvl>
   </w:abstractNum>
-  <w:abstractNum w:abstractNumId="52" w15:restartNumberingAfterBreak="0">
+  <w:abstractNum w:abstractNumId="57" w15:restartNumberingAfterBreak="0">
     <w:nsid w:val="660E6280"/>
     <w:multiLevelType w:val="multilevel"/>
     <w:tmpl w:val="19A42C26"/>
@@ -19136,7 +21228,7 @@
       </w:rPr>
     </w:lvl>
   </w:abstractNum>
-  <w:abstractNum w:abstractNumId="53" w15:restartNumberingAfterBreak="0">
+  <w:abstractNum w:abstractNumId="58" w15:restartNumberingAfterBreak="0">
     <w:nsid w:val="66D54201"/>
     <w:multiLevelType w:val="multilevel"/>
     <w:tmpl w:val="BCA6AD92"/>
@@ -19285,7 +21377,156 @@
       </w:rPr>
     </w:lvl>
   </w:abstractNum>
-  <w:abstractNum w:abstractNumId="54" w15:restartNumberingAfterBreak="0">
+  <w:abstractNum w:abstractNumId="59" w15:restartNumberingAfterBreak="0">
+    <w:nsid w:val="674D3DBC"/>
+    <w:multiLevelType w:val="multilevel"/>
+    <w:tmpl w:val="2CDA07AE"/>
+    <w:lvl w:ilvl="0">
+      <w:start w:val="1"/>
+      <w:numFmt w:val="bullet"/>
+      <w:lvlText w:val=""/>
+      <w:lvlJc w:val="left"/>
+      <w:pPr>
+        <w:tabs>
+          <w:tab w:val="num" w:pos="720"/>
+        </w:tabs>
+        <w:ind w:left="720" w:hanging="360"/>
+      </w:pPr>
+      <w:rPr>
+        <w:rFonts w:ascii="Symbol" w:hAnsi="Symbol" w:hint="default"/>
+        <w:sz w:val="20"/>
+      </w:rPr>
+    </w:lvl>
+    <w:lvl w:ilvl="1" w:tentative="1">
+      <w:start w:val="1"/>
+      <w:numFmt w:val="bullet"/>
+      <w:lvlText w:val="o"/>
+      <w:lvlJc w:val="left"/>
+      <w:pPr>
+        <w:tabs>
+          <w:tab w:val="num" w:pos="1440"/>
+        </w:tabs>
+        <w:ind w:left="1440" w:hanging="360"/>
+      </w:pPr>
+      <w:rPr>
+        <w:rFonts w:ascii="Courier New" w:hAnsi="Courier New" w:hint="default"/>
+        <w:sz w:val="20"/>
+      </w:rPr>
+    </w:lvl>
+    <w:lvl w:ilvl="2" w:tentative="1">
+      <w:start w:val="1"/>
+      <w:numFmt w:val="bullet"/>
+      <w:lvlText w:val=""/>
+      <w:lvlJc w:val="left"/>
+      <w:pPr>
+        <w:tabs>
+          <w:tab w:val="num" w:pos="2160"/>
+        </w:tabs>
+        <w:ind w:left="2160" w:hanging="360"/>
+      </w:pPr>
+      <w:rPr>
+        <w:rFonts w:ascii="Wingdings" w:hAnsi="Wingdings" w:hint="default"/>
+        <w:sz w:val="20"/>
+      </w:rPr>
+    </w:lvl>
+    <w:lvl w:ilvl="3" w:tentative="1">
+      <w:start w:val="1"/>
+      <w:numFmt w:val="bullet"/>
+      <w:lvlText w:val=""/>
+      <w:lvlJc w:val="left"/>
+      <w:pPr>
+        <w:tabs>
+          <w:tab w:val="num" w:pos="2880"/>
+        </w:tabs>
+        <w:ind w:left="2880" w:hanging="360"/>
+      </w:pPr>
+      <w:rPr>
+        <w:rFonts w:ascii="Wingdings" w:hAnsi="Wingdings" w:hint="default"/>
+        <w:sz w:val="20"/>
+      </w:rPr>
+    </w:lvl>
+    <w:lvl w:ilvl="4" w:tentative="1">
+      <w:start w:val="1"/>
+      <w:numFmt w:val="bullet"/>
+      <w:lvlText w:val=""/>
+      <w:lvlJc w:val="left"/>
+      <w:pPr>
+        <w:tabs>
+          <w:tab w:val="num" w:pos="3600"/>
+        </w:tabs>
+        <w:ind w:left="3600" w:hanging="360"/>
+      </w:pPr>
+      <w:rPr>
+        <w:rFonts w:ascii="Wingdings" w:hAnsi="Wingdings" w:hint="default"/>
+        <w:sz w:val="20"/>
+      </w:rPr>
+    </w:lvl>
+    <w:lvl w:ilvl="5" w:tentative="1">
+      <w:start w:val="1"/>
+      <w:numFmt w:val="bullet"/>
+      <w:lvlText w:val=""/>
+      <w:lvlJc w:val="left"/>
+      <w:pPr>
+        <w:tabs>
+          <w:tab w:val="num" w:pos="4320"/>
+        </w:tabs>
+        <w:ind w:left="4320" w:hanging="360"/>
+      </w:pPr>
+      <w:rPr>
+        <w:rFonts w:ascii="Wingdings" w:hAnsi="Wingdings" w:hint="default"/>
+        <w:sz w:val="20"/>
+      </w:rPr>
+    </w:lvl>
+    <w:lvl w:ilvl="6" w:tentative="1">
+      <w:start w:val="1"/>
+      <w:numFmt w:val="bullet"/>
+      <w:lvlText w:val=""/>
+      <w:lvlJc w:val="left"/>
+      <w:pPr>
+        <w:tabs>
+          <w:tab w:val="num" w:pos="5040"/>
+        </w:tabs>
+        <w:ind w:left="5040" w:hanging="360"/>
+      </w:pPr>
+      <w:rPr>
+        <w:rFonts w:ascii="Wingdings" w:hAnsi="Wingdings" w:hint="default"/>
+        <w:sz w:val="20"/>
+      </w:rPr>
+    </w:lvl>
+    <w:lvl w:ilvl="7" w:tentative="1">
+      <w:start w:val="1"/>
+      <w:numFmt w:val="bullet"/>
+      <w:lvlText w:val=""/>
+      <w:lvlJc w:val="left"/>
+      <w:pPr>
+        <w:tabs>
+          <w:tab w:val="num" w:pos="5760"/>
+        </w:tabs>
+        <w:ind w:left="5760" w:hanging="360"/>
+      </w:pPr>
+      <w:rPr>
+        <w:rFonts w:ascii="Wingdings" w:hAnsi="Wingdings" w:hint="default"/>
+        <w:sz w:val="20"/>
+      </w:rPr>
+    </w:lvl>
+    <w:lvl w:ilvl="8" w:tentative="1">
+      <w:start w:val="1"/>
+      <w:numFmt w:val="bullet"/>
+      <w:lvlText w:val=""/>
+      <w:lvlJc w:val="left"/>
+      <w:pPr>
+        <w:tabs>
+          <w:tab w:val="num" w:pos="6480"/>
+        </w:tabs>
+        <w:ind w:left="6480" w:hanging="360"/>
+      </w:pPr>
+      <w:rPr>
+        <w:rFonts w:ascii="Wingdings" w:hAnsi="Wingdings" w:hint="default"/>
+        <w:sz w:val="20"/>
+      </w:rPr>
+    </w:lvl>
+  </w:abstractNum>
+  <w:abstractNum w:abstractNumId="60" w15:restartNumberingAfterBreak="0">
     <w:nsid w:val="686F2F06"/>
     <w:multiLevelType w:val="multilevel"/>
     <w:tmpl w:val="543276EE"/>
@@ -19434,7 +21675,7 @@
       </w:rPr>
     </w:lvl>
   </w:abstractNum>
-  <w:abstractNum w:abstractNumId="55" w15:restartNumberingAfterBreak="0">
+  <w:abstractNum w:abstractNumId="61" w15:restartNumberingAfterBreak="0">
     <w:nsid w:val="6A0E646F"/>
     <w:multiLevelType w:val="multilevel"/>
     <w:tmpl w:val="98B25B0E"/>
@@ -19583,7 +21824,7 @@
       </w:rPr>
     </w:lvl>
   </w:abstractNum>
-  <w:abstractNum w:abstractNumId="56" w15:restartNumberingAfterBreak="0">
+  <w:abstractNum w:abstractNumId="62" w15:restartNumberingAfterBreak="0">
     <w:nsid w:val="6A3959CC"/>
     <w:multiLevelType w:val="multilevel"/>
     <w:tmpl w:val="592ED5C0"/>
@@ -19732,7 +21973,7 @@
       </w:rPr>
     </w:lvl>
   </w:abstractNum>
-  <w:abstractNum w:abstractNumId="57" w15:restartNumberingAfterBreak="0">
+  <w:abstractNum w:abstractNumId="63" w15:restartNumberingAfterBreak="0">
     <w:nsid w:val="6A731197"/>
     <w:multiLevelType w:val="multilevel"/>
     <w:tmpl w:val="FEC8F45A"/>
@@ -19881,7 +22122,7 @@
       </w:rPr>
     </w:lvl>
   </w:abstractNum>
-  <w:abstractNum w:abstractNumId="58" w15:restartNumberingAfterBreak="0">
+  <w:abstractNum w:abstractNumId="64" w15:restartNumberingAfterBreak="0">
     <w:nsid w:val="6B4B6A21"/>
     <w:multiLevelType w:val="multilevel"/>
     <w:tmpl w:val="92FE7EDE"/>
@@ -20030,7 +22271,7 @@
       </w:rPr>
     </w:lvl>
   </w:abstractNum>
-  <w:abstractNum w:abstractNumId="59" w15:restartNumberingAfterBreak="0">
+  <w:abstractNum w:abstractNumId="65" w15:restartNumberingAfterBreak="0">
     <w:nsid w:val="6BFA2976"/>
     <w:multiLevelType w:val="multilevel"/>
     <w:tmpl w:val="7F6A6AAE"/>
@@ -20179,7 +22420,7 @@
       </w:rPr>
     </w:lvl>
   </w:abstractNum>
-  <w:abstractNum w:abstractNumId="60" w15:restartNumberingAfterBreak="0">
+  <w:abstractNum w:abstractNumId="66" w15:restartNumberingAfterBreak="0">
     <w:nsid w:val="6C1C365F"/>
     <w:multiLevelType w:val="multilevel"/>
     <w:tmpl w:val="438810AA"/>
@@ -20328,7 +22569,7 @@
       </w:rPr>
     </w:lvl>
   </w:abstractNum>
-  <w:abstractNum w:abstractNumId="61" w15:restartNumberingAfterBreak="0">
+  <w:abstractNum w:abstractNumId="67" w15:restartNumberingAfterBreak="0">
     <w:nsid w:val="6C333C24"/>
     <w:multiLevelType w:val="multilevel"/>
     <w:tmpl w:val="E3AA6D26"/>
@@ -20477,7 +22718,7 @@
       </w:rPr>
     </w:lvl>
   </w:abstractNum>
-  <w:abstractNum w:abstractNumId="62" w15:restartNumberingAfterBreak="0">
+  <w:abstractNum w:abstractNumId="68" w15:restartNumberingAfterBreak="0">
     <w:nsid w:val="71E23B4A"/>
     <w:multiLevelType w:val="multilevel"/>
     <w:tmpl w:val="8DD0E2CC"/>
@@ -20626,7 +22867,7 @@
       </w:rPr>
     </w:lvl>
   </w:abstractNum>
-  <w:abstractNum w:abstractNumId="63" w15:restartNumberingAfterBreak="0">
+  <w:abstractNum w:abstractNumId="69" w15:restartNumberingAfterBreak="0">
     <w:nsid w:val="74F70406"/>
     <w:multiLevelType w:val="multilevel"/>
     <w:tmpl w:val="2402B338"/>
@@ -20775,7 +23016,7 @@
       </w:rPr>
     </w:lvl>
   </w:abstractNum>
-  <w:abstractNum w:abstractNumId="64" w15:restartNumberingAfterBreak="0">
+  <w:abstractNum w:abstractNumId="70" w15:restartNumberingAfterBreak="0">
     <w:nsid w:val="76AC05B5"/>
     <w:multiLevelType w:val="multilevel"/>
     <w:tmpl w:val="1CE849FC"/>
@@ -20924,7 +23165,7 @@
       </w:rPr>
     </w:lvl>
   </w:abstractNum>
-  <w:abstractNum w:abstractNumId="65" w15:restartNumberingAfterBreak="0">
+  <w:abstractNum w:abstractNumId="71" w15:restartNumberingAfterBreak="0">
     <w:nsid w:val="78A35D76"/>
     <w:multiLevelType w:val="multilevel"/>
     <w:tmpl w:val="846EFFA6"/>
@@ -21073,7 +23314,7 @@
       </w:rPr>
     </w:lvl>
   </w:abstractNum>
-  <w:abstractNum w:abstractNumId="66" w15:restartNumberingAfterBreak="0">
+  <w:abstractNum w:abstractNumId="72" w15:restartNumberingAfterBreak="0">
     <w:nsid w:val="796B5219"/>
     <w:multiLevelType w:val="multilevel"/>
     <w:tmpl w:val="941463EA"/>
@@ -21222,7 +23463,7 @@
       </w:rPr>
     </w:lvl>
   </w:abstractNum>
-  <w:abstractNum w:abstractNumId="67" w15:restartNumberingAfterBreak="0">
+  <w:abstractNum w:abstractNumId="73" w15:restartNumberingAfterBreak="0">
     <w:nsid w:val="7A501858"/>
     <w:multiLevelType w:val="multilevel"/>
     <w:tmpl w:val="3740F67E"/>
@@ -21371,7 +23612,7 @@
       </w:rPr>
     </w:lvl>
   </w:abstractNum>
-  <w:abstractNum w:abstractNumId="68" w15:restartNumberingAfterBreak="0">
+  <w:abstractNum w:abstractNumId="74" w15:restartNumberingAfterBreak="0">
     <w:nsid w:val="7A684783"/>
     <w:multiLevelType w:val="multilevel"/>
     <w:tmpl w:val="8270A7D8"/>
@@ -21520,7 +23761,7 @@
       </w:rPr>
     </w:lvl>
   </w:abstractNum>
-  <w:abstractNum w:abstractNumId="69" w15:restartNumberingAfterBreak="0">
+  <w:abstractNum w:abstractNumId="75" w15:restartNumberingAfterBreak="0">
     <w:nsid w:val="7EEF7B4F"/>
     <w:multiLevelType w:val="multilevel"/>
     <w:tmpl w:val="D1461E90"/>
@@ -21670,55 +23911,55 @@
     </w:lvl>
   </w:abstractNum>
   <w:num w:numId="1" w16cid:durableId="1601067662">
-    <w:abstractNumId w:val="64"/>
+    <w:abstractNumId w:val="70"/>
   </w:num>
   <w:num w:numId="2" w16cid:durableId="1842160260">
-    <w:abstractNumId w:val="21"/>
+    <w:abstractNumId w:val="24"/>
   </w:num>
   <w:num w:numId="3" w16cid:durableId="427888292">
-    <w:abstractNumId w:val="40"/>
+    <w:abstractNumId w:val="44"/>
   </w:num>
   <w:num w:numId="4" w16cid:durableId="1239897464">
-    <w:abstractNumId w:val="46"/>
+    <w:abstractNumId w:val="51"/>
   </w:num>
   <w:num w:numId="5" w16cid:durableId="1715275080">
     <w:abstractNumId w:val="9"/>
   </w:num>
   <w:num w:numId="6" w16cid:durableId="591793">
-    <w:abstractNumId w:val="32"/>
+    <w:abstractNumId w:val="35"/>
   </w:num>
   <w:num w:numId="7" w16cid:durableId="1668097145">
-    <w:abstractNumId w:val="26"/>
+    <w:abstractNumId w:val="29"/>
   </w:num>
   <w:num w:numId="8" w16cid:durableId="388305022">
+    <w:abstractNumId w:val="60"/>
+  </w:num>
+  <w:num w:numId="9" w16cid:durableId="507983134">
     <w:abstractNumId w:val="54"/>
   </w:num>
-  <w:num w:numId="9" w16cid:durableId="507983134">
-    <w:abstractNumId w:val="49"/>
-  </w:num>
   <w:num w:numId="10" w16cid:durableId="1812745135">
-    <w:abstractNumId w:val="67"/>
+    <w:abstractNumId w:val="73"/>
   </w:num>
   <w:num w:numId="11" w16cid:durableId="834338879">
-    <w:abstractNumId w:val="27"/>
+    <w:abstractNumId w:val="30"/>
   </w:num>
   <w:num w:numId="12" w16cid:durableId="2117942136">
-    <w:abstractNumId w:val="20"/>
+    <w:abstractNumId w:val="21"/>
   </w:num>
   <w:num w:numId="13" w16cid:durableId="1863933511">
-    <w:abstractNumId w:val="22"/>
+    <w:abstractNumId w:val="25"/>
   </w:num>
   <w:num w:numId="14" w16cid:durableId="540291627">
     <w:abstractNumId w:val="8"/>
   </w:num>
   <w:num w:numId="15" w16cid:durableId="1636523159">
-    <w:abstractNumId w:val="55"/>
+    <w:abstractNumId w:val="61"/>
   </w:num>
   <w:num w:numId="16" w16cid:durableId="1861624381">
-    <w:abstractNumId w:val="47"/>
+    <w:abstractNumId w:val="52"/>
   </w:num>
   <w:num w:numId="17" w16cid:durableId="1791515050">
-    <w:abstractNumId w:val="36"/>
+    <w:abstractNumId w:val="40"/>
   </w:num>
   <w:num w:numId="18" w16cid:durableId="1397700912">
     <w:abstractNumId w:val="5"/>
@@ -21727,43 +23968,43 @@
     <w:abstractNumId w:val="6"/>
   </w:num>
   <w:num w:numId="20" w16cid:durableId="1265844389">
+    <w:abstractNumId w:val="72"/>
+  </w:num>
+  <w:num w:numId="21" w16cid:durableId="603849961">
+    <w:abstractNumId w:val="42"/>
+  </w:num>
+  <w:num w:numId="22" w16cid:durableId="2146654949">
+    <w:abstractNumId w:val="75"/>
+  </w:num>
+  <w:num w:numId="23" w16cid:durableId="1096947934">
+    <w:abstractNumId w:val="37"/>
+  </w:num>
+  <w:num w:numId="24" w16cid:durableId="1818721275">
+    <w:abstractNumId w:val="15"/>
+  </w:num>
+  <w:num w:numId="25" w16cid:durableId="1656257368">
+    <w:abstractNumId w:val="18"/>
+  </w:num>
+  <w:num w:numId="26" w16cid:durableId="618337997">
+    <w:abstractNumId w:val="20"/>
+  </w:num>
+  <w:num w:numId="27" w16cid:durableId="1167746404">
+    <w:abstractNumId w:val="16"/>
+  </w:num>
+  <w:num w:numId="28" w16cid:durableId="1382366140">
     <w:abstractNumId w:val="66"/>
   </w:num>
-  <w:num w:numId="21" w16cid:durableId="603849961">
-    <w:abstractNumId w:val="38"/>
-  </w:num>
-  <w:num w:numId="22" w16cid:durableId="2146654949">
-    <w:abstractNumId w:val="69"/>
-  </w:num>
-  <w:num w:numId="23" w16cid:durableId="1096947934">
-    <w:abstractNumId w:val="34"/>
-  </w:num>
-  <w:num w:numId="24" w16cid:durableId="1818721275">
-    <w:abstractNumId w:val="14"/>
-  </w:num>
-  <w:num w:numId="25" w16cid:durableId="1656257368">
-    <w:abstractNumId w:val="17"/>
-  </w:num>
-  <w:num w:numId="26" w16cid:durableId="618337997">
-    <w:abstractNumId w:val="19"/>
-  </w:num>
-  <w:num w:numId="27" w16cid:durableId="1167746404">
-    <w:abstractNumId w:val="15"/>
-  </w:num>
-  <w:num w:numId="28" w16cid:durableId="1382366140">
-    <w:abstractNumId w:val="60"/>
-  </w:num>
   <w:num w:numId="29" w16cid:durableId="394744024">
-    <w:abstractNumId w:val="52"/>
+    <w:abstractNumId w:val="57"/>
   </w:num>
   <w:num w:numId="30" w16cid:durableId="639844085">
-    <w:abstractNumId w:val="16"/>
+    <w:abstractNumId w:val="17"/>
   </w:num>
   <w:num w:numId="31" w16cid:durableId="1792892985">
     <w:abstractNumId w:val="0"/>
   </w:num>
   <w:num w:numId="32" w16cid:durableId="247690888">
-    <w:abstractNumId w:val="24"/>
+    <w:abstractNumId w:val="27"/>
   </w:num>
   <w:num w:numId="33" w16cid:durableId="158690485">
     <w:abstractNumId w:val="4"/>
@@ -21772,112 +24013,130 @@
     <w:abstractNumId w:val="7"/>
   </w:num>
   <w:num w:numId="35" w16cid:durableId="1026447968">
-    <w:abstractNumId w:val="39"/>
+    <w:abstractNumId w:val="43"/>
   </w:num>
   <w:num w:numId="36" w16cid:durableId="895169701">
-    <w:abstractNumId w:val="58"/>
+    <w:abstractNumId w:val="64"/>
   </w:num>
   <w:num w:numId="37" w16cid:durableId="1054432657">
-    <w:abstractNumId w:val="50"/>
+    <w:abstractNumId w:val="55"/>
   </w:num>
   <w:num w:numId="38" w16cid:durableId="982197546">
-    <w:abstractNumId w:val="30"/>
+    <w:abstractNumId w:val="33"/>
   </w:num>
   <w:num w:numId="39" w16cid:durableId="224730662">
-    <w:abstractNumId w:val="48"/>
+    <w:abstractNumId w:val="53"/>
   </w:num>
   <w:num w:numId="40" w16cid:durableId="1386877970">
-    <w:abstractNumId w:val="61"/>
+    <w:abstractNumId w:val="67"/>
   </w:num>
   <w:num w:numId="41" w16cid:durableId="499856297">
-    <w:abstractNumId w:val="37"/>
+    <w:abstractNumId w:val="41"/>
   </w:num>
   <w:num w:numId="42" w16cid:durableId="348262419">
     <w:abstractNumId w:val="10"/>
   </w:num>
   <w:num w:numId="43" w16cid:durableId="1433235826">
-    <w:abstractNumId w:val="25"/>
+    <w:abstractNumId w:val="28"/>
   </w:num>
   <w:num w:numId="44" w16cid:durableId="1570723628">
-    <w:abstractNumId w:val="51"/>
+    <w:abstractNumId w:val="56"/>
   </w:num>
   <w:num w:numId="45" w16cid:durableId="186212376">
-    <w:abstractNumId w:val="59"/>
+    <w:abstractNumId w:val="65"/>
   </w:num>
   <w:num w:numId="46" w16cid:durableId="735325319">
-    <w:abstractNumId w:val="29"/>
+    <w:abstractNumId w:val="32"/>
   </w:num>
   <w:num w:numId="47" w16cid:durableId="1140532661">
-    <w:abstractNumId w:val="68"/>
+    <w:abstractNumId w:val="74"/>
   </w:num>
   <w:num w:numId="48" w16cid:durableId="190192697">
-    <w:abstractNumId w:val="42"/>
+    <w:abstractNumId w:val="47"/>
   </w:num>
   <w:num w:numId="49" w16cid:durableId="752816508">
-    <w:abstractNumId w:val="44"/>
+    <w:abstractNumId w:val="49"/>
   </w:num>
   <w:num w:numId="50" w16cid:durableId="383259824">
     <w:abstractNumId w:val="3"/>
   </w:num>
   <w:num w:numId="51" w16cid:durableId="479468768">
-    <w:abstractNumId w:val="53"/>
+    <w:abstractNumId w:val="58"/>
   </w:num>
   <w:num w:numId="52" w16cid:durableId="1928154536">
     <w:abstractNumId w:val="12"/>
   </w:num>
   <w:num w:numId="53" w16cid:durableId="1687440873">
-    <w:abstractNumId w:val="31"/>
+    <w:abstractNumId w:val="34"/>
   </w:num>
   <w:num w:numId="54" w16cid:durableId="219290444">
-    <w:abstractNumId w:val="45"/>
+    <w:abstractNumId w:val="50"/>
   </w:num>
   <w:num w:numId="55" w16cid:durableId="2072189939">
-    <w:abstractNumId w:val="41"/>
+    <w:abstractNumId w:val="46"/>
   </w:num>
   <w:num w:numId="56" w16cid:durableId="209876496">
-    <w:abstractNumId w:val="65"/>
+    <w:abstractNumId w:val="71"/>
   </w:num>
   <w:num w:numId="57" w16cid:durableId="1023751729">
-    <w:abstractNumId w:val="33"/>
+    <w:abstractNumId w:val="36"/>
   </w:num>
   <w:num w:numId="58" w16cid:durableId="358091959">
-    <w:abstractNumId w:val="28"/>
+    <w:abstractNumId w:val="31"/>
   </w:num>
   <w:num w:numId="59" w16cid:durableId="504828465">
     <w:abstractNumId w:val="2"/>
   </w:num>
   <w:num w:numId="60" w16cid:durableId="1396393029">
-    <w:abstractNumId w:val="57"/>
+    <w:abstractNumId w:val="63"/>
   </w:num>
   <w:num w:numId="61" w16cid:durableId="1466198500">
-    <w:abstractNumId w:val="43"/>
+    <w:abstractNumId w:val="48"/>
   </w:num>
   <w:num w:numId="62" w16cid:durableId="1380472791">
     <w:abstractNumId w:val="11"/>
   </w:num>
   <w:num w:numId="63" w16cid:durableId="1017734211">
-    <w:abstractNumId w:val="18"/>
+    <w:abstractNumId w:val="19"/>
   </w:num>
   <w:num w:numId="64" w16cid:durableId="297688022">
-    <w:abstractNumId w:val="23"/>
+    <w:abstractNumId w:val="26"/>
   </w:num>
   <w:num w:numId="65" w16cid:durableId="933979171">
-    <w:abstractNumId w:val="62"/>
+    <w:abstractNumId w:val="68"/>
   </w:num>
   <w:num w:numId="66" w16cid:durableId="183402321">
     <w:abstractNumId w:val="1"/>
   </w:num>
   <w:num w:numId="67" w16cid:durableId="1174413203">
+    <w:abstractNumId w:val="14"/>
+  </w:num>
+  <w:num w:numId="68" w16cid:durableId="1864393723">
+    <w:abstractNumId w:val="69"/>
+  </w:num>
+  <w:num w:numId="69" w16cid:durableId="1620987036">
+    <w:abstractNumId w:val="62"/>
+  </w:num>
+  <w:num w:numId="70" w16cid:durableId="1558010844">
+    <w:abstractNumId w:val="39"/>
+  </w:num>
+  <w:num w:numId="71" w16cid:durableId="1421683068">
     <w:abstractNumId w:val="13"/>
   </w:num>
-  <w:num w:numId="68" w16cid:durableId="1864393723">
-    <w:abstractNumId w:val="63"/>
+  <w:num w:numId="72" w16cid:durableId="2045327131">
+    <w:abstractNumId w:val="23"/>
   </w:num>
-  <w:num w:numId="69" w16cid:durableId="1620987036">
-    <w:abstractNumId w:val="56"/>
+  <w:num w:numId="73" w16cid:durableId="1331522367">
+    <w:abstractNumId w:val="45"/>
   </w:num>
-  <w:num w:numId="70" w16cid:durableId="1558010844">
-    <w:abstractNumId w:val="35"/>
+  <w:num w:numId="74" w16cid:durableId="1190491682">
+    <w:abstractNumId w:val="22"/>
+  </w:num>
+  <w:num w:numId="75" w16cid:durableId="730814975">
+    <w:abstractNumId w:val="38"/>
+  </w:num>
+  <w:num w:numId="76" w16cid:durableId="2123375167">
+    <w:abstractNumId w:val="59"/>
   </w:num>
 </w:numbering>
 </file>
@@ -22346,6 +24605,29 @@
       <w14:ligatures w14:val="none"/>
     </w:rPr>
   </w:style>
+  <w:style w:type="paragraph" w:styleId="Heading4">
+    <w:name w:val="heading 4"/>
+    <w:basedOn w:val="Normal"/>
+    <w:next w:val="Normal"/>
+    <w:link w:val="Heading4Char"/>
+    <w:uiPriority w:val="9"/>
+    <w:semiHidden/>
+    <w:unhideWhenUsed/>
+    <w:qFormat/>
+    <w:rsid w:val="00851F9F"/>
+    <w:pPr>
+      <w:keepNext/>
+      <w:keepLines/>
+      <w:spacing w:before="40" w:after="0"/>
+      <w:outlineLvl w:val="3"/>
+    </w:pPr>
+    <w:rPr>
+      <w:rFonts w:asciiTheme="majorHAnsi" w:eastAsiaTheme="majorEastAsia" w:hAnsiTheme="majorHAnsi" w:cstheme="majorBidi"/>
+      <w:i/>
+      <w:iCs/>
+      <w:color w:val="2F5496" w:themeColor="accent1" w:themeShade="BF"/>
+    </w:rPr>
+  </w:style>
   <w:style w:type="character" w:default="1" w:styleId="DefaultParagraphFont">
     <w:name w:val="Default Paragraph Font"/>
     <w:uiPriority w:val="1"/>
@@ -22521,6 +24803,20 @@
     <w:rPr>
       <w:i/>
       <w:iCs/>
+    </w:rPr>
+  </w:style>
+  <w:style w:type="character" w:customStyle="1" w:styleId="Heading4Char">
+    <w:name w:val="Heading 4 Char"/>
+    <w:basedOn w:val="DefaultParagraphFont"/>
+    <w:link w:val="Heading4"/>
+    <w:uiPriority w:val="9"/>
+    <w:semiHidden/>
+    <w:rsid w:val="00851F9F"/>
+    <w:rPr>
+      <w:rFonts w:asciiTheme="majorHAnsi" w:eastAsiaTheme="majorEastAsia" w:hAnsiTheme="majorHAnsi" w:cstheme="majorBidi"/>
+      <w:i/>
+      <w:iCs/>
+      <w:color w:val="2F5496" w:themeColor="accent1" w:themeShade="BF"/>
     </w:rPr>
   </w:style>
 </w:styles>

</xml_diff>

<commit_message>
auto: sync changes at 2026-05-05 19:21:06
</commit_message>
<xml_diff>
--- a/Progress Report.docx
+++ b/Progress Report.docx
@@ -22241,6 +22241,2001 @@
         </w:rPr>
       </w:pPr>
     </w:p>
+    <w:p>
+      <w:pPr>
+        <w:tabs>
+          <w:tab w:val="left" w:pos="3975"/>
+        </w:tabs>
+        <w:rPr>
+          <w:sz w:val="52"/>
+          <w:szCs w:val="52"/>
+        </w:rPr>
+      </w:pPr>
+    </w:p>
+    <w:p>
+      <w:pPr>
+        <w:tabs>
+          <w:tab w:val="left" w:pos="3975"/>
+        </w:tabs>
+        <w:rPr>
+          <w:sz w:val="52"/>
+          <w:szCs w:val="52"/>
+        </w:rPr>
+      </w:pPr>
+      <w:r>
+        <w:rPr>
+          <w:sz w:val="52"/>
+          <w:szCs w:val="52"/>
+        </w:rPr>
+        <w:lastRenderedPageBreak/>
+        <w:t>Date- 05-05-2025</w:t>
+      </w:r>
+    </w:p>
+    <w:p>
+      <w:pPr>
+        <w:spacing w:before="100" w:beforeAutospacing="1" w:after="100" w:afterAutospacing="1" w:line="240" w:lineRule="auto"/>
+        <w:rPr>
+          <w:rFonts w:ascii="Times New Roman" w:eastAsia="Times New Roman" w:hAnsi="Times New Roman" w:cs="Times New Roman"/>
+          <w:kern w:val="0"/>
+          <w:sz w:val="24"/>
+          <w:szCs w:val="24"/>
+          <w14:ligatures w14:val="none"/>
+        </w:rPr>
+      </w:pPr>
+      <w:r>
+        <w:rPr>
+          <w:rFonts w:ascii="Segoe UI Emoji" w:eastAsia="Times New Roman" w:hAnsi="Segoe UI Emoji" w:cs="Segoe UI Emoji"/>
+          <w:kern w:val="0"/>
+          <w:sz w:val="24"/>
+          <w:szCs w:val="24"/>
+          <w14:ligatures w14:val="none"/>
+        </w:rPr>
+        <w:t>📊</w:t>
+      </w:r>
+      <w:r>
+        <w:rPr>
+          <w:rFonts w:ascii="Times New Roman" w:eastAsia="Times New Roman" w:hAnsi="Times New Roman" w:cs="Times New Roman"/>
+          <w:kern w:val="0"/>
+          <w:sz w:val="24"/>
+          <w:szCs w:val="24"/>
+          <w14:ligatures w14:val="none"/>
+        </w:rPr>
+        <w:t xml:space="preserve"> </w:t>
+      </w:r>
+      <w:r>
+        <w:rPr>
+          <w:rFonts w:ascii="Times New Roman" w:eastAsia="Times New Roman" w:hAnsi="Times New Roman" w:cs="Times New Roman"/>
+          <w:b/>
+          <w:bCs/>
+          <w:kern w:val="0"/>
+          <w:sz w:val="24"/>
+          <w:szCs w:val="24"/>
+          <w14:ligatures w14:val="none"/>
+        </w:rPr>
+        <w:t>Formal Progress Report — Session Summary</w:t>
+      </w:r>
+      <w:r>
+        <w:rPr>
+          <w:rFonts w:ascii="Times New Roman" w:eastAsia="Times New Roman" w:hAnsi="Times New Roman" w:cs="Times New Roman"/>
+          <w:kern w:val="0"/>
+          <w:sz w:val="24"/>
+          <w:szCs w:val="24"/>
+          <w14:ligatures w14:val="none"/>
+        </w:rPr>
+        <w:t xml:space="preserve"> </w:t>
+      </w:r>
+      <w:r>
+        <w:rPr>
+          <w:rFonts w:ascii="Times New Roman" w:eastAsia="Times New Roman" w:hAnsi="Times New Roman" w:cs="Times New Roman"/>
+          <w:kern w:val="0"/>
+          <w:sz w:val="24"/>
+          <w:szCs w:val="24"/>
+          <w14:ligatures w14:val="none"/>
+        </w:rPr>
+        <w:br/>
+      </w:r>
+      <w:r>
+        <w:rPr>
+          <w:rFonts w:ascii="Segoe UI Emoji" w:eastAsia="Times New Roman" w:hAnsi="Segoe UI Emoji" w:cs="Segoe UI Emoji"/>
+          <w:kern w:val="0"/>
+          <w:sz w:val="24"/>
+          <w:szCs w:val="24"/>
+          <w14:ligatures w14:val="none"/>
+        </w:rPr>
+        <w:t>📅</w:t>
+      </w:r>
+      <w:r>
+        <w:rPr>
+          <w:rFonts w:ascii="Times New Roman" w:eastAsia="Times New Roman" w:hAnsi="Times New Roman" w:cs="Times New Roman"/>
+          <w:kern w:val="0"/>
+          <w:sz w:val="24"/>
+          <w:szCs w:val="24"/>
+          <w14:ligatures w14:val="none"/>
+        </w:rPr>
+        <w:t xml:space="preserve"> Date: 05</w:t>
+      </w:r>
+      <w:r>
+        <w:rPr>
+          <w:rFonts w:ascii="Times New Roman" w:eastAsia="Times New Roman" w:hAnsi="Times New Roman" w:cs="Times New Roman"/>
+          <w:kern w:val="0"/>
+          <w:sz w:val="24"/>
+          <w:szCs w:val="24"/>
+          <w14:ligatures w14:val="none"/>
+        </w:rPr>
+        <w:noBreakHyphen/>
+        <w:t>05</w:t>
+      </w:r>
+      <w:r>
+        <w:rPr>
+          <w:rFonts w:ascii="Times New Roman" w:eastAsia="Times New Roman" w:hAnsi="Times New Roman" w:cs="Times New Roman"/>
+          <w:kern w:val="0"/>
+          <w:sz w:val="24"/>
+          <w:szCs w:val="24"/>
+          <w14:ligatures w14:val="none"/>
+        </w:rPr>
+        <w:noBreakHyphen/>
+        <w:t>2026</w:t>
+      </w:r>
+    </w:p>
+    <w:p>
+      <w:pPr>
+        <w:spacing w:after="0" w:line="240" w:lineRule="auto"/>
+        <w:rPr>
+          <w:rFonts w:ascii="Times New Roman" w:eastAsia="Times New Roman" w:hAnsi="Times New Roman" w:cs="Times New Roman"/>
+          <w:kern w:val="0"/>
+          <w:sz w:val="24"/>
+          <w:szCs w:val="24"/>
+          <w14:ligatures w14:val="none"/>
+        </w:rPr>
+      </w:pPr>
+      <w:r>
+        <w:rPr>
+          <w:rFonts w:ascii="Times New Roman" w:eastAsia="Times New Roman" w:hAnsi="Times New Roman" w:cs="Times New Roman"/>
+          <w:kern w:val="0"/>
+          <w:sz w:val="24"/>
+          <w:szCs w:val="24"/>
+          <w14:ligatures w14:val="none"/>
+        </w:rPr>
+        <w:pict w14:anchorId="24545E96">
+          <v:rect id="_x0000_i1120" style="width:0;height:1.5pt" o:hralign="center" o:hrstd="t" o:hr="t" fillcolor="#a0a0a0" stroked="f"/>
+        </w:pict>
+      </w:r>
+    </w:p>
+    <w:p>
+      <w:pPr>
+        <w:spacing w:before="100" w:beforeAutospacing="1" w:after="100" w:afterAutospacing="1" w:line="240" w:lineRule="auto"/>
+        <w:outlineLvl w:val="2"/>
+        <w:rPr>
+          <w:rFonts w:ascii="Times New Roman" w:eastAsia="Times New Roman" w:hAnsi="Times New Roman" w:cs="Times New Roman"/>
+          <w:b/>
+          <w:bCs/>
+          <w:kern w:val="0"/>
+          <w:sz w:val="27"/>
+          <w:szCs w:val="27"/>
+          <w14:ligatures w14:val="none"/>
+        </w:rPr>
+      </w:pPr>
+      <w:r>
+        <w:rPr>
+          <w:rFonts w:ascii="Segoe UI Emoji" w:eastAsia="Times New Roman" w:hAnsi="Segoe UI Emoji" w:cs="Segoe UI Emoji"/>
+          <w:b/>
+          <w:bCs/>
+          <w:kern w:val="0"/>
+          <w:sz w:val="27"/>
+          <w:szCs w:val="27"/>
+          <w14:ligatures w14:val="none"/>
+        </w:rPr>
+        <w:t>🧭</w:t>
+      </w:r>
+      <w:r>
+        <w:rPr>
+          <w:rFonts w:ascii="Times New Roman" w:eastAsia="Times New Roman" w:hAnsi="Times New Roman" w:cs="Times New Roman"/>
+          <w:b/>
+          <w:bCs/>
+          <w:kern w:val="0"/>
+          <w:sz w:val="27"/>
+          <w:szCs w:val="27"/>
+          <w14:ligatures w14:val="none"/>
+        </w:rPr>
+        <w:t xml:space="preserve"> Objective</w:t>
+      </w:r>
+    </w:p>
+    <w:p>
+      <w:pPr>
+        <w:spacing w:before="100" w:beforeAutospacing="1" w:after="100" w:afterAutospacing="1" w:line="240" w:lineRule="auto"/>
+        <w:rPr>
+          <w:rFonts w:ascii="Times New Roman" w:eastAsia="Times New Roman" w:hAnsi="Times New Roman" w:cs="Times New Roman"/>
+          <w:kern w:val="0"/>
+          <w:sz w:val="24"/>
+          <w:szCs w:val="24"/>
+          <w14:ligatures w14:val="none"/>
+        </w:rPr>
+      </w:pPr>
+      <w:r>
+        <w:rPr>
+          <w:rFonts w:ascii="Times New Roman" w:eastAsia="Times New Roman" w:hAnsi="Times New Roman" w:cs="Times New Roman"/>
+          <w:kern w:val="0"/>
+          <w:sz w:val="24"/>
+          <w:szCs w:val="24"/>
+          <w14:ligatures w14:val="none"/>
+        </w:rPr>
+        <w:t>To design a proof</w:t>
+      </w:r>
+      <w:r>
+        <w:rPr>
+          <w:rFonts w:ascii="Times New Roman" w:eastAsia="Times New Roman" w:hAnsi="Times New Roman" w:cs="Times New Roman"/>
+          <w:kern w:val="0"/>
+          <w:sz w:val="24"/>
+          <w:szCs w:val="24"/>
+          <w14:ligatures w14:val="none"/>
+        </w:rPr>
+        <w:noBreakHyphen/>
+        <w:t>of</w:t>
+      </w:r>
+      <w:r>
+        <w:rPr>
+          <w:rFonts w:ascii="Times New Roman" w:eastAsia="Times New Roman" w:hAnsi="Times New Roman" w:cs="Times New Roman"/>
+          <w:kern w:val="0"/>
+          <w:sz w:val="24"/>
+          <w:szCs w:val="24"/>
+          <w14:ligatures w14:val="none"/>
+        </w:rPr>
+        <w:noBreakHyphen/>
+        <w:t>concept workflow enabling the AI model inside the Electron app to access, propose, and apply file edits within a Docker sandbox, replicating GitHub Copilot</w:t>
+      </w:r>
+      <w:r>
+        <w:rPr>
+          <w:rFonts w:ascii="Times New Roman" w:eastAsia="Times New Roman" w:hAnsi="Times New Roman" w:cs="Times New Roman"/>
+          <w:kern w:val="0"/>
+          <w:sz w:val="24"/>
+          <w:szCs w:val="24"/>
+          <w14:ligatures w14:val="none"/>
+        </w:rPr>
+        <w:noBreakHyphen/>
+        <w:t>style behavior while maintaining safety and validation controls.</w:t>
+      </w:r>
+    </w:p>
+    <w:p>
+      <w:pPr>
+        <w:spacing w:after="0" w:line="240" w:lineRule="auto"/>
+        <w:rPr>
+          <w:rFonts w:ascii="Times New Roman" w:eastAsia="Times New Roman" w:hAnsi="Times New Roman" w:cs="Times New Roman"/>
+          <w:kern w:val="0"/>
+          <w:sz w:val="24"/>
+          <w:szCs w:val="24"/>
+          <w14:ligatures w14:val="none"/>
+        </w:rPr>
+      </w:pPr>
+      <w:r>
+        <w:rPr>
+          <w:rFonts w:ascii="Times New Roman" w:eastAsia="Times New Roman" w:hAnsi="Times New Roman" w:cs="Times New Roman"/>
+          <w:kern w:val="0"/>
+          <w:sz w:val="24"/>
+          <w:szCs w:val="24"/>
+          <w14:ligatures w14:val="none"/>
+        </w:rPr>
+        <w:pict w14:anchorId="53BD57DD">
+          <v:rect id="_x0000_i1121" style="width:0;height:1.5pt" o:hralign="center" o:hrstd="t" o:hr="t" fillcolor="#a0a0a0" stroked="f"/>
+        </w:pict>
+      </w:r>
+    </w:p>
+    <w:p>
+      <w:pPr>
+        <w:spacing w:before="100" w:beforeAutospacing="1" w:after="100" w:afterAutospacing="1" w:line="240" w:lineRule="auto"/>
+        <w:outlineLvl w:val="2"/>
+        <w:rPr>
+          <w:rFonts w:ascii="Times New Roman" w:eastAsia="Times New Roman" w:hAnsi="Times New Roman" w:cs="Times New Roman"/>
+          <w:b/>
+          <w:bCs/>
+          <w:kern w:val="0"/>
+          <w:sz w:val="27"/>
+          <w:szCs w:val="27"/>
+          <w14:ligatures w14:val="none"/>
+        </w:rPr>
+      </w:pPr>
+      <w:r>
+        <w:rPr>
+          <w:rFonts w:ascii="Segoe UI Emoji" w:eastAsia="Times New Roman" w:hAnsi="Segoe UI Emoji" w:cs="Segoe UI Emoji"/>
+          <w:b/>
+          <w:bCs/>
+          <w:kern w:val="0"/>
+          <w:sz w:val="27"/>
+          <w:szCs w:val="27"/>
+          <w14:ligatures w14:val="none"/>
+        </w:rPr>
+        <w:t>🔧</w:t>
+      </w:r>
+      <w:r>
+        <w:rPr>
+          <w:rFonts w:ascii="Times New Roman" w:eastAsia="Times New Roman" w:hAnsi="Times New Roman" w:cs="Times New Roman"/>
+          <w:b/>
+          <w:bCs/>
+          <w:kern w:val="0"/>
+          <w:sz w:val="27"/>
+          <w:szCs w:val="27"/>
+          <w14:ligatures w14:val="none"/>
+        </w:rPr>
+        <w:t xml:space="preserve"> Key Decisions &amp; Updates</w:t>
+      </w:r>
+    </w:p>
+    <w:p>
+      <w:pPr>
+        <w:numPr>
+          <w:ilvl w:val="0"/>
+          <w:numId w:val="112"/>
+        </w:numPr>
+        <w:spacing w:before="100" w:beforeAutospacing="1" w:after="100" w:afterAutospacing="1" w:line="240" w:lineRule="auto"/>
+        <w:rPr>
+          <w:rFonts w:ascii="Times New Roman" w:eastAsia="Times New Roman" w:hAnsi="Times New Roman" w:cs="Times New Roman"/>
+          <w:kern w:val="0"/>
+          <w:sz w:val="24"/>
+          <w:szCs w:val="24"/>
+          <w14:ligatures w14:val="none"/>
+        </w:rPr>
+      </w:pPr>
+      <w:r>
+        <w:rPr>
+          <w:rFonts w:ascii="Times New Roman" w:eastAsia="Times New Roman" w:hAnsi="Times New Roman" w:cs="Times New Roman"/>
+          <w:b/>
+          <w:bCs/>
+          <w:kern w:val="0"/>
+          <w:sz w:val="24"/>
+          <w:szCs w:val="24"/>
+          <w14:ligatures w14:val="none"/>
+        </w:rPr>
+        <w:t>Sandbox Location</w:t>
+      </w:r>
+    </w:p>
+    <w:p>
+      <w:pPr>
+        <w:numPr>
+          <w:ilvl w:val="1"/>
+          <w:numId w:val="112"/>
+        </w:numPr>
+        <w:spacing w:before="100" w:beforeAutospacing="1" w:after="100" w:afterAutospacing="1" w:line="240" w:lineRule="auto"/>
+        <w:rPr>
+          <w:rFonts w:ascii="Times New Roman" w:eastAsia="Times New Roman" w:hAnsi="Times New Roman" w:cs="Times New Roman"/>
+          <w:kern w:val="0"/>
+          <w:sz w:val="24"/>
+          <w:szCs w:val="24"/>
+          <w14:ligatures w14:val="none"/>
+        </w:rPr>
+      </w:pPr>
+      <w:r>
+        <w:rPr>
+          <w:rFonts w:ascii="Times New Roman" w:eastAsia="Times New Roman" w:hAnsi="Times New Roman" w:cs="Times New Roman"/>
+          <w:kern w:val="0"/>
+          <w:sz w:val="24"/>
+          <w:szCs w:val="24"/>
+          <w14:ligatures w14:val="none"/>
+        </w:rPr>
+        <w:t xml:space="preserve">Established </w:t>
+      </w:r>
+      <w:r>
+        <w:rPr>
+          <w:rFonts w:ascii="Courier New" w:eastAsia="Times New Roman" w:hAnsi="Courier New" w:cs="Courier New"/>
+          <w:kern w:val="0"/>
+          <w:sz w:val="20"/>
+          <w:szCs w:val="20"/>
+          <w14:ligatures w14:val="none"/>
+        </w:rPr>
+        <w:t>D:\AI_LAB\Test\Docker-Testing\</w:t>
+      </w:r>
+      <w:r>
+        <w:rPr>
+          <w:rFonts w:ascii="Times New Roman" w:eastAsia="Times New Roman" w:hAnsi="Times New Roman" w:cs="Times New Roman"/>
+          <w:kern w:val="0"/>
+          <w:sz w:val="24"/>
+          <w:szCs w:val="24"/>
+          <w14:ligatures w14:val="none"/>
+        </w:rPr>
+        <w:t xml:space="preserve"> as the controlled environment for experimentation.</w:t>
+      </w:r>
+    </w:p>
+    <w:p>
+      <w:pPr>
+        <w:numPr>
+          <w:ilvl w:val="1"/>
+          <w:numId w:val="112"/>
+        </w:numPr>
+        <w:spacing w:before="100" w:beforeAutospacing="1" w:after="100" w:afterAutospacing="1" w:line="240" w:lineRule="auto"/>
+        <w:rPr>
+          <w:rFonts w:ascii="Times New Roman" w:eastAsia="Times New Roman" w:hAnsi="Times New Roman" w:cs="Times New Roman"/>
+          <w:kern w:val="0"/>
+          <w:sz w:val="24"/>
+          <w:szCs w:val="24"/>
+          <w14:ligatures w14:val="none"/>
+        </w:rPr>
+      </w:pPr>
+      <w:r>
+        <w:rPr>
+          <w:rFonts w:ascii="Times New Roman" w:eastAsia="Times New Roman" w:hAnsi="Times New Roman" w:cs="Times New Roman"/>
+          <w:kern w:val="0"/>
+          <w:sz w:val="24"/>
+          <w:szCs w:val="24"/>
+          <w14:ligatures w14:val="none"/>
+        </w:rPr>
+        <w:t>Sample/template scripts (Python, Java, Ruby, Go, etc.) will be placed here for AI editing trials.</w:t>
+      </w:r>
+    </w:p>
+    <w:p>
+      <w:pPr>
+        <w:numPr>
+          <w:ilvl w:val="0"/>
+          <w:numId w:val="112"/>
+        </w:numPr>
+        <w:spacing w:before="100" w:beforeAutospacing="1" w:after="100" w:afterAutospacing="1" w:line="240" w:lineRule="auto"/>
+        <w:rPr>
+          <w:rFonts w:ascii="Times New Roman" w:eastAsia="Times New Roman" w:hAnsi="Times New Roman" w:cs="Times New Roman"/>
+          <w:kern w:val="0"/>
+          <w:sz w:val="24"/>
+          <w:szCs w:val="24"/>
+          <w14:ligatures w14:val="none"/>
+        </w:rPr>
+      </w:pPr>
+      <w:r>
+        <w:rPr>
+          <w:rFonts w:ascii="Times New Roman" w:eastAsia="Times New Roman" w:hAnsi="Times New Roman" w:cs="Times New Roman"/>
+          <w:b/>
+          <w:bCs/>
+          <w:kern w:val="0"/>
+          <w:sz w:val="24"/>
+          <w:szCs w:val="24"/>
+          <w14:ligatures w14:val="none"/>
+        </w:rPr>
+        <w:t>File Access Layer</w:t>
+      </w:r>
+    </w:p>
+    <w:p>
+      <w:pPr>
+        <w:numPr>
+          <w:ilvl w:val="1"/>
+          <w:numId w:val="112"/>
+        </w:numPr>
+        <w:spacing w:before="100" w:beforeAutospacing="1" w:after="100" w:afterAutospacing="1" w:line="240" w:lineRule="auto"/>
+        <w:rPr>
+          <w:rFonts w:ascii="Times New Roman" w:eastAsia="Times New Roman" w:hAnsi="Times New Roman" w:cs="Times New Roman"/>
+          <w:kern w:val="0"/>
+          <w:sz w:val="24"/>
+          <w:szCs w:val="24"/>
+          <w14:ligatures w14:val="none"/>
+        </w:rPr>
+      </w:pPr>
+      <w:r>
+        <w:rPr>
+          <w:rFonts w:ascii="Times New Roman" w:eastAsia="Times New Roman" w:hAnsi="Times New Roman" w:cs="Times New Roman"/>
+          <w:kern w:val="0"/>
+          <w:sz w:val="24"/>
+          <w:szCs w:val="24"/>
+          <w14:ligatures w14:val="none"/>
+        </w:rPr>
+        <w:t xml:space="preserve">Decided to create a new module </w:t>
+      </w:r>
+      <w:r>
+        <w:rPr>
+          <w:rFonts w:ascii="Courier New" w:eastAsia="Times New Roman" w:hAnsi="Courier New" w:cs="Courier New"/>
+          <w:kern w:val="0"/>
+          <w:sz w:val="20"/>
+          <w:szCs w:val="20"/>
+          <w14:ligatures w14:val="none"/>
+        </w:rPr>
+        <w:t>Bone_Code/js/file_access.js</w:t>
+      </w:r>
+      <w:r>
+        <w:rPr>
+          <w:rFonts w:ascii="Times New Roman" w:eastAsia="Times New Roman" w:hAnsi="Times New Roman" w:cs="Times New Roman"/>
+          <w:kern w:val="0"/>
+          <w:sz w:val="24"/>
+          <w:szCs w:val="24"/>
+          <w14:ligatures w14:val="none"/>
+        </w:rPr>
+        <w:t xml:space="preserve"> for handling file context exchange.</w:t>
+      </w:r>
+    </w:p>
+    <w:p>
+      <w:pPr>
+        <w:numPr>
+          <w:ilvl w:val="1"/>
+          <w:numId w:val="112"/>
+        </w:numPr>
+        <w:spacing w:before="100" w:beforeAutospacing="1" w:after="100" w:afterAutospacing="1" w:line="240" w:lineRule="auto"/>
+        <w:rPr>
+          <w:rFonts w:ascii="Times New Roman" w:eastAsia="Times New Roman" w:hAnsi="Times New Roman" w:cs="Times New Roman"/>
+          <w:kern w:val="0"/>
+          <w:sz w:val="24"/>
+          <w:szCs w:val="24"/>
+          <w14:ligatures w14:val="none"/>
+        </w:rPr>
+      </w:pPr>
+      <w:r>
+        <w:rPr>
+          <w:rFonts w:ascii="Times New Roman" w:eastAsia="Times New Roman" w:hAnsi="Times New Roman" w:cs="Times New Roman"/>
+          <w:kern w:val="0"/>
+          <w:sz w:val="24"/>
+          <w:szCs w:val="24"/>
+          <w14:ligatures w14:val="none"/>
+        </w:rPr>
+        <w:t>This module will send file tree and contents to the AI model and receive proposed edits back.</w:t>
+      </w:r>
+    </w:p>
+    <w:p>
+      <w:pPr>
+        <w:numPr>
+          <w:ilvl w:val="0"/>
+          <w:numId w:val="112"/>
+        </w:numPr>
+        <w:spacing w:before="100" w:beforeAutospacing="1" w:after="100" w:afterAutospacing="1" w:line="240" w:lineRule="auto"/>
+        <w:rPr>
+          <w:rFonts w:ascii="Times New Roman" w:eastAsia="Times New Roman" w:hAnsi="Times New Roman" w:cs="Times New Roman"/>
+          <w:kern w:val="0"/>
+          <w:sz w:val="24"/>
+          <w:szCs w:val="24"/>
+          <w14:ligatures w14:val="none"/>
+        </w:rPr>
+      </w:pPr>
+      <w:r>
+        <w:rPr>
+          <w:rFonts w:ascii="Times New Roman" w:eastAsia="Times New Roman" w:hAnsi="Times New Roman" w:cs="Times New Roman"/>
+          <w:b/>
+          <w:bCs/>
+          <w:kern w:val="0"/>
+          <w:sz w:val="24"/>
+          <w:szCs w:val="24"/>
+          <w14:ligatures w14:val="none"/>
+        </w:rPr>
+        <w:t>Docker Automation</w:t>
+      </w:r>
+    </w:p>
+    <w:p>
+      <w:pPr>
+        <w:numPr>
+          <w:ilvl w:val="1"/>
+          <w:numId w:val="112"/>
+        </w:numPr>
+        <w:spacing w:before="100" w:beforeAutospacing="1" w:after="100" w:afterAutospacing="1" w:line="240" w:lineRule="auto"/>
+        <w:rPr>
+          <w:rFonts w:ascii="Times New Roman" w:eastAsia="Times New Roman" w:hAnsi="Times New Roman" w:cs="Times New Roman"/>
+          <w:kern w:val="0"/>
+          <w:sz w:val="24"/>
+          <w:szCs w:val="24"/>
+          <w14:ligatures w14:val="none"/>
+        </w:rPr>
+      </w:pPr>
+      <w:r>
+        <w:rPr>
+          <w:rFonts w:ascii="Times New Roman" w:eastAsia="Times New Roman" w:hAnsi="Times New Roman" w:cs="Times New Roman"/>
+          <w:kern w:val="0"/>
+          <w:sz w:val="24"/>
+          <w:szCs w:val="24"/>
+          <w14:ligatures w14:val="none"/>
+        </w:rPr>
+        <w:t xml:space="preserve">Confirmed automation script location: </w:t>
+      </w:r>
+      <w:r>
+        <w:rPr>
+          <w:rFonts w:ascii="Courier New" w:eastAsia="Times New Roman" w:hAnsi="Courier New" w:cs="Courier New"/>
+          <w:kern w:val="0"/>
+          <w:sz w:val="20"/>
+          <w:szCs w:val="20"/>
+          <w14:ligatures w14:val="none"/>
+        </w:rPr>
+        <w:t>D:\AI_LAB\Tools\docker_testing.py</w:t>
+      </w:r>
+      <w:r>
+        <w:rPr>
+          <w:rFonts w:ascii="Times New Roman" w:eastAsia="Times New Roman" w:hAnsi="Times New Roman" w:cs="Times New Roman"/>
+          <w:kern w:val="0"/>
+          <w:sz w:val="24"/>
+          <w:szCs w:val="24"/>
+          <w14:ligatures w14:val="none"/>
+        </w:rPr>
+        <w:t>.</w:t>
+      </w:r>
+    </w:p>
+    <w:p>
+      <w:pPr>
+        <w:numPr>
+          <w:ilvl w:val="1"/>
+          <w:numId w:val="112"/>
+        </w:numPr>
+        <w:spacing w:before="100" w:beforeAutospacing="1" w:after="100" w:afterAutospacing="1" w:line="240" w:lineRule="auto"/>
+        <w:rPr>
+          <w:rFonts w:ascii="Times New Roman" w:eastAsia="Times New Roman" w:hAnsi="Times New Roman" w:cs="Times New Roman"/>
+          <w:kern w:val="0"/>
+          <w:sz w:val="24"/>
+          <w:szCs w:val="24"/>
+          <w14:ligatures w14:val="none"/>
+        </w:rPr>
+      </w:pPr>
+      <w:r>
+        <w:rPr>
+          <w:rFonts w:ascii="Times New Roman" w:eastAsia="Times New Roman" w:hAnsi="Times New Roman" w:cs="Times New Roman"/>
+          <w:kern w:val="0"/>
+          <w:sz w:val="24"/>
+          <w:szCs w:val="24"/>
+          <w14:ligatures w14:val="none"/>
+        </w:rPr>
+        <w:t xml:space="preserve">Responsibilities: build/run container, mount </w:t>
+      </w:r>
+      <w:r>
+        <w:rPr>
+          <w:rFonts w:ascii="Courier New" w:eastAsia="Times New Roman" w:hAnsi="Courier New" w:cs="Courier New"/>
+          <w:kern w:val="0"/>
+          <w:sz w:val="20"/>
+          <w:szCs w:val="20"/>
+          <w14:ligatures w14:val="none"/>
+        </w:rPr>
+        <w:t>Docker-Testing/</w:t>
+      </w:r>
+      <w:r>
+        <w:rPr>
+          <w:rFonts w:ascii="Times New Roman" w:eastAsia="Times New Roman" w:hAnsi="Times New Roman" w:cs="Times New Roman"/>
+          <w:kern w:val="0"/>
+          <w:sz w:val="24"/>
+          <w:szCs w:val="24"/>
+          <w14:ligatures w14:val="none"/>
+        </w:rPr>
+        <w:t>, and expose file operations (list, read, apply patch).</w:t>
+      </w:r>
+    </w:p>
+    <w:p>
+      <w:pPr>
+        <w:numPr>
+          <w:ilvl w:val="0"/>
+          <w:numId w:val="112"/>
+        </w:numPr>
+        <w:spacing w:before="100" w:beforeAutospacing="1" w:after="100" w:afterAutospacing="1" w:line="240" w:lineRule="auto"/>
+        <w:rPr>
+          <w:rFonts w:ascii="Times New Roman" w:eastAsia="Times New Roman" w:hAnsi="Times New Roman" w:cs="Times New Roman"/>
+          <w:kern w:val="0"/>
+          <w:sz w:val="24"/>
+          <w:szCs w:val="24"/>
+          <w14:ligatures w14:val="none"/>
+        </w:rPr>
+      </w:pPr>
+      <w:r>
+        <w:rPr>
+          <w:rFonts w:ascii="Times New Roman" w:eastAsia="Times New Roman" w:hAnsi="Times New Roman" w:cs="Times New Roman"/>
+          <w:b/>
+          <w:bCs/>
+          <w:kern w:val="0"/>
+          <w:sz w:val="24"/>
+          <w:szCs w:val="24"/>
+          <w14:ligatures w14:val="none"/>
+        </w:rPr>
+        <w:t>Validation Workflow</w:t>
+      </w:r>
+    </w:p>
+    <w:p>
+      <w:pPr>
+        <w:numPr>
+          <w:ilvl w:val="1"/>
+          <w:numId w:val="112"/>
+        </w:numPr>
+        <w:spacing w:before="100" w:beforeAutospacing="1" w:after="100" w:afterAutospacing="1" w:line="240" w:lineRule="auto"/>
+        <w:rPr>
+          <w:rFonts w:ascii="Times New Roman" w:eastAsia="Times New Roman" w:hAnsi="Times New Roman" w:cs="Times New Roman"/>
+          <w:kern w:val="0"/>
+          <w:sz w:val="24"/>
+          <w:szCs w:val="24"/>
+          <w14:ligatures w14:val="none"/>
+        </w:rPr>
+      </w:pPr>
+      <w:r>
+        <w:rPr>
+          <w:rFonts w:ascii="Times New Roman" w:eastAsia="Times New Roman" w:hAnsi="Times New Roman" w:cs="Times New Roman"/>
+          <w:kern w:val="0"/>
+          <w:sz w:val="24"/>
+          <w:szCs w:val="24"/>
+          <w14:ligatures w14:val="none"/>
+        </w:rPr>
+        <w:t xml:space="preserve">Chose </w:t>
+      </w:r>
+      <w:r>
+        <w:rPr>
+          <w:rFonts w:ascii="Times New Roman" w:eastAsia="Times New Roman" w:hAnsi="Times New Roman" w:cs="Times New Roman"/>
+          <w:b/>
+          <w:bCs/>
+          <w:kern w:val="0"/>
+          <w:sz w:val="24"/>
+          <w:szCs w:val="24"/>
+          <w14:ligatures w14:val="none"/>
+        </w:rPr>
+        <w:t>chat</w:t>
+      </w:r>
+      <w:r>
+        <w:rPr>
+          <w:rFonts w:ascii="Times New Roman" w:eastAsia="Times New Roman" w:hAnsi="Times New Roman" w:cs="Times New Roman"/>
+          <w:b/>
+          <w:bCs/>
+          <w:kern w:val="0"/>
+          <w:sz w:val="24"/>
+          <w:szCs w:val="24"/>
+          <w14:ligatures w14:val="none"/>
+        </w:rPr>
+        <w:noBreakHyphen/>
+        <w:t>based validation</w:t>
+      </w:r>
+      <w:r>
+        <w:rPr>
+          <w:rFonts w:ascii="Times New Roman" w:eastAsia="Times New Roman" w:hAnsi="Times New Roman" w:cs="Times New Roman"/>
+          <w:kern w:val="0"/>
+          <w:sz w:val="24"/>
+          <w:szCs w:val="24"/>
+          <w14:ligatures w14:val="none"/>
+        </w:rPr>
+        <w:t xml:space="preserve"> instead of side preview panels for simplicity in testing phase.</w:t>
+      </w:r>
+    </w:p>
+    <w:p>
+      <w:pPr>
+        <w:numPr>
+          <w:ilvl w:val="1"/>
+          <w:numId w:val="112"/>
+        </w:numPr>
+        <w:spacing w:before="100" w:beforeAutospacing="1" w:after="100" w:afterAutospacing="1" w:line="240" w:lineRule="auto"/>
+        <w:rPr>
+          <w:rFonts w:ascii="Times New Roman" w:eastAsia="Times New Roman" w:hAnsi="Times New Roman" w:cs="Times New Roman"/>
+          <w:kern w:val="0"/>
+          <w:sz w:val="24"/>
+          <w:szCs w:val="24"/>
+          <w14:ligatures w14:val="none"/>
+        </w:rPr>
+      </w:pPr>
+      <w:r>
+        <w:rPr>
+          <w:rFonts w:ascii="Times New Roman" w:eastAsia="Times New Roman" w:hAnsi="Times New Roman" w:cs="Times New Roman"/>
+          <w:kern w:val="0"/>
+          <w:sz w:val="24"/>
+          <w:szCs w:val="24"/>
+          <w14:ligatures w14:val="none"/>
+        </w:rPr>
+        <w:t>AI’s proposed edits will appear inline in the chat as diffs/code blocks.</w:t>
+      </w:r>
+    </w:p>
+    <w:p>
+      <w:pPr>
+        <w:numPr>
+          <w:ilvl w:val="1"/>
+          <w:numId w:val="112"/>
+        </w:numPr>
+        <w:spacing w:before="100" w:beforeAutospacing="1" w:after="100" w:afterAutospacing="1" w:line="240" w:lineRule="auto"/>
+        <w:rPr>
+          <w:rFonts w:ascii="Times New Roman" w:eastAsia="Times New Roman" w:hAnsi="Times New Roman" w:cs="Times New Roman"/>
+          <w:kern w:val="0"/>
+          <w:sz w:val="24"/>
+          <w:szCs w:val="24"/>
+          <w14:ligatures w14:val="none"/>
+        </w:rPr>
+      </w:pPr>
+      <w:r>
+        <w:rPr>
+          <w:rFonts w:ascii="Times New Roman" w:eastAsia="Times New Roman" w:hAnsi="Times New Roman" w:cs="Times New Roman"/>
+          <w:kern w:val="0"/>
+          <w:sz w:val="24"/>
+          <w:szCs w:val="24"/>
+          <w14:ligatures w14:val="none"/>
+        </w:rPr>
+        <w:t>Approval triggers patch application inside container; rejection discards safely.</w:t>
+      </w:r>
+    </w:p>
+    <w:p>
+      <w:pPr>
+        <w:numPr>
+          <w:ilvl w:val="0"/>
+          <w:numId w:val="112"/>
+        </w:numPr>
+        <w:spacing w:before="100" w:beforeAutospacing="1" w:after="100" w:afterAutospacing="1" w:line="240" w:lineRule="auto"/>
+        <w:rPr>
+          <w:rFonts w:ascii="Times New Roman" w:eastAsia="Times New Roman" w:hAnsi="Times New Roman" w:cs="Times New Roman"/>
+          <w:kern w:val="0"/>
+          <w:sz w:val="24"/>
+          <w:szCs w:val="24"/>
+          <w14:ligatures w14:val="none"/>
+        </w:rPr>
+      </w:pPr>
+      <w:r>
+        <w:rPr>
+          <w:rFonts w:ascii="Times New Roman" w:eastAsia="Times New Roman" w:hAnsi="Times New Roman" w:cs="Times New Roman"/>
+          <w:b/>
+          <w:bCs/>
+          <w:kern w:val="0"/>
+          <w:sz w:val="24"/>
+          <w:szCs w:val="24"/>
+          <w14:ligatures w14:val="none"/>
+        </w:rPr>
+        <w:t>Change Propagation</w:t>
+      </w:r>
+    </w:p>
+    <w:p>
+      <w:pPr>
+        <w:numPr>
+          <w:ilvl w:val="1"/>
+          <w:numId w:val="112"/>
+        </w:numPr>
+        <w:spacing w:before="100" w:beforeAutospacing="1" w:after="100" w:afterAutospacing="1" w:line="240" w:lineRule="auto"/>
+        <w:rPr>
+          <w:rFonts w:ascii="Times New Roman" w:eastAsia="Times New Roman" w:hAnsi="Times New Roman" w:cs="Times New Roman"/>
+          <w:kern w:val="0"/>
+          <w:sz w:val="24"/>
+          <w:szCs w:val="24"/>
+          <w14:ligatures w14:val="none"/>
+        </w:rPr>
+      </w:pPr>
+      <w:r>
+        <w:rPr>
+          <w:rFonts w:ascii="Times New Roman" w:eastAsia="Times New Roman" w:hAnsi="Times New Roman" w:cs="Times New Roman"/>
+          <w:kern w:val="0"/>
+          <w:sz w:val="24"/>
+          <w:szCs w:val="24"/>
+          <w14:ligatures w14:val="none"/>
+        </w:rPr>
+        <w:t>Approved edits applied in container update host files instantly via bind</w:t>
+      </w:r>
+      <w:r>
+        <w:rPr>
+          <w:rFonts w:ascii="Times New Roman" w:eastAsia="Times New Roman" w:hAnsi="Times New Roman" w:cs="Times New Roman"/>
+          <w:kern w:val="0"/>
+          <w:sz w:val="24"/>
+          <w:szCs w:val="24"/>
+          <w14:ligatures w14:val="none"/>
+        </w:rPr>
+        <w:noBreakHyphen/>
+        <w:t>mount.</w:t>
+      </w:r>
+    </w:p>
+    <w:p>
+      <w:pPr>
+        <w:numPr>
+          <w:ilvl w:val="1"/>
+          <w:numId w:val="112"/>
+        </w:numPr>
+        <w:spacing w:before="100" w:beforeAutospacing="1" w:after="100" w:afterAutospacing="1" w:line="240" w:lineRule="auto"/>
+        <w:rPr>
+          <w:rFonts w:ascii="Times New Roman" w:eastAsia="Times New Roman" w:hAnsi="Times New Roman" w:cs="Times New Roman"/>
+          <w:kern w:val="0"/>
+          <w:sz w:val="24"/>
+          <w:szCs w:val="24"/>
+          <w14:ligatures w14:val="none"/>
+        </w:rPr>
+      </w:pPr>
+      <w:r>
+        <w:rPr>
+          <w:rFonts w:ascii="Times New Roman" w:eastAsia="Times New Roman" w:hAnsi="Times New Roman" w:cs="Times New Roman"/>
+          <w:kern w:val="0"/>
+          <w:sz w:val="24"/>
+          <w:szCs w:val="24"/>
+          <w14:ligatures w14:val="none"/>
+        </w:rPr>
+        <w:t xml:space="preserve">Ensures real scripts in </w:t>
+      </w:r>
+      <w:r>
+        <w:rPr>
+          <w:rFonts w:ascii="Courier New" w:eastAsia="Times New Roman" w:hAnsi="Courier New" w:cs="Courier New"/>
+          <w:kern w:val="0"/>
+          <w:sz w:val="20"/>
+          <w:szCs w:val="20"/>
+          <w14:ligatures w14:val="none"/>
+        </w:rPr>
+        <w:t>Docker-Testing/</w:t>
+      </w:r>
+      <w:r>
+        <w:rPr>
+          <w:rFonts w:ascii="Times New Roman" w:eastAsia="Times New Roman" w:hAnsi="Times New Roman" w:cs="Times New Roman"/>
+          <w:kern w:val="0"/>
+          <w:sz w:val="24"/>
+          <w:szCs w:val="24"/>
+          <w14:ligatures w14:val="none"/>
+        </w:rPr>
+        <w:t xml:space="preserve"> reflect AI changes without touching the original repo.</w:t>
+      </w:r>
+    </w:p>
+    <w:p>
+      <w:pPr>
+        <w:spacing w:after="0" w:line="240" w:lineRule="auto"/>
+        <w:rPr>
+          <w:rFonts w:ascii="Times New Roman" w:eastAsia="Times New Roman" w:hAnsi="Times New Roman" w:cs="Times New Roman"/>
+          <w:kern w:val="0"/>
+          <w:sz w:val="24"/>
+          <w:szCs w:val="24"/>
+          <w14:ligatures w14:val="none"/>
+        </w:rPr>
+      </w:pPr>
+      <w:r>
+        <w:rPr>
+          <w:rFonts w:ascii="Times New Roman" w:eastAsia="Times New Roman" w:hAnsi="Times New Roman" w:cs="Times New Roman"/>
+          <w:kern w:val="0"/>
+          <w:sz w:val="24"/>
+          <w:szCs w:val="24"/>
+          <w14:ligatures w14:val="none"/>
+        </w:rPr>
+        <w:pict w14:anchorId="21E0A78B">
+          <v:rect id="_x0000_i1122" style="width:0;height:1.5pt" o:hralign="center" o:hrstd="t" o:hr="t" fillcolor="#a0a0a0" stroked="f"/>
+        </w:pict>
+      </w:r>
+    </w:p>
+    <w:p>
+      <w:pPr>
+        <w:spacing w:before="100" w:beforeAutospacing="1" w:after="100" w:afterAutospacing="1" w:line="240" w:lineRule="auto"/>
+        <w:outlineLvl w:val="2"/>
+        <w:rPr>
+          <w:rFonts w:ascii="Times New Roman" w:eastAsia="Times New Roman" w:hAnsi="Times New Roman" w:cs="Times New Roman"/>
+          <w:b/>
+          <w:bCs/>
+          <w:kern w:val="0"/>
+          <w:sz w:val="27"/>
+          <w:szCs w:val="27"/>
+          <w14:ligatures w14:val="none"/>
+        </w:rPr>
+      </w:pPr>
+      <w:r>
+        <w:rPr>
+          <w:rFonts w:ascii="Segoe UI Emoji" w:eastAsia="Times New Roman" w:hAnsi="Segoe UI Emoji" w:cs="Segoe UI Emoji"/>
+          <w:b/>
+          <w:bCs/>
+          <w:kern w:val="0"/>
+          <w:sz w:val="27"/>
+          <w:szCs w:val="27"/>
+          <w14:ligatures w14:val="none"/>
+        </w:rPr>
+        <w:lastRenderedPageBreak/>
+        <w:t>📈</w:t>
+      </w:r>
+      <w:r>
+        <w:rPr>
+          <w:rFonts w:ascii="Times New Roman" w:eastAsia="Times New Roman" w:hAnsi="Times New Roman" w:cs="Times New Roman"/>
+          <w:b/>
+          <w:bCs/>
+          <w:kern w:val="0"/>
+          <w:sz w:val="27"/>
+          <w:szCs w:val="27"/>
+          <w14:ligatures w14:val="none"/>
+        </w:rPr>
+        <w:t xml:space="preserve"> Outcomes</w:t>
+      </w:r>
+    </w:p>
+    <w:p>
+      <w:pPr>
+        <w:numPr>
+          <w:ilvl w:val="0"/>
+          <w:numId w:val="113"/>
+        </w:numPr>
+        <w:spacing w:before="100" w:beforeAutospacing="1" w:after="100" w:afterAutospacing="1" w:line="240" w:lineRule="auto"/>
+        <w:rPr>
+          <w:rFonts w:ascii="Times New Roman" w:eastAsia="Times New Roman" w:hAnsi="Times New Roman" w:cs="Times New Roman"/>
+          <w:kern w:val="0"/>
+          <w:sz w:val="24"/>
+          <w:szCs w:val="24"/>
+          <w14:ligatures w14:val="none"/>
+        </w:rPr>
+      </w:pPr>
+      <w:r>
+        <w:rPr>
+          <w:rFonts w:ascii="Times New Roman" w:eastAsia="Times New Roman" w:hAnsi="Times New Roman" w:cs="Times New Roman"/>
+          <w:kern w:val="0"/>
+          <w:sz w:val="24"/>
+          <w:szCs w:val="24"/>
+          <w14:ligatures w14:val="none"/>
+        </w:rPr>
+        <w:t xml:space="preserve">A complete </w:t>
+      </w:r>
+      <w:r>
+        <w:rPr>
+          <w:rFonts w:ascii="Times New Roman" w:eastAsia="Times New Roman" w:hAnsi="Times New Roman" w:cs="Times New Roman"/>
+          <w:b/>
+          <w:bCs/>
+          <w:kern w:val="0"/>
+          <w:sz w:val="24"/>
+          <w:szCs w:val="24"/>
+          <w14:ligatures w14:val="none"/>
+        </w:rPr>
+        <w:t>roadmap</w:t>
+      </w:r>
+      <w:r>
+        <w:rPr>
+          <w:rFonts w:ascii="Times New Roman" w:eastAsia="Times New Roman" w:hAnsi="Times New Roman" w:cs="Times New Roman"/>
+          <w:kern w:val="0"/>
+          <w:sz w:val="24"/>
+          <w:szCs w:val="24"/>
+          <w14:ligatures w14:val="none"/>
+        </w:rPr>
+        <w:t xml:space="preserve"> for proof</w:t>
+      </w:r>
+      <w:r>
+        <w:rPr>
+          <w:rFonts w:ascii="Times New Roman" w:eastAsia="Times New Roman" w:hAnsi="Times New Roman" w:cs="Times New Roman"/>
+          <w:kern w:val="0"/>
+          <w:sz w:val="24"/>
+          <w:szCs w:val="24"/>
+          <w14:ligatures w14:val="none"/>
+        </w:rPr>
+        <w:noBreakHyphen/>
+        <w:t>of</w:t>
+      </w:r>
+      <w:r>
+        <w:rPr>
+          <w:rFonts w:ascii="Times New Roman" w:eastAsia="Times New Roman" w:hAnsi="Times New Roman" w:cs="Times New Roman"/>
+          <w:kern w:val="0"/>
+          <w:sz w:val="24"/>
+          <w:szCs w:val="24"/>
+          <w14:ligatures w14:val="none"/>
+        </w:rPr>
+        <w:noBreakHyphen/>
+        <w:t>concept was finalized.</w:t>
+      </w:r>
+    </w:p>
+    <w:p>
+      <w:pPr>
+        <w:numPr>
+          <w:ilvl w:val="0"/>
+          <w:numId w:val="113"/>
+        </w:numPr>
+        <w:spacing w:before="100" w:beforeAutospacing="1" w:after="100" w:afterAutospacing="1" w:line="240" w:lineRule="auto"/>
+        <w:rPr>
+          <w:rFonts w:ascii="Times New Roman" w:eastAsia="Times New Roman" w:hAnsi="Times New Roman" w:cs="Times New Roman"/>
+          <w:kern w:val="0"/>
+          <w:sz w:val="24"/>
+          <w:szCs w:val="24"/>
+          <w14:ligatures w14:val="none"/>
+        </w:rPr>
+      </w:pPr>
+      <w:r>
+        <w:rPr>
+          <w:rFonts w:ascii="Times New Roman" w:eastAsia="Times New Roman" w:hAnsi="Times New Roman" w:cs="Times New Roman"/>
+          <w:kern w:val="0"/>
+          <w:sz w:val="24"/>
+          <w:szCs w:val="24"/>
+          <w14:ligatures w14:val="none"/>
+        </w:rPr>
+        <w:t xml:space="preserve">Clear separation between </w:t>
+      </w:r>
+      <w:r>
+        <w:rPr>
+          <w:rFonts w:ascii="Times New Roman" w:eastAsia="Times New Roman" w:hAnsi="Times New Roman" w:cs="Times New Roman"/>
+          <w:b/>
+          <w:bCs/>
+          <w:kern w:val="0"/>
+          <w:sz w:val="24"/>
+          <w:szCs w:val="24"/>
+          <w14:ligatures w14:val="none"/>
+        </w:rPr>
+        <w:t>sandbox edits</w:t>
+      </w:r>
+      <w:r>
+        <w:rPr>
+          <w:rFonts w:ascii="Times New Roman" w:eastAsia="Times New Roman" w:hAnsi="Times New Roman" w:cs="Times New Roman"/>
+          <w:kern w:val="0"/>
+          <w:sz w:val="24"/>
+          <w:szCs w:val="24"/>
+          <w14:ligatures w14:val="none"/>
+        </w:rPr>
+        <w:t xml:space="preserve"> and </w:t>
+      </w:r>
+      <w:r>
+        <w:rPr>
+          <w:rFonts w:ascii="Times New Roman" w:eastAsia="Times New Roman" w:hAnsi="Times New Roman" w:cs="Times New Roman"/>
+          <w:b/>
+          <w:bCs/>
+          <w:kern w:val="0"/>
+          <w:sz w:val="24"/>
+          <w:szCs w:val="24"/>
+          <w14:ligatures w14:val="none"/>
+        </w:rPr>
+        <w:t>host runtime</w:t>
+      </w:r>
+      <w:r>
+        <w:rPr>
+          <w:rFonts w:ascii="Times New Roman" w:eastAsia="Times New Roman" w:hAnsi="Times New Roman" w:cs="Times New Roman"/>
+          <w:kern w:val="0"/>
+          <w:sz w:val="24"/>
+          <w:szCs w:val="24"/>
+          <w14:ligatures w14:val="none"/>
+        </w:rPr>
+        <w:t xml:space="preserve"> established.</w:t>
+      </w:r>
+    </w:p>
+    <w:p>
+      <w:pPr>
+        <w:numPr>
+          <w:ilvl w:val="0"/>
+          <w:numId w:val="113"/>
+        </w:numPr>
+        <w:spacing w:before="100" w:beforeAutospacing="1" w:after="100" w:afterAutospacing="1" w:line="240" w:lineRule="auto"/>
+        <w:rPr>
+          <w:rFonts w:ascii="Times New Roman" w:eastAsia="Times New Roman" w:hAnsi="Times New Roman" w:cs="Times New Roman"/>
+          <w:kern w:val="0"/>
+          <w:sz w:val="24"/>
+          <w:szCs w:val="24"/>
+          <w14:ligatures w14:val="none"/>
+        </w:rPr>
+      </w:pPr>
+      <w:r>
+        <w:rPr>
+          <w:rFonts w:ascii="Times New Roman" w:eastAsia="Times New Roman" w:hAnsi="Times New Roman" w:cs="Times New Roman"/>
+          <w:kern w:val="0"/>
+          <w:sz w:val="24"/>
+          <w:szCs w:val="24"/>
+          <w14:ligatures w14:val="none"/>
+        </w:rPr>
+        <w:t>Validation flow simplified to reduce friction during testing.</w:t>
+      </w:r>
+    </w:p>
+    <w:p>
+      <w:pPr>
+        <w:numPr>
+          <w:ilvl w:val="0"/>
+          <w:numId w:val="113"/>
+        </w:numPr>
+        <w:spacing w:before="100" w:beforeAutospacing="1" w:after="100" w:afterAutospacing="1" w:line="240" w:lineRule="auto"/>
+        <w:rPr>
+          <w:rFonts w:ascii="Times New Roman" w:eastAsia="Times New Roman" w:hAnsi="Times New Roman" w:cs="Times New Roman"/>
+          <w:kern w:val="0"/>
+          <w:sz w:val="24"/>
+          <w:szCs w:val="24"/>
+          <w14:ligatures w14:val="none"/>
+        </w:rPr>
+      </w:pPr>
+      <w:r>
+        <w:rPr>
+          <w:rFonts w:ascii="Times New Roman" w:eastAsia="Times New Roman" w:hAnsi="Times New Roman" w:cs="Times New Roman"/>
+          <w:kern w:val="0"/>
+          <w:sz w:val="24"/>
+          <w:szCs w:val="24"/>
+          <w14:ligatures w14:val="none"/>
+        </w:rPr>
+        <w:t>Automation responsibilities assigned to Python orchestrator, ensuring reproducibility.</w:t>
+      </w:r>
+    </w:p>
+    <w:p>
+      <w:pPr>
+        <w:spacing w:after="0" w:line="240" w:lineRule="auto"/>
+        <w:rPr>
+          <w:rFonts w:ascii="Times New Roman" w:eastAsia="Times New Roman" w:hAnsi="Times New Roman" w:cs="Times New Roman"/>
+          <w:kern w:val="0"/>
+          <w:sz w:val="24"/>
+          <w:szCs w:val="24"/>
+          <w14:ligatures w14:val="none"/>
+        </w:rPr>
+      </w:pPr>
+      <w:r>
+        <w:rPr>
+          <w:rFonts w:ascii="Times New Roman" w:eastAsia="Times New Roman" w:hAnsi="Times New Roman" w:cs="Times New Roman"/>
+          <w:kern w:val="0"/>
+          <w:sz w:val="24"/>
+          <w:szCs w:val="24"/>
+          <w14:ligatures w14:val="none"/>
+        </w:rPr>
+        <w:pict w14:anchorId="42885105">
+          <v:rect id="_x0000_i1123" style="width:0;height:1.5pt" o:hralign="center" o:hrstd="t" o:hr="t" fillcolor="#a0a0a0" stroked="f"/>
+        </w:pict>
+      </w:r>
+    </w:p>
+    <w:p>
+      <w:pPr>
+        <w:spacing w:before="100" w:beforeAutospacing="1" w:after="100" w:afterAutospacing="1" w:line="240" w:lineRule="auto"/>
+        <w:outlineLvl w:val="2"/>
+        <w:rPr>
+          <w:rFonts w:ascii="Times New Roman" w:eastAsia="Times New Roman" w:hAnsi="Times New Roman" w:cs="Times New Roman"/>
+          <w:b/>
+          <w:bCs/>
+          <w:kern w:val="0"/>
+          <w:sz w:val="27"/>
+          <w:szCs w:val="27"/>
+          <w14:ligatures w14:val="none"/>
+        </w:rPr>
+      </w:pPr>
+      <w:r>
+        <w:rPr>
+          <w:rFonts w:ascii="Segoe UI Emoji" w:eastAsia="Times New Roman" w:hAnsi="Segoe UI Emoji" w:cs="Segoe UI Emoji"/>
+          <w:b/>
+          <w:bCs/>
+          <w:kern w:val="0"/>
+          <w:sz w:val="27"/>
+          <w:szCs w:val="27"/>
+          <w14:ligatures w14:val="none"/>
+        </w:rPr>
+        <w:t>🧭</w:t>
+      </w:r>
+      <w:r>
+        <w:rPr>
+          <w:rFonts w:ascii="Times New Roman" w:eastAsia="Times New Roman" w:hAnsi="Times New Roman" w:cs="Times New Roman"/>
+          <w:b/>
+          <w:bCs/>
+          <w:kern w:val="0"/>
+          <w:sz w:val="27"/>
+          <w:szCs w:val="27"/>
+          <w14:ligatures w14:val="none"/>
+        </w:rPr>
+        <w:t xml:space="preserve"> Next Strategic Target</w:t>
+      </w:r>
+    </w:p>
+    <w:p>
+      <w:pPr>
+        <w:numPr>
+          <w:ilvl w:val="0"/>
+          <w:numId w:val="114"/>
+        </w:numPr>
+        <w:spacing w:before="100" w:beforeAutospacing="1" w:after="100" w:afterAutospacing="1" w:line="240" w:lineRule="auto"/>
+        <w:rPr>
+          <w:rFonts w:ascii="Times New Roman" w:eastAsia="Times New Roman" w:hAnsi="Times New Roman" w:cs="Times New Roman"/>
+          <w:kern w:val="0"/>
+          <w:sz w:val="24"/>
+          <w:szCs w:val="24"/>
+          <w14:ligatures w14:val="none"/>
+        </w:rPr>
+      </w:pPr>
+      <w:r>
+        <w:rPr>
+          <w:rFonts w:ascii="Times New Roman" w:eastAsia="Times New Roman" w:hAnsi="Times New Roman" w:cs="Times New Roman"/>
+          <w:kern w:val="0"/>
+          <w:sz w:val="24"/>
+          <w:szCs w:val="24"/>
+          <w14:ligatures w14:val="none"/>
+        </w:rPr>
+        <w:t xml:space="preserve">Implement </w:t>
+      </w:r>
+      <w:r>
+        <w:rPr>
+          <w:rFonts w:ascii="Courier New" w:eastAsia="Times New Roman" w:hAnsi="Courier New" w:cs="Courier New"/>
+          <w:kern w:val="0"/>
+          <w:sz w:val="20"/>
+          <w:szCs w:val="20"/>
+          <w14:ligatures w14:val="none"/>
+        </w:rPr>
+        <w:t>docker_testing.py</w:t>
+      </w:r>
+      <w:r>
+        <w:rPr>
+          <w:rFonts w:ascii="Times New Roman" w:eastAsia="Times New Roman" w:hAnsi="Times New Roman" w:cs="Times New Roman"/>
+          <w:kern w:val="0"/>
+          <w:sz w:val="24"/>
+          <w:szCs w:val="24"/>
+          <w14:ligatures w14:val="none"/>
+        </w:rPr>
+        <w:t xml:space="preserve"> and </w:t>
+      </w:r>
+      <w:r>
+        <w:rPr>
+          <w:rFonts w:ascii="Courier New" w:eastAsia="Times New Roman" w:hAnsi="Courier New" w:cs="Courier New"/>
+          <w:kern w:val="0"/>
+          <w:sz w:val="20"/>
+          <w:szCs w:val="20"/>
+          <w14:ligatures w14:val="none"/>
+        </w:rPr>
+        <w:t>file_access.js</w:t>
+      </w:r>
+      <w:r>
+        <w:rPr>
+          <w:rFonts w:ascii="Times New Roman" w:eastAsia="Times New Roman" w:hAnsi="Times New Roman" w:cs="Times New Roman"/>
+          <w:kern w:val="0"/>
+          <w:sz w:val="24"/>
+          <w:szCs w:val="24"/>
+          <w14:ligatures w14:val="none"/>
+        </w:rPr>
+        <w:t xml:space="preserve"> skeletons.</w:t>
+      </w:r>
+    </w:p>
+    <w:p>
+      <w:pPr>
+        <w:numPr>
+          <w:ilvl w:val="0"/>
+          <w:numId w:val="114"/>
+        </w:numPr>
+        <w:spacing w:before="100" w:beforeAutospacing="1" w:after="100" w:afterAutospacing="1" w:line="240" w:lineRule="auto"/>
+        <w:rPr>
+          <w:rFonts w:ascii="Times New Roman" w:eastAsia="Times New Roman" w:hAnsi="Times New Roman" w:cs="Times New Roman"/>
+          <w:kern w:val="0"/>
+          <w:sz w:val="24"/>
+          <w:szCs w:val="24"/>
+          <w14:ligatures w14:val="none"/>
+        </w:rPr>
+      </w:pPr>
+      <w:r>
+        <w:rPr>
+          <w:rFonts w:ascii="Times New Roman" w:eastAsia="Times New Roman" w:hAnsi="Times New Roman" w:cs="Times New Roman"/>
+          <w:kern w:val="0"/>
+          <w:sz w:val="24"/>
+          <w:szCs w:val="24"/>
+          <w14:ligatures w14:val="none"/>
+        </w:rPr>
+        <w:t xml:space="preserve">Populate </w:t>
+      </w:r>
+      <w:r>
+        <w:rPr>
+          <w:rFonts w:ascii="Courier New" w:eastAsia="Times New Roman" w:hAnsi="Courier New" w:cs="Courier New"/>
+          <w:kern w:val="0"/>
+          <w:sz w:val="20"/>
+          <w:szCs w:val="20"/>
+          <w14:ligatures w14:val="none"/>
+        </w:rPr>
+        <w:t>Docker-Testing/</w:t>
+      </w:r>
+      <w:r>
+        <w:rPr>
+          <w:rFonts w:ascii="Times New Roman" w:eastAsia="Times New Roman" w:hAnsi="Times New Roman" w:cs="Times New Roman"/>
+          <w:kern w:val="0"/>
+          <w:sz w:val="24"/>
+          <w:szCs w:val="24"/>
+          <w14:ligatures w14:val="none"/>
+        </w:rPr>
+        <w:t xml:space="preserve"> with sample scripts.</w:t>
+      </w:r>
+    </w:p>
+    <w:p>
+      <w:pPr>
+        <w:numPr>
+          <w:ilvl w:val="0"/>
+          <w:numId w:val="114"/>
+        </w:numPr>
+        <w:spacing w:before="100" w:beforeAutospacing="1" w:after="100" w:afterAutospacing="1" w:line="240" w:lineRule="auto"/>
+        <w:rPr>
+          <w:rFonts w:ascii="Times New Roman" w:eastAsia="Times New Roman" w:hAnsi="Times New Roman" w:cs="Times New Roman"/>
+          <w:kern w:val="0"/>
+          <w:sz w:val="24"/>
+          <w:szCs w:val="24"/>
+          <w14:ligatures w14:val="none"/>
+        </w:rPr>
+      </w:pPr>
+      <w:r>
+        <w:rPr>
+          <w:rFonts w:ascii="Times New Roman" w:eastAsia="Times New Roman" w:hAnsi="Times New Roman" w:cs="Times New Roman"/>
+          <w:kern w:val="0"/>
+          <w:sz w:val="24"/>
+          <w:szCs w:val="24"/>
+          <w14:ligatures w14:val="none"/>
+        </w:rPr>
+        <w:t>Begin controlled trials of AI</w:t>
+      </w:r>
+      <w:r>
+        <w:rPr>
+          <w:rFonts w:ascii="Times New Roman" w:eastAsia="Times New Roman" w:hAnsi="Times New Roman" w:cs="Times New Roman"/>
+          <w:kern w:val="0"/>
+          <w:sz w:val="24"/>
+          <w:szCs w:val="24"/>
+          <w14:ligatures w14:val="none"/>
+        </w:rPr>
+        <w:noBreakHyphen/>
+        <w:t>driven file edits with inline chat validation.</w:t>
+      </w:r>
+    </w:p>
+    <w:p>
+      <w:pPr>
+        <w:spacing w:after="0" w:line="240" w:lineRule="auto"/>
+        <w:rPr>
+          <w:rFonts w:ascii="Times New Roman" w:eastAsia="Times New Roman" w:hAnsi="Times New Roman" w:cs="Times New Roman"/>
+          <w:kern w:val="0"/>
+          <w:sz w:val="24"/>
+          <w:szCs w:val="24"/>
+          <w14:ligatures w14:val="none"/>
+        </w:rPr>
+      </w:pPr>
+      <w:r>
+        <w:rPr>
+          <w:rFonts w:ascii="Times New Roman" w:eastAsia="Times New Roman" w:hAnsi="Times New Roman" w:cs="Times New Roman"/>
+          <w:kern w:val="0"/>
+          <w:sz w:val="24"/>
+          <w:szCs w:val="24"/>
+          <w14:ligatures w14:val="none"/>
+        </w:rPr>
+        <w:pict w14:anchorId="0298F846">
+          <v:rect id="_x0000_i1124" style="width:0;height:1.5pt" o:hralign="center" o:hrstd="t" o:hr="t" fillcolor="#a0a0a0" stroked="f"/>
+        </w:pict>
+      </w:r>
+    </w:p>
+    <w:p>
+      <w:pPr>
+        <w:spacing w:before="100" w:beforeAutospacing="1" w:after="100" w:afterAutospacing="1" w:line="240" w:lineRule="auto"/>
+        <w:rPr>
+          <w:rFonts w:ascii="Times New Roman" w:eastAsia="Times New Roman" w:hAnsi="Times New Roman" w:cs="Times New Roman"/>
+          <w:kern w:val="0"/>
+          <w:sz w:val="24"/>
+          <w:szCs w:val="24"/>
+          <w14:ligatures w14:val="none"/>
+        </w:rPr>
+      </w:pPr>
+      <w:r>
+        <w:rPr>
+          <w:rFonts w:ascii="Segoe UI Emoji" w:eastAsia="Times New Roman" w:hAnsi="Segoe UI Emoji" w:cs="Segoe UI Emoji"/>
+          <w:kern w:val="0"/>
+          <w:sz w:val="24"/>
+          <w:szCs w:val="24"/>
+          <w14:ligatures w14:val="none"/>
+        </w:rPr>
+        <w:t>✅</w:t>
+      </w:r>
+      <w:r>
+        <w:rPr>
+          <w:rFonts w:ascii="Times New Roman" w:eastAsia="Times New Roman" w:hAnsi="Times New Roman" w:cs="Times New Roman"/>
+          <w:kern w:val="0"/>
+          <w:sz w:val="24"/>
+          <w:szCs w:val="24"/>
+          <w14:ligatures w14:val="none"/>
+        </w:rPr>
+        <w:t xml:space="preserve"> </w:t>
+      </w:r>
+      <w:r>
+        <w:rPr>
+          <w:rFonts w:ascii="Times New Roman" w:eastAsia="Times New Roman" w:hAnsi="Times New Roman" w:cs="Times New Roman"/>
+          <w:b/>
+          <w:bCs/>
+          <w:kern w:val="0"/>
+          <w:sz w:val="24"/>
+          <w:szCs w:val="24"/>
+          <w14:ligatures w14:val="none"/>
+        </w:rPr>
+        <w:t>Status:</w:t>
+      </w:r>
+      <w:r>
+        <w:rPr>
+          <w:rFonts w:ascii="Times New Roman" w:eastAsia="Times New Roman" w:hAnsi="Times New Roman" w:cs="Times New Roman"/>
+          <w:kern w:val="0"/>
+          <w:sz w:val="24"/>
+          <w:szCs w:val="24"/>
+          <w14:ligatures w14:val="none"/>
+        </w:rPr>
+        <w:t xml:space="preserve"> Roadmap finalized. Mission ready for execution phase.</w:t>
+      </w:r>
+      <w:r>
+        <w:rPr>
+          <w:rFonts w:ascii="Times New Roman" w:eastAsia="Times New Roman" w:hAnsi="Times New Roman" w:cs="Times New Roman"/>
+          <w:kern w:val="0"/>
+          <w:sz w:val="24"/>
+          <w:szCs w:val="24"/>
+          <w14:ligatures w14:val="none"/>
+        </w:rPr>
+        <w:br/>
+        <w:t>Over.</w:t>
+      </w:r>
+    </w:p>
+    <w:p>
+      <w:pPr>
+        <w:tabs>
+          <w:tab w:val="left" w:pos="3975"/>
+        </w:tabs>
+        <w:rPr>
+          <w:sz w:val="52"/>
+          <w:szCs w:val="52"/>
+        </w:rPr>
+      </w:pPr>
+    </w:p>
+    <w:p>
+      <w:pPr>
+        <w:tabs>
+          <w:tab w:val="left" w:pos="3975"/>
+        </w:tabs>
+        <w:rPr>
+          <w:sz w:val="52"/>
+          <w:szCs w:val="52"/>
+        </w:rPr>
+      </w:pPr>
+      <w:r>
+        <w:rPr>
+          <w:sz w:val="52"/>
+          <w:szCs w:val="52"/>
+        </w:rPr>
+        <w:t>Date- 05-05-2026</w:t>
+      </w:r>
+    </w:p>
+    <w:p>
+      <w:pPr>
+        <w:pStyle w:val="Heading3"/>
+      </w:pPr>
+      <w:r>
+        <w:t>Progress Report – Session Summary</w:t>
+      </w:r>
+    </w:p>
+    <w:p>
+      <w:pPr>
+        <w:pStyle w:val="NormalWeb"/>
+      </w:pPr>
+      <w:r>
+        <w:rPr>
+          <w:rStyle w:val="Strong"/>
+        </w:rPr>
+        <w:t>Date:</w:t>
+      </w:r>
+      <w:r>
+        <w:t xml:space="preserve"> 5 May 2026</w:t>
+      </w:r>
+      <w:r>
+        <w:br/>
+      </w:r>
+      <w:r>
+        <w:rPr>
+          <w:rStyle w:val="Strong"/>
+        </w:rPr>
+        <w:t>Subject:</w:t>
+      </w:r>
+      <w:r>
+        <w:t xml:space="preserve"> Proof</w:t>
+      </w:r>
+      <w:r>
+        <w:noBreakHyphen/>
+        <w:t>of</w:t>
+      </w:r>
+      <w:r>
+        <w:noBreakHyphen/>
+        <w:t>Concept Development – AI Sandbox with Docker</w:t>
+      </w:r>
+    </w:p>
+    <w:p>
+      <w:r>
+        <w:pict w14:anchorId="3479906F">
+          <v:rect id="_x0000_i1125" style="width:0;height:1.5pt" o:hralign="center" o:hrstd="t" o:hr="t" fillcolor="#a0a0a0" stroked="f"/>
+        </w:pict>
+      </w:r>
+    </w:p>
+    <w:p>
+      <w:pPr>
+        <w:pStyle w:val="Heading4"/>
+      </w:pPr>
+      <w:r>
+        <w:t>Objectives Undertaken</w:t>
+      </w:r>
+    </w:p>
+    <w:p>
+      <w:pPr>
+        <w:numPr>
+          <w:ilvl w:val="0"/>
+          <w:numId w:val="115"/>
+        </w:numPr>
+        <w:spacing w:before="100" w:beforeAutospacing="1" w:after="100" w:afterAutospacing="1" w:line="240" w:lineRule="auto"/>
+      </w:pPr>
+      <w:r>
+        <w:t>Establish a controlled Docker sandbox for AI file editing and validation.</w:t>
+      </w:r>
+    </w:p>
+    <w:p>
+      <w:pPr>
+        <w:numPr>
+          <w:ilvl w:val="0"/>
+          <w:numId w:val="115"/>
+        </w:numPr>
+        <w:spacing w:before="100" w:beforeAutospacing="1" w:after="100" w:afterAutospacing="1" w:line="240" w:lineRule="auto"/>
+      </w:pPr>
+      <w:r>
+        <w:t>Prepare sample/template scripts in multiple languages for testing.</w:t>
+      </w:r>
+    </w:p>
+    <w:p>
+      <w:pPr>
+        <w:numPr>
+          <w:ilvl w:val="0"/>
+          <w:numId w:val="115"/>
+        </w:numPr>
+        <w:spacing w:before="100" w:beforeAutospacing="1" w:after="100" w:afterAutospacing="1" w:line="240" w:lineRule="auto"/>
+      </w:pPr>
+      <w:r>
+        <w:t>Automate container lifecycle: deletion, rebuilding, and verification.</w:t>
+      </w:r>
+    </w:p>
+    <w:p>
+      <w:pPr>
+        <w:numPr>
+          <w:ilvl w:val="0"/>
+          <w:numId w:val="115"/>
+        </w:numPr>
+        <w:spacing w:before="100" w:beforeAutospacing="1" w:after="100" w:afterAutospacing="1" w:line="240" w:lineRule="auto"/>
+      </w:pPr>
+      <w:r>
+        <w:t>Attempt Git installation inside the container for version control integration.</w:t>
+      </w:r>
+    </w:p>
+    <w:p>
+      <w:pPr>
+        <w:spacing w:after="0"/>
+      </w:pPr>
+      <w:r>
+        <w:pict w14:anchorId="36A6B024">
+          <v:rect id="_x0000_i1126" style="width:0;height:1.5pt" o:hralign="center" o:hrstd="t" o:hr="t" fillcolor="#a0a0a0" stroked="f"/>
+        </w:pict>
+      </w:r>
+    </w:p>
+    <w:p>
+      <w:pPr>
+        <w:pStyle w:val="Heading4"/>
+      </w:pPr>
+      <w:r>
+        <w:t>Actions Completed</w:t>
+      </w:r>
+    </w:p>
+    <w:p>
+      <w:pPr>
+        <w:pStyle w:val="NormalWeb"/>
+        <w:numPr>
+          <w:ilvl w:val="0"/>
+          <w:numId w:val="116"/>
+        </w:numPr>
+      </w:pPr>
+      <w:r>
+        <w:rPr>
+          <w:rStyle w:val="Strong"/>
+        </w:rPr>
+        <w:t>Sample Script Preparation</w:t>
+      </w:r>
+    </w:p>
+    <w:p>
+      <w:pPr>
+        <w:numPr>
+          <w:ilvl w:val="1"/>
+          <w:numId w:val="116"/>
+        </w:numPr>
+        <w:spacing w:before="100" w:beforeAutospacing="1" w:after="100" w:afterAutospacing="1" w:line="240" w:lineRule="auto"/>
+      </w:pPr>
+      <w:r>
+        <w:lastRenderedPageBreak/>
+        <w:t xml:space="preserve">Decision to place template scripts (Python, Java, Ruby, Go, etc.) inside the </w:t>
+      </w:r>
+      <w:r>
+        <w:rPr>
+          <w:rStyle w:val="HTMLCode"/>
+          <w:rFonts w:eastAsiaTheme="majorEastAsia"/>
+        </w:rPr>
+        <w:t>Docker-Testing</w:t>
+      </w:r>
+      <w:r>
+        <w:t xml:space="preserve"> folder.</w:t>
+      </w:r>
+    </w:p>
+    <w:p>
+      <w:pPr>
+        <w:numPr>
+          <w:ilvl w:val="1"/>
+          <w:numId w:val="116"/>
+        </w:numPr>
+        <w:spacing w:before="100" w:beforeAutospacing="1" w:after="100" w:afterAutospacing="1" w:line="240" w:lineRule="auto"/>
+      </w:pPr>
+      <w:r>
+        <w:t>These serve as controlled test files for AI to edit and validate without touching the real repository.</w:t>
+      </w:r>
+    </w:p>
+    <w:p>
+      <w:pPr>
+        <w:pStyle w:val="NormalWeb"/>
+        <w:numPr>
+          <w:ilvl w:val="0"/>
+          <w:numId w:val="116"/>
+        </w:numPr>
+      </w:pPr>
+      <w:r>
+        <w:rPr>
+          <w:rStyle w:val="Strong"/>
+        </w:rPr>
+        <w:t>Container &amp; Image Cleanup</w:t>
+      </w:r>
+    </w:p>
+    <w:p>
+      <w:pPr>
+        <w:numPr>
+          <w:ilvl w:val="1"/>
+          <w:numId w:val="116"/>
+        </w:numPr>
+        <w:spacing w:before="100" w:beforeAutospacing="1" w:after="100" w:afterAutospacing="1" w:line="240" w:lineRule="auto"/>
+      </w:pPr>
+      <w:r>
+        <w:t>All previous containers removed (</w:t>
+      </w:r>
+      <w:r>
+        <w:rPr>
+          <w:rStyle w:val="HTMLCode"/>
+          <w:rFonts w:eastAsiaTheme="majorEastAsia"/>
+        </w:rPr>
+        <w:t>docker rm -f</w:t>
+      </w:r>
+      <w:r>
+        <w:t>).</w:t>
+      </w:r>
+    </w:p>
+    <w:p>
+      <w:pPr>
+        <w:numPr>
+          <w:ilvl w:val="1"/>
+          <w:numId w:val="116"/>
+        </w:numPr>
+        <w:spacing w:before="100" w:beforeAutospacing="1" w:after="100" w:afterAutospacing="1" w:line="240" w:lineRule="auto"/>
+      </w:pPr>
+      <w:r>
+        <w:t xml:space="preserve">Old </w:t>
+      </w:r>
+      <w:r>
+        <w:rPr>
+          <w:rStyle w:val="HTMLCode"/>
+          <w:rFonts w:eastAsiaTheme="majorEastAsia"/>
+        </w:rPr>
+        <w:t>ai_sandbox</w:t>
+      </w:r>
+      <w:r>
+        <w:t xml:space="preserve"> image deleted (</w:t>
+      </w:r>
+      <w:r>
+        <w:rPr>
+          <w:rStyle w:val="HTMLCode"/>
+          <w:rFonts w:eastAsiaTheme="majorEastAsia"/>
+        </w:rPr>
+        <w:t>docker rmi -f</w:t>
+      </w:r>
+      <w:r>
+        <w:t>).</w:t>
+      </w:r>
+    </w:p>
+    <w:p>
+      <w:pPr>
+        <w:numPr>
+          <w:ilvl w:val="1"/>
+          <w:numId w:val="116"/>
+        </w:numPr>
+        <w:spacing w:before="100" w:beforeAutospacing="1" w:after="100" w:afterAutospacing="1" w:line="240" w:lineRule="auto"/>
+      </w:pPr>
+      <w:r>
+        <w:t>Verified clean state (</w:t>
+      </w:r>
+      <w:r>
+        <w:rPr>
+          <w:rStyle w:val="HTMLCode"/>
+          <w:rFonts w:eastAsiaTheme="majorEastAsia"/>
+        </w:rPr>
+        <w:t>docker ps -a</w:t>
+      </w:r>
+      <w:r>
+        <w:t xml:space="preserve"> returned empty).</w:t>
+      </w:r>
+    </w:p>
+    <w:p>
+      <w:pPr>
+        <w:pStyle w:val="NormalWeb"/>
+        <w:numPr>
+          <w:ilvl w:val="0"/>
+          <w:numId w:val="116"/>
+        </w:numPr>
+      </w:pPr>
+      <w:r>
+        <w:rPr>
+          <w:rStyle w:val="Strong"/>
+        </w:rPr>
+        <w:t>Rebuild Process</w:t>
+      </w:r>
+    </w:p>
+    <w:p>
+      <w:pPr>
+        <w:numPr>
+          <w:ilvl w:val="1"/>
+          <w:numId w:val="116"/>
+        </w:numPr>
+        <w:spacing w:before="100" w:beforeAutospacing="1" w:after="100" w:afterAutospacing="1" w:line="240" w:lineRule="auto"/>
+      </w:pPr>
+      <w:r>
+        <w:t>Fresh image built using updated Dockerfile.</w:t>
+      </w:r>
+    </w:p>
+    <w:p>
+      <w:pPr>
+        <w:numPr>
+          <w:ilvl w:val="1"/>
+          <w:numId w:val="116"/>
+        </w:numPr>
+        <w:spacing w:before="100" w:beforeAutospacing="1" w:after="100" w:afterAutospacing="1" w:line="240" w:lineRule="auto"/>
+      </w:pPr>
+      <w:r>
+        <w:t>Container launched successfully (</w:t>
+      </w:r>
+      <w:r>
+        <w:rPr>
+          <w:rStyle w:val="HTMLCode"/>
+          <w:rFonts w:eastAsiaTheme="majorEastAsia"/>
+        </w:rPr>
+        <w:t>ai_sandbox_container</w:t>
+      </w:r>
+      <w:r>
+        <w:t>).</w:t>
+      </w:r>
+    </w:p>
+    <w:p>
+      <w:pPr>
+        <w:pStyle w:val="NormalWeb"/>
+        <w:numPr>
+          <w:ilvl w:val="0"/>
+          <w:numId w:val="116"/>
+        </w:numPr>
+      </w:pPr>
+      <w:r>
+        <w:rPr>
+          <w:rStyle w:val="Strong"/>
+        </w:rPr>
+        <w:t>Verification Attempts</w:t>
+      </w:r>
+    </w:p>
+    <w:p>
+      <w:pPr>
+        <w:numPr>
+          <w:ilvl w:val="1"/>
+          <w:numId w:val="116"/>
+        </w:numPr>
+        <w:spacing w:before="100" w:beforeAutospacing="1" w:after="100" w:afterAutospacing="1" w:line="240" w:lineRule="auto"/>
+      </w:pPr>
+      <w:r>
+        <w:t>Multiple checks (</w:t>
+      </w:r>
+      <w:r>
+        <w:rPr>
+          <w:rStyle w:val="HTMLCode"/>
+          <w:rFonts w:eastAsiaTheme="majorEastAsia"/>
+        </w:rPr>
+        <w:t>docker exec ai_sandbox_container git --version</w:t>
+      </w:r>
+      <w:r>
+        <w:t>) failed.</w:t>
+      </w:r>
+    </w:p>
+    <w:p>
+      <w:pPr>
+        <w:numPr>
+          <w:ilvl w:val="1"/>
+          <w:numId w:val="116"/>
+        </w:numPr>
+        <w:spacing w:before="100" w:beforeAutospacing="1" w:after="100" w:afterAutospacing="1" w:line="240" w:lineRule="auto"/>
+      </w:pPr>
+      <w:r>
+        <w:t xml:space="preserve">Error consistently: </w:t>
+      </w:r>
+      <w:r>
+        <w:rPr>
+          <w:rStyle w:val="Emphasis"/>
+        </w:rPr>
+        <w:t>“executable file not found in $PATH”</w:t>
+      </w:r>
+      <w:r>
+        <w:t>.</w:t>
+      </w:r>
+    </w:p>
+    <w:p>
+      <w:pPr>
+        <w:numPr>
+          <w:ilvl w:val="1"/>
+          <w:numId w:val="116"/>
+        </w:numPr>
+        <w:spacing w:before="100" w:beforeAutospacing="1" w:after="100" w:afterAutospacing="1" w:line="240" w:lineRule="auto"/>
+      </w:pPr>
+      <w:r>
+        <w:t>Indicates Git installation step did not execute during build.</w:t>
+      </w:r>
+    </w:p>
+    <w:p>
+      <w:pPr>
+        <w:spacing w:after="0"/>
+      </w:pPr>
+      <w:r>
+        <w:pict w14:anchorId="33C0294C">
+          <v:rect id="_x0000_i1127" style="width:0;height:1.5pt" o:hralign="center" o:hrstd="t" o:hr="t" fillcolor="#a0a0a0" stroked="f"/>
+        </w:pict>
+      </w:r>
+    </w:p>
+    <w:p>
+      <w:pPr>
+        <w:pStyle w:val="Heading4"/>
+      </w:pPr>
+      <w:r>
+        <w:t>Current Status</w:t>
+      </w:r>
+    </w:p>
+    <w:p>
+      <w:pPr>
+        <w:numPr>
+          <w:ilvl w:val="0"/>
+          <w:numId w:val="117"/>
+        </w:numPr>
+        <w:spacing w:before="100" w:beforeAutospacing="1" w:after="100" w:afterAutospacing="1" w:line="240" w:lineRule="auto"/>
+      </w:pPr>
+      <w:r>
+        <w:t>Sandbox environment reset and rebuilt successfully.</w:t>
+      </w:r>
+    </w:p>
+    <w:p>
+      <w:pPr>
+        <w:numPr>
+          <w:ilvl w:val="0"/>
+          <w:numId w:val="117"/>
+        </w:numPr>
+        <w:spacing w:before="100" w:beforeAutospacing="1" w:after="100" w:afterAutospacing="1" w:line="240" w:lineRule="auto"/>
+      </w:pPr>
+      <w:r>
+        <w:t>Sample scripts designated for proof</w:t>
+      </w:r>
+      <w:r>
+        <w:noBreakHyphen/>
+        <w:t>of</w:t>
+      </w:r>
+      <w:r>
+        <w:noBreakHyphen/>
+        <w:t>concept testing are in place.</w:t>
+      </w:r>
+    </w:p>
+    <w:p>
+      <w:pPr>
+        <w:numPr>
+          <w:ilvl w:val="0"/>
+          <w:numId w:val="117"/>
+        </w:numPr>
+        <w:spacing w:before="100" w:beforeAutospacing="1" w:after="100" w:afterAutospacing="1" w:line="240" w:lineRule="auto"/>
+      </w:pPr>
+      <w:r>
+        <w:t>Container runs, but Git remains absent.</w:t>
+      </w:r>
+    </w:p>
+    <w:p>
+      <w:pPr>
+        <w:numPr>
+          <w:ilvl w:val="0"/>
+          <w:numId w:val="117"/>
+        </w:numPr>
+        <w:spacing w:before="100" w:beforeAutospacing="1" w:after="100" w:afterAutospacing="1" w:line="240" w:lineRule="auto"/>
+      </w:pPr>
+      <w:r>
+        <w:t>Root cause unresolved: Dockerfile install step not applying as expected.</w:t>
+      </w:r>
+    </w:p>
+    <w:p>
+      <w:pPr>
+        <w:numPr>
+          <w:ilvl w:val="0"/>
+          <w:numId w:val="117"/>
+        </w:numPr>
+        <w:spacing w:before="100" w:beforeAutospacing="1" w:after="100" w:afterAutospacing="1" w:line="240" w:lineRule="auto"/>
+      </w:pPr>
+      <w:r>
+        <w:t>Currently deleted all incorrectly made images and containers.</w:t>
+      </w:r>
+    </w:p>
+    <w:p>
+      <w:pPr>
+        <w:spacing w:after="0"/>
+      </w:pPr>
+      <w:r>
+        <w:pict w14:anchorId="2410DC96">
+          <v:rect id="_x0000_i1129" style="width:0;height:1.5pt" o:hralign="center" o:hrstd="t" o:hr="t" fillcolor="#a0a0a0" stroked="f"/>
+        </w:pict>
+      </w:r>
+    </w:p>
+    <w:p>
+      <w:pPr>
+        <w:pStyle w:val="NormalWeb"/>
+      </w:pPr>
+      <w:r>
+        <w:rPr>
+          <w:rStyle w:val="Strong"/>
+        </w:rPr>
+        <w:t>Conclusion:</w:t>
+      </w:r>
+      <w:r>
+        <w:t xml:space="preserve"> </w:t>
+      </w:r>
+      <w:r>
+        <w:br/>
+        <w:t>Today’s session achieved environment cleanup, sample script preparation, and container rebuild. The proof</w:t>
+      </w:r>
+      <w:r>
+        <w:noBreakHyphen/>
+        <w:t>of</w:t>
+      </w:r>
+      <w:r>
+        <w:noBreakHyphen/>
+        <w:t>concept structure is established, but Git integration remains incomplete. Further debugging of the Dockerfile and base image selection is required before proceeding to AI</w:t>
+      </w:r>
+      <w:r>
+        <w:noBreakHyphen/>
+        <w:t>driven file edit validation. Over.</w:t>
+      </w:r>
+    </w:p>
+    <w:p>
+      <w:pPr>
+        <w:tabs>
+          <w:tab w:val="left" w:pos="3975"/>
+        </w:tabs>
+        <w:rPr>
+          <w:sz w:val="52"/>
+          <w:szCs w:val="52"/>
+        </w:rPr>
+      </w:pPr>
+    </w:p>
     <w:sectPr>
       <w:pgSz w:w="12240" w:h="15840"/>
       <w:pgMar w:top="1440" w:right="1440" w:bottom="1440" w:left="1440" w:header="720" w:footer="720" w:gutter="0"/>
@@ -23112,6 +25107,155 @@
     </w:lvl>
   </w:abstractNum>
   <w:abstractNum w:abstractNumId="6" w15:restartNumberingAfterBreak="0">
+    <w:nsid w:val="036A38FA"/>
+    <w:multiLevelType w:val="multilevel"/>
+    <w:tmpl w:val="28861F98"/>
+    <w:lvl w:ilvl="0">
+      <w:start w:val="1"/>
+      <w:numFmt w:val="bullet"/>
+      <w:lvlText w:val=""/>
+      <w:lvlJc w:val="left"/>
+      <w:pPr>
+        <w:tabs>
+          <w:tab w:val="num" w:pos="720"/>
+        </w:tabs>
+        <w:ind w:left="720" w:hanging="360"/>
+      </w:pPr>
+      <w:rPr>
+        <w:rFonts w:ascii="Symbol" w:hAnsi="Symbol" w:hint="default"/>
+        <w:sz w:val="20"/>
+      </w:rPr>
+    </w:lvl>
+    <w:lvl w:ilvl="1" w:tentative="1">
+      <w:start w:val="1"/>
+      <w:numFmt w:val="bullet"/>
+      <w:lvlText w:val="o"/>
+      <w:lvlJc w:val="left"/>
+      <w:pPr>
+        <w:tabs>
+          <w:tab w:val="num" w:pos="1440"/>
+        </w:tabs>
+        <w:ind w:left="1440" w:hanging="360"/>
+      </w:pPr>
+      <w:rPr>
+        <w:rFonts w:ascii="Courier New" w:hAnsi="Courier New" w:hint="default"/>
+        <w:sz w:val="20"/>
+      </w:rPr>
+    </w:lvl>
+    <w:lvl w:ilvl="2" w:tentative="1">
+      <w:start w:val="1"/>
+      <w:numFmt w:val="bullet"/>
+      <w:lvlText w:val=""/>
+      <w:lvlJc w:val="left"/>
+      <w:pPr>
+        <w:tabs>
+          <w:tab w:val="num" w:pos="2160"/>
+        </w:tabs>
+        <w:ind w:left="2160" w:hanging="360"/>
+      </w:pPr>
+      <w:rPr>
+        <w:rFonts w:ascii="Wingdings" w:hAnsi="Wingdings" w:hint="default"/>
+        <w:sz w:val="20"/>
+      </w:rPr>
+    </w:lvl>
+    <w:lvl w:ilvl="3" w:tentative="1">
+      <w:start w:val="1"/>
+      <w:numFmt w:val="bullet"/>
+      <w:lvlText w:val=""/>
+      <w:lvlJc w:val="left"/>
+      <w:pPr>
+        <w:tabs>
+          <w:tab w:val="num" w:pos="2880"/>
+        </w:tabs>
+        <w:ind w:left="2880" w:hanging="360"/>
+      </w:pPr>
+      <w:rPr>
+        <w:rFonts w:ascii="Wingdings" w:hAnsi="Wingdings" w:hint="default"/>
+        <w:sz w:val="20"/>
+      </w:rPr>
+    </w:lvl>
+    <w:lvl w:ilvl="4" w:tentative="1">
+      <w:start w:val="1"/>
+      <w:numFmt w:val="bullet"/>
+      <w:lvlText w:val=""/>
+      <w:lvlJc w:val="left"/>
+      <w:pPr>
+        <w:tabs>
+          <w:tab w:val="num" w:pos="3600"/>
+        </w:tabs>
+        <w:ind w:left="3600" w:hanging="360"/>
+      </w:pPr>
+      <w:rPr>
+        <w:rFonts w:ascii="Wingdings" w:hAnsi="Wingdings" w:hint="default"/>
+        <w:sz w:val="20"/>
+      </w:rPr>
+    </w:lvl>
+    <w:lvl w:ilvl="5" w:tentative="1">
+      <w:start w:val="1"/>
+      <w:numFmt w:val="bullet"/>
+      <w:lvlText w:val=""/>
+      <w:lvlJc w:val="left"/>
+      <w:pPr>
+        <w:tabs>
+          <w:tab w:val="num" w:pos="4320"/>
+        </w:tabs>
+        <w:ind w:left="4320" w:hanging="360"/>
+      </w:pPr>
+      <w:rPr>
+        <w:rFonts w:ascii="Wingdings" w:hAnsi="Wingdings" w:hint="default"/>
+        <w:sz w:val="20"/>
+      </w:rPr>
+    </w:lvl>
+    <w:lvl w:ilvl="6" w:tentative="1">
+      <w:start w:val="1"/>
+      <w:numFmt w:val="bullet"/>
+      <w:lvlText w:val=""/>
+      <w:lvlJc w:val="left"/>
+      <w:pPr>
+        <w:tabs>
+          <w:tab w:val="num" w:pos="5040"/>
+        </w:tabs>
+        <w:ind w:left="5040" w:hanging="360"/>
+      </w:pPr>
+      <w:rPr>
+        <w:rFonts w:ascii="Wingdings" w:hAnsi="Wingdings" w:hint="default"/>
+        <w:sz w:val="20"/>
+      </w:rPr>
+    </w:lvl>
+    <w:lvl w:ilvl="7" w:tentative="1">
+      <w:start w:val="1"/>
+      <w:numFmt w:val="bullet"/>
+      <w:lvlText w:val=""/>
+      <w:lvlJc w:val="left"/>
+      <w:pPr>
+        <w:tabs>
+          <w:tab w:val="num" w:pos="5760"/>
+        </w:tabs>
+        <w:ind w:left="5760" w:hanging="360"/>
+      </w:pPr>
+      <w:rPr>
+        <w:rFonts w:ascii="Wingdings" w:hAnsi="Wingdings" w:hint="default"/>
+        <w:sz w:val="20"/>
+      </w:rPr>
+    </w:lvl>
+    <w:lvl w:ilvl="8" w:tentative="1">
+      <w:start w:val="1"/>
+      <w:numFmt w:val="bullet"/>
+      <w:lvlText w:val=""/>
+      <w:lvlJc w:val="left"/>
+      <w:pPr>
+        <w:tabs>
+          <w:tab w:val="num" w:pos="6480"/>
+        </w:tabs>
+        <w:ind w:left="6480" w:hanging="360"/>
+      </w:pPr>
+      <w:rPr>
+        <w:rFonts w:ascii="Wingdings" w:hAnsi="Wingdings" w:hint="default"/>
+        <w:sz w:val="20"/>
+      </w:rPr>
+    </w:lvl>
+  </w:abstractNum>
+  <w:abstractNum w:abstractNumId="7" w15:restartNumberingAfterBreak="0">
     <w:nsid w:val="03E52080"/>
     <w:multiLevelType w:val="multilevel"/>
     <w:tmpl w:val="1CD430A8"/>
@@ -23260,7 +25404,7 @@
       </w:rPr>
     </w:lvl>
   </w:abstractNum>
-  <w:abstractNum w:abstractNumId="7" w15:restartNumberingAfterBreak="0">
+  <w:abstractNum w:abstractNumId="8" w15:restartNumberingAfterBreak="0">
     <w:nsid w:val="0557090F"/>
     <w:multiLevelType w:val="multilevel"/>
     <w:tmpl w:val="63C02DB8"/>
@@ -23409,7 +25553,7 @@
       </w:rPr>
     </w:lvl>
   </w:abstractNum>
-  <w:abstractNum w:abstractNumId="8" w15:restartNumberingAfterBreak="0">
+  <w:abstractNum w:abstractNumId="9" w15:restartNumberingAfterBreak="0">
     <w:nsid w:val="0E5D3725"/>
     <w:multiLevelType w:val="multilevel"/>
     <w:tmpl w:val="A94A1D8E"/>
@@ -23558,7 +25702,7 @@
       </w:rPr>
     </w:lvl>
   </w:abstractNum>
-  <w:abstractNum w:abstractNumId="9" w15:restartNumberingAfterBreak="0">
+  <w:abstractNum w:abstractNumId="10" w15:restartNumberingAfterBreak="0">
     <w:nsid w:val="111751D8"/>
     <w:multiLevelType w:val="multilevel"/>
     <w:tmpl w:val="066CDE22"/>
@@ -23707,7 +25851,7 @@
       </w:rPr>
     </w:lvl>
   </w:abstractNum>
-  <w:abstractNum w:abstractNumId="10" w15:restartNumberingAfterBreak="0">
+  <w:abstractNum w:abstractNumId="11" w15:restartNumberingAfterBreak="0">
     <w:nsid w:val="152A2023"/>
     <w:multiLevelType w:val="multilevel"/>
     <w:tmpl w:val="2738F738"/>
@@ -23856,7 +26000,7 @@
       </w:rPr>
     </w:lvl>
   </w:abstractNum>
-  <w:abstractNum w:abstractNumId="11" w15:restartNumberingAfterBreak="0">
+  <w:abstractNum w:abstractNumId="12" w15:restartNumberingAfterBreak="0">
     <w:nsid w:val="170F5AFB"/>
     <w:multiLevelType w:val="multilevel"/>
     <w:tmpl w:val="4FA0166C"/>
@@ -24005,7 +26149,7 @@
       </w:rPr>
     </w:lvl>
   </w:abstractNum>
-  <w:abstractNum w:abstractNumId="12" w15:restartNumberingAfterBreak="0">
+  <w:abstractNum w:abstractNumId="13" w15:restartNumberingAfterBreak="0">
     <w:nsid w:val="181C309E"/>
     <w:multiLevelType w:val="multilevel"/>
     <w:tmpl w:val="CCE8601C"/>
@@ -24154,7 +26298,7 @@
       </w:rPr>
     </w:lvl>
   </w:abstractNum>
-  <w:abstractNum w:abstractNumId="13" w15:restartNumberingAfterBreak="0">
+  <w:abstractNum w:abstractNumId="14" w15:restartNumberingAfterBreak="0">
     <w:nsid w:val="186B7A88"/>
     <w:multiLevelType w:val="multilevel"/>
     <w:tmpl w:val="1B7CC96C"/>
@@ -24303,7 +26447,7 @@
       </w:rPr>
     </w:lvl>
   </w:abstractNum>
-  <w:abstractNum w:abstractNumId="14" w15:restartNumberingAfterBreak="0">
+  <w:abstractNum w:abstractNumId="15" w15:restartNumberingAfterBreak="0">
     <w:nsid w:val="197726C7"/>
     <w:multiLevelType w:val="multilevel"/>
     <w:tmpl w:val="AE242412"/>
@@ -24452,7 +26596,7 @@
       </w:rPr>
     </w:lvl>
   </w:abstractNum>
-  <w:abstractNum w:abstractNumId="15" w15:restartNumberingAfterBreak="0">
+  <w:abstractNum w:abstractNumId="16" w15:restartNumberingAfterBreak="0">
     <w:nsid w:val="19AC19A5"/>
     <w:multiLevelType w:val="multilevel"/>
     <w:tmpl w:val="00E472B4"/>
@@ -24601,7 +26745,7 @@
       </w:rPr>
     </w:lvl>
   </w:abstractNum>
-  <w:abstractNum w:abstractNumId="16" w15:restartNumberingAfterBreak="0">
+  <w:abstractNum w:abstractNumId="17" w15:restartNumberingAfterBreak="0">
     <w:nsid w:val="19BB5737"/>
     <w:multiLevelType w:val="multilevel"/>
     <w:tmpl w:val="6178B8B0"/>
@@ -24750,7 +26894,7 @@
       </w:rPr>
     </w:lvl>
   </w:abstractNum>
-  <w:abstractNum w:abstractNumId="17" w15:restartNumberingAfterBreak="0">
+  <w:abstractNum w:abstractNumId="18" w15:restartNumberingAfterBreak="0">
     <w:nsid w:val="1BD9187E"/>
     <w:multiLevelType w:val="multilevel"/>
     <w:tmpl w:val="8BC48AB0"/>
@@ -24899,7 +27043,7 @@
       </w:rPr>
     </w:lvl>
   </w:abstractNum>
-  <w:abstractNum w:abstractNumId="18" w15:restartNumberingAfterBreak="0">
+  <w:abstractNum w:abstractNumId="19" w15:restartNumberingAfterBreak="0">
     <w:nsid w:val="1CDD0AC9"/>
     <w:multiLevelType w:val="multilevel"/>
     <w:tmpl w:val="077A5326"/>
@@ -25048,7 +27192,124 @@
       </w:rPr>
     </w:lvl>
   </w:abstractNum>
-  <w:abstractNum w:abstractNumId="19" w15:restartNumberingAfterBreak="0">
+  <w:abstractNum w:abstractNumId="20" w15:restartNumberingAfterBreak="0">
+    <w:nsid w:val="1D5E6354"/>
+    <w:multiLevelType w:val="multilevel"/>
+    <w:tmpl w:val="B476C586"/>
+    <w:lvl w:ilvl="0">
+      <w:start w:val="1"/>
+      <w:numFmt w:val="decimal"/>
+      <w:lvlText w:val="%1."/>
+      <w:lvlJc w:val="left"/>
+      <w:pPr>
+        <w:tabs>
+          <w:tab w:val="num" w:pos="720"/>
+        </w:tabs>
+        <w:ind w:left="720" w:hanging="360"/>
+      </w:pPr>
+    </w:lvl>
+    <w:lvl w:ilvl="1">
+      <w:start w:val="1"/>
+      <w:numFmt w:val="bullet"/>
+      <w:lvlText w:val="o"/>
+      <w:lvlJc w:val="left"/>
+      <w:pPr>
+        <w:tabs>
+          <w:tab w:val="num" w:pos="1440"/>
+        </w:tabs>
+        <w:ind w:left="1440" w:hanging="360"/>
+      </w:pPr>
+      <w:rPr>
+        <w:rFonts w:ascii="Courier New" w:hAnsi="Courier New" w:hint="default"/>
+        <w:sz w:val="20"/>
+      </w:rPr>
+    </w:lvl>
+    <w:lvl w:ilvl="2" w:tentative="1">
+      <w:start w:val="1"/>
+      <w:numFmt w:val="decimal"/>
+      <w:lvlText w:val="%3."/>
+      <w:lvlJc w:val="left"/>
+      <w:pPr>
+        <w:tabs>
+          <w:tab w:val="num" w:pos="2160"/>
+        </w:tabs>
+        <w:ind w:left="2160" w:hanging="360"/>
+      </w:pPr>
+    </w:lvl>
+    <w:lvl w:ilvl="3" w:tentative="1">
+      <w:start w:val="1"/>
+      <w:numFmt w:val="decimal"/>
+      <w:lvlText w:val="%4."/>
+      <w:lvlJc w:val="left"/>
+      <w:pPr>
+        <w:tabs>
+          <w:tab w:val="num" w:pos="2880"/>
+        </w:tabs>
+        <w:ind w:left="2880" w:hanging="360"/>
+      </w:pPr>
+    </w:lvl>
+    <w:lvl w:ilvl="4" w:tentative="1">
+      <w:start w:val="1"/>
+      <w:numFmt w:val="decimal"/>
+      <w:lvlText w:val="%5."/>
+      <w:lvlJc w:val="left"/>
+      <w:pPr>
+        <w:tabs>
+          <w:tab w:val="num" w:pos="3600"/>
+        </w:tabs>
+        <w:ind w:left="3600" w:hanging="360"/>
+      </w:pPr>
+    </w:lvl>
+    <w:lvl w:ilvl="5" w:tentative="1">
+      <w:start w:val="1"/>
+      <w:numFmt w:val="decimal"/>
+      <w:lvlText w:val="%6."/>
+      <w:lvlJc w:val="left"/>
+      <w:pPr>
+        <w:tabs>
+          <w:tab w:val="num" w:pos="4320"/>
+        </w:tabs>
+        <w:ind w:left="4320" w:hanging="360"/>
+      </w:pPr>
+    </w:lvl>
+    <w:lvl w:ilvl="6" w:tentative="1">
+      <w:start w:val="1"/>
+      <w:numFmt w:val="decimal"/>
+      <w:lvlText w:val="%7."/>
+      <w:lvlJc w:val="left"/>
+      <w:pPr>
+        <w:tabs>
+          <w:tab w:val="num" w:pos="5040"/>
+        </w:tabs>
+        <w:ind w:left="5040" w:hanging="360"/>
+      </w:pPr>
+    </w:lvl>
+    <w:lvl w:ilvl="7" w:tentative="1">
+      <w:start w:val="1"/>
+      <w:numFmt w:val="decimal"/>
+      <w:lvlText w:val="%8."/>
+      <w:lvlJc w:val="left"/>
+      <w:pPr>
+        <w:tabs>
+          <w:tab w:val="num" w:pos="5760"/>
+        </w:tabs>
+        <w:ind w:left="5760" w:hanging="360"/>
+      </w:pPr>
+    </w:lvl>
+    <w:lvl w:ilvl="8" w:tentative="1">
+      <w:start w:val="1"/>
+      <w:numFmt w:val="decimal"/>
+      <w:lvlText w:val="%9."/>
+      <w:lvlJc w:val="left"/>
+      <w:pPr>
+        <w:tabs>
+          <w:tab w:val="num" w:pos="6480"/>
+        </w:tabs>
+        <w:ind w:left="6480" w:hanging="360"/>
+      </w:pPr>
+    </w:lvl>
+  </w:abstractNum>
+  <w:abstractNum w:abstractNumId="21" w15:restartNumberingAfterBreak="0">
     <w:nsid w:val="1D9346C8"/>
     <w:multiLevelType w:val="multilevel"/>
     <w:tmpl w:val="79A2C96A"/>
@@ -25197,7 +27458,7 @@
       </w:rPr>
     </w:lvl>
   </w:abstractNum>
-  <w:abstractNum w:abstractNumId="20" w15:restartNumberingAfterBreak="0">
+  <w:abstractNum w:abstractNumId="22" w15:restartNumberingAfterBreak="0">
     <w:nsid w:val="1E02629D"/>
     <w:multiLevelType w:val="multilevel"/>
     <w:tmpl w:val="FD181AAE"/>
@@ -25346,7 +27607,7 @@
       </w:rPr>
     </w:lvl>
   </w:abstractNum>
-  <w:abstractNum w:abstractNumId="21" w15:restartNumberingAfterBreak="0">
+  <w:abstractNum w:abstractNumId="23" w15:restartNumberingAfterBreak="0">
     <w:nsid w:val="1EE270C9"/>
     <w:multiLevelType w:val="multilevel"/>
     <w:tmpl w:val="18B0953A"/>
@@ -25495,7 +27756,7 @@
       </w:rPr>
     </w:lvl>
   </w:abstractNum>
-  <w:abstractNum w:abstractNumId="22" w15:restartNumberingAfterBreak="0">
+  <w:abstractNum w:abstractNumId="24" w15:restartNumberingAfterBreak="0">
     <w:nsid w:val="1FC15C87"/>
     <w:multiLevelType w:val="multilevel"/>
     <w:tmpl w:val="ED94D9EA"/>
@@ -25644,7 +27905,7 @@
       </w:rPr>
     </w:lvl>
   </w:abstractNum>
-  <w:abstractNum w:abstractNumId="23" w15:restartNumberingAfterBreak="0">
+  <w:abstractNum w:abstractNumId="25" w15:restartNumberingAfterBreak="0">
     <w:nsid w:val="20662D03"/>
     <w:multiLevelType w:val="multilevel"/>
     <w:tmpl w:val="F9A825EE"/>
@@ -25765,7 +28026,7 @@
       </w:pPr>
     </w:lvl>
   </w:abstractNum>
-  <w:abstractNum w:abstractNumId="24" w15:restartNumberingAfterBreak="0">
+  <w:abstractNum w:abstractNumId="26" w15:restartNumberingAfterBreak="0">
     <w:nsid w:val="21A15432"/>
     <w:multiLevelType w:val="multilevel"/>
     <w:tmpl w:val="8AC29B36"/>
@@ -25914,7 +28175,156 @@
       </w:rPr>
     </w:lvl>
   </w:abstractNum>
-  <w:abstractNum w:abstractNumId="25" w15:restartNumberingAfterBreak="0">
+  <w:abstractNum w:abstractNumId="27" w15:restartNumberingAfterBreak="0">
+    <w:nsid w:val="21E91138"/>
+    <w:multiLevelType w:val="multilevel"/>
+    <w:tmpl w:val="891EEEFC"/>
+    <w:lvl w:ilvl="0">
+      <w:start w:val="1"/>
+      <w:numFmt w:val="bullet"/>
+      <w:lvlText w:val=""/>
+      <w:lvlJc w:val="left"/>
+      <w:pPr>
+        <w:tabs>
+          <w:tab w:val="num" w:pos="720"/>
+        </w:tabs>
+        <w:ind w:left="720" w:hanging="360"/>
+      </w:pPr>
+      <w:rPr>
+        <w:rFonts w:ascii="Symbol" w:hAnsi="Symbol" w:hint="default"/>
+        <w:sz w:val="20"/>
+      </w:rPr>
+    </w:lvl>
+    <w:lvl w:ilvl="1" w:tentative="1">
+      <w:start w:val="1"/>
+      <w:numFmt w:val="bullet"/>
+      <w:lvlText w:val="o"/>
+      <w:lvlJc w:val="left"/>
+      <w:pPr>
+        <w:tabs>
+          <w:tab w:val="num" w:pos="1440"/>
+        </w:tabs>
+        <w:ind w:left="1440" w:hanging="360"/>
+      </w:pPr>
+      <w:rPr>
+        <w:rFonts w:ascii="Courier New" w:hAnsi="Courier New" w:hint="default"/>
+        <w:sz w:val="20"/>
+      </w:rPr>
+    </w:lvl>
+    <w:lvl w:ilvl="2" w:tentative="1">
+      <w:start w:val="1"/>
+      <w:numFmt w:val="bullet"/>
+      <w:lvlText w:val=""/>
+      <w:lvlJc w:val="left"/>
+      <w:pPr>
+        <w:tabs>
+          <w:tab w:val="num" w:pos="2160"/>
+        </w:tabs>
+        <w:ind w:left="2160" w:hanging="360"/>
+      </w:pPr>
+      <w:rPr>
+        <w:rFonts w:ascii="Wingdings" w:hAnsi="Wingdings" w:hint="default"/>
+        <w:sz w:val="20"/>
+      </w:rPr>
+    </w:lvl>
+    <w:lvl w:ilvl="3" w:tentative="1">
+      <w:start w:val="1"/>
+      <w:numFmt w:val="bullet"/>
+      <w:lvlText w:val=""/>
+      <w:lvlJc w:val="left"/>
+      <w:pPr>
+        <w:tabs>
+          <w:tab w:val="num" w:pos="2880"/>
+        </w:tabs>
+        <w:ind w:left="2880" w:hanging="360"/>
+      </w:pPr>
+      <w:rPr>
+        <w:rFonts w:ascii="Wingdings" w:hAnsi="Wingdings" w:hint="default"/>
+        <w:sz w:val="20"/>
+      </w:rPr>
+    </w:lvl>
+    <w:lvl w:ilvl="4" w:tentative="1">
+      <w:start w:val="1"/>
+      <w:numFmt w:val="bullet"/>
+      <w:lvlText w:val=""/>
+      <w:lvlJc w:val="left"/>
+      <w:pPr>
+        <w:tabs>
+          <w:tab w:val="num" w:pos="3600"/>
+        </w:tabs>
+        <w:ind w:left="3600" w:hanging="360"/>
+      </w:pPr>
+      <w:rPr>
+        <w:rFonts w:ascii="Wingdings" w:hAnsi="Wingdings" w:hint="default"/>
+        <w:sz w:val="20"/>
+      </w:rPr>
+    </w:lvl>
+    <w:lvl w:ilvl="5" w:tentative="1">
+      <w:start w:val="1"/>
+      <w:numFmt w:val="bullet"/>
+      <w:lvlText w:val=""/>
+      <w:lvlJc w:val="left"/>
+      <w:pPr>
+        <w:tabs>
+          <w:tab w:val="num" w:pos="4320"/>
+        </w:tabs>
+        <w:ind w:left="4320" w:hanging="360"/>
+      </w:pPr>
+      <w:rPr>
+        <w:rFonts w:ascii="Wingdings" w:hAnsi="Wingdings" w:hint="default"/>
+        <w:sz w:val="20"/>
+      </w:rPr>
+    </w:lvl>
+    <w:lvl w:ilvl="6" w:tentative="1">
+      <w:start w:val="1"/>
+      <w:numFmt w:val="bullet"/>
+      <w:lvlText w:val=""/>
+      <w:lvlJc w:val="left"/>
+      <w:pPr>
+        <w:tabs>
+          <w:tab w:val="num" w:pos="5040"/>
+        </w:tabs>
+        <w:ind w:left="5040" w:hanging="360"/>
+      </w:pPr>
+      <w:rPr>
+        <w:rFonts w:ascii="Wingdings" w:hAnsi="Wingdings" w:hint="default"/>
+        <w:sz w:val="20"/>
+      </w:rPr>
+    </w:lvl>
+    <w:lvl w:ilvl="7" w:tentative="1">
+      <w:start w:val="1"/>
+      <w:numFmt w:val="bullet"/>
+      <w:lvlText w:val=""/>
+      <w:lvlJc w:val="left"/>
+      <w:pPr>
+        <w:tabs>
+          <w:tab w:val="num" w:pos="5760"/>
+        </w:tabs>
+        <w:ind w:left="5760" w:hanging="360"/>
+      </w:pPr>
+      <w:rPr>
+        <w:rFonts w:ascii="Wingdings" w:hAnsi="Wingdings" w:hint="default"/>
+        <w:sz w:val="20"/>
+      </w:rPr>
+    </w:lvl>
+    <w:lvl w:ilvl="8" w:tentative="1">
+      <w:start w:val="1"/>
+      <w:numFmt w:val="bullet"/>
+      <w:lvlText w:val=""/>
+      <w:lvlJc w:val="left"/>
+      <w:pPr>
+        <w:tabs>
+          <w:tab w:val="num" w:pos="6480"/>
+        </w:tabs>
+        <w:ind w:left="6480" w:hanging="360"/>
+      </w:pPr>
+      <w:rPr>
+        <w:rFonts w:ascii="Wingdings" w:hAnsi="Wingdings" w:hint="default"/>
+        <w:sz w:val="20"/>
+      </w:rPr>
+    </w:lvl>
+  </w:abstractNum>
+  <w:abstractNum w:abstractNumId="28" w15:restartNumberingAfterBreak="0">
     <w:nsid w:val="234E24EF"/>
     <w:multiLevelType w:val="multilevel"/>
     <w:tmpl w:val="42FC2EEE"/>
@@ -26063,7 +28473,7 @@
       </w:rPr>
     </w:lvl>
   </w:abstractNum>
-  <w:abstractNum w:abstractNumId="26" w15:restartNumberingAfterBreak="0">
+  <w:abstractNum w:abstractNumId="29" w15:restartNumberingAfterBreak="0">
     <w:nsid w:val="26BC218B"/>
     <w:multiLevelType w:val="multilevel"/>
     <w:tmpl w:val="04F0A698"/>
@@ -26212,7 +28622,7 @@
       </w:rPr>
     </w:lvl>
   </w:abstractNum>
-  <w:abstractNum w:abstractNumId="27" w15:restartNumberingAfterBreak="0">
+  <w:abstractNum w:abstractNumId="30" w15:restartNumberingAfterBreak="0">
     <w:nsid w:val="29903720"/>
     <w:multiLevelType w:val="multilevel"/>
     <w:tmpl w:val="E69469C6"/>
@@ -26361,7 +28771,7 @@
       </w:rPr>
     </w:lvl>
   </w:abstractNum>
-  <w:abstractNum w:abstractNumId="28" w15:restartNumberingAfterBreak="0">
+  <w:abstractNum w:abstractNumId="31" w15:restartNumberingAfterBreak="0">
     <w:nsid w:val="2A037951"/>
     <w:multiLevelType w:val="multilevel"/>
     <w:tmpl w:val="F6744FDA"/>
@@ -26510,7 +28920,7 @@
       </w:rPr>
     </w:lvl>
   </w:abstractNum>
-  <w:abstractNum w:abstractNumId="29" w15:restartNumberingAfterBreak="0">
+  <w:abstractNum w:abstractNumId="32" w15:restartNumberingAfterBreak="0">
     <w:nsid w:val="2A3F6EC5"/>
     <w:multiLevelType w:val="multilevel"/>
     <w:tmpl w:val="A23200A8"/>
@@ -26659,7 +29069,7 @@
       </w:rPr>
     </w:lvl>
   </w:abstractNum>
-  <w:abstractNum w:abstractNumId="30" w15:restartNumberingAfterBreak="0">
+  <w:abstractNum w:abstractNumId="33" w15:restartNumberingAfterBreak="0">
     <w:nsid w:val="2A734B97"/>
     <w:multiLevelType w:val="multilevel"/>
     <w:tmpl w:val="485C79BE"/>
@@ -26808,7 +29218,7 @@
       </w:rPr>
     </w:lvl>
   </w:abstractNum>
-  <w:abstractNum w:abstractNumId="31" w15:restartNumberingAfterBreak="0">
+  <w:abstractNum w:abstractNumId="34" w15:restartNumberingAfterBreak="0">
     <w:nsid w:val="2B50577F"/>
     <w:multiLevelType w:val="multilevel"/>
     <w:tmpl w:val="CB807694"/>
@@ -26929,7 +29339,7 @@
       </w:pPr>
     </w:lvl>
   </w:abstractNum>
-  <w:abstractNum w:abstractNumId="32" w15:restartNumberingAfterBreak="0">
+  <w:abstractNum w:abstractNumId="35" w15:restartNumberingAfterBreak="0">
     <w:nsid w:val="2B686062"/>
     <w:multiLevelType w:val="multilevel"/>
     <w:tmpl w:val="BD9C8A84"/>
@@ -27078,7 +29488,7 @@
       </w:rPr>
     </w:lvl>
   </w:abstractNum>
-  <w:abstractNum w:abstractNumId="33" w15:restartNumberingAfterBreak="0">
+  <w:abstractNum w:abstractNumId="36" w15:restartNumberingAfterBreak="0">
     <w:nsid w:val="2BBC7F70"/>
     <w:multiLevelType w:val="multilevel"/>
     <w:tmpl w:val="5ABC69CA"/>
@@ -27227,7 +29637,7 @@
       </w:rPr>
     </w:lvl>
   </w:abstractNum>
-  <w:abstractNum w:abstractNumId="34" w15:restartNumberingAfterBreak="0">
+  <w:abstractNum w:abstractNumId="37" w15:restartNumberingAfterBreak="0">
     <w:nsid w:val="2CCC4F7C"/>
     <w:multiLevelType w:val="multilevel"/>
     <w:tmpl w:val="26A29416"/>
@@ -27376,7 +29786,7 @@
       </w:rPr>
     </w:lvl>
   </w:abstractNum>
-  <w:abstractNum w:abstractNumId="35" w15:restartNumberingAfterBreak="0">
+  <w:abstractNum w:abstractNumId="38" w15:restartNumberingAfterBreak="0">
     <w:nsid w:val="2D2E6985"/>
     <w:multiLevelType w:val="multilevel"/>
     <w:tmpl w:val="D416F21A"/>
@@ -27525,7 +29935,156 @@
       </w:rPr>
     </w:lvl>
   </w:abstractNum>
-  <w:abstractNum w:abstractNumId="36" w15:restartNumberingAfterBreak="0">
+  <w:abstractNum w:abstractNumId="39" w15:restartNumberingAfterBreak="0">
+    <w:nsid w:val="2F4A6E99"/>
+    <w:multiLevelType w:val="multilevel"/>
+    <w:tmpl w:val="4560F894"/>
+    <w:lvl w:ilvl="0">
+      <w:start w:val="1"/>
+      <w:numFmt w:val="bullet"/>
+      <w:lvlText w:val=""/>
+      <w:lvlJc w:val="left"/>
+      <w:pPr>
+        <w:tabs>
+          <w:tab w:val="num" w:pos="720"/>
+        </w:tabs>
+        <w:ind w:left="720" w:hanging="360"/>
+      </w:pPr>
+      <w:rPr>
+        <w:rFonts w:ascii="Symbol" w:hAnsi="Symbol" w:hint="default"/>
+        <w:sz w:val="20"/>
+      </w:rPr>
+    </w:lvl>
+    <w:lvl w:ilvl="1" w:tentative="1">
+      <w:start w:val="1"/>
+      <w:numFmt w:val="bullet"/>
+      <w:lvlText w:val="o"/>
+      <w:lvlJc w:val="left"/>
+      <w:pPr>
+        <w:tabs>
+          <w:tab w:val="num" w:pos="1440"/>
+        </w:tabs>
+        <w:ind w:left="1440" w:hanging="360"/>
+      </w:pPr>
+      <w:rPr>
+        <w:rFonts w:ascii="Courier New" w:hAnsi="Courier New" w:hint="default"/>
+        <w:sz w:val="20"/>
+      </w:rPr>
+    </w:lvl>
+    <w:lvl w:ilvl="2" w:tentative="1">
+      <w:start w:val="1"/>
+      <w:numFmt w:val="bullet"/>
+      <w:lvlText w:val=""/>
+      <w:lvlJc w:val="left"/>
+      <w:pPr>
+        <w:tabs>
+          <w:tab w:val="num" w:pos="2160"/>
+        </w:tabs>
+        <w:ind w:left="2160" w:hanging="360"/>
+      </w:pPr>
+      <w:rPr>
+        <w:rFonts w:ascii="Wingdings" w:hAnsi="Wingdings" w:hint="default"/>
+        <w:sz w:val="20"/>
+      </w:rPr>
+    </w:lvl>
+    <w:lvl w:ilvl="3" w:tentative="1">
+      <w:start w:val="1"/>
+      <w:numFmt w:val="bullet"/>
+      <w:lvlText w:val=""/>
+      <w:lvlJc w:val="left"/>
+      <w:pPr>
+        <w:tabs>
+          <w:tab w:val="num" w:pos="2880"/>
+        </w:tabs>
+        <w:ind w:left="2880" w:hanging="360"/>
+      </w:pPr>
+      <w:rPr>
+        <w:rFonts w:ascii="Wingdings" w:hAnsi="Wingdings" w:hint="default"/>
+        <w:sz w:val="20"/>
+      </w:rPr>
+    </w:lvl>
+    <w:lvl w:ilvl="4" w:tentative="1">
+      <w:start w:val="1"/>
+      <w:numFmt w:val="bullet"/>
+      <w:lvlText w:val=""/>
+      <w:lvlJc w:val="left"/>
+      <w:pPr>
+        <w:tabs>
+          <w:tab w:val="num" w:pos="3600"/>
+        </w:tabs>
+        <w:ind w:left="3600" w:hanging="360"/>
+      </w:pPr>
+      <w:rPr>
+        <w:rFonts w:ascii="Wingdings" w:hAnsi="Wingdings" w:hint="default"/>
+        <w:sz w:val="20"/>
+      </w:rPr>
+    </w:lvl>
+    <w:lvl w:ilvl="5" w:tentative="1">
+      <w:start w:val="1"/>
+      <w:numFmt w:val="bullet"/>
+      <w:lvlText w:val=""/>
+      <w:lvlJc w:val="left"/>
+      <w:pPr>
+        <w:tabs>
+          <w:tab w:val="num" w:pos="4320"/>
+        </w:tabs>
+        <w:ind w:left="4320" w:hanging="360"/>
+      </w:pPr>
+      <w:rPr>
+        <w:rFonts w:ascii="Wingdings" w:hAnsi="Wingdings" w:hint="default"/>
+        <w:sz w:val="20"/>
+      </w:rPr>
+    </w:lvl>
+    <w:lvl w:ilvl="6" w:tentative="1">
+      <w:start w:val="1"/>
+      <w:numFmt w:val="bullet"/>
+      <w:lvlText w:val=""/>
+      <w:lvlJc w:val="left"/>
+      <w:pPr>
+        <w:tabs>
+          <w:tab w:val="num" w:pos="5040"/>
+        </w:tabs>
+        <w:ind w:left="5040" w:hanging="360"/>
+      </w:pPr>
+      <w:rPr>
+        <w:rFonts w:ascii="Wingdings" w:hAnsi="Wingdings" w:hint="default"/>
+        <w:sz w:val="20"/>
+      </w:rPr>
+    </w:lvl>
+    <w:lvl w:ilvl="7" w:tentative="1">
+      <w:start w:val="1"/>
+      <w:numFmt w:val="bullet"/>
+      <w:lvlText w:val=""/>
+      <w:lvlJc w:val="left"/>
+      <w:pPr>
+        <w:tabs>
+          <w:tab w:val="num" w:pos="5760"/>
+        </w:tabs>
+        <w:ind w:left="5760" w:hanging="360"/>
+      </w:pPr>
+      <w:rPr>
+        <w:rFonts w:ascii="Wingdings" w:hAnsi="Wingdings" w:hint="default"/>
+        <w:sz w:val="20"/>
+      </w:rPr>
+    </w:lvl>
+    <w:lvl w:ilvl="8" w:tentative="1">
+      <w:start w:val="1"/>
+      <w:numFmt w:val="bullet"/>
+      <w:lvlText w:val=""/>
+      <w:lvlJc w:val="left"/>
+      <w:pPr>
+        <w:tabs>
+          <w:tab w:val="num" w:pos="6480"/>
+        </w:tabs>
+        <w:ind w:left="6480" w:hanging="360"/>
+      </w:pPr>
+      <w:rPr>
+        <w:rFonts w:ascii="Wingdings" w:hAnsi="Wingdings" w:hint="default"/>
+        <w:sz w:val="20"/>
+      </w:rPr>
+    </w:lvl>
+  </w:abstractNum>
+  <w:abstractNum w:abstractNumId="40" w15:restartNumberingAfterBreak="0">
     <w:nsid w:val="30A975E7"/>
     <w:multiLevelType w:val="multilevel"/>
     <w:tmpl w:val="EB92C834"/>
@@ -27674,7 +30233,156 @@
       </w:rPr>
     </w:lvl>
   </w:abstractNum>
-  <w:abstractNum w:abstractNumId="37" w15:restartNumberingAfterBreak="0">
+  <w:abstractNum w:abstractNumId="41" w15:restartNumberingAfterBreak="0">
+    <w:nsid w:val="30F1399F"/>
+    <w:multiLevelType w:val="multilevel"/>
+    <w:tmpl w:val="841EDFE0"/>
+    <w:lvl w:ilvl="0">
+      <w:start w:val="1"/>
+      <w:numFmt w:val="bullet"/>
+      <w:lvlText w:val=""/>
+      <w:lvlJc w:val="left"/>
+      <w:pPr>
+        <w:tabs>
+          <w:tab w:val="num" w:pos="720"/>
+        </w:tabs>
+        <w:ind w:left="720" w:hanging="360"/>
+      </w:pPr>
+      <w:rPr>
+        <w:rFonts w:ascii="Symbol" w:hAnsi="Symbol" w:hint="default"/>
+        <w:sz w:val="20"/>
+      </w:rPr>
+    </w:lvl>
+    <w:lvl w:ilvl="1" w:tentative="1">
+      <w:start w:val="1"/>
+      <w:numFmt w:val="bullet"/>
+      <w:lvlText w:val="o"/>
+      <w:lvlJc w:val="left"/>
+      <w:pPr>
+        <w:tabs>
+          <w:tab w:val="num" w:pos="1440"/>
+        </w:tabs>
+        <w:ind w:left="1440" w:hanging="360"/>
+      </w:pPr>
+      <w:rPr>
+        <w:rFonts w:ascii="Courier New" w:hAnsi="Courier New" w:hint="default"/>
+        <w:sz w:val="20"/>
+      </w:rPr>
+    </w:lvl>
+    <w:lvl w:ilvl="2" w:tentative="1">
+      <w:start w:val="1"/>
+      <w:numFmt w:val="bullet"/>
+      <w:lvlText w:val=""/>
+      <w:lvlJc w:val="left"/>
+      <w:pPr>
+        <w:tabs>
+          <w:tab w:val="num" w:pos="2160"/>
+        </w:tabs>
+        <w:ind w:left="2160" w:hanging="360"/>
+      </w:pPr>
+      <w:rPr>
+        <w:rFonts w:ascii="Wingdings" w:hAnsi="Wingdings" w:hint="default"/>
+        <w:sz w:val="20"/>
+      </w:rPr>
+    </w:lvl>
+    <w:lvl w:ilvl="3" w:tentative="1">
+      <w:start w:val="1"/>
+      <w:numFmt w:val="bullet"/>
+      <w:lvlText w:val=""/>
+      <w:lvlJc w:val="left"/>
+      <w:pPr>
+        <w:tabs>
+          <w:tab w:val="num" w:pos="2880"/>
+        </w:tabs>
+        <w:ind w:left="2880" w:hanging="360"/>
+      </w:pPr>
+      <w:rPr>
+        <w:rFonts w:ascii="Wingdings" w:hAnsi="Wingdings" w:hint="default"/>
+        <w:sz w:val="20"/>
+      </w:rPr>
+    </w:lvl>
+    <w:lvl w:ilvl="4" w:tentative="1">
+      <w:start w:val="1"/>
+      <w:numFmt w:val="bullet"/>
+      <w:lvlText w:val=""/>
+      <w:lvlJc w:val="left"/>
+      <w:pPr>
+        <w:tabs>
+          <w:tab w:val="num" w:pos="3600"/>
+        </w:tabs>
+        <w:ind w:left="3600" w:hanging="360"/>
+      </w:pPr>
+      <w:rPr>
+        <w:rFonts w:ascii="Wingdings" w:hAnsi="Wingdings" w:hint="default"/>
+        <w:sz w:val="20"/>
+      </w:rPr>
+    </w:lvl>
+    <w:lvl w:ilvl="5" w:tentative="1">
+      <w:start w:val="1"/>
+      <w:numFmt w:val="bullet"/>
+      <w:lvlText w:val=""/>
+      <w:lvlJc w:val="left"/>
+      <w:pPr>
+        <w:tabs>
+          <w:tab w:val="num" w:pos="4320"/>
+        </w:tabs>
+        <w:ind w:left="4320" w:hanging="360"/>
+      </w:pPr>
+      <w:rPr>
+        <w:rFonts w:ascii="Wingdings" w:hAnsi="Wingdings" w:hint="default"/>
+        <w:sz w:val="20"/>
+      </w:rPr>
+    </w:lvl>
+    <w:lvl w:ilvl="6" w:tentative="1">
+      <w:start w:val="1"/>
+      <w:numFmt w:val="bullet"/>
+      <w:lvlText w:val=""/>
+      <w:lvlJc w:val="left"/>
+      <w:pPr>
+        <w:tabs>
+          <w:tab w:val="num" w:pos="5040"/>
+        </w:tabs>
+        <w:ind w:left="5040" w:hanging="360"/>
+      </w:pPr>
+      <w:rPr>
+        <w:rFonts w:ascii="Wingdings" w:hAnsi="Wingdings" w:hint="default"/>
+        <w:sz w:val="20"/>
+      </w:rPr>
+    </w:lvl>
+    <w:lvl w:ilvl="7" w:tentative="1">
+      <w:start w:val="1"/>
+      <w:numFmt w:val="bullet"/>
+      <w:lvlText w:val=""/>
+      <w:lvlJc w:val="left"/>
+      <w:pPr>
+        <w:tabs>
+          <w:tab w:val="num" w:pos="5760"/>
+        </w:tabs>
+        <w:ind w:left="5760" w:hanging="360"/>
+      </w:pPr>
+      <w:rPr>
+        <w:rFonts w:ascii="Wingdings" w:hAnsi="Wingdings" w:hint="default"/>
+        <w:sz w:val="20"/>
+      </w:rPr>
+    </w:lvl>
+    <w:lvl w:ilvl="8" w:tentative="1">
+      <w:start w:val="1"/>
+      <w:numFmt w:val="bullet"/>
+      <w:lvlText w:val=""/>
+      <w:lvlJc w:val="left"/>
+      <w:pPr>
+        <w:tabs>
+          <w:tab w:val="num" w:pos="6480"/>
+        </w:tabs>
+        <w:ind w:left="6480" w:hanging="360"/>
+      </w:pPr>
+      <w:rPr>
+        <w:rFonts w:ascii="Wingdings" w:hAnsi="Wingdings" w:hint="default"/>
+        <w:sz w:val="20"/>
+      </w:rPr>
+    </w:lvl>
+  </w:abstractNum>
+  <w:abstractNum w:abstractNumId="42" w15:restartNumberingAfterBreak="0">
     <w:nsid w:val="31892256"/>
     <w:multiLevelType w:val="multilevel"/>
     <w:tmpl w:val="0ADCED9A"/>
@@ -27823,7 +30531,7 @@
       </w:rPr>
     </w:lvl>
   </w:abstractNum>
-  <w:abstractNum w:abstractNumId="38" w15:restartNumberingAfterBreak="0">
+  <w:abstractNum w:abstractNumId="43" w15:restartNumberingAfterBreak="0">
     <w:nsid w:val="32407802"/>
     <w:multiLevelType w:val="multilevel"/>
     <w:tmpl w:val="6532B900"/>
@@ -27968,7 +30676,7 @@
       </w:rPr>
     </w:lvl>
   </w:abstractNum>
-  <w:abstractNum w:abstractNumId="39" w15:restartNumberingAfterBreak="0">
+  <w:abstractNum w:abstractNumId="44" w15:restartNumberingAfterBreak="0">
     <w:nsid w:val="33BE49A5"/>
     <w:multiLevelType w:val="multilevel"/>
     <w:tmpl w:val="1778D452"/>
@@ -28117,7 +30825,7 @@
       </w:rPr>
     </w:lvl>
   </w:abstractNum>
-  <w:abstractNum w:abstractNumId="40" w15:restartNumberingAfterBreak="0">
+  <w:abstractNum w:abstractNumId="45" w15:restartNumberingAfterBreak="0">
     <w:nsid w:val="33E50415"/>
     <w:multiLevelType w:val="multilevel"/>
     <w:tmpl w:val="81D8AEA6"/>
@@ -28230,7 +30938,7 @@
       </w:pPr>
     </w:lvl>
   </w:abstractNum>
-  <w:abstractNum w:abstractNumId="41" w15:restartNumberingAfterBreak="0">
+  <w:abstractNum w:abstractNumId="46" w15:restartNumberingAfterBreak="0">
     <w:nsid w:val="33F90402"/>
     <w:multiLevelType w:val="multilevel"/>
     <w:tmpl w:val="FF12022A"/>
@@ -28379,7 +31087,7 @@
       </w:rPr>
     </w:lvl>
   </w:abstractNum>
-  <w:abstractNum w:abstractNumId="42" w15:restartNumberingAfterBreak="0">
+  <w:abstractNum w:abstractNumId="47" w15:restartNumberingAfterBreak="0">
     <w:nsid w:val="3411318E"/>
     <w:multiLevelType w:val="multilevel"/>
     <w:tmpl w:val="B2B8ADFC"/>
@@ -28528,7 +31236,7 @@
       </w:rPr>
     </w:lvl>
   </w:abstractNum>
-  <w:abstractNum w:abstractNumId="43" w15:restartNumberingAfterBreak="0">
+  <w:abstractNum w:abstractNumId="48" w15:restartNumberingAfterBreak="0">
     <w:nsid w:val="347E1320"/>
     <w:multiLevelType w:val="multilevel"/>
     <w:tmpl w:val="EB44296A"/>
@@ -28677,7 +31385,7 @@
       </w:rPr>
     </w:lvl>
   </w:abstractNum>
-  <w:abstractNum w:abstractNumId="44" w15:restartNumberingAfterBreak="0">
+  <w:abstractNum w:abstractNumId="49" w15:restartNumberingAfterBreak="0">
     <w:nsid w:val="34FB49FE"/>
     <w:multiLevelType w:val="multilevel"/>
     <w:tmpl w:val="C75003F8"/>
@@ -28826,7 +31534,7 @@
       </w:rPr>
     </w:lvl>
   </w:abstractNum>
-  <w:abstractNum w:abstractNumId="45" w15:restartNumberingAfterBreak="0">
+  <w:abstractNum w:abstractNumId="50" w15:restartNumberingAfterBreak="0">
     <w:nsid w:val="37E50510"/>
     <w:multiLevelType w:val="multilevel"/>
     <w:tmpl w:val="E9DC5C1A"/>
@@ -28975,7 +31683,7 @@
       </w:rPr>
     </w:lvl>
   </w:abstractNum>
-  <w:abstractNum w:abstractNumId="46" w15:restartNumberingAfterBreak="0">
+  <w:abstractNum w:abstractNumId="51" w15:restartNumberingAfterBreak="0">
     <w:nsid w:val="38DA4745"/>
     <w:multiLevelType w:val="multilevel"/>
     <w:tmpl w:val="BFFE1DA8"/>
@@ -29124,7 +31832,7 @@
       </w:rPr>
     </w:lvl>
   </w:abstractNum>
-  <w:abstractNum w:abstractNumId="47" w15:restartNumberingAfterBreak="0">
+  <w:abstractNum w:abstractNumId="52" w15:restartNumberingAfterBreak="0">
     <w:nsid w:val="3BEB578A"/>
     <w:multiLevelType w:val="multilevel"/>
     <w:tmpl w:val="418E5F56"/>
@@ -29273,7 +31981,7 @@
       </w:rPr>
     </w:lvl>
   </w:abstractNum>
-  <w:abstractNum w:abstractNumId="48" w15:restartNumberingAfterBreak="0">
+  <w:abstractNum w:abstractNumId="53" w15:restartNumberingAfterBreak="0">
     <w:nsid w:val="3D5C293C"/>
     <w:multiLevelType w:val="multilevel"/>
     <w:tmpl w:val="1500FEFA"/>
@@ -29422,7 +32130,7 @@
       </w:rPr>
     </w:lvl>
   </w:abstractNum>
-  <w:abstractNum w:abstractNumId="49" w15:restartNumberingAfterBreak="0">
+  <w:abstractNum w:abstractNumId="54" w15:restartNumberingAfterBreak="0">
     <w:nsid w:val="3F060C0A"/>
     <w:multiLevelType w:val="multilevel"/>
     <w:tmpl w:val="21B231A6"/>
@@ -29571,7 +32279,7 @@
       </w:rPr>
     </w:lvl>
   </w:abstractNum>
-  <w:abstractNum w:abstractNumId="50" w15:restartNumberingAfterBreak="0">
+  <w:abstractNum w:abstractNumId="55" w15:restartNumberingAfterBreak="0">
     <w:nsid w:val="3F491717"/>
     <w:multiLevelType w:val="multilevel"/>
     <w:tmpl w:val="F37C5BAC"/>
@@ -29720,7 +32428,7 @@
       </w:rPr>
     </w:lvl>
   </w:abstractNum>
-  <w:abstractNum w:abstractNumId="51" w15:restartNumberingAfterBreak="0">
+  <w:abstractNum w:abstractNumId="56" w15:restartNumberingAfterBreak="0">
     <w:nsid w:val="3FBE1FE5"/>
     <w:multiLevelType w:val="multilevel"/>
     <w:tmpl w:val="74A44AC2"/>
@@ -29869,7 +32577,7 @@
       </w:rPr>
     </w:lvl>
   </w:abstractNum>
-  <w:abstractNum w:abstractNumId="52" w15:restartNumberingAfterBreak="0">
+  <w:abstractNum w:abstractNumId="57" w15:restartNumberingAfterBreak="0">
     <w:nsid w:val="3FEC0747"/>
     <w:multiLevelType w:val="multilevel"/>
     <w:tmpl w:val="D902D9FA"/>
@@ -30018,7 +32726,7 @@
       </w:rPr>
     </w:lvl>
   </w:abstractNum>
-  <w:abstractNum w:abstractNumId="53" w15:restartNumberingAfterBreak="0">
+  <w:abstractNum w:abstractNumId="58" w15:restartNumberingAfterBreak="0">
     <w:nsid w:val="4022142D"/>
     <w:multiLevelType w:val="multilevel"/>
     <w:tmpl w:val="91CE0946"/>
@@ -30167,7 +32875,7 @@
       </w:rPr>
     </w:lvl>
   </w:abstractNum>
-  <w:abstractNum w:abstractNumId="54" w15:restartNumberingAfterBreak="0">
+  <w:abstractNum w:abstractNumId="59" w15:restartNumberingAfterBreak="0">
     <w:nsid w:val="414376EC"/>
     <w:multiLevelType w:val="multilevel"/>
     <w:tmpl w:val="336AC92E"/>
@@ -30288,7 +32996,7 @@
       </w:pPr>
     </w:lvl>
   </w:abstractNum>
-  <w:abstractNum w:abstractNumId="55" w15:restartNumberingAfterBreak="0">
+  <w:abstractNum w:abstractNumId="60" w15:restartNumberingAfterBreak="0">
     <w:nsid w:val="416E5C2A"/>
     <w:multiLevelType w:val="multilevel"/>
     <w:tmpl w:val="0D863D18"/>
@@ -30437,7 +33145,7 @@
       </w:rPr>
     </w:lvl>
   </w:abstractNum>
-  <w:abstractNum w:abstractNumId="56" w15:restartNumberingAfterBreak="0">
+  <w:abstractNum w:abstractNumId="61" w15:restartNumberingAfterBreak="0">
     <w:nsid w:val="42295FD5"/>
     <w:multiLevelType w:val="multilevel"/>
     <w:tmpl w:val="5678AC2C"/>
@@ -30586,7 +33294,7 @@
       </w:rPr>
     </w:lvl>
   </w:abstractNum>
-  <w:abstractNum w:abstractNumId="57" w15:restartNumberingAfterBreak="0">
+  <w:abstractNum w:abstractNumId="62" w15:restartNumberingAfterBreak="0">
     <w:nsid w:val="4384673A"/>
     <w:multiLevelType w:val="multilevel"/>
     <w:tmpl w:val="B40A7566"/>
@@ -30731,7 +33439,7 @@
       </w:rPr>
     </w:lvl>
   </w:abstractNum>
-  <w:abstractNum w:abstractNumId="58" w15:restartNumberingAfterBreak="0">
+  <w:abstractNum w:abstractNumId="63" w15:restartNumberingAfterBreak="0">
     <w:nsid w:val="44B17DA9"/>
     <w:multiLevelType w:val="multilevel"/>
     <w:tmpl w:val="3662BEB4"/>
@@ -30844,7 +33552,7 @@
       </w:pPr>
     </w:lvl>
   </w:abstractNum>
-  <w:abstractNum w:abstractNumId="59" w15:restartNumberingAfterBreak="0">
+  <w:abstractNum w:abstractNumId="64" w15:restartNumberingAfterBreak="0">
     <w:nsid w:val="452E410B"/>
     <w:multiLevelType w:val="multilevel"/>
     <w:tmpl w:val="0B925B04"/>
@@ -30993,7 +33701,7 @@
       </w:rPr>
     </w:lvl>
   </w:abstractNum>
-  <w:abstractNum w:abstractNumId="60" w15:restartNumberingAfterBreak="0">
+  <w:abstractNum w:abstractNumId="65" w15:restartNumberingAfterBreak="0">
     <w:nsid w:val="474733A0"/>
     <w:multiLevelType w:val="multilevel"/>
     <w:tmpl w:val="A39AFA32"/>
@@ -31142,7 +33850,7 @@
       </w:rPr>
     </w:lvl>
   </w:abstractNum>
-  <w:abstractNum w:abstractNumId="61" w15:restartNumberingAfterBreak="0">
+  <w:abstractNum w:abstractNumId="66" w15:restartNumberingAfterBreak="0">
     <w:nsid w:val="486D547F"/>
     <w:multiLevelType w:val="multilevel"/>
     <w:tmpl w:val="8CE231FA"/>
@@ -31291,7 +33999,7 @@
       </w:rPr>
     </w:lvl>
   </w:abstractNum>
-  <w:abstractNum w:abstractNumId="62" w15:restartNumberingAfterBreak="0">
+  <w:abstractNum w:abstractNumId="67" w15:restartNumberingAfterBreak="0">
     <w:nsid w:val="4DD47F4F"/>
     <w:multiLevelType w:val="multilevel"/>
     <w:tmpl w:val="C16AB81E"/>
@@ -31440,7 +34148,7 @@
       </w:rPr>
     </w:lvl>
   </w:abstractNum>
-  <w:abstractNum w:abstractNumId="63" w15:restartNumberingAfterBreak="0">
+  <w:abstractNum w:abstractNumId="68" w15:restartNumberingAfterBreak="0">
     <w:nsid w:val="4E072FF2"/>
     <w:multiLevelType w:val="multilevel"/>
     <w:tmpl w:val="0570E538"/>
@@ -31589,7 +34297,7 @@
       </w:rPr>
     </w:lvl>
   </w:abstractNum>
-  <w:abstractNum w:abstractNumId="64" w15:restartNumberingAfterBreak="0">
+  <w:abstractNum w:abstractNumId="69" w15:restartNumberingAfterBreak="0">
     <w:nsid w:val="4E84565A"/>
     <w:multiLevelType w:val="multilevel"/>
     <w:tmpl w:val="E7BEE546"/>
@@ -31738,7 +34446,7 @@
       </w:rPr>
     </w:lvl>
   </w:abstractNum>
-  <w:abstractNum w:abstractNumId="65" w15:restartNumberingAfterBreak="0">
+  <w:abstractNum w:abstractNumId="70" w15:restartNumberingAfterBreak="0">
     <w:nsid w:val="503D70EA"/>
     <w:multiLevelType w:val="multilevel"/>
     <w:tmpl w:val="FF0CFC1C"/>
@@ -31887,7 +34595,7 @@
       </w:rPr>
     </w:lvl>
   </w:abstractNum>
-  <w:abstractNum w:abstractNumId="66" w15:restartNumberingAfterBreak="0">
+  <w:abstractNum w:abstractNumId="71" w15:restartNumberingAfterBreak="0">
     <w:nsid w:val="532330AB"/>
     <w:multiLevelType w:val="multilevel"/>
     <w:tmpl w:val="B3D6AF0C"/>
@@ -32036,7 +34744,7 @@
       </w:rPr>
     </w:lvl>
   </w:abstractNum>
-  <w:abstractNum w:abstractNumId="67" w15:restartNumberingAfterBreak="0">
+  <w:abstractNum w:abstractNumId="72" w15:restartNumberingAfterBreak="0">
     <w:nsid w:val="53982AAB"/>
     <w:multiLevelType w:val="multilevel"/>
     <w:tmpl w:val="3BE8998E"/>
@@ -32185,7 +34893,7 @@
       </w:rPr>
     </w:lvl>
   </w:abstractNum>
-  <w:abstractNum w:abstractNumId="68" w15:restartNumberingAfterBreak="0">
+  <w:abstractNum w:abstractNumId="73" w15:restartNumberingAfterBreak="0">
     <w:nsid w:val="54064360"/>
     <w:multiLevelType w:val="multilevel"/>
     <w:tmpl w:val="E56AAC72"/>
@@ -32334,7 +35042,7 @@
       </w:rPr>
     </w:lvl>
   </w:abstractNum>
-  <w:abstractNum w:abstractNumId="69" w15:restartNumberingAfterBreak="0">
+  <w:abstractNum w:abstractNumId="74" w15:restartNumberingAfterBreak="0">
     <w:nsid w:val="542C6EED"/>
     <w:multiLevelType w:val="multilevel"/>
     <w:tmpl w:val="B2BC62E6"/>
@@ -32483,7 +35191,7 @@
       </w:rPr>
     </w:lvl>
   </w:abstractNum>
-  <w:abstractNum w:abstractNumId="70" w15:restartNumberingAfterBreak="0">
+  <w:abstractNum w:abstractNumId="75" w15:restartNumberingAfterBreak="0">
     <w:nsid w:val="553521D3"/>
     <w:multiLevelType w:val="multilevel"/>
     <w:tmpl w:val="86421860"/>
@@ -32632,7 +35340,7 @@
       </w:rPr>
     </w:lvl>
   </w:abstractNum>
-  <w:abstractNum w:abstractNumId="71" w15:restartNumberingAfterBreak="0">
+  <w:abstractNum w:abstractNumId="76" w15:restartNumberingAfterBreak="0">
     <w:nsid w:val="56F07886"/>
     <w:multiLevelType w:val="multilevel"/>
     <w:tmpl w:val="F6887A2E"/>
@@ -32781,7 +35489,7 @@
       </w:rPr>
     </w:lvl>
   </w:abstractNum>
-  <w:abstractNum w:abstractNumId="72" w15:restartNumberingAfterBreak="0">
+  <w:abstractNum w:abstractNumId="77" w15:restartNumberingAfterBreak="0">
     <w:nsid w:val="5A1F2437"/>
     <w:multiLevelType w:val="multilevel"/>
     <w:tmpl w:val="18CA3C0C"/>
@@ -32898,7 +35606,7 @@
       </w:pPr>
     </w:lvl>
   </w:abstractNum>
-  <w:abstractNum w:abstractNumId="73" w15:restartNumberingAfterBreak="0">
+  <w:abstractNum w:abstractNumId="78" w15:restartNumberingAfterBreak="0">
     <w:nsid w:val="5A843B23"/>
     <w:multiLevelType w:val="multilevel"/>
     <w:tmpl w:val="F0A6BDD6"/>
@@ -33047,7 +35755,7 @@
       </w:rPr>
     </w:lvl>
   </w:abstractNum>
-  <w:abstractNum w:abstractNumId="74" w15:restartNumberingAfterBreak="0">
+  <w:abstractNum w:abstractNumId="79" w15:restartNumberingAfterBreak="0">
     <w:nsid w:val="5B692442"/>
     <w:multiLevelType w:val="multilevel"/>
     <w:tmpl w:val="78CA4470"/>
@@ -33196,7 +35904,7 @@
       </w:rPr>
     </w:lvl>
   </w:abstractNum>
-  <w:abstractNum w:abstractNumId="75" w15:restartNumberingAfterBreak="0">
+  <w:abstractNum w:abstractNumId="80" w15:restartNumberingAfterBreak="0">
     <w:nsid w:val="5CBC56D7"/>
     <w:multiLevelType w:val="multilevel"/>
     <w:tmpl w:val="90D6E342"/>
@@ -33345,7 +36053,7 @@
       </w:rPr>
     </w:lvl>
   </w:abstractNum>
-  <w:abstractNum w:abstractNumId="76" w15:restartNumberingAfterBreak="0">
+  <w:abstractNum w:abstractNumId="81" w15:restartNumberingAfterBreak="0">
     <w:nsid w:val="5CDE7704"/>
     <w:multiLevelType w:val="multilevel"/>
     <w:tmpl w:val="5E9054A0"/>
@@ -33494,7 +36202,7 @@
       </w:rPr>
     </w:lvl>
   </w:abstractNum>
-  <w:abstractNum w:abstractNumId="77" w15:restartNumberingAfterBreak="0">
+  <w:abstractNum w:abstractNumId="82" w15:restartNumberingAfterBreak="0">
     <w:nsid w:val="5E442BAC"/>
     <w:multiLevelType w:val="multilevel"/>
     <w:tmpl w:val="21B45664"/>
@@ -33643,7 +36351,7 @@
       </w:rPr>
     </w:lvl>
   </w:abstractNum>
-  <w:abstractNum w:abstractNumId="78" w15:restartNumberingAfterBreak="0">
+  <w:abstractNum w:abstractNumId="83" w15:restartNumberingAfterBreak="0">
     <w:nsid w:val="5E6341BC"/>
     <w:multiLevelType w:val="multilevel"/>
     <w:tmpl w:val="FC52693A"/>
@@ -33792,7 +36500,7 @@
       </w:rPr>
     </w:lvl>
   </w:abstractNum>
-  <w:abstractNum w:abstractNumId="79" w15:restartNumberingAfterBreak="0">
+  <w:abstractNum w:abstractNumId="84" w15:restartNumberingAfterBreak="0">
     <w:nsid w:val="5EC97F19"/>
     <w:multiLevelType w:val="multilevel"/>
     <w:tmpl w:val="49FCB750"/>
@@ -33941,7 +36649,7 @@
       </w:rPr>
     </w:lvl>
   </w:abstractNum>
-  <w:abstractNum w:abstractNumId="80" w15:restartNumberingAfterBreak="0">
+  <w:abstractNum w:abstractNumId="85" w15:restartNumberingAfterBreak="0">
     <w:nsid w:val="5FB26915"/>
     <w:multiLevelType w:val="multilevel"/>
     <w:tmpl w:val="1DD4BD44"/>
@@ -34090,7 +36798,7 @@
       </w:rPr>
     </w:lvl>
   </w:abstractNum>
-  <w:abstractNum w:abstractNumId="81" w15:restartNumberingAfterBreak="0">
+  <w:abstractNum w:abstractNumId="86" w15:restartNumberingAfterBreak="0">
     <w:nsid w:val="605C6834"/>
     <w:multiLevelType w:val="multilevel"/>
     <w:tmpl w:val="A288BBDE"/>
@@ -34239,7 +36947,7 @@
       </w:rPr>
     </w:lvl>
   </w:abstractNum>
-  <w:abstractNum w:abstractNumId="82" w15:restartNumberingAfterBreak="0">
+  <w:abstractNum w:abstractNumId="87" w15:restartNumberingAfterBreak="0">
     <w:nsid w:val="638127B1"/>
     <w:multiLevelType w:val="multilevel"/>
     <w:tmpl w:val="E6A4D87E"/>
@@ -34388,7 +37096,7 @@
       </w:rPr>
     </w:lvl>
   </w:abstractNum>
-  <w:abstractNum w:abstractNumId="83" w15:restartNumberingAfterBreak="0">
+  <w:abstractNum w:abstractNumId="88" w15:restartNumberingAfterBreak="0">
     <w:nsid w:val="63FD2244"/>
     <w:multiLevelType w:val="multilevel"/>
     <w:tmpl w:val="7A78F2A4"/>
@@ -34537,7 +37245,7 @@
       </w:rPr>
     </w:lvl>
   </w:abstractNum>
-  <w:abstractNum w:abstractNumId="84" w15:restartNumberingAfterBreak="0">
+  <w:abstractNum w:abstractNumId="89" w15:restartNumberingAfterBreak="0">
     <w:nsid w:val="647661AA"/>
     <w:multiLevelType w:val="multilevel"/>
     <w:tmpl w:val="2530F62C"/>
@@ -34686,7 +37394,7 @@
       </w:rPr>
     </w:lvl>
   </w:abstractNum>
-  <w:abstractNum w:abstractNumId="85" w15:restartNumberingAfterBreak="0">
+  <w:abstractNum w:abstractNumId="90" w15:restartNumberingAfterBreak="0">
     <w:nsid w:val="64D34A4E"/>
     <w:multiLevelType w:val="multilevel"/>
     <w:tmpl w:val="BB4270B8"/>
@@ -34835,7 +37543,7 @@
       </w:rPr>
     </w:lvl>
   </w:abstractNum>
-  <w:abstractNum w:abstractNumId="86" w15:restartNumberingAfterBreak="0">
+  <w:abstractNum w:abstractNumId="91" w15:restartNumberingAfterBreak="0">
     <w:nsid w:val="660E6280"/>
     <w:multiLevelType w:val="multilevel"/>
     <w:tmpl w:val="19A42C26"/>
@@ -34984,7 +37692,7 @@
       </w:rPr>
     </w:lvl>
   </w:abstractNum>
-  <w:abstractNum w:abstractNumId="87" w15:restartNumberingAfterBreak="0">
+  <w:abstractNum w:abstractNumId="92" w15:restartNumberingAfterBreak="0">
     <w:nsid w:val="66CB4DBF"/>
     <w:multiLevelType w:val="multilevel"/>
     <w:tmpl w:val="D25A428E"/>
@@ -35133,7 +37841,7 @@
       </w:rPr>
     </w:lvl>
   </w:abstractNum>
-  <w:abstractNum w:abstractNumId="88" w15:restartNumberingAfterBreak="0">
+  <w:abstractNum w:abstractNumId="93" w15:restartNumberingAfterBreak="0">
     <w:nsid w:val="66D54201"/>
     <w:multiLevelType w:val="multilevel"/>
     <w:tmpl w:val="BCA6AD92"/>
@@ -35282,7 +37990,7 @@
       </w:rPr>
     </w:lvl>
   </w:abstractNum>
-  <w:abstractNum w:abstractNumId="89" w15:restartNumberingAfterBreak="0">
+  <w:abstractNum w:abstractNumId="94" w15:restartNumberingAfterBreak="0">
     <w:nsid w:val="674D3DBC"/>
     <w:multiLevelType w:val="multilevel"/>
     <w:tmpl w:val="2CDA07AE"/>
@@ -35431,7 +38139,124 @@
       </w:rPr>
     </w:lvl>
   </w:abstractNum>
-  <w:abstractNum w:abstractNumId="90" w15:restartNumberingAfterBreak="0">
+  <w:abstractNum w:abstractNumId="95" w15:restartNumberingAfterBreak="0">
+    <w:nsid w:val="682A6CB0"/>
+    <w:multiLevelType w:val="multilevel"/>
+    <w:tmpl w:val="B9EE9112"/>
+    <w:lvl w:ilvl="0">
+      <w:start w:val="1"/>
+      <w:numFmt w:val="decimal"/>
+      <w:lvlText w:val="%1."/>
+      <w:lvlJc w:val="left"/>
+      <w:pPr>
+        <w:tabs>
+          <w:tab w:val="num" w:pos="720"/>
+        </w:tabs>
+        <w:ind w:left="720" w:hanging="360"/>
+      </w:pPr>
+    </w:lvl>
+    <w:lvl w:ilvl="1">
+      <w:start w:val="1"/>
+      <w:numFmt w:val="bullet"/>
+      <w:lvlText w:val="o"/>
+      <w:lvlJc w:val="left"/>
+      <w:pPr>
+        <w:tabs>
+          <w:tab w:val="num" w:pos="1440"/>
+        </w:tabs>
+        <w:ind w:left="1440" w:hanging="360"/>
+      </w:pPr>
+      <w:rPr>
+        <w:rFonts w:ascii="Courier New" w:hAnsi="Courier New" w:hint="default"/>
+        <w:sz w:val="20"/>
+      </w:rPr>
+    </w:lvl>
+    <w:lvl w:ilvl="2" w:tentative="1">
+      <w:start w:val="1"/>
+      <w:numFmt w:val="decimal"/>
+      <w:lvlText w:val="%3."/>
+      <w:lvlJc w:val="left"/>
+      <w:pPr>
+        <w:tabs>
+          <w:tab w:val="num" w:pos="2160"/>
+        </w:tabs>
+        <w:ind w:left="2160" w:hanging="360"/>
+      </w:pPr>
+    </w:lvl>
+    <w:lvl w:ilvl="3" w:tentative="1">
+      <w:start w:val="1"/>
+      <w:numFmt w:val="decimal"/>
+      <w:lvlText w:val="%4."/>
+      <w:lvlJc w:val="left"/>
+      <w:pPr>
+        <w:tabs>
+          <w:tab w:val="num" w:pos="2880"/>
+        </w:tabs>
+        <w:ind w:left="2880" w:hanging="360"/>
+      </w:pPr>
+    </w:lvl>
+    <w:lvl w:ilvl="4" w:tentative="1">
+      <w:start w:val="1"/>
+      <w:numFmt w:val="decimal"/>
+      <w:lvlText w:val="%5."/>
+      <w:lvlJc w:val="left"/>
+      <w:pPr>
+        <w:tabs>
+          <w:tab w:val="num" w:pos="3600"/>
+        </w:tabs>
+        <w:ind w:left="3600" w:hanging="360"/>
+      </w:pPr>
+    </w:lvl>
+    <w:lvl w:ilvl="5" w:tentative="1">
+      <w:start w:val="1"/>
+      <w:numFmt w:val="decimal"/>
+      <w:lvlText w:val="%6."/>
+      <w:lvlJc w:val="left"/>
+      <w:pPr>
+        <w:tabs>
+          <w:tab w:val="num" w:pos="4320"/>
+        </w:tabs>
+        <w:ind w:left="4320" w:hanging="360"/>
+      </w:pPr>
+    </w:lvl>
+    <w:lvl w:ilvl="6" w:tentative="1">
+      <w:start w:val="1"/>
+      <w:numFmt w:val="decimal"/>
+      <w:lvlText w:val="%7."/>
+      <w:lvlJc w:val="left"/>
+      <w:pPr>
+        <w:tabs>
+          <w:tab w:val="num" w:pos="5040"/>
+        </w:tabs>
+        <w:ind w:left="5040" w:hanging="360"/>
+      </w:pPr>
+    </w:lvl>
+    <w:lvl w:ilvl="7" w:tentative="1">
+      <w:start w:val="1"/>
+      <w:numFmt w:val="decimal"/>
+      <w:lvlText w:val="%8."/>
+      <w:lvlJc w:val="left"/>
+      <w:pPr>
+        <w:tabs>
+          <w:tab w:val="num" w:pos="5760"/>
+        </w:tabs>
+        <w:ind w:left="5760" w:hanging="360"/>
+      </w:pPr>
+    </w:lvl>
+    <w:lvl w:ilvl="8" w:tentative="1">
+      <w:start w:val="1"/>
+      <w:numFmt w:val="decimal"/>
+      <w:lvlText w:val="%9."/>
+      <w:lvlJc w:val="left"/>
+      <w:pPr>
+        <w:tabs>
+          <w:tab w:val="num" w:pos="6480"/>
+        </w:tabs>
+        <w:ind w:left="6480" w:hanging="360"/>
+      </w:pPr>
+    </w:lvl>
+  </w:abstractNum>
+  <w:abstractNum w:abstractNumId="96" w15:restartNumberingAfterBreak="0">
     <w:nsid w:val="686F2F06"/>
     <w:multiLevelType w:val="multilevel"/>
     <w:tmpl w:val="543276EE"/>
@@ -35580,7 +38405,7 @@
       </w:rPr>
     </w:lvl>
   </w:abstractNum>
-  <w:abstractNum w:abstractNumId="91" w15:restartNumberingAfterBreak="0">
+  <w:abstractNum w:abstractNumId="97" w15:restartNumberingAfterBreak="0">
     <w:nsid w:val="6A0E646F"/>
     <w:multiLevelType w:val="multilevel"/>
     <w:tmpl w:val="98B25B0E"/>
@@ -35729,7 +38554,7 @@
       </w:rPr>
     </w:lvl>
   </w:abstractNum>
-  <w:abstractNum w:abstractNumId="92" w15:restartNumberingAfterBreak="0">
+  <w:abstractNum w:abstractNumId="98" w15:restartNumberingAfterBreak="0">
     <w:nsid w:val="6A3959CC"/>
     <w:multiLevelType w:val="multilevel"/>
     <w:tmpl w:val="592ED5C0"/>
@@ -35878,7 +38703,7 @@
       </w:rPr>
     </w:lvl>
   </w:abstractNum>
-  <w:abstractNum w:abstractNumId="93" w15:restartNumberingAfterBreak="0">
+  <w:abstractNum w:abstractNumId="99" w15:restartNumberingAfterBreak="0">
     <w:nsid w:val="6A731197"/>
     <w:multiLevelType w:val="multilevel"/>
     <w:tmpl w:val="FEC8F45A"/>
@@ -36027,7 +38852,7 @@
       </w:rPr>
     </w:lvl>
   </w:abstractNum>
-  <w:abstractNum w:abstractNumId="94" w15:restartNumberingAfterBreak="0">
+  <w:abstractNum w:abstractNumId="100" w15:restartNumberingAfterBreak="0">
     <w:nsid w:val="6B4B6A21"/>
     <w:multiLevelType w:val="multilevel"/>
     <w:tmpl w:val="92FE7EDE"/>
@@ -36176,7 +39001,156 @@
       </w:rPr>
     </w:lvl>
   </w:abstractNum>
-  <w:abstractNum w:abstractNumId="95" w15:restartNumberingAfterBreak="0">
+  <w:abstractNum w:abstractNumId="101" w15:restartNumberingAfterBreak="0">
+    <w:nsid w:val="6B501990"/>
+    <w:multiLevelType w:val="multilevel"/>
+    <w:tmpl w:val="D14E1A9C"/>
+    <w:lvl w:ilvl="0">
+      <w:start w:val="1"/>
+      <w:numFmt w:val="bullet"/>
+      <w:lvlText w:val=""/>
+      <w:lvlJc w:val="left"/>
+      <w:pPr>
+        <w:tabs>
+          <w:tab w:val="num" w:pos="720"/>
+        </w:tabs>
+        <w:ind w:left="720" w:hanging="360"/>
+      </w:pPr>
+      <w:rPr>
+        <w:rFonts w:ascii="Symbol" w:hAnsi="Symbol" w:hint="default"/>
+        <w:sz w:val="20"/>
+      </w:rPr>
+    </w:lvl>
+    <w:lvl w:ilvl="1" w:tentative="1">
+      <w:start w:val="1"/>
+      <w:numFmt w:val="bullet"/>
+      <w:lvlText w:val="o"/>
+      <w:lvlJc w:val="left"/>
+      <w:pPr>
+        <w:tabs>
+          <w:tab w:val="num" w:pos="1440"/>
+        </w:tabs>
+        <w:ind w:left="1440" w:hanging="360"/>
+      </w:pPr>
+      <w:rPr>
+        <w:rFonts w:ascii="Courier New" w:hAnsi="Courier New" w:hint="default"/>
+        <w:sz w:val="20"/>
+      </w:rPr>
+    </w:lvl>
+    <w:lvl w:ilvl="2" w:tentative="1">
+      <w:start w:val="1"/>
+      <w:numFmt w:val="bullet"/>
+      <w:lvlText w:val=""/>
+      <w:lvlJc w:val="left"/>
+      <w:pPr>
+        <w:tabs>
+          <w:tab w:val="num" w:pos="2160"/>
+        </w:tabs>
+        <w:ind w:left="2160" w:hanging="360"/>
+      </w:pPr>
+      <w:rPr>
+        <w:rFonts w:ascii="Wingdings" w:hAnsi="Wingdings" w:hint="default"/>
+        <w:sz w:val="20"/>
+      </w:rPr>
+    </w:lvl>
+    <w:lvl w:ilvl="3" w:tentative="1">
+      <w:start w:val="1"/>
+      <w:numFmt w:val="bullet"/>
+      <w:lvlText w:val=""/>
+      <w:lvlJc w:val="left"/>
+      <w:pPr>
+        <w:tabs>
+          <w:tab w:val="num" w:pos="2880"/>
+        </w:tabs>
+        <w:ind w:left="2880" w:hanging="360"/>
+      </w:pPr>
+      <w:rPr>
+        <w:rFonts w:ascii="Wingdings" w:hAnsi="Wingdings" w:hint="default"/>
+        <w:sz w:val="20"/>
+      </w:rPr>
+    </w:lvl>
+    <w:lvl w:ilvl="4" w:tentative="1">
+      <w:start w:val="1"/>
+      <w:numFmt w:val="bullet"/>
+      <w:lvlText w:val=""/>
+      <w:lvlJc w:val="left"/>
+      <w:pPr>
+        <w:tabs>
+          <w:tab w:val="num" w:pos="3600"/>
+        </w:tabs>
+        <w:ind w:left="3600" w:hanging="360"/>
+      </w:pPr>
+      <w:rPr>
+        <w:rFonts w:ascii="Wingdings" w:hAnsi="Wingdings" w:hint="default"/>
+        <w:sz w:val="20"/>
+      </w:rPr>
+    </w:lvl>
+    <w:lvl w:ilvl="5" w:tentative="1">
+      <w:start w:val="1"/>
+      <w:numFmt w:val="bullet"/>
+      <w:lvlText w:val=""/>
+      <w:lvlJc w:val="left"/>
+      <w:pPr>
+        <w:tabs>
+          <w:tab w:val="num" w:pos="4320"/>
+        </w:tabs>
+        <w:ind w:left="4320" w:hanging="360"/>
+      </w:pPr>
+      <w:rPr>
+        <w:rFonts w:ascii="Wingdings" w:hAnsi="Wingdings" w:hint="default"/>
+        <w:sz w:val="20"/>
+      </w:rPr>
+    </w:lvl>
+    <w:lvl w:ilvl="6" w:tentative="1">
+      <w:start w:val="1"/>
+      <w:numFmt w:val="bullet"/>
+      <w:lvlText w:val=""/>
+      <w:lvlJc w:val="left"/>
+      <w:pPr>
+        <w:tabs>
+          <w:tab w:val="num" w:pos="5040"/>
+        </w:tabs>
+        <w:ind w:left="5040" w:hanging="360"/>
+      </w:pPr>
+      <w:rPr>
+        <w:rFonts w:ascii="Wingdings" w:hAnsi="Wingdings" w:hint="default"/>
+        <w:sz w:val="20"/>
+      </w:rPr>
+    </w:lvl>
+    <w:lvl w:ilvl="7" w:tentative="1">
+      <w:start w:val="1"/>
+      <w:numFmt w:val="bullet"/>
+      <w:lvlText w:val=""/>
+      <w:lvlJc w:val="left"/>
+      <w:pPr>
+        <w:tabs>
+          <w:tab w:val="num" w:pos="5760"/>
+        </w:tabs>
+        <w:ind w:left="5760" w:hanging="360"/>
+      </w:pPr>
+      <w:rPr>
+        <w:rFonts w:ascii="Wingdings" w:hAnsi="Wingdings" w:hint="default"/>
+        <w:sz w:val="20"/>
+      </w:rPr>
+    </w:lvl>
+    <w:lvl w:ilvl="8" w:tentative="1">
+      <w:start w:val="1"/>
+      <w:numFmt w:val="bullet"/>
+      <w:lvlText w:val=""/>
+      <w:lvlJc w:val="left"/>
+      <w:pPr>
+        <w:tabs>
+          <w:tab w:val="num" w:pos="6480"/>
+        </w:tabs>
+        <w:ind w:left="6480" w:hanging="360"/>
+      </w:pPr>
+      <w:rPr>
+        <w:rFonts w:ascii="Wingdings" w:hAnsi="Wingdings" w:hint="default"/>
+        <w:sz w:val="20"/>
+      </w:rPr>
+    </w:lvl>
+  </w:abstractNum>
+  <w:abstractNum w:abstractNumId="102" w15:restartNumberingAfterBreak="0">
     <w:nsid w:val="6BFA2976"/>
     <w:multiLevelType w:val="multilevel"/>
     <w:tmpl w:val="7F6A6AAE"/>
@@ -36325,7 +39299,7 @@
       </w:rPr>
     </w:lvl>
   </w:abstractNum>
-  <w:abstractNum w:abstractNumId="96" w15:restartNumberingAfterBreak="0">
+  <w:abstractNum w:abstractNumId="103" w15:restartNumberingAfterBreak="0">
     <w:nsid w:val="6C1C365F"/>
     <w:multiLevelType w:val="multilevel"/>
     <w:tmpl w:val="438810AA"/>
@@ -36474,7 +39448,7 @@
       </w:rPr>
     </w:lvl>
   </w:abstractNum>
-  <w:abstractNum w:abstractNumId="97" w15:restartNumberingAfterBreak="0">
+  <w:abstractNum w:abstractNumId="104" w15:restartNumberingAfterBreak="0">
     <w:nsid w:val="6C333C24"/>
     <w:multiLevelType w:val="multilevel"/>
     <w:tmpl w:val="E3AA6D26"/>
@@ -36623,7 +39597,7 @@
       </w:rPr>
     </w:lvl>
   </w:abstractNum>
-  <w:abstractNum w:abstractNumId="98" w15:restartNumberingAfterBreak="0">
+  <w:abstractNum w:abstractNumId="105" w15:restartNumberingAfterBreak="0">
     <w:nsid w:val="71E23B4A"/>
     <w:multiLevelType w:val="multilevel"/>
     <w:tmpl w:val="8DD0E2CC"/>
@@ -36772,7 +39746,7 @@
       </w:rPr>
     </w:lvl>
   </w:abstractNum>
-  <w:abstractNum w:abstractNumId="99" w15:restartNumberingAfterBreak="0">
+  <w:abstractNum w:abstractNumId="106" w15:restartNumberingAfterBreak="0">
     <w:nsid w:val="735A1CB3"/>
     <w:multiLevelType w:val="multilevel"/>
     <w:tmpl w:val="639AA1B6"/>
@@ -36921,7 +39895,7 @@
       </w:rPr>
     </w:lvl>
   </w:abstractNum>
-  <w:abstractNum w:abstractNumId="100" w15:restartNumberingAfterBreak="0">
+  <w:abstractNum w:abstractNumId="107" w15:restartNumberingAfterBreak="0">
     <w:nsid w:val="74DE301B"/>
     <w:multiLevelType w:val="multilevel"/>
     <w:tmpl w:val="8B7EC7E2"/>
@@ -37070,7 +40044,7 @@
       </w:rPr>
     </w:lvl>
   </w:abstractNum>
-  <w:abstractNum w:abstractNumId="101" w15:restartNumberingAfterBreak="0">
+  <w:abstractNum w:abstractNumId="108" w15:restartNumberingAfterBreak="0">
     <w:nsid w:val="74F70406"/>
     <w:multiLevelType w:val="multilevel"/>
     <w:tmpl w:val="2402B338"/>
@@ -37219,7 +40193,7 @@
       </w:rPr>
     </w:lvl>
   </w:abstractNum>
-  <w:abstractNum w:abstractNumId="102" w15:restartNumberingAfterBreak="0">
+  <w:abstractNum w:abstractNumId="109" w15:restartNumberingAfterBreak="0">
     <w:nsid w:val="76AC05B5"/>
     <w:multiLevelType w:val="multilevel"/>
     <w:tmpl w:val="1CE849FC"/>
@@ -37368,7 +40342,7 @@
       </w:rPr>
     </w:lvl>
   </w:abstractNum>
-  <w:abstractNum w:abstractNumId="103" w15:restartNumberingAfterBreak="0">
+  <w:abstractNum w:abstractNumId="110" w15:restartNumberingAfterBreak="0">
     <w:nsid w:val="771244AB"/>
     <w:multiLevelType w:val="multilevel"/>
     <w:tmpl w:val="16F05DB8"/>
@@ -37485,7 +40459,7 @@
       </w:pPr>
     </w:lvl>
   </w:abstractNum>
-  <w:abstractNum w:abstractNumId="104" w15:restartNumberingAfterBreak="0">
+  <w:abstractNum w:abstractNumId="111" w15:restartNumberingAfterBreak="0">
     <w:nsid w:val="78A35D76"/>
     <w:multiLevelType w:val="multilevel"/>
     <w:tmpl w:val="846EFFA6"/>
@@ -37634,7 +40608,7 @@
       </w:rPr>
     </w:lvl>
   </w:abstractNum>
-  <w:abstractNum w:abstractNumId="105" w15:restartNumberingAfterBreak="0">
+  <w:abstractNum w:abstractNumId="112" w15:restartNumberingAfterBreak="0">
     <w:nsid w:val="796B5219"/>
     <w:multiLevelType w:val="multilevel"/>
     <w:tmpl w:val="941463EA"/>
@@ -37783,7 +40757,7 @@
       </w:rPr>
     </w:lvl>
   </w:abstractNum>
-  <w:abstractNum w:abstractNumId="106" w15:restartNumberingAfterBreak="0">
+  <w:abstractNum w:abstractNumId="113" w15:restartNumberingAfterBreak="0">
     <w:nsid w:val="7A501858"/>
     <w:multiLevelType w:val="multilevel"/>
     <w:tmpl w:val="3740F67E"/>
@@ -37932,7 +40906,7 @@
       </w:rPr>
     </w:lvl>
   </w:abstractNum>
-  <w:abstractNum w:abstractNumId="107" w15:restartNumberingAfterBreak="0">
+  <w:abstractNum w:abstractNumId="114" w15:restartNumberingAfterBreak="0">
     <w:nsid w:val="7A684783"/>
     <w:multiLevelType w:val="multilevel"/>
     <w:tmpl w:val="8270A7D8"/>
@@ -38081,7 +41055,7 @@
       </w:rPr>
     </w:lvl>
   </w:abstractNum>
-  <w:abstractNum w:abstractNumId="108" w15:restartNumberingAfterBreak="0">
+  <w:abstractNum w:abstractNumId="115" w15:restartNumberingAfterBreak="0">
     <w:nsid w:val="7E7945DF"/>
     <w:multiLevelType w:val="multilevel"/>
     <w:tmpl w:val="8D429524"/>
@@ -38230,7 +41204,7 @@
       </w:rPr>
     </w:lvl>
   </w:abstractNum>
-  <w:abstractNum w:abstractNumId="109" w15:restartNumberingAfterBreak="0">
+  <w:abstractNum w:abstractNumId="116" w15:restartNumberingAfterBreak="0">
     <w:nsid w:val="7EBC5001"/>
     <w:multiLevelType w:val="multilevel"/>
     <w:tmpl w:val="D2D033D2"/>
@@ -38379,7 +41353,7 @@
       </w:rPr>
     </w:lvl>
   </w:abstractNum>
-  <w:abstractNum w:abstractNumId="110" w15:restartNumberingAfterBreak="0">
+  <w:abstractNum w:abstractNumId="117" w15:restartNumberingAfterBreak="0">
     <w:nsid w:val="7EEF7B4F"/>
     <w:multiLevelType w:val="multilevel"/>
     <w:tmpl w:val="D1461E90"/>
@@ -38529,337 +41503,358 @@
     </w:lvl>
   </w:abstractNum>
   <w:num w:numId="1" w16cid:durableId="1601067662">
-    <w:abstractNumId w:val="102"/>
+    <w:abstractNumId w:val="109"/>
   </w:num>
   <w:num w:numId="2" w16cid:durableId="1842160260">
-    <w:abstractNumId w:val="37"/>
+    <w:abstractNumId w:val="42"/>
   </w:num>
   <w:num w:numId="3" w16cid:durableId="427888292">
-    <w:abstractNumId w:val="68"/>
+    <w:abstractNumId w:val="73"/>
   </w:num>
   <w:num w:numId="4" w16cid:durableId="1239897464">
-    <w:abstractNumId w:val="80"/>
+    <w:abstractNumId w:val="85"/>
   </w:num>
   <w:num w:numId="5" w16cid:durableId="1715275080">
-    <w:abstractNumId w:val="16"/>
+    <w:abstractNumId w:val="17"/>
   </w:num>
   <w:num w:numId="6" w16cid:durableId="591793">
+    <w:abstractNumId w:val="58"/>
+  </w:num>
+  <w:num w:numId="7" w16cid:durableId="1668097145">
+    <w:abstractNumId w:val="52"/>
+  </w:num>
+  <w:num w:numId="8" w16cid:durableId="388305022">
+    <w:abstractNumId w:val="96"/>
+  </w:num>
+  <w:num w:numId="9" w16cid:durableId="507983134">
+    <w:abstractNumId w:val="88"/>
+  </w:num>
+  <w:num w:numId="10" w16cid:durableId="1812745135">
+    <w:abstractNumId w:val="113"/>
+  </w:num>
+  <w:num w:numId="11" w16cid:durableId="834338879">
     <w:abstractNumId w:val="53"/>
   </w:num>
-  <w:num w:numId="7" w16cid:durableId="1668097145">
-    <w:abstractNumId w:val="47"/>
-  </w:num>
-  <w:num w:numId="8" w16cid:durableId="388305022">
-    <w:abstractNumId w:val="90"/>
-  </w:num>
-  <w:num w:numId="9" w16cid:durableId="507983134">
-    <w:abstractNumId w:val="83"/>
-  </w:num>
-  <w:num w:numId="10" w16cid:durableId="1812745135">
-    <w:abstractNumId w:val="106"/>
-  </w:num>
-  <w:num w:numId="11" w16cid:durableId="834338879">
-    <w:abstractNumId w:val="48"/>
-  </w:num>
   <w:num w:numId="12" w16cid:durableId="2117942136">
-    <w:abstractNumId w:val="33"/>
+    <w:abstractNumId w:val="36"/>
   </w:num>
   <w:num w:numId="13" w16cid:durableId="1863933511">
-    <w:abstractNumId w:val="39"/>
+    <w:abstractNumId w:val="44"/>
   </w:num>
   <w:num w:numId="14" w16cid:durableId="540291627">
-    <w:abstractNumId w:val="14"/>
+    <w:abstractNumId w:val="15"/>
   </w:num>
   <w:num w:numId="15" w16cid:durableId="1636523159">
+    <w:abstractNumId w:val="97"/>
+  </w:num>
+  <w:num w:numId="16" w16cid:durableId="1861624381">
+    <w:abstractNumId w:val="86"/>
+  </w:num>
+  <w:num w:numId="17" w16cid:durableId="1791515050">
+    <w:abstractNumId w:val="66"/>
+  </w:num>
+  <w:num w:numId="18" w16cid:durableId="1397700912">
+    <w:abstractNumId w:val="11"/>
+  </w:num>
+  <w:num w:numId="19" w16cid:durableId="991567642">
+    <w:abstractNumId w:val="12"/>
+  </w:num>
+  <w:num w:numId="20" w16cid:durableId="1265844389">
+    <w:abstractNumId w:val="112"/>
+  </w:num>
+  <w:num w:numId="21" w16cid:durableId="603849961">
+    <w:abstractNumId w:val="69"/>
+  </w:num>
+  <w:num w:numId="22" w16cid:durableId="2146654949">
+    <w:abstractNumId w:val="117"/>
+  </w:num>
+  <w:num w:numId="23" w16cid:durableId="1096947934">
+    <w:abstractNumId w:val="61"/>
+  </w:num>
+  <w:num w:numId="24" w16cid:durableId="1818721275">
+    <w:abstractNumId w:val="28"/>
+  </w:num>
+  <w:num w:numId="25" w16cid:durableId="1656257368">
+    <w:abstractNumId w:val="31"/>
+  </w:num>
+  <w:num w:numId="26" w16cid:durableId="618337997">
+    <w:abstractNumId w:val="35"/>
+  </w:num>
+  <w:num w:numId="27" w16cid:durableId="1167746404">
+    <w:abstractNumId w:val="29"/>
+  </w:num>
+  <w:num w:numId="28" w16cid:durableId="1382366140">
+    <w:abstractNumId w:val="103"/>
+  </w:num>
+  <w:num w:numId="29" w16cid:durableId="394744024">
     <w:abstractNumId w:val="91"/>
   </w:num>
-  <w:num w:numId="16" w16cid:durableId="1861624381">
-    <w:abstractNumId w:val="81"/>
-  </w:num>
-  <w:num w:numId="17" w16cid:durableId="1791515050">
-    <w:abstractNumId w:val="61"/>
-  </w:num>
-  <w:num w:numId="18" w16cid:durableId="1397700912">
-    <w:abstractNumId w:val="10"/>
-  </w:num>
-  <w:num w:numId="19" w16cid:durableId="991567642">
-    <w:abstractNumId w:val="11"/>
-  </w:num>
-  <w:num w:numId="20" w16cid:durableId="1265844389">
-    <w:abstractNumId w:val="105"/>
-  </w:num>
-  <w:num w:numId="21" w16cid:durableId="603849961">
-    <w:abstractNumId w:val="64"/>
-  </w:num>
-  <w:num w:numId="22" w16cid:durableId="2146654949">
-    <w:abstractNumId w:val="110"/>
-  </w:num>
-  <w:num w:numId="23" w16cid:durableId="1096947934">
-    <w:abstractNumId w:val="56"/>
-  </w:num>
-  <w:num w:numId="24" w16cid:durableId="1818721275">
-    <w:abstractNumId w:val="25"/>
-  </w:num>
-  <w:num w:numId="25" w16cid:durableId="1656257368">
-    <w:abstractNumId w:val="28"/>
-  </w:num>
-  <w:num w:numId="26" w16cid:durableId="618337997">
-    <w:abstractNumId w:val="32"/>
-  </w:num>
-  <w:num w:numId="27" w16cid:durableId="1167746404">
-    <w:abstractNumId w:val="26"/>
-  </w:num>
-  <w:num w:numId="28" w16cid:durableId="1382366140">
-    <w:abstractNumId w:val="96"/>
-  </w:num>
-  <w:num w:numId="29" w16cid:durableId="394744024">
-    <w:abstractNumId w:val="86"/>
-  </w:num>
   <w:num w:numId="30" w16cid:durableId="639844085">
-    <w:abstractNumId w:val="27"/>
+    <w:abstractNumId w:val="30"/>
   </w:num>
   <w:num w:numId="31" w16cid:durableId="1792892985">
     <w:abstractNumId w:val="2"/>
   </w:num>
   <w:num w:numId="32" w16cid:durableId="247690888">
-    <w:abstractNumId w:val="43"/>
+    <w:abstractNumId w:val="48"/>
   </w:num>
   <w:num w:numId="33" w16cid:durableId="158690485">
-    <w:abstractNumId w:val="8"/>
+    <w:abstractNumId w:val="9"/>
   </w:num>
   <w:num w:numId="34" w16cid:durableId="1270697427">
-    <w:abstractNumId w:val="12"/>
+    <w:abstractNumId w:val="13"/>
   </w:num>
   <w:num w:numId="35" w16cid:durableId="1026447968">
-    <w:abstractNumId w:val="67"/>
+    <w:abstractNumId w:val="72"/>
   </w:num>
   <w:num w:numId="36" w16cid:durableId="895169701">
-    <w:abstractNumId w:val="94"/>
+    <w:abstractNumId w:val="100"/>
   </w:num>
   <w:num w:numId="37" w16cid:durableId="1054432657">
+    <w:abstractNumId w:val="89"/>
+  </w:num>
+  <w:num w:numId="38" w16cid:durableId="982197546">
+    <w:abstractNumId w:val="56"/>
+  </w:num>
+  <w:num w:numId="39" w16cid:durableId="224730662">
+    <w:abstractNumId w:val="87"/>
+  </w:num>
+  <w:num w:numId="40" w16cid:durableId="1386877970">
+    <w:abstractNumId w:val="104"/>
+  </w:num>
+  <w:num w:numId="41" w16cid:durableId="499856297">
+    <w:abstractNumId w:val="68"/>
+  </w:num>
+  <w:num w:numId="42" w16cid:durableId="348262419">
+    <w:abstractNumId w:val="19"/>
+  </w:num>
+  <w:num w:numId="43" w16cid:durableId="1433235826">
+    <w:abstractNumId w:val="49"/>
+  </w:num>
+  <w:num w:numId="44" w16cid:durableId="1570723628">
+    <w:abstractNumId w:val="90"/>
+  </w:num>
+  <w:num w:numId="45" w16cid:durableId="186212376">
+    <w:abstractNumId w:val="102"/>
+  </w:num>
+  <w:num w:numId="46" w16cid:durableId="735325319">
+    <w:abstractNumId w:val="55"/>
+  </w:num>
+  <w:num w:numId="47" w16cid:durableId="1140532661">
+    <w:abstractNumId w:val="114"/>
+  </w:num>
+  <w:num w:numId="48" w16cid:durableId="190192697">
+    <w:abstractNumId w:val="81"/>
+  </w:num>
+  <w:num w:numId="49" w16cid:durableId="752816508">
+    <w:abstractNumId w:val="83"/>
+  </w:num>
+  <w:num w:numId="50" w16cid:durableId="383259824">
+    <w:abstractNumId w:val="7"/>
+  </w:num>
+  <w:num w:numId="51" w16cid:durableId="479468768">
+    <w:abstractNumId w:val="93"/>
+  </w:num>
+  <w:num w:numId="52" w16cid:durableId="1928154536">
+    <w:abstractNumId w:val="22"/>
+  </w:num>
+  <w:num w:numId="53" w16cid:durableId="1687440873">
+    <w:abstractNumId w:val="57"/>
+  </w:num>
+  <w:num w:numId="54" w16cid:durableId="219290444">
     <w:abstractNumId w:val="84"/>
   </w:num>
-  <w:num w:numId="38" w16cid:durableId="982197546">
-    <w:abstractNumId w:val="51"/>
-  </w:num>
-  <w:num w:numId="39" w16cid:durableId="224730662">
-    <w:abstractNumId w:val="82"/>
-  </w:num>
-  <w:num w:numId="40" w16cid:durableId="1386877970">
-    <w:abstractNumId w:val="97"/>
-  </w:num>
-  <w:num w:numId="41" w16cid:durableId="499856297">
-    <w:abstractNumId w:val="63"/>
-  </w:num>
-  <w:num w:numId="42" w16cid:durableId="348262419">
-    <w:abstractNumId w:val="18"/>
-  </w:num>
-  <w:num w:numId="43" w16cid:durableId="1433235826">
-    <w:abstractNumId w:val="44"/>
-  </w:num>
-  <w:num w:numId="44" w16cid:durableId="1570723628">
-    <w:abstractNumId w:val="85"/>
-  </w:num>
-  <w:num w:numId="45" w16cid:durableId="186212376">
-    <w:abstractNumId w:val="95"/>
-  </w:num>
-  <w:num w:numId="46" w16cid:durableId="735325319">
-    <w:abstractNumId w:val="50"/>
-  </w:num>
-  <w:num w:numId="47" w16cid:durableId="1140532661">
-    <w:abstractNumId w:val="107"/>
-  </w:num>
-  <w:num w:numId="48" w16cid:durableId="190192697">
-    <w:abstractNumId w:val="76"/>
-  </w:num>
-  <w:num w:numId="49" w16cid:durableId="752816508">
-    <w:abstractNumId w:val="78"/>
-  </w:num>
-  <w:num w:numId="50" w16cid:durableId="383259824">
-    <w:abstractNumId w:val="6"/>
-  </w:num>
-  <w:num w:numId="51" w16cid:durableId="479468768">
-    <w:abstractNumId w:val="88"/>
-  </w:num>
-  <w:num w:numId="52" w16cid:durableId="1928154536">
-    <w:abstractNumId w:val="20"/>
-  </w:num>
-  <w:num w:numId="53" w16cid:durableId="1687440873">
-    <w:abstractNumId w:val="52"/>
-  </w:num>
-  <w:num w:numId="54" w16cid:durableId="219290444">
-    <w:abstractNumId w:val="79"/>
-  </w:num>
   <w:num w:numId="55" w16cid:durableId="2072189939">
-    <w:abstractNumId w:val="72"/>
+    <w:abstractNumId w:val="77"/>
   </w:num>
   <w:num w:numId="56" w16cid:durableId="209876496">
-    <w:abstractNumId w:val="104"/>
+    <w:abstractNumId w:val="111"/>
   </w:num>
   <w:num w:numId="57" w16cid:durableId="1023751729">
-    <w:abstractNumId w:val="54"/>
+    <w:abstractNumId w:val="59"/>
   </w:num>
   <w:num w:numId="58" w16cid:durableId="358091959">
-    <w:abstractNumId w:val="49"/>
+    <w:abstractNumId w:val="54"/>
   </w:num>
   <w:num w:numId="59" w16cid:durableId="504828465">
     <w:abstractNumId w:val="4"/>
   </w:num>
   <w:num w:numId="60" w16cid:durableId="1396393029">
-    <w:abstractNumId w:val="93"/>
+    <w:abstractNumId w:val="99"/>
   </w:num>
   <w:num w:numId="61" w16cid:durableId="1466198500">
-    <w:abstractNumId w:val="77"/>
+    <w:abstractNumId w:val="82"/>
   </w:num>
   <w:num w:numId="62" w16cid:durableId="1380472791">
-    <w:abstractNumId w:val="19"/>
+    <w:abstractNumId w:val="21"/>
   </w:num>
   <w:num w:numId="63" w16cid:durableId="1017734211">
-    <w:abstractNumId w:val="29"/>
+    <w:abstractNumId w:val="32"/>
   </w:num>
   <w:num w:numId="64" w16cid:durableId="297688022">
-    <w:abstractNumId w:val="42"/>
+    <w:abstractNumId w:val="47"/>
   </w:num>
   <w:num w:numId="65" w16cid:durableId="933979171">
-    <w:abstractNumId w:val="98"/>
+    <w:abstractNumId w:val="105"/>
   </w:num>
   <w:num w:numId="66" w16cid:durableId="183402321">
     <w:abstractNumId w:val="3"/>
   </w:num>
   <w:num w:numId="67" w16cid:durableId="1174413203">
+    <w:abstractNumId w:val="25"/>
+  </w:num>
+  <w:num w:numId="68" w16cid:durableId="1864393723">
+    <w:abstractNumId w:val="108"/>
+  </w:num>
+  <w:num w:numId="69" w16cid:durableId="1620987036">
+    <w:abstractNumId w:val="98"/>
+  </w:num>
+  <w:num w:numId="70" w16cid:durableId="1558010844">
+    <w:abstractNumId w:val="63"/>
+  </w:num>
+  <w:num w:numId="71" w16cid:durableId="1421683068">
+    <w:abstractNumId w:val="24"/>
+  </w:num>
+  <w:num w:numId="72" w16cid:durableId="2045327131">
+    <w:abstractNumId w:val="40"/>
+  </w:num>
+  <w:num w:numId="73" w16cid:durableId="1331522367">
+    <w:abstractNumId w:val="74"/>
+  </w:num>
+  <w:num w:numId="74" w16cid:durableId="1190491682">
+    <w:abstractNumId w:val="38"/>
+  </w:num>
+  <w:num w:numId="75" w16cid:durableId="730814975">
+    <w:abstractNumId w:val="62"/>
+  </w:num>
+  <w:num w:numId="76" w16cid:durableId="2123375167">
+    <w:abstractNumId w:val="94"/>
+  </w:num>
+  <w:num w:numId="77" w16cid:durableId="553852911">
     <w:abstractNumId w:val="23"/>
   </w:num>
-  <w:num w:numId="68" w16cid:durableId="1864393723">
-    <w:abstractNumId w:val="101"/>
-  </w:num>
-  <w:num w:numId="69" w16cid:durableId="1620987036">
-    <w:abstractNumId w:val="92"/>
-  </w:num>
-  <w:num w:numId="70" w16cid:durableId="1558010844">
-    <w:abstractNumId w:val="58"/>
-  </w:num>
-  <w:num w:numId="71" w16cid:durableId="1421683068">
-    <w:abstractNumId w:val="22"/>
-  </w:num>
-  <w:num w:numId="72" w16cid:durableId="2045327131">
-    <w:abstractNumId w:val="36"/>
-  </w:num>
-  <w:num w:numId="73" w16cid:durableId="1331522367">
-    <w:abstractNumId w:val="69"/>
-  </w:num>
-  <w:num w:numId="74" w16cid:durableId="1190491682">
-    <w:abstractNumId w:val="35"/>
-  </w:num>
-  <w:num w:numId="75" w16cid:durableId="730814975">
-    <w:abstractNumId w:val="57"/>
-  </w:num>
-  <w:num w:numId="76" w16cid:durableId="2123375167">
-    <w:abstractNumId w:val="89"/>
-  </w:num>
-  <w:num w:numId="77" w16cid:durableId="553852911">
-    <w:abstractNumId w:val="21"/>
-  </w:num>
   <w:num w:numId="78" w16cid:durableId="2034569324">
-    <w:abstractNumId w:val="62"/>
+    <w:abstractNumId w:val="67"/>
   </w:num>
   <w:num w:numId="79" w16cid:durableId="371421016">
-    <w:abstractNumId w:val="59"/>
+    <w:abstractNumId w:val="64"/>
   </w:num>
   <w:num w:numId="80" w16cid:durableId="1722555584">
-    <w:abstractNumId w:val="74"/>
+    <w:abstractNumId w:val="79"/>
   </w:num>
   <w:num w:numId="81" w16cid:durableId="1350911606">
-    <w:abstractNumId w:val="31"/>
+    <w:abstractNumId w:val="34"/>
   </w:num>
   <w:num w:numId="82" w16cid:durableId="1174371584">
-    <w:abstractNumId w:val="65"/>
+    <w:abstractNumId w:val="70"/>
   </w:num>
   <w:num w:numId="83" w16cid:durableId="113796862">
-    <w:abstractNumId w:val="55"/>
+    <w:abstractNumId w:val="60"/>
   </w:num>
   <w:num w:numId="84" w16cid:durableId="392972513">
-    <w:abstractNumId w:val="73"/>
+    <w:abstractNumId w:val="78"/>
   </w:num>
   <w:num w:numId="85" w16cid:durableId="1851947334">
-    <w:abstractNumId w:val="24"/>
+    <w:abstractNumId w:val="26"/>
   </w:num>
   <w:num w:numId="86" w16cid:durableId="1712461149">
+    <w:abstractNumId w:val="50"/>
+  </w:num>
+  <w:num w:numId="87" w16cid:durableId="2034181852">
+    <w:abstractNumId w:val="71"/>
+  </w:num>
+  <w:num w:numId="88" w16cid:durableId="704065615">
+    <w:abstractNumId w:val="10"/>
+  </w:num>
+  <w:num w:numId="89" w16cid:durableId="1345282548">
     <w:abstractNumId w:val="45"/>
   </w:num>
-  <w:num w:numId="87" w16cid:durableId="2034181852">
-    <w:abstractNumId w:val="66"/>
-  </w:num>
-  <w:num w:numId="88" w16cid:durableId="704065615">
-    <w:abstractNumId w:val="9"/>
-  </w:num>
-  <w:num w:numId="89" w16cid:durableId="1345282548">
-    <w:abstractNumId w:val="40"/>
-  </w:num>
   <w:num w:numId="90" w16cid:durableId="1583295986">
-    <w:abstractNumId w:val="13"/>
+    <w:abstractNumId w:val="14"/>
   </w:num>
   <w:num w:numId="91" w16cid:durableId="1348824051">
-    <w:abstractNumId w:val="70"/>
+    <w:abstractNumId w:val="75"/>
   </w:num>
   <w:num w:numId="92" w16cid:durableId="819923782">
-    <w:abstractNumId w:val="7"/>
+    <w:abstractNumId w:val="8"/>
   </w:num>
   <w:num w:numId="93" w16cid:durableId="1332181473">
-    <w:abstractNumId w:val="34"/>
+    <w:abstractNumId w:val="37"/>
   </w:num>
   <w:num w:numId="94" w16cid:durableId="1947735533">
-    <w:abstractNumId w:val="75"/>
+    <w:abstractNumId w:val="80"/>
   </w:num>
   <w:num w:numId="95" w16cid:durableId="1763724796">
-    <w:abstractNumId w:val="71"/>
+    <w:abstractNumId w:val="76"/>
   </w:num>
   <w:num w:numId="96" w16cid:durableId="614169460">
     <w:abstractNumId w:val="0"/>
   </w:num>
   <w:num w:numId="97" w16cid:durableId="1531332672">
-    <w:abstractNumId w:val="100"/>
+    <w:abstractNumId w:val="107"/>
   </w:num>
   <w:num w:numId="98" w16cid:durableId="923227259">
     <w:abstractNumId w:val="1"/>
   </w:num>
   <w:num w:numId="99" w16cid:durableId="1019504736">
-    <w:abstractNumId w:val="41"/>
+    <w:abstractNumId w:val="46"/>
   </w:num>
   <w:num w:numId="100" w16cid:durableId="1744714576">
-    <w:abstractNumId w:val="87"/>
+    <w:abstractNumId w:val="92"/>
   </w:num>
   <w:num w:numId="101" w16cid:durableId="1802646702">
-    <w:abstractNumId w:val="38"/>
+    <w:abstractNumId w:val="43"/>
   </w:num>
   <w:num w:numId="102" w16cid:durableId="209729862">
-    <w:abstractNumId w:val="46"/>
+    <w:abstractNumId w:val="51"/>
   </w:num>
   <w:num w:numId="103" w16cid:durableId="1461266200">
-    <w:abstractNumId w:val="103"/>
+    <w:abstractNumId w:val="110"/>
   </w:num>
   <w:num w:numId="104" w16cid:durableId="378557114">
     <w:abstractNumId w:val="5"/>
   </w:num>
   <w:num w:numId="105" w16cid:durableId="566569502">
-    <w:abstractNumId w:val="99"/>
+    <w:abstractNumId w:val="106"/>
   </w:num>
   <w:num w:numId="106" w16cid:durableId="1082801780">
-    <w:abstractNumId w:val="109"/>
+    <w:abstractNumId w:val="116"/>
   </w:num>
   <w:num w:numId="107" w16cid:durableId="1792940832">
-    <w:abstractNumId w:val="30"/>
+    <w:abstractNumId w:val="33"/>
   </w:num>
   <w:num w:numId="108" w16cid:durableId="1881697824">
-    <w:abstractNumId w:val="60"/>
+    <w:abstractNumId w:val="65"/>
   </w:num>
   <w:num w:numId="109" w16cid:durableId="138497712">
-    <w:abstractNumId w:val="17"/>
+    <w:abstractNumId w:val="18"/>
   </w:num>
   <w:num w:numId="110" w16cid:durableId="352459771">
-    <w:abstractNumId w:val="108"/>
+    <w:abstractNumId w:val="115"/>
   </w:num>
   <w:num w:numId="111" w16cid:durableId="2054575885">
-    <w:abstractNumId w:val="15"/>
+    <w:abstractNumId w:val="16"/>
+  </w:num>
+  <w:num w:numId="112" w16cid:durableId="585189141">
+    <w:abstractNumId w:val="20"/>
+  </w:num>
+  <w:num w:numId="113" w16cid:durableId="1704094233">
+    <w:abstractNumId w:val="39"/>
+  </w:num>
+  <w:num w:numId="114" w16cid:durableId="2126535493">
+    <w:abstractNumId w:val="27"/>
+  </w:num>
+  <w:num w:numId="115" w16cid:durableId="405225368">
+    <w:abstractNumId w:val="101"/>
+  </w:num>
+  <w:num w:numId="116" w16cid:durableId="1871916299">
+    <w:abstractNumId w:val="95"/>
+  </w:num>
+  <w:num w:numId="117" w16cid:durableId="675034929">
+    <w:abstractNumId w:val="41"/>
+  </w:num>
+  <w:num w:numId="118" w16cid:durableId="1027829183">
+    <w:abstractNumId w:val="6"/>
   </w:num>
 </w:numbering>
 </file>

</xml_diff>